<commit_message>
Rebuild deck to 15 slides with fuller wording and even blocks; update speech
Co-Authored-By: Claude Sonnet 5.5 <noreply@anthropic.com>
Claude-Session: https://claude.ai/code/session_01JHAi78QVA9c3PviMoRDJFz
</commit_message>
<xml_diff>
--- a/harness/Doklad-Harness.docx
+++ b/harness/Doklad-Harness.docx
@@ -2,7 +2,7 @@
 <file path=word/document.xml><?xml version="1.0" encoding="utf-8"?>
 <w:document xmlns:w="http://schemas.openxmlformats.org/wordprocessingml/2006/main" xmlns:m="http://schemas.openxmlformats.org/officeDocument/2006/math" xmlns:r="http://schemas.openxmlformats.org/officeDocument/2006/relationships" xmlns:o="urn:schemas-microsoft-com:office:office" xmlns:v="urn:schemas-microsoft-com:vml" xmlns:w10="urn:schemas-microsoft-com:office:word" xmlns:a="http://schemas.openxmlformats.org/drawingml/2006/main" xmlns:pic="http://schemas.openxmlformats.org/drawingml/2006/picture" xmlns:wp="http://schemas.openxmlformats.org/drawingml/2006/wordprocessingDrawing">
   <w:body>
-    <w:bookmarkStart w:id="33" w:name="X629d0992977e639803607b7e6d671af564ee6f1"/>
+    <w:bookmarkStart w:id="36" w:name="X629d0992977e639803607b7e6d671af564ee6f1"/>
     <w:p>
       <w:pPr>
         <w:pStyle w:val="Heading1"/>
@@ -26,7 +26,7 @@
         <w:t xml:space="preserve"> </w:t>
       </w:r>
       <w:r>
-        <w:t xml:space="preserve">11–12 минут, 12 слайдов.</w:t>
+        <w:t xml:space="preserve">около 13 минут, 15 слайдов.</w:t>
       </w:r>
       <w:r>
         <w:t xml:space="preserve"> </w:t>
@@ -113,7 +113,7 @@
         <w:t xml:space="preserve"> </w:t>
       </w:r>
       <w:r>
-        <w:t xml:space="preserve">— его рабочее место: компьютер, блокнот, начальник, который проверяет, и пропуск с доступами.</w:t>
+        <w:t xml:space="preserve">— его рабочее место: компьютер, блокнот, проверяющий и пропуск с доступами.</w:t>
       </w:r>
     </w:p>
     <w:p>
@@ -159,7 +159,20 @@
         <w:pStyle w:val="FirstParagraph"/>
       </w:pPr>
       <w:r>
-        <w:t xml:space="preserve">Каждый слайд отвечает на вопрос, который родился на предыдущем. Эти вопросы-связки написаны жирным: произносите их вслух, они держат доклад.</w:t>
+        <w:t xml:space="preserve">Каждый слайд отвечает на вопрос, который родился на предыдущем. Эти вопросы-связки выделены</w:t>
+      </w:r>
+      <w:r>
+        <w:t xml:space="preserve"> </w:t>
+      </w:r>
+      <w:r>
+        <w:rPr>
+          <w:bCs/>
+          <w:b/>
+        </w:rPr>
+        <w:t xml:space="preserve">жирным</w:t>
+      </w:r>
+      <w:r>
+        <w:t xml:space="preserve">: произносите их вслух, они держат доклад. А на каждом слайде есть плашка «Маркетинг» с выводом для вашего предмета: её стоит произносить тоже.</w:t>
       </w:r>
     </w:p>
     <w:p>
@@ -196,7 +209,7 @@
         <w:pStyle w:val="BodyText"/>
       </w:pPr>
       <w:r>
-        <w:t xml:space="preserve">Добрый день! Скажите, кто пользуется ChatGPT? А теперь представьте, что вы директор компании и вам нужно выбрать ИИ-помощника. Все предлагают «умную нейросеть». По какому признаку вы будете выбирать?</w:t>
+        <w:t xml:space="preserve">Добрый день! Меня зовут Владислав. Представьте, что вы директор компании и выбираете ИИ-помощника. Все предлагают вам «умную нейросеть». По какому признаку вы будете выбирать?</w:t>
       </w:r>
     </w:p>
     <w:p>
@@ -204,7 +217,7 @@
         <w:pStyle w:val="BodyText"/>
       </w:pPr>
       <w:r>
-        <w:t xml:space="preserve">Вот об этом мой доклад. И ответ вас, возможно, удивит.</w:t>
+        <w:t xml:space="preserve">Вот об этом мой доклад, и ответ может вас удивить.</w:t>
       </w:r>
     </w:p>
     <w:p>
@@ -215,13 +228,13 @@
       </w:r>
     </w:p>
     <w:bookmarkEnd w:id="21"/>
-    <w:bookmarkStart w:id="22" w:name="слайд-2.-модель-у-всех-одна"/>
+    <w:bookmarkStart w:id="22" w:name="слайд-2.-вопрос-модель-у-всех-одна"/>
     <w:p>
       <w:pPr>
         <w:pStyle w:val="Heading2"/>
       </w:pPr>
       <w:r>
-        <w:t xml:space="preserve">Слайд 2. Модель у всех одна</w:t>
+        <w:t xml:space="preserve">Слайд 2. Вопрос: модель у всех одна</w:t>
       </w:r>
     </w:p>
     <w:p>
@@ -229,7 +242,7 @@
         <w:pStyle w:val="FirstParagraph"/>
       </w:pPr>
       <w:r>
-        <w:t xml:space="preserve">Начнём с факта: самих «умных моделей» на рынке немного. GPT, Claude, Gemini. И любая компания может встроить их в свой продукт. Это как мука: она у всех пекарен одна, а хлеб разный.</w:t>
+        <w:t xml:space="preserve">Начнём с факта. Самих «умных моделей» на рынке немного: GPT от OpenAI, Claude от Anthropic, Gemini от Google. И любая компания может встроить их в свой продукт.</w:t>
       </w:r>
     </w:p>
     <w:p>
@@ -237,11 +250,7 @@
         <w:pStyle w:val="BodyText"/>
       </w:pPr>
       <w:r>
-        <w:rPr>
-          <w:bCs/>
-          <w:b/>
-        </w:rPr>
-        <w:t xml:space="preserve">Значит, вопрос: если «мозг» у всех один, почему продукты такие разные?</w:t>
+        <w:t xml:space="preserve">Это как мука. У всех пекарен она одна и та же, а хлеб получается разный.</w:t>
       </w:r>
     </w:p>
     <w:p>
@@ -249,7 +258,17 @@
         <w:pStyle w:val="BodyText"/>
       </w:pPr>
       <w:r>
-        <w:t xml:space="preserve">Вот случай. Компания LangChain взяла ИИ-агента для программистов. В рейтинге он был где-то за тридцатым местом. Они не меняли модель вообще, те же самые настройки. Поменяли только всё вокруг неё. Результат: пятое место.</w:t>
+        <w:t xml:space="preserve">Так же и здесь. Поэтому главный вопрос доклада такой:</w:t>
+      </w:r>
+      <w:r>
+        <w:t xml:space="preserve"> </w:t>
+      </w:r>
+      <w:r>
+        <w:rPr>
+          <w:bCs/>
+          <w:b/>
+        </w:rPr>
+        <w:t xml:space="preserve">почему один ИИ-продукт работает лучше другого, если «мозг» у них одинаковый?</w:t>
       </w:r>
     </w:p>
     <w:p>
@@ -257,7 +276,7 @@
         <w:pStyle w:val="BodyText"/>
       </w:pPr>
       <w:r>
-        <w:t xml:space="preserve">Один и тот же «мозг», а разница в двадцать с лишним мест. Значит, секрет не в модели. А в чём?</w:t>
+        <w:t xml:space="preserve">Для маркетолога вывод сразу: клиент сравнивает продукты, а не модели.</w:t>
       </w:r>
     </w:p>
     <w:p>
@@ -268,13 +287,13 @@
       </w:r>
     </w:p>
     <w:bookmarkEnd w:id="22"/>
-    <w:bookmarkStart w:id="23" w:name="слайд-3.-ответ-модель-обвязка"/>
+    <w:bookmarkStart w:id="23" w:name="X7536fdec3dd6b5ef3d64b7a56070f775d62b31f"/>
     <w:p>
       <w:pPr>
         <w:pStyle w:val="Heading2"/>
       </w:pPr>
       <w:r>
-        <w:t xml:space="preserve">Слайд 3. Ответ: модель + обвязка</w:t>
+        <w:t xml:space="preserve">Слайд 3. Доказательство: та же модель, другой результат</w:t>
       </w:r>
     </w:p>
     <w:p>
@@ -282,20 +301,83 @@
         <w:pStyle w:val="FirstParagraph"/>
       </w:pPr>
       <w:r>
-        <w:t xml:space="preserve">Секрет в том, что называют по-английски</w:t>
-      </w:r>
-      <w:r>
-        <w:t xml:space="preserve"> </w:t>
-      </w:r>
+        <w:t xml:space="preserve">И это не теория, есть цифры. Компания LangChain взяла ИИ-агента для программистов. В рейтинге он был где-то за пределами первых тридцати. Они не меняли модель вообще. Поменяли только всё вокруг неё. Результат: пятое место.</w:t>
+      </w:r>
+    </w:p>
+    <w:p>
+      <w:pPr>
+        <w:pStyle w:val="BodyText"/>
+      </w:pPr>
       <w:r>
         <w:rPr>
           <w:iCs/>
           <w:i/>
         </w:rPr>
+        <w:t xml:space="preserve">(Пауза после слов «пятое место».)</w:t>
+      </w:r>
+    </w:p>
+    <w:p>
+      <w:pPr>
+        <w:pStyle w:val="BodyText"/>
+      </w:pPr>
+      <w:r>
+        <w:t xml:space="preserve">Второй пример. В другом исследовании ИИ сам подобрал себе окружение, и оно решило больше задач без ошибок, чем системы, которые люди собирали вручную. Это 76,4% решённых задач.</w:t>
+      </w:r>
+    </w:p>
+    <w:p>
+      <w:pPr>
+        <w:pStyle w:val="BodyText"/>
+      </w:pPr>
+      <w:r>
+        <w:t xml:space="preserve">Значит, секрет не в модели.</w:t>
+      </w:r>
+      <w:r>
+        <w:t xml:space="preserve"> </w:t>
+      </w:r>
+      <w:r>
+        <w:rPr>
+          <w:bCs/>
+          <w:b/>
+        </w:rPr>
+        <w:t xml:space="preserve">А в чём?</w:t>
+      </w:r>
+    </w:p>
+    <w:p>
+      <w:r>
+        <w:pict>
+          <v:rect style="width:0;height:1.5pt" o:hralign="center" o:hrstd="t" o:hr="t"/>
+        </w:pict>
+      </w:r>
+    </w:p>
+    <w:bookmarkEnd w:id="23"/>
+    <w:bookmarkStart w:id="24" w:name="слайд-4.-ответ-агент-модель-обвязка"/>
+    <w:p>
+      <w:pPr>
+        <w:pStyle w:val="Heading2"/>
+      </w:pPr>
+      <w:r>
+        <w:t xml:space="preserve">Слайд 4. Ответ: агент = модель + обвязка</w:t>
+      </w:r>
+    </w:p>
+    <w:p>
+      <w:pPr>
+        <w:pStyle w:val="FirstParagraph"/>
+      </w:pPr>
+      <w:r>
+        <w:t xml:space="preserve">Секрет в том, что по-английски называют</w:t>
+      </w:r>
+      <w:r>
+        <w:t xml:space="preserve"> </w:t>
+      </w:r>
+      <w:r>
+        <w:rPr>
+          <w:iCs/>
+          <w:i/>
+        </w:rPr>
         <w:t xml:space="preserve">harness</w:t>
       </w:r>
       <w:r>
-        <w:t xml:space="preserve">. Дословно это «упряжь». Лошадь сильная, но поле сама не вспашет, ей нужна упряжь. Я буду говорить «обвязка».</w:t>
+        <w:t xml:space="preserve">. Дословно это «упряжь». Лошадь сильная, но поле сама не вспашет, ей нужна упряжь, которая направляет её силу. Я буду говорить «обвязка».</w:t>
       </w:r>
     </w:p>
     <w:p>
@@ -303,7 +385,7 @@
         <w:pStyle w:val="BodyText"/>
       </w:pPr>
       <w:r>
-        <w:t xml:space="preserve">Теперь вернёмся к директору из начала. Вы нанимаете гениального выпускника. Он знает всё, что есть в книгах. Но посадите его в пустую комнату, и работы не будет. Ему нужно рабочее место.</w:t>
+        <w:t xml:space="preserve">Вернёмся к директору. Вы нанимаете гениального выпускника. Он знает всё, что есть в книгах. Но посадите его в пустую комнату, и работы не будет. Ему нужно рабочее место.</w:t>
       </w:r>
     </w:p>
     <w:p>
@@ -365,19 +447,17 @@
         <w:pStyle w:val="FirstParagraph"/>
       </w:pPr>
       <w:r>
-        <w:t xml:space="preserve">Один специалист сказал это ещё короче: «Если ты не модель, ты харнесс». То есть всё, что не модель, и есть обвязка.</w:t>
-      </w:r>
-    </w:p>
-    <w:p>
-      <w:pPr>
-        <w:pStyle w:val="BodyText"/>
-      </w:pPr>
-      <w:r>
-        <w:rPr>
-          <w:bCs/>
-          <w:b/>
-        </w:rPr>
-        <w:t xml:space="preserve">Хорошо. А из чего это рабочее место состоит?</w:t>
+        <w:t xml:space="preserve">Один специалист сказал это короче: «Если ты не модель, ты харнесс». То есть всё, что не модель, и есть обвязка. А ведь вы, наверное, уже слышали слова «промпт» и «контекст».</w:t>
+      </w:r>
+      <w:r>
+        <w:t xml:space="preserve"> </w:t>
+      </w:r>
+      <w:r>
+        <w:rPr>
+          <w:bCs/>
+          <w:b/>
+        </w:rPr>
+        <w:t xml:space="preserve">Как они связаны с обвязкой?</w:t>
       </w:r>
     </w:p>
     <w:p>
@@ -387,14 +467,14 @@
         </w:pict>
       </w:r>
     </w:p>
-    <w:bookmarkEnd w:id="23"/>
-    <w:bookmarkStart w:id="24" w:name="слайд-4.-из-чего-состоит-рабочее-место"/>
+    <w:bookmarkEnd w:id="24"/>
+    <w:bookmarkStart w:id="25" w:name="слайд-5.-три-слоя-вокруг-модели"/>
     <w:p>
       <w:pPr>
         <w:pStyle w:val="Heading2"/>
       </w:pPr>
       <w:r>
-        <w:t xml:space="preserve">Слайд 4. Из чего состоит рабочее место</w:t>
+        <w:t xml:space="preserve">Слайд 5. Три слоя вокруг модели</w:t>
       </w:r>
     </w:p>
     <w:p>
@@ -402,7 +482,7 @@
         <w:pStyle w:val="FirstParagraph"/>
       </w:pPr>
       <w:r>
-        <w:t xml:space="preserve">Представьте, что вы делаете карточку товара на маркетплейсе. Какие характеристики туда запишете? У обвязки их четыре.</w:t>
+        <w:t xml:space="preserve">Тут всё просто, если вспомнить нашего сотрудника. У него есть три слоя помощи.</w:t>
       </w:r>
     </w:p>
     <w:p>
@@ -418,13 +498,13 @@
           <w:bCs/>
           <w:b/>
         </w:rPr>
-        <w:t xml:space="preserve">Руки.</w:t>
-      </w:r>
-      <w:r>
-        <w:t xml:space="preserve"> </w:t>
-      </w:r>
-      <w:r>
-        <w:t xml:space="preserve">Инструменты: открыть файл, найти в интернете, запустить программу. Без них модель только говорит.</w:t>
+        <w:t xml:space="preserve">Промпт.</w:t>
+      </w:r>
+      <w:r>
+        <w:t xml:space="preserve"> </w:t>
+      </w:r>
+      <w:r>
+        <w:t xml:space="preserve">Это то, как вы объяснили ему задачу.</w:t>
       </w:r>
     </w:p>
     <w:p>
@@ -440,13 +520,13 @@
           <w:bCs/>
           <w:b/>
         </w:rPr>
-        <w:t xml:space="preserve">Блокнот.</w:t>
-      </w:r>
-      <w:r>
-        <w:t xml:space="preserve"> </w:t>
-      </w:r>
-      <w:r>
-        <w:t xml:space="preserve">Память. Что уже сделано и о чём договорились.</w:t>
+        <w:t xml:space="preserve">Контекст.</w:t>
+      </w:r>
+      <w:r>
+        <w:t xml:space="preserve"> </w:t>
+      </w:r>
+      <w:r>
+        <w:t xml:space="preserve">Это то, какие бумаги вы положили ему на стол: документы, историю, записи.</w:t>
       </w:r>
     </w:p>
     <w:p>
@@ -462,35 +542,13 @@
           <w:bCs/>
           <w:b/>
         </w:rPr>
-        <w:t xml:space="preserve">Контролёр.</w:t>
-      </w:r>
-      <w:r>
-        <w:t xml:space="preserve"> </w:t>
-      </w:r>
-      <w:r>
-        <w:t xml:space="preserve">Проверяет результат и ловит ошибки.</w:t>
-      </w:r>
-    </w:p>
-    <w:p>
-      <w:pPr>
-        <w:numPr>
-          <w:ilvl w:val="0"/>
-          <w:numId w:val="1003"/>
-        </w:numPr>
-        <w:pStyle w:val="Compact"/>
-      </w:pPr>
-      <w:r>
-        <w:rPr>
-          <w:bCs/>
-          <w:b/>
-        </w:rPr>
-        <w:t xml:space="preserve">Пропуск.</w:t>
-      </w:r>
-      <w:r>
-        <w:t xml:space="preserve"> </w:t>
-      </w:r>
-      <w:r>
-        <w:t xml:space="preserve">Правила: что можно делать самому, а что только с разрешения человека.</w:t>
+        <w:t xml:space="preserve">Обвязка.</w:t>
+      </w:r>
+      <w:r>
+        <w:t xml:space="preserve"> </w:t>
+      </w:r>
+      <w:r>
+        <w:t xml:space="preserve">Это всё рабочее место целиком.</w:t>
       </w:r>
     </w:p>
     <w:p>
@@ -498,25 +556,17 @@
         <w:pStyle w:val="FirstParagraph"/>
       </w:pPr>
       <w:r>
-        <w:t xml:space="preserve">Это мой упрощённый вариант. В статье, по которой я готовил доклад, технических частей одиннадцать, я собрал их в четыре.</w:t>
-      </w:r>
-    </w:p>
-    <w:p>
-      <w:pPr>
-        <w:pStyle w:val="BodyText"/>
-      </w:pPr>
-      <w:r>
-        <w:t xml:space="preserve">Маркетологу это знакомо: вот ваши характеристики для сравнения продуктов.</w:t>
-      </w:r>
-      <w:r>
-        <w:t xml:space="preserve"> </w:t>
-      </w:r>
-      <w:r>
-        <w:rPr>
-          <w:bCs/>
-          <w:b/>
-        </w:rPr>
-        <w:t xml:space="preserve">Но как сотрудник вообще работает? Посмотрим на его рабочий день.</w:t>
+        <w:t xml:space="preserve">И важно: каждый следующий слой включает предыдущий. Обвязка — это и промпт, и контекст, и всё остальное. Поэтому конкурируют сегодня не удачными формулировками, а целым рабочим местом.</w:t>
+      </w:r>
+      <w:r>
+        <w:t xml:space="preserve"> </w:t>
+      </w:r>
+      <w:r>
+        <w:rPr>
+          <w:bCs/>
+          <w:b/>
+        </w:rPr>
+        <w:t xml:space="preserve">А из чего оно состоит?</w:t>
       </w:r>
     </w:p>
     <w:p>
@@ -526,14 +576,14 @@
         </w:pict>
       </w:r>
     </w:p>
-    <w:bookmarkEnd w:id="24"/>
-    <w:bookmarkStart w:id="25" w:name="слайд-5.-как-он-работает-по-кругу"/>
+    <w:bookmarkEnd w:id="25"/>
+    <w:bookmarkStart w:id="26" w:name="слайд-6.-из-чего-состоит-рабочее-место"/>
     <w:p>
       <w:pPr>
         <w:pStyle w:val="Heading2"/>
       </w:pPr>
       <w:r>
-        <w:t xml:space="preserve">Слайд 5. Как он работает: по кругу</w:t>
+        <w:t xml:space="preserve">Слайд 6. Из чего состоит рабочее место</w:t>
       </w:r>
     </w:p>
     <w:p>
@@ -541,74 +591,7 @@
         <w:pStyle w:val="FirstParagraph"/>
       </w:pPr>
       <w:r>
-        <w:t xml:space="preserve">Рабочий день агента — это простой круг. Он получил задание. Подумал, что делать. Сделал. Записал результат. Посмотрел, готово ли дело. Если нет, снова по кругу.</w:t>
-      </w:r>
-    </w:p>
-    <w:p>
-      <w:pPr>
-        <w:pStyle w:val="BodyText"/>
-      </w:pPr>
-      <w:r>
-        <w:t xml:space="preserve">Самое неожиданное: сама программа, которая крутит этот круг, очень простая. В Anthropic её в шутку называют «тупым циклом». Весь ум — в модели. А круг лишь следит за порядком: что сделано, что дальше, когда остановиться.</w:t>
-      </w:r>
-    </w:p>
-    <w:p>
-      <w:pPr>
-        <w:pStyle w:val="BodyText"/>
-      </w:pPr>
-      <w:r>
-        <w:t xml:space="preserve">Для клиента всё это невидимо. Он видит только итог: «агент сам довёл дело до конца». Но у такого сотрудника есть две главные беды.</w:t>
-      </w:r>
-      <w:r>
-        <w:t xml:space="preserve"> </w:t>
-      </w:r>
-      <w:r>
-        <w:rPr>
-          <w:bCs/>
-          <w:b/>
-        </w:rPr>
-        <w:t xml:space="preserve">Первая: стол, на котором он работает, слишком мал.</w:t>
-      </w:r>
-    </w:p>
-    <w:p>
-      <w:r>
-        <w:pict>
-          <v:rect style="width:0;height:1.5pt" o:hralign="center" o:hrstd="t" o:hr="t"/>
-        </w:pict>
-      </w:r>
-    </w:p>
-    <w:bookmarkEnd w:id="25"/>
-    <w:bookmarkStart w:id="26" w:name="слайд-6.-беда-1-места-на-столе-мало"/>
-    <w:p>
-      <w:pPr>
-        <w:pStyle w:val="Heading2"/>
-      </w:pPr>
-      <w:r>
-        <w:t xml:space="preserve">Слайд 6. Беда №1: места на столе мало</w:t>
-      </w:r>
-    </w:p>
-    <w:p>
-      <w:pPr>
-        <w:pStyle w:val="FirstParagraph"/>
-      </w:pPr>
-      <w:r>
-        <w:t xml:space="preserve">У модели есть «рабочий стол»: то, что она одновременно держит в голове. Он ограничен. И вот что выяснили исследователи: если важное оказывается в середине длинного текста, качество падает на 30% и больше.</w:t>
-      </w:r>
-    </w:p>
-    <w:p>
-      <w:pPr>
-        <w:pStyle w:val="BodyText"/>
-      </w:pPr>
-      <w:r>
-        <w:t xml:space="preserve">Это знакомо любому студенту. Лекцию вы помните с начала и с конца, а середина проваливается.</w:t>
-      </w:r>
-    </w:p>
-    <w:p>
-      <w:pPr>
-        <w:pStyle w:val="BodyText"/>
-      </w:pPr>
-      <w:r>
-        <w:t xml:space="preserve">Как с этим борются? Как в нормальном офисе:</w:t>
+        <w:t xml:space="preserve">Представьте, что вы делаете карточку товара на маркетплейсе. Какие характеристики записали бы? У обвязки их четыре.</w:t>
       </w:r>
     </w:p>
     <w:p>
@@ -620,20 +603,17 @@
         <w:pStyle w:val="Compact"/>
       </w:pPr>
       <w:r>
-        <w:t xml:space="preserve">Переписку сжимают в</w:t>
-      </w:r>
-      <w:r>
-        <w:t xml:space="preserve"> </w:t>
-      </w:r>
-      <w:r>
-        <w:rPr>
-          <w:bCs/>
-          <w:b/>
-        </w:rPr>
-        <w:t xml:space="preserve">конспект</w:t>
-      </w:r>
-      <w:r>
-        <w:t xml:space="preserve">: решения оставляют, лишнее убирают.</w:t>
+        <w:rPr>
+          <w:bCs/>
+          <w:b/>
+        </w:rPr>
+        <w:t xml:space="preserve">Руки.</w:t>
+      </w:r>
+      <w:r>
+        <w:t xml:space="preserve"> </w:t>
+      </w:r>
+      <w:r>
+        <w:t xml:space="preserve">ИИ умеет не только говорить, но и делать: открывает файлы, ищет в интернете, запускает программы.</w:t>
       </w:r>
     </w:p>
     <w:p>
@@ -645,20 +625,17 @@
         <w:pStyle w:val="Compact"/>
       </w:pPr>
       <w:r>
-        <w:t xml:space="preserve">Старые бумаги</w:t>
-      </w:r>
-      <w:r>
-        <w:t xml:space="preserve"> </w:t>
-      </w:r>
-      <w:r>
-        <w:rPr>
-          <w:bCs/>
-          <w:b/>
-        </w:rPr>
-        <w:t xml:space="preserve">убирают со стола</w:t>
-      </w:r>
-      <w:r>
-        <w:t xml:space="preserve">.</w:t>
+        <w:rPr>
+          <w:bCs/>
+          <w:b/>
+        </w:rPr>
+        <w:t xml:space="preserve">Блокнот.</w:t>
+      </w:r>
+      <w:r>
+        <w:t xml:space="preserve"> </w:t>
+      </w:r>
+      <w:r>
+        <w:t xml:space="preserve">Он помнит, о чём договорились: хранит записи, ведёт список задач.</w:t>
       </w:r>
     </w:p>
     <w:p>
@@ -670,20 +647,17 @@
         <w:pStyle w:val="Compact"/>
       </w:pPr>
       <w:r>
-        <w:t xml:space="preserve">Нужный документ</w:t>
-      </w:r>
-      <w:r>
-        <w:t xml:space="preserve"> </w:t>
-      </w:r>
-      <w:r>
-        <w:rPr>
-          <w:bCs/>
-          <w:b/>
-        </w:rPr>
-        <w:t xml:space="preserve">ищут по мере надобности</w:t>
-      </w:r>
-      <w:r>
-        <w:t xml:space="preserve">, а не читают всё подряд.</w:t>
+        <w:rPr>
+          <w:bCs/>
+          <w:b/>
+        </w:rPr>
+        <w:t xml:space="preserve">Контролёр.</w:t>
+      </w:r>
+      <w:r>
+        <w:t xml:space="preserve"> </w:t>
+      </w:r>
+      <w:r>
+        <w:t xml:space="preserve">Он проверяет свою работу и ловит ошибки до того, как их увидит клиент.</w:t>
       </w:r>
     </w:p>
     <w:p>
@@ -695,20 +669,17 @@
         <w:pStyle w:val="Compact"/>
       </w:pPr>
       <w:r>
-        <w:t xml:space="preserve">Для отдельной темы зовут</w:t>
-      </w:r>
-      <w:r>
-        <w:t xml:space="preserve"> </w:t>
-      </w:r>
-      <w:r>
-        <w:rPr>
-          <w:bCs/>
-          <w:b/>
-        </w:rPr>
-        <w:t xml:space="preserve">помощника</w:t>
-      </w:r>
-      <w:r>
-        <w:t xml:space="preserve">, который приносит короткую выжимку.</w:t>
+        <w:rPr>
+          <w:bCs/>
+          <w:b/>
+        </w:rPr>
+        <w:t xml:space="preserve">Пропуск.</w:t>
+      </w:r>
+      <w:r>
+        <w:t xml:space="preserve"> </w:t>
+      </w:r>
+      <w:r>
+        <w:t xml:space="preserve">Он знает, что ему разрешено: что делает сам, а что только с одобрения человека.</w:t>
       </w:r>
     </w:p>
     <w:p>
@@ -716,30 +687,17 @@
         <w:pStyle w:val="FirstParagraph"/>
       </w:pPr>
       <w:r>
-        <w:t xml:space="preserve">Для клиента это значит:</w:t>
-      </w:r>
-      <w:r>
-        <w:t xml:space="preserve"> </w:t>
-      </w:r>
-      <w:r>
-        <w:rPr>
-          <w:iCs/>
-          <w:i/>
-        </w:rPr>
-        <w:t xml:space="preserve">агент не тупеет к концу работы</w:t>
-      </w:r>
-      <w:r>
-        <w:t xml:space="preserve">. Эту характеристику вы не увидите в названии модели. Она целиком от обвязки.</w:t>
-      </w:r>
-      <w:r>
-        <w:t xml:space="preserve"> </w:t>
-      </w:r>
-      <w:r>
-        <w:rPr>
-          <w:bCs/>
-          <w:b/>
-        </w:rPr>
-        <w:t xml:space="preserve">Беда вторая: сотрудник ошибается.</w:t>
+        <w:t xml:space="preserve">Это мой упрощённый вариант. В статье, по которой я готовил доклад, таких частей одиннадцать, я собрал их в четыре. И это именно характеристики для карточки сравнения.</w:t>
+      </w:r>
+      <w:r>
+        <w:t xml:space="preserve"> </w:t>
+      </w:r>
+      <w:r>
+        <w:rPr>
+          <w:bCs/>
+          <w:b/>
+        </w:rPr>
+        <w:t xml:space="preserve">Но как такой сотрудник работает?</w:t>
       </w:r>
     </w:p>
     <w:p>
@@ -750,13 +708,13 @@
       </w:r>
     </w:p>
     <w:bookmarkEnd w:id="26"/>
-    <w:bookmarkStart w:id="27" w:name="слайд-7.-беда-2-ошибки-копятся"/>
+    <w:bookmarkStart w:id="27" w:name="слайд-7.-рабочий-день-круг"/>
     <w:p>
       <w:pPr>
         <w:pStyle w:val="Heading2"/>
       </w:pPr>
       <w:r>
-        <w:t xml:space="preserve">Слайд 7. Беда №2: ошибки копятся</w:t>
+        <w:t xml:space="preserve">Слайд 7. Рабочий день: круг</w:t>
       </w:r>
     </w:p>
     <w:p>
@@ -764,7 +722,7 @@
         <w:pStyle w:val="FirstParagraph"/>
       </w:pPr>
       <w:r>
-        <w:t xml:space="preserve">Посчитаем. Допустим, агент на каждом шаге справляется в 99 случаях из 100. Звучит прекрасно. Но дело состоит из десяти шагов. И тогда без единой ошибки доходит около 90 дел из ста. Каждое десятое идёт не так.</w:t>
+        <w:t xml:space="preserve">Рабочий день агента — это простой круг. Он получил задание. Подумал, что делать. Сделал. Записал результат. И, если дело не готово, снова по кругу.</w:t>
       </w:r>
     </w:p>
     <w:p>
@@ -772,7 +730,7 @@
         <w:pStyle w:val="BodyText"/>
       </w:pPr>
       <w:r>
-        <w:t xml:space="preserve">Что с этим делают? Два способа.</w:t>
+        <w:t xml:space="preserve">Самое неожиданное: сам этот круг — очень простая программа. В Anthropic её в шутку называют «тупым циклом». Весь ум в модели, а круг только следит за порядком: что сделано, что дальше, когда остановиться.</w:t>
       </w:r>
     </w:p>
     <w:p>
@@ -780,79 +738,17 @@
         <w:pStyle w:val="BodyText"/>
       </w:pPr>
       <w:r>
-        <w:rPr>
-          <w:bCs/>
-          <w:b/>
-        </w:rPr>
-        <w:t xml:space="preserve">Первый: самопроверка.</w:t>
-      </w:r>
-      <w:r>
-        <w:t xml:space="preserve"> </w:t>
-      </w:r>
-      <w:r>
-        <w:t xml:space="preserve">Если агент умеет проверять свою работу (прогнать тесты, посмотреть на экран или показать результат второму ИИ), качество вырастает в два-три раза. Это как корректор в издательстве.</w:t>
-      </w:r>
-    </w:p>
-    <w:p>
-      <w:pPr>
-        <w:pStyle w:val="BodyText"/>
-      </w:pPr>
-      <w:r>
-        <w:rPr>
-          <w:bCs/>
-          <w:b/>
-        </w:rPr>
-        <w:t xml:space="preserve">Второй: границы.</w:t>
-      </w:r>
-      <w:r>
-        <w:t xml:space="preserve"> </w:t>
-      </w:r>
-      <w:r>
-        <w:t xml:space="preserve">Модель решает, что</w:t>
-      </w:r>
-      <w:r>
-        <w:t xml:space="preserve"> </w:t>
-      </w:r>
-      <w:r>
-        <w:rPr>
-          <w:iCs/>
-          <w:i/>
-        </w:rPr>
-        <w:t xml:space="preserve">попробовать</w:t>
-      </w:r>
-      <w:r>
-        <w:t xml:space="preserve">, а система решает, что ей</w:t>
-      </w:r>
-      <w:r>
-        <w:t xml:space="preserve"> </w:t>
-      </w:r>
-      <w:r>
-        <w:rPr>
-          <w:iCs/>
-          <w:i/>
-        </w:rPr>
-        <w:t xml:space="preserve">разрешено</w:t>
-      </w:r>
-      <w:r>
-        <w:t xml:space="preserve">. Как в любой компании: сотрудник может читать документы, но не может удалять. В Claude Code так под отдельным контролем около сорока действий.</w:t>
-      </w:r>
-    </w:p>
-    <w:p>
-      <w:pPr>
-        <w:pStyle w:val="BodyText"/>
-      </w:pPr>
-      <w:r>
-        <w:t xml:space="preserve">Для вас это готовые аргументы продаж: надёжность и безопасность.</w:t>
-      </w:r>
-      <w:r>
-        <w:t xml:space="preserve"> </w:t>
-      </w:r>
-      <w:r>
-        <w:rPr>
-          <w:bCs/>
-          <w:b/>
-        </w:rPr>
-        <w:t xml:space="preserve">А что, если задача такая большая, что за один рабочий день её не сделать?</w:t>
+        <w:t xml:space="preserve">Клиент этого круга не видит. Он видит только итог: «агент сам довёл дело до конца». Но у такого сотрудника есть две главные беды.</w:t>
+      </w:r>
+      <w:r>
+        <w:t xml:space="preserve"> </w:t>
+      </w:r>
+      <w:r>
+        <w:rPr>
+          <w:bCs/>
+          <w:b/>
+        </w:rPr>
+        <w:t xml:space="preserve">Первая: стол, на котором он работает, слишком мал.</w:t>
       </w:r>
     </w:p>
     <w:p>
@@ -863,13 +759,13 @@
       </w:r>
     </w:p>
     <w:bookmarkEnd w:id="27"/>
-    <w:bookmarkStart w:id="28" w:name="слайд-8.-большое-дело-журнал-смены"/>
+    <w:bookmarkStart w:id="28" w:name="слайд-8.-беда-1-места-на-столе-мало"/>
     <w:p>
       <w:pPr>
         <w:pStyle w:val="Heading2"/>
       </w:pPr>
       <w:r>
-        <w:t xml:space="preserve">Слайд 8. Большое дело: журнал смены</w:t>
+        <w:t xml:space="preserve">Слайд 8. Беда №1: места на столе мало</w:t>
       </w:r>
     </w:p>
     <w:p>
@@ -877,7 +773,7 @@
         <w:pStyle w:val="FirstParagraph"/>
       </w:pPr>
       <w:r>
-        <w:t xml:space="preserve">В Anthropic придумали решение, которое знакомо каждому, кто работал сменами. В больнице люди меняются, а журнал остаётся.</w:t>
+        <w:t xml:space="preserve">У модели есть «рабочий стол»: то, что она одновременно держит в голове. И он ограничен.</w:t>
       </w:r>
     </w:p>
     <w:p>
@@ -885,33 +781,7 @@
         <w:pStyle w:val="BodyText"/>
       </w:pPr>
       <w:r>
-        <w:t xml:space="preserve">Сначала приходит</w:t>
-      </w:r>
-      <w:r>
-        <w:t xml:space="preserve"> </w:t>
-      </w:r>
-      <w:r>
-        <w:rPr>
-          <w:bCs/>
-          <w:b/>
-        </w:rPr>
-        <w:t xml:space="preserve">подготовщик</w:t>
-      </w:r>
-      <w:r>
-        <w:t xml:space="preserve">: один раз оформляет рабочее место, список задач и отчёт о прогрессе. Потом приходит</w:t>
-      </w:r>
-      <w:r>
-        <w:t xml:space="preserve"> </w:t>
-      </w:r>
-      <w:r>
-        <w:rPr>
-          <w:bCs/>
-          <w:b/>
-        </w:rPr>
-        <w:t xml:space="preserve">исполнитель</w:t>
-      </w:r>
-      <w:r>
-        <w:t xml:space="preserve">. Каждую смену он начинает с чтения журнала: что уже сделано? Берёт самую важную незавершённую задачу, делает её, сохраняет работу и пишет краткий итог. Следующий исполнитель начнёт с этой записки.</w:t>
+        <w:t xml:space="preserve">Исследователи выяснили: если важное оказывается в середине длинного текста, качество падает на 30% и больше. Это знакомо любому студенту. Начало и конец лекции вы помните, а середина проваливается.</w:t>
       </w:r>
     </w:p>
     <w:p>
@@ -919,66 +789,7 @@
         <w:pStyle w:val="BodyText"/>
       </w:pPr>
       <w:r>
-        <w:t xml:space="preserve">Благодаря этому работа не теряется между сессиями. А ещё один совет, против моды. Иногда рядом ставят целую команду агентов-помощников. Но и OpenAI, и Anthropic говорят:</w:t>
-      </w:r>
-      <w:r>
-        <w:t xml:space="preserve"> </w:t>
-      </w:r>
-      <w:r>
-        <w:rPr>
-          <w:bCs/>
-          <w:b/>
-        </w:rPr>
-        <w:t xml:space="preserve">сначала один агент.</w:t>
-      </w:r>
-      <w:r>
-        <w:t xml:space="preserve"> </w:t>
-      </w:r>
-      <w:r>
-        <w:t xml:space="preserve">Каждый помощник — это лишние расходы и риск потерять информацию при передаче дела. Не нанимайте отдел, пока один сотрудник не загружен.</w:t>
-      </w:r>
-    </w:p>
-    <w:p>
-      <w:pPr>
-        <w:pStyle w:val="BodyText"/>
-      </w:pPr>
-      <w:r>
-        <w:t xml:space="preserve">Итак, как устроен хороший ИИ-сотрудник, мы разобрали.</w:t>
-      </w:r>
-      <w:r>
-        <w:t xml:space="preserve"> </w:t>
-      </w:r>
-      <w:r>
-        <w:rPr>
-          <w:bCs/>
-          <w:b/>
-        </w:rPr>
-        <w:t xml:space="preserve">Теперь вернёмся на рынок.</w:t>
-      </w:r>
-    </w:p>
-    <w:p>
-      <w:r>
-        <w:pict>
-          <v:rect style="width:0;height:1.5pt" o:hralign="center" o:hrstd="t" o:hr="t"/>
-        </w:pict>
-      </w:r>
-    </w:p>
-    <w:bookmarkEnd w:id="28"/>
-    <w:bookmarkStart w:id="29" w:name="X5313c9b2d12a10c465acc869900fe8a9aec9b76"/>
-    <w:p>
-      <w:pPr>
-        <w:pStyle w:val="Heading2"/>
-      </w:pPr>
-      <w:r>
-        <w:t xml:space="preserve">Слайд 9. Рынок: одна модель, разные обещания</w:t>
-      </w:r>
-    </w:p>
-    <w:p>
-      <w:pPr>
-        <w:pStyle w:val="FirstParagraph"/>
-      </w:pPr>
-      <w:r>
-        <w:t xml:space="preserve">Вот пять известных продуктов, и у каждого своё «обещание».</w:t>
+        <w:t xml:space="preserve">Как с этим справляются? Как в нормальном офисе.</w:t>
       </w:r>
     </w:p>
     <w:p>
@@ -990,17 +801,20 @@
         <w:pStyle w:val="Compact"/>
       </w:pPr>
       <w:r>
-        <w:rPr>
-          <w:bCs/>
-          <w:b/>
-        </w:rPr>
-        <w:t xml:space="preserve">Claude Code</w:t>
-      </w:r>
-      <w:r>
-        <w:t xml:space="preserve"> </w:t>
-      </w:r>
-      <w:r>
-        <w:t xml:space="preserve">от Anthropic: лёгкая обвязка. Ставка на то, что модель будет умнее, поэтому лишнее убирают.</w:t>
+        <w:t xml:space="preserve">Переписку сжимают в</w:t>
+      </w:r>
+      <w:r>
+        <w:t xml:space="preserve"> </w:t>
+      </w:r>
+      <w:r>
+        <w:rPr>
+          <w:bCs/>
+          <w:b/>
+        </w:rPr>
+        <w:t xml:space="preserve">конспект</w:t>
+      </w:r>
+      <w:r>
+        <w:t xml:space="preserve">: важное остаётся, лишнее уходит.</w:t>
       </w:r>
     </w:p>
     <w:p>
@@ -1012,17 +826,20 @@
         <w:pStyle w:val="Compact"/>
       </w:pPr>
       <w:r>
-        <w:rPr>
-          <w:bCs/>
-          <w:b/>
-        </w:rPr>
-        <w:t xml:space="preserve">Codex</w:t>
-      </w:r>
-      <w:r>
-        <w:t xml:space="preserve"> </w:t>
-      </w:r>
-      <w:r>
-        <w:t xml:space="preserve">от OpenAI: одна и та же обвязка в терминале, в редакторе и в браузере.</w:t>
+        <w:t xml:space="preserve">Старые бумаги</w:t>
+      </w:r>
+      <w:r>
+        <w:t xml:space="preserve"> </w:t>
+      </w:r>
+      <w:r>
+        <w:rPr>
+          <w:bCs/>
+          <w:b/>
+        </w:rPr>
+        <w:t xml:space="preserve">убирают со стола</w:t>
+      </w:r>
+      <w:r>
+        <w:t xml:space="preserve">, но помнят, что с ними было.</w:t>
       </w:r>
     </w:p>
     <w:p>
@@ -1034,14 +851,20 @@
         <w:pStyle w:val="Compact"/>
       </w:pPr>
       <w:r>
-        <w:rPr>
-          <w:bCs/>
-          <w:b/>
-        </w:rPr>
-        <w:t xml:space="preserve">LangGraph</w:t>
-      </w:r>
-      <w:r>
-        <w:t xml:space="preserve">: работа расписана как схема, каждый шаг под контролем.</w:t>
+        <w:t xml:space="preserve">Нужный документ</w:t>
+      </w:r>
+      <w:r>
+        <w:t xml:space="preserve"> </w:t>
+      </w:r>
+      <w:r>
+        <w:rPr>
+          <w:bCs/>
+          <w:b/>
+        </w:rPr>
+        <w:t xml:space="preserve">ищут, когда он нужен</w:t>
+      </w:r>
+      <w:r>
+        <w:t xml:space="preserve">, а не читают всё подряд.</w:t>
       </w:r>
     </w:p>
     <w:p>
@@ -1053,36 +876,20 @@
         <w:pStyle w:val="Compact"/>
       </w:pPr>
       <w:r>
-        <w:rPr>
-          <w:bCs/>
-          <w:b/>
-        </w:rPr>
-        <w:t xml:space="preserve">CrewAI</w:t>
-      </w:r>
-      <w:r>
-        <w:t xml:space="preserve">: команда агентов, у каждого роль.</w:t>
-      </w:r>
-    </w:p>
-    <w:p>
-      <w:pPr>
-        <w:numPr>
-          <w:ilvl w:val="0"/>
-          <w:numId w:val="1005"/>
-        </w:numPr>
-        <w:pStyle w:val="Compact"/>
-      </w:pPr>
-      <w:r>
-        <w:rPr>
-          <w:bCs/>
-          <w:b/>
-        </w:rPr>
-        <w:t xml:space="preserve">AutoGen</w:t>
-      </w:r>
-      <w:r>
-        <w:t xml:space="preserve"> </w:t>
-      </w:r>
-      <w:r>
-        <w:t xml:space="preserve">от Microsoft: агенты решают задачу в общем «чате».</w:t>
+        <w:t xml:space="preserve">Для отдельной темы зовут</w:t>
+      </w:r>
+      <w:r>
+        <w:t xml:space="preserve"> </w:t>
+      </w:r>
+      <w:r>
+        <w:rPr>
+          <w:bCs/>
+          <w:b/>
+        </w:rPr>
+        <w:t xml:space="preserve">помощника</w:t>
+      </w:r>
+      <w:r>
+        <w:t xml:space="preserve">, который приносит короткую выжимку.</w:t>
       </w:r>
     </w:p>
     <w:p>
@@ -1090,35 +897,17 @@
         <w:pStyle w:val="FirstParagraph"/>
       </w:pPr>
       <w:r>
-        <w:t xml:space="preserve">Модель можно взять одну и ту же. А продают разный подход: «лёгкий», «контролируемый», «командный». На языке маркетинга это называется</w:t>
-      </w:r>
-      <w:r>
-        <w:t xml:space="preserve"> </w:t>
-      </w:r>
-      <w:r>
-        <w:rPr>
-          <w:bCs/>
-          <w:b/>
-        </w:rPr>
-        <w:t xml:space="preserve">позиционирование.</w:t>
-      </w:r>
-      <w:r>
-        <w:t xml:space="preserve"> </w:t>
-      </w:r>
-      <w:r>
-        <w:t xml:space="preserve">Конкурентное различие живёт в обвязке.</w:t>
-      </w:r>
-    </w:p>
-    <w:p>
-      <w:pPr>
-        <w:pStyle w:val="BodyText"/>
-      </w:pPr>
-      <w:r>
-        <w:rPr>
-          <w:bCs/>
-          <w:b/>
-        </w:rPr>
-        <w:t xml:space="preserve">Но можно ли построить хорошую обвязку один раз и успокоиться?</w:t>
+        <w:t xml:space="preserve">Клиент ощущает это так: «ИИ не тупеет к концу работы». Эту характеристику вы не увидите в названии модели. Она целиком от обвязки.</w:t>
+      </w:r>
+      <w:r>
+        <w:t xml:space="preserve"> </w:t>
+      </w:r>
+      <w:r>
+        <w:rPr>
+          <w:bCs/>
+          <w:b/>
+        </w:rPr>
+        <w:t xml:space="preserve">Беда вторая: сотрудник ошибается.</w:t>
       </w:r>
     </w:p>
     <w:p>
@@ -1128,14 +917,14 @@
         </w:pict>
       </w:r>
     </w:p>
-    <w:bookmarkEnd w:id="29"/>
-    <w:bookmarkStart w:id="30" w:name="слайд-10.-будущее-леса-убирают"/>
+    <w:bookmarkEnd w:id="28"/>
+    <w:bookmarkStart w:id="29" w:name="слайд-9.-беда-2-ошибки-копятся"/>
     <w:p>
       <w:pPr>
         <w:pStyle w:val="Heading2"/>
       </w:pPr>
       <w:r>
-        <w:t xml:space="preserve">Слайд 10. Будущее: леса убирают</w:t>
+        <w:t xml:space="preserve">Слайд 9. Беда №2: ошибки копятся</w:t>
       </w:r>
     </w:p>
     <w:p>
@@ -1143,7 +932,7 @@
         <w:pStyle w:val="FirstParagraph"/>
       </w:pPr>
       <w:r>
-        <w:t xml:space="preserve">Автор статьи использует образ строительных лесов. Они нужны, чтобы добраться до верхних этажей, но сами ничего не строят. Когда здание готово, леса убирают.</w:t>
+        <w:t xml:space="preserve">Посчитаем. Допустим, на каждом шаге ИИ не ошибается в 99 случаях из 100. Звучит прекрасно. Но дело состоит из десяти шагов. И тогда без единой ошибки доходит около 90 дел из ста. Каждое десятое идёт не так. Поэтому ошибки нужно ловить на ходу, а число повторных попыток ограничивать. В компании Stripe, например, больше двух повторов не разрешают.</w:t>
       </w:r>
     </w:p>
     <w:p>
@@ -1151,7 +940,7 @@
         <w:pStyle w:val="BodyText"/>
       </w:pPr>
       <w:r>
-        <w:t xml:space="preserve">С обвязкой то же. Модели умнеют, и обвязка должна становиться проще. Продукт Manus за полгода переделали пять раз, и каждый раз убирали лишнее. В Claude Code убирают шаги, которые модель научилась делать сама. Посмотрите на график: чем сильнее модель, тем тоньше обвязка.</w:t>
+        <w:t xml:space="preserve">Что с этим делают? Два способа.</w:t>
       </w:r>
     </w:p>
     <w:p>
@@ -1159,23 +948,79 @@
         <w:pStyle w:val="BodyText"/>
       </w:pPr>
       <w:r>
-        <w:t xml:space="preserve">Для маркетолога это предупреждение:</w:t>
-      </w:r>
-      <w:r>
-        <w:t xml:space="preserve"> </w:t>
-      </w:r>
-      <w:r>
-        <w:rPr>
-          <w:bCs/>
-          <w:b/>
-        </w:rPr>
-        <w:t xml:space="preserve">преимущество в обвязке нельзя создать один раз.</w:t>
-      </w:r>
-      <w:r>
-        <w:t xml:space="preserve"> </w:t>
-      </w:r>
-      <w:r>
-        <w:t xml:space="preserve">Его придётся пересобирать с каждой новой моделью. И теперь соберём всё вместе.</w:t>
+        <w:rPr>
+          <w:bCs/>
+          <w:b/>
+        </w:rPr>
+        <w:t xml:space="preserve">Первый: пусть сотрудник проверяет сам себя.</w:t>
+      </w:r>
+      <w:r>
+        <w:t xml:space="preserve"> </w:t>
+      </w:r>
+      <w:r>
+        <w:t xml:space="preserve">Создатель Claude Code Борис Черни говорит: если агент умеет проверить результат (прогнать тесты, посмотреть на экран или показать работу второму ИИ), качество растёт в два-три раза. Это как корректор в издательстве.</w:t>
+      </w:r>
+    </w:p>
+    <w:p>
+      <w:pPr>
+        <w:pStyle w:val="BodyText"/>
+      </w:pPr>
+      <w:r>
+        <w:rPr>
+          <w:bCs/>
+          <w:b/>
+        </w:rPr>
+        <w:t xml:space="preserve">Второй: границы.</w:t>
+      </w:r>
+      <w:r>
+        <w:t xml:space="preserve"> </w:t>
+      </w:r>
+      <w:r>
+        <w:t xml:space="preserve">Модель решает, что</w:t>
+      </w:r>
+      <w:r>
+        <w:t xml:space="preserve"> </w:t>
+      </w:r>
+      <w:r>
+        <w:rPr>
+          <w:iCs/>
+          <w:i/>
+        </w:rPr>
+        <w:t xml:space="preserve">попробовать</w:t>
+      </w:r>
+      <w:r>
+        <w:t xml:space="preserve">, а система решает, что</w:t>
+      </w:r>
+      <w:r>
+        <w:t xml:space="preserve"> </w:t>
+      </w:r>
+      <w:r>
+        <w:rPr>
+          <w:iCs/>
+          <w:i/>
+        </w:rPr>
+        <w:t xml:space="preserve">разрешить</w:t>
+      </w:r>
+      <w:r>
+        <w:t xml:space="preserve">. Как в любой компании: можно читать документы, нельзя удалять. В Claude Code так отдельно проверяют около сорока действий.</w:t>
+      </w:r>
+    </w:p>
+    <w:p>
+      <w:pPr>
+        <w:pStyle w:val="BodyText"/>
+      </w:pPr>
+      <w:r>
+        <w:t xml:space="preserve">Это готовые аргументы продаж: надёжность и безопасность.</w:t>
+      </w:r>
+      <w:r>
+        <w:t xml:space="preserve"> </w:t>
+      </w:r>
+      <w:r>
+        <w:rPr>
+          <w:bCs/>
+          <w:b/>
+        </w:rPr>
+        <w:t xml:space="preserve">А что, если дело настолько большое, что за один рабочий день его не сделать?</w:t>
       </w:r>
     </w:p>
     <w:p>
@@ -1185,14 +1030,91 @@
         </w:pict>
       </w:r>
     </w:p>
+    <w:bookmarkEnd w:id="29"/>
+    <w:bookmarkStart w:id="30" w:name="слайд-10.-большое-дело-журнал-смены"/>
+    <w:p>
+      <w:pPr>
+        <w:pStyle w:val="Heading2"/>
+      </w:pPr>
+      <w:r>
+        <w:t xml:space="preserve">Слайд 10. Большое дело: журнал смены</w:t>
+      </w:r>
+    </w:p>
+    <w:p>
+      <w:pPr>
+        <w:pStyle w:val="FirstParagraph"/>
+      </w:pPr>
+      <w:r>
+        <w:t xml:space="preserve">В Anthropic придумали решение, знакомое каждому, кто работал сменами. В больнице люди меняются, а журнал остаётся.</w:t>
+      </w:r>
+    </w:p>
+    <w:p>
+      <w:pPr>
+        <w:pStyle w:val="BodyText"/>
+      </w:pPr>
+      <w:r>
+        <w:t xml:space="preserve">Сначала приходит</w:t>
+      </w:r>
+      <w:r>
+        <w:t xml:space="preserve"> </w:t>
+      </w:r>
+      <w:r>
+        <w:rPr>
+          <w:bCs/>
+          <w:b/>
+        </w:rPr>
+        <w:t xml:space="preserve">подготовщик</w:t>
+      </w:r>
+      <w:r>
+        <w:t xml:space="preserve">. Он один раз готовит рабочее место, составляет список задач, заводит отчёт и делает первое сохранение работы. Потом каждую смену приходит</w:t>
+      </w:r>
+      <w:r>
+        <w:t xml:space="preserve"> </w:t>
+      </w:r>
+      <w:r>
+        <w:rPr>
+          <w:bCs/>
+          <w:b/>
+        </w:rPr>
+        <w:t xml:space="preserve">исполнитель</w:t>
+      </w:r>
+      <w:r>
+        <w:t xml:space="preserve">. Он читает журнал и вспоминает, что уже сделано. Берёт самую важную задачу, выполняет её и записывает итог для следующей смены.</w:t>
+      </w:r>
+    </w:p>
+    <w:p>
+      <w:pPr>
+        <w:pStyle w:val="BodyText"/>
+      </w:pPr>
+      <w:r>
+        <w:t xml:space="preserve">Благодаря этому большое дело можно делать частями, и ничего не теряется. Для клиента это значит: непрерывность работы.</w:t>
+      </w:r>
+      <w:r>
+        <w:t xml:space="preserve"> </w:t>
+      </w:r>
+      <w:r>
+        <w:rPr>
+          <w:bCs/>
+          <w:b/>
+        </w:rPr>
+        <w:t xml:space="preserve">А что, если сотрудников нужно несколько?</w:t>
+      </w:r>
+    </w:p>
+    <w:p>
+      <w:r>
+        <w:pict>
+          <v:rect style="width:0;height:1.5pt" o:hralign="center" o:hrstd="t" o:hr="t"/>
+        </w:pict>
+      </w:r>
+    </w:p>
     <w:bookmarkEnd w:id="30"/>
-    <w:bookmarkStart w:id="31" w:name="X5514863fbb24c11076a4077ed51196b56b237eb"/>
+    <w:bookmarkStart w:id="31" w:name="слайд-11.-как-сотрудники-делят-работу"/>
     <w:p>
       <w:pPr>
         <w:pStyle w:val="Heading2"/>
       </w:pPr>
       <w:r>
-        <w:t xml:space="preserve">Слайд 11. Вывод: модель — товар, обвязка — продукт</w:t>
+        <w:t xml:space="preserve">Слайд 11. Как сотрудники делят работу</w:t>
       </w:r>
     </w:p>
     <w:p>
@@ -1200,7 +1122,74 @@
         <w:pStyle w:val="FirstParagraph"/>
       </w:pPr>
       <w:r>
-        <w:t xml:space="preserve">Вернёмся к директору, который выбирал ИИ-помощника. Что мы выяснили?</w:t>
+        <w:t xml:space="preserve">Иногда главному агенту помогают другие. Посмотрите на слайд. В Claude Code это три способа: помощник получает копию всего, что знает главный; или работает как отдельный коллега и общается записками; или трудится в своей копии проекта и никому не мешает. У OpenAI два способа: специалист решает узкую задачу и возвращает результат, либо полностью берёт задачу на себя. А в LangGraph помощники — это маленькие схемы внутри большой.</w:t>
+      </w:r>
+    </w:p>
+    <w:p>
+      <w:pPr>
+        <w:pStyle w:val="BodyText"/>
+      </w:pPr>
+      <w:r>
+        <w:t xml:space="preserve">Главное в этом слайде внизу, и это совет против моды:</w:t>
+      </w:r>
+      <w:r>
+        <w:t xml:space="preserve"> </w:t>
+      </w:r>
+      <w:r>
+        <w:rPr>
+          <w:bCs/>
+          <w:b/>
+        </w:rPr>
+        <w:t xml:space="preserve">сначала один сотрудник.</w:t>
+      </w:r>
+      <w:r>
+        <w:t xml:space="preserve"> </w:t>
+      </w:r>
+      <w:r>
+        <w:t xml:space="preserve">И Anthropic, и OpenAI советуют выжать максимум из одного агента. Каждый новый помощник — это расходы и риск потерять часть информации при передаче дела. Не нанимайте целый отдел, пока один сотрудник не загружен.</w:t>
+      </w:r>
+    </w:p>
+    <w:p>
+      <w:pPr>
+        <w:pStyle w:val="BodyText"/>
+      </w:pPr>
+      <w:r>
+        <w:t xml:space="preserve">Теперь мы знаем, как устроен хороший ИИ-сотрудник.</w:t>
+      </w:r>
+      <w:r>
+        <w:t xml:space="preserve"> </w:t>
+      </w:r>
+      <w:r>
+        <w:rPr>
+          <w:bCs/>
+          <w:b/>
+        </w:rPr>
+        <w:t xml:space="preserve">Давайте посмотрим на рынок.</w:t>
+      </w:r>
+    </w:p>
+    <w:p>
+      <w:r>
+        <w:pict>
+          <v:rect style="width:0;height:1.5pt" o:hralign="center" o:hrstd="t" o:hr="t"/>
+        </w:pict>
+      </w:r>
+    </w:p>
+    <w:bookmarkEnd w:id="31"/>
+    <w:bookmarkStart w:id="32" w:name="X65fb9b3cb2661b6842224564d3ff36ecc1efefb"/>
+    <w:p>
+      <w:pPr>
+        <w:pStyle w:val="Heading2"/>
+      </w:pPr>
+      <w:r>
+        <w:t xml:space="preserve">Слайд 12. Рынок: одна модель, разные обещания</w:t>
+      </w:r>
+    </w:p>
+    <w:p>
+      <w:pPr>
+        <w:pStyle w:val="FirstParagraph"/>
+      </w:pPr>
+      <w:r>
+        <w:t xml:space="preserve">Вот пять известных продуктов, и у каждого своё «обещание».</w:t>
       </w:r>
     </w:p>
     <w:p>
@@ -1212,20 +1201,17 @@
         <w:pStyle w:val="Compact"/>
       </w:pPr>
       <w:r>
-        <w:t xml:space="preserve">Модели доступны всем. Это почти</w:t>
-      </w:r>
-      <w:r>
-        <w:t xml:space="preserve"> </w:t>
-      </w:r>
-      <w:r>
-        <w:rPr>
-          <w:iCs/>
-          <w:i/>
-        </w:rPr>
-        <w:t xml:space="preserve">товар</w:t>
-      </w:r>
-      <w:r>
-        <w:t xml:space="preserve">, как мука.</w:t>
+        <w:rPr>
+          <w:bCs/>
+          <w:b/>
+        </w:rPr>
+        <w:t xml:space="preserve">Claude Code</w:t>
+      </w:r>
+      <w:r>
+        <w:t xml:space="preserve"> </w:t>
+      </w:r>
+      <w:r>
+        <w:t xml:space="preserve">от Anthropic: лёгкая обвязка. Ставка на то, что модель станет умнее, поэтому лишние шаги убирают.</w:t>
       </w:r>
     </w:p>
     <w:p>
@@ -1237,7 +1223,17 @@
         <w:pStyle w:val="Compact"/>
       </w:pPr>
       <w:r>
-        <w:t xml:space="preserve">Поэтому отличие уходит в обвязку: на одной модели продукты работают по-разному.</w:t>
+        <w:rPr>
+          <w:bCs/>
+          <w:b/>
+        </w:rPr>
+        <w:t xml:space="preserve">Codex</w:t>
+      </w:r>
+      <w:r>
+        <w:t xml:space="preserve"> </w:t>
+      </w:r>
+      <w:r>
+        <w:t xml:space="preserve">от OpenAI: одна и та же обвязка работает в терминале, в редакторе и в браузере.</w:t>
       </w:r>
     </w:p>
     <w:p>
@@ -1249,7 +1245,58 @@
         <w:pStyle w:val="Compact"/>
       </w:pPr>
       <w:r>
-        <w:t xml:space="preserve">Обвязку трудно скопировать. В ней опыт и ошибки команды. Это и есть преимущество.</w:t>
+        <w:rPr>
+          <w:bCs/>
+          <w:b/>
+        </w:rPr>
+        <w:t xml:space="preserve">LangGraph</w:t>
+      </w:r>
+      <w:r>
+        <w:t xml:space="preserve"> </w:t>
+      </w:r>
+      <w:r>
+        <w:t xml:space="preserve">от LangChain: работа расписана как схема, каждый шаг под контролем.</w:t>
+      </w:r>
+    </w:p>
+    <w:p>
+      <w:pPr>
+        <w:numPr>
+          <w:ilvl w:val="0"/>
+          <w:numId w:val="1006"/>
+        </w:numPr>
+        <w:pStyle w:val="Compact"/>
+      </w:pPr>
+      <w:r>
+        <w:rPr>
+          <w:bCs/>
+          <w:b/>
+        </w:rPr>
+        <w:t xml:space="preserve">CrewAI</w:t>
+      </w:r>
+      <w:r>
+        <w:t xml:space="preserve">: команда агентов, у каждого своя роль.</w:t>
+      </w:r>
+    </w:p>
+    <w:p>
+      <w:pPr>
+        <w:numPr>
+          <w:ilvl w:val="0"/>
+          <w:numId w:val="1006"/>
+        </w:numPr>
+        <w:pStyle w:val="Compact"/>
+      </w:pPr>
+      <w:r>
+        <w:rPr>
+          <w:bCs/>
+          <w:b/>
+        </w:rPr>
+        <w:t xml:space="preserve">AutoGen</w:t>
+      </w:r>
+      <w:r>
+        <w:t xml:space="preserve"> </w:t>
+      </w:r>
+      <w:r>
+        <w:t xml:space="preserve">от Microsoft: агенты решают задачу вместе, как в общем чате.</w:t>
       </w:r>
     </w:p>
     <w:p>
@@ -1257,7 +1304,115 @@
         <w:pStyle w:val="FirstParagraph"/>
       </w:pPr>
       <w:r>
-        <w:t xml:space="preserve">Теперь у вас есть практический инструмент: четыре вопроса любому ИИ-продукту.</w:t>
+        <w:t xml:space="preserve">Модель можно взять одну и ту же. А продают разный подход: «лёгкий», «контролируемый», «командный». На языке маркетинга это</w:t>
+      </w:r>
+      <w:r>
+        <w:t xml:space="preserve"> </w:t>
+      </w:r>
+      <w:r>
+        <w:rPr>
+          <w:bCs/>
+          <w:b/>
+        </w:rPr>
+        <w:t xml:space="preserve">позиционирование.</w:t>
+      </w:r>
+      <w:r>
+        <w:t xml:space="preserve"> </w:t>
+      </w:r>
+      <w:r>
+        <w:t xml:space="preserve">Конкурентное различие живёт в обвязке.</w:t>
+      </w:r>
+      <w:r>
+        <w:t xml:space="preserve"> </w:t>
+      </w:r>
+      <w:r>
+        <w:rPr>
+          <w:bCs/>
+          <w:b/>
+        </w:rPr>
+        <w:t xml:space="preserve">Но можно ли построить хорошую обвязку один раз и успокоиться?</w:t>
+      </w:r>
+    </w:p>
+    <w:p>
+      <w:r>
+        <w:pict>
+          <v:rect style="width:0;height:1.5pt" o:hralign="center" o:hrstd="t" o:hr="t"/>
+        </w:pict>
+      </w:r>
+    </w:p>
+    <w:bookmarkEnd w:id="32"/>
+    <w:bookmarkStart w:id="33" w:name="слайд-13.-будущее-леса-убирают"/>
+    <w:p>
+      <w:pPr>
+        <w:pStyle w:val="Heading2"/>
+      </w:pPr>
+      <w:r>
+        <w:t xml:space="preserve">Слайд 13. Будущее: леса убирают</w:t>
+      </w:r>
+    </w:p>
+    <w:p>
+      <w:pPr>
+        <w:pStyle w:val="FirstParagraph"/>
+      </w:pPr>
+      <w:r>
+        <w:t xml:space="preserve">Автор статьи использует образ строительных лесов. Они нужны, чтобы добраться до верхних этажей, но сами ничего не строят. Когда здание готово, леса убирают.</w:t>
+      </w:r>
+    </w:p>
+    <w:p>
+      <w:pPr>
+        <w:pStyle w:val="BodyText"/>
+      </w:pPr>
+      <w:r>
+        <w:t xml:space="preserve">С обвязкой то же. Модели умнеют, и обвязка должна становиться проще. Продукт Manus за полгода переделывали пять раз, и каждый раз убирали лишнее. В Claude Code убирают шаги, которые модель научилась делать сама. На графике видно: чем сильнее модель, тем тоньше нужна обвязка. Это схема по смыслу статьи, без точных цифр, я специально это подписал.</w:t>
+      </w:r>
+    </w:p>
+    <w:p>
+      <w:pPr>
+        <w:pStyle w:val="BodyText"/>
+      </w:pPr>
+      <w:r>
+        <w:t xml:space="preserve">Предупреждение для маркетолога:</w:t>
+      </w:r>
+      <w:r>
+        <w:t xml:space="preserve"> </w:t>
+      </w:r>
+      <w:r>
+        <w:rPr>
+          <w:bCs/>
+          <w:b/>
+        </w:rPr>
+        <w:t xml:space="preserve">преимущество в обвязке нельзя создать один раз.</w:t>
+      </w:r>
+      <w:r>
+        <w:t xml:space="preserve"> </w:t>
+      </w:r>
+      <w:r>
+        <w:t xml:space="preserve">Его придётся пересобирать с каждой новой моделью. А теперь соберём всё вместе.</w:t>
+      </w:r>
+    </w:p>
+    <w:p>
+      <w:r>
+        <w:pict>
+          <v:rect style="width:0;height:1.5pt" o:hralign="center" o:hrstd="t" o:hr="t"/>
+        </w:pict>
+      </w:r>
+    </w:p>
+    <w:bookmarkEnd w:id="33"/>
+    <w:bookmarkStart w:id="34" w:name="X80a4a4adefed9ddc8503e3981517a5ef38c894a"/>
+    <w:p>
+      <w:pPr>
+        <w:pStyle w:val="Heading2"/>
+      </w:pPr>
+      <w:r>
+        <w:t xml:space="preserve">Слайд 14. Вывод: модель — товар, обвязка — продукт</w:t>
+      </w:r>
+    </w:p>
+    <w:p>
+      <w:pPr>
+        <w:pStyle w:val="FirstParagraph"/>
+      </w:pPr>
+      <w:r>
+        <w:t xml:space="preserve">Вернёмся к директору, который выбирал ИИ-помощника. Что мы выяснили?</w:t>
       </w:r>
     </w:p>
     <w:p>
@@ -1269,23 +1424,20 @@
         <w:pStyle w:val="Compact"/>
       </w:pPr>
       <w:r>
-        <w:t xml:space="preserve">Что он</w:t>
-      </w:r>
-      <w:r>
-        <w:t xml:space="preserve"> </w:t>
-      </w:r>
-      <w:r>
-        <w:rPr>
-          <w:bCs/>
-          <w:b/>
-        </w:rPr>
-        <w:t xml:space="preserve">помнит</w:t>
-      </w:r>
-      <w:r>
-        <w:t xml:space="preserve"> </w:t>
-      </w:r>
-      <w:r>
-        <w:t xml:space="preserve">между сессиями?</w:t>
+        <w:t xml:space="preserve">Модели доступны всем. Это почти</w:t>
+      </w:r>
+      <w:r>
+        <w:t xml:space="preserve"> </w:t>
+      </w:r>
+      <w:r>
+        <w:rPr>
+          <w:iCs/>
+          <w:i/>
+        </w:rPr>
+        <w:t xml:space="preserve">товар</w:t>
+      </w:r>
+      <w:r>
+        <w:t xml:space="preserve">, как мука.</w:t>
       </w:r>
     </w:p>
     <w:p>
@@ -1297,23 +1449,7 @@
         <w:pStyle w:val="Compact"/>
       </w:pPr>
       <w:r>
-        <w:t xml:space="preserve">Как</w:t>
-      </w:r>
-      <w:r>
-        <w:t xml:space="preserve"> </w:t>
-      </w:r>
-      <w:r>
-        <w:rPr>
-          <w:bCs/>
-          <w:b/>
-        </w:rPr>
-        <w:t xml:space="preserve">проверяет</w:t>
-      </w:r>
-      <w:r>
-        <w:t xml:space="preserve"> </w:t>
-      </w:r>
-      <w:r>
-        <w:t xml:space="preserve">свою работу?</w:t>
+        <w:t xml:space="preserve">Поэтому отличие уходит в обвязку: на одной и той же модели продукты работают по-разному.</w:t>
       </w:r>
     </w:p>
     <w:p>
@@ -1325,34 +1461,110 @@
         <w:pStyle w:val="Compact"/>
       </w:pPr>
       <w:r>
-        <w:t xml:space="preserve">Что ему</w:t>
-      </w:r>
-      <w:r>
-        <w:t xml:space="preserve"> </w:t>
-      </w:r>
-      <w:r>
-        <w:rPr>
-          <w:bCs/>
-          <w:b/>
-        </w:rPr>
-        <w:t xml:space="preserve">разрешено</w:t>
-      </w:r>
-      <w:r>
-        <w:t xml:space="preserve"> </w:t>
-      </w:r>
-      <w:r>
-        <w:t xml:space="preserve">без человека?</w:t>
+        <w:t xml:space="preserve">Обвязку трудно скопировать, в ней опыт и ошибки команды. Это и есть преимущество.</w:t>
+      </w:r>
+    </w:p>
+    <w:p>
+      <w:pPr>
+        <w:pStyle w:val="FirstParagraph"/>
+      </w:pPr>
+      <w:r>
+        <w:t xml:space="preserve">И у вас теперь есть практический инструмент: четыре вопроса любому ИИ-продукту.</w:t>
       </w:r>
     </w:p>
     <w:p>
       <w:pPr>
         <w:numPr>
           <w:ilvl w:val="0"/>
-          <w:numId w:val="1007"/>
+          <w:numId w:val="1008"/>
         </w:numPr>
         <w:pStyle w:val="Compact"/>
       </w:pPr>
       <w:r>
+        <w:t xml:space="preserve">Что он</w:t>
+      </w:r>
+      <w:r>
+        <w:t xml:space="preserve"> </w:t>
+      </w:r>
+      <w:r>
+        <w:rPr>
+          <w:bCs/>
+          <w:b/>
+        </w:rPr>
+        <w:t xml:space="preserve">помнит</w:t>
+      </w:r>
+      <w:r>
+        <w:t xml:space="preserve"> </w:t>
+      </w:r>
+      <w:r>
+        <w:t xml:space="preserve">между сессиями?</w:t>
+      </w:r>
+    </w:p>
+    <w:p>
+      <w:pPr>
+        <w:numPr>
+          <w:ilvl w:val="0"/>
+          <w:numId w:val="1008"/>
+        </w:numPr>
+        <w:pStyle w:val="Compact"/>
+      </w:pPr>
+      <w:r>
+        <w:t xml:space="preserve">Как</w:t>
+      </w:r>
+      <w:r>
+        <w:t xml:space="preserve"> </w:t>
+      </w:r>
+      <w:r>
+        <w:rPr>
+          <w:bCs/>
+          <w:b/>
+        </w:rPr>
+        <w:t xml:space="preserve">проверяет</w:t>
+      </w:r>
+      <w:r>
+        <w:t xml:space="preserve"> </w:t>
+      </w:r>
+      <w:r>
+        <w:t xml:space="preserve">свою работу?</w:t>
+      </w:r>
+    </w:p>
+    <w:p>
+      <w:pPr>
+        <w:numPr>
+          <w:ilvl w:val="0"/>
+          <w:numId w:val="1008"/>
+        </w:numPr>
+        <w:pStyle w:val="Compact"/>
+      </w:pPr>
+      <w:r>
+        <w:t xml:space="preserve">Что ему</w:t>
+      </w:r>
+      <w:r>
+        <w:t xml:space="preserve"> </w:t>
+      </w:r>
+      <w:r>
+        <w:rPr>
+          <w:bCs/>
+          <w:b/>
+        </w:rPr>
+        <w:t xml:space="preserve">разрешено</w:t>
+      </w:r>
+      <w:r>
+        <w:t xml:space="preserve"> </w:t>
+      </w:r>
+      <w:r>
+        <w:t xml:space="preserve">без человека?</w:t>
+      </w:r>
+    </w:p>
+    <w:p>
+      <w:pPr>
+        <w:numPr>
+          <w:ilvl w:val="0"/>
+          <w:numId w:val="1008"/>
+        </w:numPr>
+        <w:pStyle w:val="Compact"/>
+      </w:pPr>
+      <w:r>
         <w:t xml:space="preserve">Что делает, когда</w:t>
       </w:r>
       <w:r>
@@ -1374,7 +1586,7 @@
         <w:pStyle w:val="FirstParagraph"/>
       </w:pPr>
       <w:r>
-        <w:t xml:space="preserve">Если продавец уверенно отвечает, за красивой моделью стоит продуманная обвязка. Известная маркетинговая фраза говорит: людям нужна не дрель, а дырка в стене. Так и тут: клиенту продают не «доступ к ИИ», а</w:t>
+        <w:t xml:space="preserve">Если продавец уверенно отвечает, за красивой моделью стоит продуманная обвязка. Известная маркетинговая фраза говорит: людям нужна не дрель, а дырка в стене. Так и здесь: клиенту продают не «доступ к ИИ», а</w:t>
       </w:r>
       <w:r>
         <w:t xml:space="preserve"> </w:t>
@@ -1394,14 +1606,14 @@
         </w:pict>
       </w:r>
     </w:p>
-    <w:bookmarkEnd w:id="31"/>
-    <w:bookmarkStart w:id="32" w:name="слайд-12.-спасибо"/>
+    <w:bookmarkEnd w:id="34"/>
+    <w:bookmarkStart w:id="35" w:name="слайд-15.-спасибо"/>
     <w:p>
       <w:pPr>
         <w:pStyle w:val="Heading2"/>
       </w:pPr>
       <w:r>
-        <w:t xml:space="preserve">Слайд 12. Спасибо</w:t>
+        <w:t xml:space="preserve">Слайд 15. Спасибо</w:t>
       </w:r>
     </w:p>
     <w:p>
@@ -1427,7 +1639,7 @@
         <w:pStyle w:val="BodyText"/>
       </w:pPr>
       <w:r>
-        <w:t xml:space="preserve">Спасибо! Буду рад вопросам.</w:t>
+        <w:t xml:space="preserve">Спасибо за внимание! Буду рад вопросам.</w:t>
       </w:r>
     </w:p>
     <w:p>
@@ -1437,9 +1649,9 @@
         </w:pict>
       </w:r>
     </w:p>
-    <w:bookmarkEnd w:id="32"/>
-    <w:bookmarkEnd w:id="33"/>
-    <w:bookmarkStart w:id="37" w:name="приложение"/>
+    <w:bookmarkEnd w:id="35"/>
+    <w:bookmarkEnd w:id="36"/>
+    <w:bookmarkStart w:id="40" w:name="приложение"/>
     <w:p>
       <w:pPr>
         <w:pStyle w:val="Heading1"/>
@@ -1448,7 +1660,7 @@
         <w:t xml:space="preserve">Приложение</w:t>
       </w:r>
     </w:p>
-    <w:bookmarkStart w:id="34" w:name="если-спросят"/>
+    <w:bookmarkStart w:id="37" w:name="если-спросят"/>
     <w:p>
       <w:pPr>
         <w:pStyle w:val="Heading2"/>
@@ -1544,11 +1756,29 @@
         <w:t xml:space="preserve"> </w:t>
       </w:r>
       <w:r>
-        <w:t xml:space="preserve">Из статьи Akshay «Что такое Harness?» (перевод на Хабре). Это обзор публичных материалов Anthropic, OpenAI, LangChain и других. Часть чисел (например, «2–3 раза» или «76,4%») — заявления самих компаний и авторов, независимо я их не проверял.</w:t>
-      </w:r>
-    </w:p>
-    <w:bookmarkEnd w:id="34"/>
-    <w:bookmarkStart w:id="35" w:name="мини-словарик"/>
+        <w:t xml:space="preserve">Из статьи Akshay «Что такое Harness?» (перевод на Хабре). Это обзор публичных материалов Anthropic, OpenAI, LangChain и других. Часть чисел («2–3 раза», 76,4%) — заявления самих компаний и авторов, независимо я их не проверял.</w:t>
+      </w:r>
+    </w:p>
+    <w:p>
+      <w:pPr>
+        <w:pStyle w:val="BodyText"/>
+      </w:pPr>
+      <w:r>
+        <w:rPr>
+          <w:bCs/>
+          <w:b/>
+        </w:rPr>
+        <w:t xml:space="preserve">Это точная классификация — четыре характеристики?</w:t>
+      </w:r>
+      <w:r>
+        <w:t xml:space="preserve"> </w:t>
+      </w:r>
+      <w:r>
+        <w:t xml:space="preserve">Нет, это моё упрощение. В статье перечислено одиннадцать технических компонентов (заявлено двенадцать). Четыре группы удобны для объяснения и для карточки сравнения.</w:t>
+      </w:r>
+    </w:p>
+    <w:bookmarkEnd w:id="37"/>
+    <w:bookmarkStart w:id="38" w:name="мини-словарик"/>
     <w:p>
       <w:pPr>
         <w:pStyle w:val="Heading2"/>
@@ -1684,7 +1914,7 @@
               <w:jc w:val="left"/>
             </w:pPr>
             <w:r>
-              <w:t xml:space="preserve">Контекст</w:t>
+              <w:t xml:space="preserve">Промпт</w:t>
             </w:r>
           </w:p>
         </w:tc>
@@ -1696,7 +1926,7 @@
               <w:jc w:val="left"/>
             </w:pPr>
             <w:r>
-              <w:t xml:space="preserve">Всё, что модель «видит» прямо сейчас; места ограниченно</w:t>
+              <w:t xml:space="preserve">Формулировка задачи для модели</w:t>
             </w:r>
           </w:p>
         </w:tc>
@@ -1710,7 +1940,7 @@
               <w:jc w:val="left"/>
             </w:pPr>
             <w:r>
-              <w:t xml:space="preserve">Инструмент</w:t>
+              <w:t xml:space="preserve">Контекст</w:t>
             </w:r>
           </w:p>
         </w:tc>
@@ -1722,14 +1952,14 @@
               <w:jc w:val="left"/>
             </w:pPr>
             <w:r>
-              <w:t xml:space="preserve">Действие, которое агенту разрешено: открыть файл, найти в интернете</w:t>
+              <w:t xml:space="preserve">Всё, что модель «видит» прямо сейчас; места ограничено</w:t>
             </w:r>
           </w:p>
         </w:tc>
       </w:tr>
     </w:tbl>
-    <w:bookmarkEnd w:id="35"/>
-    <w:bookmarkStart w:id="36" w:name="как-выступать"/>
+    <w:bookmarkEnd w:id="38"/>
+    <w:bookmarkStart w:id="39" w:name="как-выступать"/>
     <w:p>
       <w:pPr>
         <w:pStyle w:val="Heading2"/>
@@ -1742,31 +1972,31 @@
       <w:pPr>
         <w:numPr>
           <w:ilvl w:val="0"/>
-          <w:numId w:val="1008"/>
+          <w:numId w:val="1009"/>
         </w:numPr>
         <w:pStyle w:val="Compact"/>
       </w:pPr>
       <w:r>
-        <w:t xml:space="preserve">Не читайте слайды: на них короткие фразы, а смысл в ваших словах.</w:t>
+        <w:t xml:space="preserve">Не читайте слайды: на них короткие фразы, смысл — в ваших словах.</w:t>
       </w:r>
     </w:p>
     <w:p>
       <w:pPr>
         <w:numPr>
           <w:ilvl w:val="0"/>
-          <w:numId w:val="1008"/>
+          <w:numId w:val="1009"/>
         </w:numPr>
         <w:pStyle w:val="Compact"/>
       </w:pPr>
       <w:r>
-        <w:t xml:space="preserve">Вопросы-связки (жирные) произносите вслух и делайте паузу. Они держат внимание.</w:t>
+        <w:t xml:space="preserve">Вопросы-связки (жирные) произносите вслух и делайте паузу.</w:t>
       </w:r>
     </w:p>
     <w:p>
       <w:pPr>
         <w:numPr>
           <w:ilvl w:val="0"/>
-          <w:numId w:val="1008"/>
+          <w:numId w:val="1009"/>
         </w:numPr>
         <w:pStyle w:val="Compact"/>
       </w:pPr>
@@ -1778,19 +2008,19 @@
       <w:pPr>
         <w:numPr>
           <w:ilvl w:val="0"/>
-          <w:numId w:val="1008"/>
+          <w:numId w:val="1009"/>
         </w:numPr>
         <w:pStyle w:val="Compact"/>
       </w:pPr>
       <w:r>
-        <w:t xml:space="preserve">Если не хватает времени, слайд 8 можно рассказать за 30 секунд.</w:t>
+        <w:t xml:space="preserve">Если не хватает времени, слайды 10 и 11 рассказывайте за 30 секунд каждый.</w:t>
       </w:r>
     </w:p>
     <w:p>
       <w:pPr>
         <w:numPr>
           <w:ilvl w:val="0"/>
-          <w:numId w:val="1008"/>
+          <w:numId w:val="1009"/>
         </w:numPr>
         <w:pStyle w:val="Compact"/>
       </w:pPr>
@@ -1798,8 +2028,8 @@
         <w:t xml:space="preserve">Источники фото и логотипов указаны на последнем слайде.</w:t>
       </w:r>
     </w:p>
-    <w:bookmarkEnd w:id="36"/>
-    <w:bookmarkEnd w:id="37"/>
+    <w:bookmarkEnd w:id="39"/>
+    <w:bookmarkEnd w:id="40"/>
     <w:sectPr/>
   </w:body>
 </w:document>
@@ -2107,45 +2337,102 @@
     </w:lvlOverride>
   </w:num>
   <w:num w:numId="1004">
+    <w:abstractNumId w:val="99411"/>
+    <w:lvlOverride w:ilvl="0">
+      <w:startOverride w:val="1"/>
+    </w:lvlOverride>
+    <w:lvlOverride w:ilvl="1">
+      <w:startOverride w:val="1"/>
+    </w:lvlOverride>
+    <w:lvlOverride w:ilvl="2">
+      <w:startOverride w:val="1"/>
+    </w:lvlOverride>
+    <w:lvlOverride w:ilvl="3">
+      <w:startOverride w:val="1"/>
+    </w:lvlOverride>
+    <w:lvlOverride w:ilvl="4">
+      <w:startOverride w:val="1"/>
+    </w:lvlOverride>
+    <w:lvlOverride w:ilvl="5">
+      <w:startOverride w:val="1"/>
+    </w:lvlOverride>
+    <w:lvlOverride w:ilvl="6">
+      <w:startOverride w:val="1"/>
+    </w:lvlOverride>
+    <w:lvlOverride w:ilvl="7">
+      <w:startOverride w:val="1"/>
+    </w:lvlOverride>
+    <w:lvlOverride w:ilvl="8">
+      <w:startOverride w:val="1"/>
+    </w:lvlOverride>
+  </w:num>
+  <w:num w:numId="1005">
+    <w:abstractNumId w:val="99411"/>
+    <w:lvlOverride w:ilvl="0">
+      <w:startOverride w:val="1"/>
+    </w:lvlOverride>
+    <w:lvlOverride w:ilvl="1">
+      <w:startOverride w:val="1"/>
+    </w:lvlOverride>
+    <w:lvlOverride w:ilvl="2">
+      <w:startOverride w:val="1"/>
+    </w:lvlOverride>
+    <w:lvlOverride w:ilvl="3">
+      <w:startOverride w:val="1"/>
+    </w:lvlOverride>
+    <w:lvlOverride w:ilvl="4">
+      <w:startOverride w:val="1"/>
+    </w:lvlOverride>
+    <w:lvlOverride w:ilvl="5">
+      <w:startOverride w:val="1"/>
+    </w:lvlOverride>
+    <w:lvlOverride w:ilvl="6">
+      <w:startOverride w:val="1"/>
+    </w:lvlOverride>
+    <w:lvlOverride w:ilvl="7">
+      <w:startOverride w:val="1"/>
+    </w:lvlOverride>
+    <w:lvlOverride w:ilvl="8">
+      <w:startOverride w:val="1"/>
+    </w:lvlOverride>
+  </w:num>
+  <w:num w:numId="1006">
     <w:abstractNumId w:val="991"/>
   </w:num>
-  <w:num w:numId="1005">
+  <w:num w:numId="1007">
+    <w:abstractNumId w:val="99411"/>
+    <w:lvlOverride w:ilvl="0">
+      <w:startOverride w:val="1"/>
+    </w:lvlOverride>
+    <w:lvlOverride w:ilvl="1">
+      <w:startOverride w:val="1"/>
+    </w:lvlOverride>
+    <w:lvlOverride w:ilvl="2">
+      <w:startOverride w:val="1"/>
+    </w:lvlOverride>
+    <w:lvlOverride w:ilvl="3">
+      <w:startOverride w:val="1"/>
+    </w:lvlOverride>
+    <w:lvlOverride w:ilvl="4">
+      <w:startOverride w:val="1"/>
+    </w:lvlOverride>
+    <w:lvlOverride w:ilvl="5">
+      <w:startOverride w:val="1"/>
+    </w:lvlOverride>
+    <w:lvlOverride w:ilvl="6">
+      <w:startOverride w:val="1"/>
+    </w:lvlOverride>
+    <w:lvlOverride w:ilvl="7">
+      <w:startOverride w:val="1"/>
+    </w:lvlOverride>
+    <w:lvlOverride w:ilvl="8">
+      <w:startOverride w:val="1"/>
+    </w:lvlOverride>
+  </w:num>
+  <w:num w:numId="1008">
     <w:abstractNumId w:val="991"/>
   </w:num>
-  <w:num w:numId="1006">
-    <w:abstractNumId w:val="99411"/>
-    <w:lvlOverride w:ilvl="0">
-      <w:startOverride w:val="1"/>
-    </w:lvlOverride>
-    <w:lvlOverride w:ilvl="1">
-      <w:startOverride w:val="1"/>
-    </w:lvlOverride>
-    <w:lvlOverride w:ilvl="2">
-      <w:startOverride w:val="1"/>
-    </w:lvlOverride>
-    <w:lvlOverride w:ilvl="3">
-      <w:startOverride w:val="1"/>
-    </w:lvlOverride>
-    <w:lvlOverride w:ilvl="4">
-      <w:startOverride w:val="1"/>
-    </w:lvlOverride>
-    <w:lvlOverride w:ilvl="5">
-      <w:startOverride w:val="1"/>
-    </w:lvlOverride>
-    <w:lvlOverride w:ilvl="6">
-      <w:startOverride w:val="1"/>
-    </w:lvlOverride>
-    <w:lvlOverride w:ilvl="7">
-      <w:startOverride w:val="1"/>
-    </w:lvlOverride>
-    <w:lvlOverride w:ilvl="8">
-      <w:startOverride w:val="1"/>
-    </w:lvlOverride>
-  </w:num>
-  <w:num w:numId="1007">
-    <w:abstractNumId w:val="991"/>
-  </w:num>
-  <w:num w:numId="1008">
+  <w:num w:numId="1009">
     <w:abstractNumId w:val="991"/>
   </w:num>
 </w:numbering>

</xml_diff>

<commit_message>
Concrete harness definition and mail example; use 'harness' instead of 'обвязка'
Co-Authored-By: Claude Sonnet 5.5 <noreply@anthropic.com>
Claude-Session: https://claude.ai/code/session_01JHAi78QVA9c3PviMoRDJFz
</commit_message>
<xml_diff>
--- a/harness/Doklad-Harness.docx
+++ b/harness/Doklad-Harness.docx
@@ -107,13 +107,13 @@
           <w:bCs/>
           <w:b/>
         </w:rPr>
-        <w:t xml:space="preserve">Harness («обвязка»)</w:t>
-      </w:r>
-      <w:r>
-        <w:t xml:space="preserve"> </w:t>
-      </w:r>
-      <w:r>
-        <w:t xml:space="preserve">— его рабочее место: компьютер, блокнот, проверяющий и пропуск с доступами.</w:t>
+        <w:t xml:space="preserve">Harness</w:t>
+      </w:r>
+      <w:r>
+        <w:t xml:space="preserve"> </w:t>
+      </w:r>
+      <w:r>
+        <w:t xml:space="preserve">— его рабочее место: программа с инструментами, блокнотом, проверкой и доступами.</w:t>
       </w:r>
     </w:p>
     <w:p>
@@ -159,6 +159,27 @@
         <w:pStyle w:val="FirstParagraph"/>
       </w:pPr>
       <w:r>
+        <w:t xml:space="preserve">Слово harness в докладе не заменяем: произносим его как есть. Перевод («обвязка», дословно «упряжь») называем</w:t>
+      </w:r>
+      <w:r>
+        <w:t xml:space="preserve"> </w:t>
+      </w:r>
+      <w:r>
+        <w:rPr>
+          <w:bCs/>
+          <w:b/>
+        </w:rPr>
+        <w:t xml:space="preserve">один раз</w:t>
+      </w:r>
+      <w:r>
+        <w:t xml:space="preserve">, на слайде 4.</w:t>
+      </w:r>
+    </w:p>
+    <w:p>
+      <w:pPr>
+        <w:pStyle w:val="BodyText"/>
+      </w:pPr>
+      <w:r>
         <w:t xml:space="preserve">Каждый слайд отвечает на вопрос, который родился на предыдущем. Эти вопросы-связки выделены</w:t>
       </w:r>
       <w:r>
@@ -172,7 +193,7 @@
         <w:t xml:space="preserve">жирным</w:t>
       </w:r>
       <w:r>
-        <w:t xml:space="preserve">: произносите их вслух, они держат доклад. А на каждом слайде есть плашка «Маркетинг» с выводом для вашего предмета: её стоит произносить тоже.</w:t>
+        <w:t xml:space="preserve">: произносите их вслух. А на плашке «Маркетинг» внизу слайда есть вывод для вашего предмета: его тоже стоит произносить.</w:t>
       </w:r>
     </w:p>
     <w:p>
@@ -258,7 +279,7 @@
         <w:pStyle w:val="BodyText"/>
       </w:pPr>
       <w:r>
-        <w:t xml:space="preserve">Так же и здесь. Поэтому главный вопрос доклада такой:</w:t>
+        <w:t xml:space="preserve">Поэтому главный вопрос доклада такой:</w:t>
       </w:r>
       <w:r>
         <w:t xml:space="preserve"> </w:t>
@@ -350,13 +371,13 @@
       </w:r>
     </w:p>
     <w:bookmarkEnd w:id="23"/>
-    <w:bookmarkStart w:id="24" w:name="слайд-4.-ответ-агент-модель-обвязка"/>
+    <w:bookmarkStart w:id="24" w:name="слайд-4.-определение-что-такое-harness"/>
     <w:p>
       <w:pPr>
         <w:pStyle w:val="Heading2"/>
       </w:pPr>
       <w:r>
-        <w:t xml:space="preserve">Слайд 4. Ответ: агент = модель + обвязка</w:t>
+        <w:t xml:space="preserve">Слайд 4. Определение: что такое harness</w:t>
       </w:r>
     </w:p>
     <w:p>
@@ -364,7 +385,7 @@
         <w:pStyle w:val="FirstParagraph"/>
       </w:pPr>
       <w:r>
-        <w:t xml:space="preserve">Секрет в том, что по-английски называют</w:t>
+        <w:t xml:space="preserve">Секрет называется</w:t>
       </w:r>
       <w:r>
         <w:t xml:space="preserve"> </w:t>
@@ -377,7 +398,7 @@
         <w:t xml:space="preserve">harness</w:t>
       </w:r>
       <w:r>
-        <w:t xml:space="preserve">. Дословно это «упряжь». Лошадь сильная, но поле сама не вспашет, ей нужна упряжь, которая направляет её силу. Я буду говорить «обвязка».</w:t>
+        <w:t xml:space="preserve">. По-русски это «обвязка», дословно «упряжь»: лошадь сильная, но без упряжи поле не вспашет. Дальше я буду говорить просто harness.</w:t>
       </w:r>
     </w:p>
     <w:p>
@@ -385,7 +406,17 @@
         <w:pStyle w:val="BodyText"/>
       </w:pPr>
       <w:r>
-        <w:t xml:space="preserve">Вернёмся к директору. Вы нанимаете гениального выпускника. Он знает всё, что есть в книгах. Но посадите его в пустую комнату, и работы не будет. Ему нужно рабочее место.</w:t>
+        <w:t xml:space="preserve">А теперь самое важное: что это такое</w:t>
+      </w:r>
+      <w:r>
+        <w:t xml:space="preserve"> </w:t>
+      </w:r>
+      <w:r>
+        <w:rPr>
+          <w:bCs/>
+          <w:b/>
+        </w:rPr>
+        <w:t xml:space="preserve">конкретно.</w:t>
       </w:r>
     </w:p>
     <w:p>
@@ -393,17 +424,7 @@
         <w:pStyle w:val="BodyText"/>
       </w:pPr>
       <w:r>
-        <w:t xml:space="preserve">Отсюда формула:</w:t>
-      </w:r>
-      <w:r>
-        <w:t xml:space="preserve"> </w:t>
-      </w:r>
-      <w:r>
-        <w:rPr>
-          <w:bCs/>
-          <w:b/>
-        </w:rPr>
-        <w:t xml:space="preserve">агент = модель + обвязка.</w:t>
+        <w:t xml:space="preserve">Harness — это обычная компьютерная программа, которая управляет моделью. Не магия, а программа. Она делает пять вещей:</w:t>
       </w:r>
     </w:p>
     <w:p>
@@ -415,7 +436,17 @@
         <w:pStyle w:val="Compact"/>
       </w:pPr>
       <w:r>
-        <w:t xml:space="preserve">Модель — это выпускник.</w:t>
+        <w:rPr>
+          <w:bCs/>
+          <w:b/>
+        </w:rPr>
+        <w:t xml:space="preserve">Отправляет</w:t>
+      </w:r>
+      <w:r>
+        <w:t xml:space="preserve"> </w:t>
+      </w:r>
+      <w:r>
+        <w:t xml:space="preserve">модели задачу.</w:t>
       </w:r>
     </w:p>
     <w:p>
@@ -427,7 +458,17 @@
         <w:pStyle w:val="Compact"/>
       </w:pPr>
       <w:r>
-        <w:t xml:space="preserve">Обвязка — это его рабочее место.</w:t>
+        <w:rPr>
+          <w:bCs/>
+          <w:b/>
+        </w:rPr>
+        <w:t xml:space="preserve">Даёт</w:t>
+      </w:r>
+      <w:r>
+        <w:t xml:space="preserve"> </w:t>
+      </w:r>
+      <w:r>
+        <w:t xml:space="preserve">ей инструменты: почту, файлы, поиск в интернете.</w:t>
       </w:r>
     </w:p>
     <w:p>
@@ -439,7 +480,61 @@
         <w:pStyle w:val="Compact"/>
       </w:pPr>
       <w:r>
-        <w:t xml:space="preserve">Агент — это уже сотрудник, который берёт задачу и доводит её до конца.</w:t>
+        <w:rPr>
+          <w:bCs/>
+          <w:b/>
+        </w:rPr>
+        <w:t xml:space="preserve">Хранит</w:t>
+      </w:r>
+      <w:r>
+        <w:t xml:space="preserve"> </w:t>
+      </w:r>
+      <w:r>
+        <w:t xml:space="preserve">память о прошлой работе.</w:t>
+      </w:r>
+    </w:p>
+    <w:p>
+      <w:pPr>
+        <w:numPr>
+          <w:ilvl w:val="0"/>
+          <w:numId w:val="1002"/>
+        </w:numPr>
+        <w:pStyle w:val="Compact"/>
+      </w:pPr>
+      <w:r>
+        <w:rPr>
+          <w:bCs/>
+          <w:b/>
+        </w:rPr>
+        <w:t xml:space="preserve">Проверяет</w:t>
+      </w:r>
+      <w:r>
+        <w:t xml:space="preserve"> </w:t>
+      </w:r>
+      <w:r>
+        <w:t xml:space="preserve">результат.</w:t>
+      </w:r>
+    </w:p>
+    <w:p>
+      <w:pPr>
+        <w:numPr>
+          <w:ilvl w:val="0"/>
+          <w:numId w:val="1002"/>
+        </w:numPr>
+        <w:pStyle w:val="Compact"/>
+      </w:pPr>
+      <w:r>
+        <w:rPr>
+          <w:bCs/>
+          <w:b/>
+        </w:rPr>
+        <w:t xml:space="preserve">Следит</w:t>
+      </w:r>
+      <w:r>
+        <w:t xml:space="preserve"> </w:t>
+      </w:r>
+      <w:r>
+        <w:t xml:space="preserve">за правилами и доступами.</w:t>
       </w:r>
     </w:p>
     <w:p>
@@ -447,17 +542,45 @@
         <w:pStyle w:val="FirstParagraph"/>
       </w:pPr>
       <w:r>
-        <w:t xml:space="preserve">Один специалист сказал это короче: «Если ты не модель, ты харнесс». То есть всё, что не модель, и есть обвязка. А ведь вы, наверное, уже слышали слова «промпт» и «контекст».</w:t>
-      </w:r>
-      <w:r>
-        <w:t xml:space="preserve"> </w:t>
-      </w:r>
-      <w:r>
-        <w:rPr>
-          <w:bCs/>
-          <w:b/>
-        </w:rPr>
-        <w:t xml:space="preserve">Как они связаны с обвязкой?</w:t>
+        <w:t xml:space="preserve">Пример из жизни: Claude Code, который мы увидим на рынке, — это не модель. Это harness, который стоит вокруг модели Claude.</w:t>
+      </w:r>
+    </w:p>
+    <w:p>
+      <w:pPr>
+        <w:pStyle w:val="BodyText"/>
+      </w:pPr>
+      <w:r>
+        <w:t xml:space="preserve">Теперь вернёмся к нашему директору. Вы нанимаете гениального выпускника. Он знает всё из книг, но в пустой комнате ничего не сделает. Ему нужно рабочее место. Модель — это выпускник, harness — рабочее место, а вместе они дают сотрудника, то есть агента:</w:t>
+      </w:r>
+      <w:r>
+        <w:t xml:space="preserve"> </w:t>
+      </w:r>
+      <w:r>
+        <w:rPr>
+          <w:bCs/>
+          <w:b/>
+        </w:rPr>
+        <w:t xml:space="preserve">агент = модель + harness.</w:t>
+      </w:r>
+    </w:p>
+    <w:p>
+      <w:pPr>
+        <w:pStyle w:val="BodyText"/>
+      </w:pPr>
+      <w:r>
+        <w:t xml:space="preserve">Специалист из LangChain сказал это ещё короче: «Если ты не модель, ты харнесс». То есть всё, что не модель.</w:t>
+      </w:r>
+    </w:p>
+    <w:p>
+      <w:pPr>
+        <w:pStyle w:val="BodyText"/>
+      </w:pPr>
+      <w:r>
+        <w:rPr>
+          <w:bCs/>
+          <w:b/>
+        </w:rPr>
+        <w:t xml:space="preserve">Звучит понятно, но как это выглядит на деле?</w:t>
       </w:r>
     </w:p>
     <w:p>
@@ -468,13 +591,13 @@
       </w:r>
     </w:p>
     <w:bookmarkEnd w:id="24"/>
-    <w:bookmarkStart w:id="25" w:name="слайд-5.-три-слоя-вокруг-модели"/>
+    <w:bookmarkStart w:id="25" w:name="слайд-5.-пример-ии-разбирает-вашу-почту"/>
     <w:p>
       <w:pPr>
         <w:pStyle w:val="Heading2"/>
       </w:pPr>
       <w:r>
-        <w:t xml:space="preserve">Слайд 5. Три слоя вокруг модели</w:t>
+        <w:t xml:space="preserve">Слайд 5. Пример: ИИ разбирает вашу почту</w:t>
       </w:r>
     </w:p>
     <w:p>
@@ -482,7 +605,19 @@
         <w:pStyle w:val="FirstParagraph"/>
       </w:pPr>
       <w:r>
-        <w:t xml:space="preserve">Тут всё просто, если вспомнить нашего сотрудника. У него есть три слоя помощи.</w:t>
+        <w:rPr>
+          <w:iCs/>
+          <w:i/>
+        </w:rPr>
+        <w:t xml:space="preserve">(Это учебная иллюстрация. В статье примеры в основном про программирование, но принцип тот же.)</w:t>
+      </w:r>
+    </w:p>
+    <w:p>
+      <w:pPr>
+        <w:pStyle w:val="BodyText"/>
+      </w:pPr>
+      <w:r>
+        <w:t xml:space="preserve">Допустим, вы говорите ИИ-ассистенту: «Разбери утреннюю почту и ответь на срочные письма». Смотрите, что происходит. И заметьте, кто что делает.</w:t>
       </w:r>
     </w:p>
     <w:p>
@@ -498,13 +633,13 @@
           <w:bCs/>
           <w:b/>
         </w:rPr>
-        <w:t xml:space="preserve">Промпт.</w:t>
-      </w:r>
-      <w:r>
-        <w:t xml:space="preserve"> </w:t>
-      </w:r>
-      <w:r>
-        <w:t xml:space="preserve">Это то, как вы объяснили ему задачу.</w:t>
+        <w:t xml:space="preserve">Harness</w:t>
+      </w:r>
+      <w:r>
+        <w:t xml:space="preserve"> </w:t>
+      </w:r>
+      <w:r>
+        <w:t xml:space="preserve">собирает задание: вашу просьбу, инструкции и записи прошлых дней. И отправляет модели.</w:t>
       </w:r>
     </w:p>
     <w:p>
@@ -520,13 +655,13 @@
           <w:bCs/>
           <w:b/>
         </w:rPr>
-        <w:t xml:space="preserve">Контекст.</w:t>
-      </w:r>
-      <w:r>
-        <w:t xml:space="preserve"> </w:t>
-      </w:r>
-      <w:r>
-        <w:t xml:space="preserve">Это то, какие бумаги вы положили ему на стол: документы, историю, записи.</w:t>
+        <w:t xml:space="preserve">Модель</w:t>
+      </w:r>
+      <w:r>
+        <w:t xml:space="preserve"> </w:t>
+      </w:r>
+      <w:r>
+        <w:t xml:space="preserve">отвечает: «Открой почту».</w:t>
       </w:r>
     </w:p>
     <w:p>
@@ -542,13 +677,57 @@
           <w:bCs/>
           <w:b/>
         </w:rPr>
-        <w:t xml:space="preserve">Обвязка.</w:t>
-      </w:r>
-      <w:r>
-        <w:t xml:space="preserve"> </w:t>
-      </w:r>
-      <w:r>
-        <w:t xml:space="preserve">Это всё рабочее место целиком.</w:t>
+        <w:t xml:space="preserve">Harness</w:t>
+      </w:r>
+      <w:r>
+        <w:t xml:space="preserve"> </w:t>
+      </w:r>
+      <w:r>
+        <w:t xml:space="preserve">открывает почту и показывает модели письма.</w:t>
+      </w:r>
+    </w:p>
+    <w:p>
+      <w:pPr>
+        <w:numPr>
+          <w:ilvl w:val="0"/>
+          <w:numId w:val="1003"/>
+        </w:numPr>
+        <w:pStyle w:val="Compact"/>
+      </w:pPr>
+      <w:r>
+        <w:rPr>
+          <w:bCs/>
+          <w:b/>
+        </w:rPr>
+        <w:t xml:space="preserve">Модель</w:t>
+      </w:r>
+      <w:r>
+        <w:t xml:space="preserve"> </w:t>
+      </w:r>
+      <w:r>
+        <w:t xml:space="preserve">читает письма и пишет черновики ответов.</w:t>
+      </w:r>
+    </w:p>
+    <w:p>
+      <w:pPr>
+        <w:numPr>
+          <w:ilvl w:val="0"/>
+          <w:numId w:val="1003"/>
+        </w:numPr>
+        <w:pStyle w:val="Compact"/>
+      </w:pPr>
+      <w:r>
+        <w:rPr>
+          <w:bCs/>
+          <w:b/>
+        </w:rPr>
+        <w:t xml:space="preserve">Harness</w:t>
+      </w:r>
+      <w:r>
+        <w:t xml:space="preserve"> </w:t>
+      </w:r>
+      <w:r>
+        <w:t xml:space="preserve">проверяет черновики и спрашивает вас: «Отправить?» Письма уходят только после вашего «да».</w:t>
       </w:r>
     </w:p>
     <w:p>
@@ -556,17 +735,25 @@
         <w:pStyle w:val="FirstParagraph"/>
       </w:pPr>
       <w:r>
-        <w:t xml:space="preserve">И важно: каждый следующий слой включает предыдущий. Обвязка — это и промпт, и контекст, и всё остальное. Поэтому конкурируют сегодня не удачными формулировками, а целым рабочим местом.</w:t>
-      </w:r>
-      <w:r>
-        <w:t xml:space="preserve"> </w:t>
-      </w:r>
-      <w:r>
-        <w:rPr>
-          <w:bCs/>
-          <w:b/>
-        </w:rPr>
-        <w:t xml:space="preserve">А из чего оно состоит?</w:t>
+        <w:t xml:space="preserve">Видите? Модель только читает и пишет текст. Почту открывает, письма отправляет и у вас спрашивает разрешение именно harness. Без него модель — просто собеседник в чате.</w:t>
+      </w:r>
+    </w:p>
+    <w:p>
+      <w:pPr>
+        <w:pStyle w:val="BodyText"/>
+      </w:pPr>
+      <w:r>
+        <w:t xml:space="preserve">Для маркетолога вывод: клиент платит за результат «почта разобрана», а не за «умную модель».</w:t>
+      </w:r>
+      <w:r>
+        <w:t xml:space="preserve"> </w:t>
+      </w:r>
+      <w:r>
+        <w:rPr>
+          <w:bCs/>
+          <w:b/>
+        </w:rPr>
+        <w:t xml:space="preserve">Но где у harness слои и как они связаны с тем, что вы уже слышали?</w:t>
       </w:r>
     </w:p>
     <w:p>
@@ -577,13 +764,13 @@
       </w:r>
     </w:p>
     <w:bookmarkEnd w:id="25"/>
-    <w:bookmarkStart w:id="26" w:name="слайд-6.-из-чего-состоит-рабочее-место"/>
+    <w:bookmarkStart w:id="26" w:name="X0d2cbd5f1daa38a36f2b7861f3dafddc9284460"/>
     <w:p>
       <w:pPr>
         <w:pStyle w:val="Heading2"/>
       </w:pPr>
       <w:r>
-        <w:t xml:space="preserve">Слайд 6. Из чего состоит рабочее место</w:t>
+        <w:t xml:space="preserve">Слайд 6. Три слоя: промпт, контекст, harness</w:t>
       </w:r>
     </w:p>
     <w:p>
@@ -591,7 +778,7 @@
         <w:pStyle w:val="FirstParagraph"/>
       </w:pPr>
       <w:r>
-        <w:t xml:space="preserve">Представьте, что вы делаете карточку товара на маркетплейсе. Какие характеристики записали бы? У обвязки их четыре.</w:t>
+        <w:t xml:space="preserve">Наверняка вы уже слышали слова «промпт» и «контекст». Вот как они соотносятся с harness. Опять возьмём нашего сотрудника.</w:t>
       </w:r>
     </w:p>
     <w:p>
@@ -607,13 +794,13 @@
           <w:bCs/>
           <w:b/>
         </w:rPr>
-        <w:t xml:space="preserve">Руки.</w:t>
-      </w:r>
-      <w:r>
-        <w:t xml:space="preserve"> </w:t>
-      </w:r>
-      <w:r>
-        <w:t xml:space="preserve">ИИ умеет не только говорить, но и делать: открывает файлы, ищет в интернете, запускает программы.</w:t>
+        <w:t xml:space="preserve">Промпт.</w:t>
+      </w:r>
+      <w:r>
+        <w:t xml:space="preserve"> </w:t>
+      </w:r>
+      <w:r>
+        <w:t xml:space="preserve">Как вы объяснили ему задачу.</w:t>
       </w:r>
     </w:p>
     <w:p>
@@ -629,13 +816,13 @@
           <w:bCs/>
           <w:b/>
         </w:rPr>
-        <w:t xml:space="preserve">Блокнот.</w:t>
-      </w:r>
-      <w:r>
-        <w:t xml:space="preserve"> </w:t>
-      </w:r>
-      <w:r>
-        <w:t xml:space="preserve">Он помнит, о чём договорились: хранит записи, ведёт список задач.</w:t>
+        <w:t xml:space="preserve">Контекст.</w:t>
+      </w:r>
+      <w:r>
+        <w:t xml:space="preserve"> </w:t>
+      </w:r>
+      <w:r>
+        <w:t xml:space="preserve">Какие бумаги вы положили ему на стол: документы, историю, записи.</w:t>
       </w:r>
     </w:p>
     <w:p>
@@ -651,35 +838,13 @@
           <w:bCs/>
           <w:b/>
         </w:rPr>
-        <w:t xml:space="preserve">Контролёр.</w:t>
-      </w:r>
-      <w:r>
-        <w:t xml:space="preserve"> </w:t>
-      </w:r>
-      <w:r>
-        <w:t xml:space="preserve">Он проверяет свою работу и ловит ошибки до того, как их увидит клиент.</w:t>
-      </w:r>
-    </w:p>
-    <w:p>
-      <w:pPr>
-        <w:numPr>
-          <w:ilvl w:val="0"/>
-          <w:numId w:val="1004"/>
-        </w:numPr>
-        <w:pStyle w:val="Compact"/>
-      </w:pPr>
-      <w:r>
-        <w:rPr>
-          <w:bCs/>
-          <w:b/>
-        </w:rPr>
-        <w:t xml:space="preserve">Пропуск.</w:t>
-      </w:r>
-      <w:r>
-        <w:t xml:space="preserve"> </w:t>
-      </w:r>
-      <w:r>
-        <w:t xml:space="preserve">Он знает, что ему разрешено: что делает сам, а что только с одобрения человека.</w:t>
+        <w:t xml:space="preserve">Harness.</w:t>
+      </w:r>
+      <w:r>
+        <w:t xml:space="preserve"> </w:t>
+      </w:r>
+      <w:r>
+        <w:t xml:space="preserve">Всё рабочее место целиком.</w:t>
       </w:r>
     </w:p>
     <w:p>
@@ -687,17 +852,17 @@
         <w:pStyle w:val="FirstParagraph"/>
       </w:pPr>
       <w:r>
-        <w:t xml:space="preserve">Это мой упрощённый вариант. В статье, по которой я готовил доклад, таких частей одиннадцать, я собрал их в четыре. И это именно характеристики для карточки сравнения.</w:t>
-      </w:r>
-      <w:r>
-        <w:t xml:space="preserve"> </w:t>
-      </w:r>
-      <w:r>
-        <w:rPr>
-          <w:bCs/>
-          <w:b/>
-        </w:rPr>
-        <w:t xml:space="preserve">Но как такой сотрудник работает?</w:t>
+        <w:t xml:space="preserve">Каждый следующий слой включает предыдущий. Harness — это и промпт, и контекст, и всё остальное. Поэтому сегодня конкурируют не удачными формулировками, а целым рабочим местом.</w:t>
+      </w:r>
+      <w:r>
+        <w:t xml:space="preserve"> </w:t>
+      </w:r>
+      <w:r>
+        <w:rPr>
+          <w:bCs/>
+          <w:b/>
+        </w:rPr>
+        <w:t xml:space="preserve">А из чего оно состоит?</w:t>
       </w:r>
     </w:p>
     <w:p>
@@ -708,13 +873,13 @@
       </w:r>
     </w:p>
     <w:bookmarkEnd w:id="26"/>
-    <w:bookmarkStart w:id="27" w:name="слайд-7.-рабочий-день-круг"/>
+    <w:bookmarkStart w:id="27" w:name="слайд-7.-из-чего-состоит-harness"/>
     <w:p>
       <w:pPr>
         <w:pStyle w:val="Heading2"/>
       </w:pPr>
       <w:r>
-        <w:t xml:space="preserve">Слайд 7. Рабочий день: круг</w:t>
+        <w:t xml:space="preserve">Слайд 7. Из чего состоит harness</w:t>
       </w:r>
     </w:p>
     <w:p>
@@ -722,33 +887,113 @@
         <w:pStyle w:val="FirstParagraph"/>
       </w:pPr>
       <w:r>
-        <w:t xml:space="preserve">Рабочий день агента — это простой круг. Он получил задание. Подумал, что делать. Сделал. Записал результат. И, если дело не готово, снова по кругу.</w:t>
-      </w:r>
-    </w:p>
-    <w:p>
-      <w:pPr>
-        <w:pStyle w:val="BodyText"/>
-      </w:pPr>
-      <w:r>
-        <w:t xml:space="preserve">Самое неожиданное: сам этот круг — очень простая программа. В Anthropic её в шутку называют «тупым циклом». Весь ум в модели, а круг только следит за порядком: что сделано, что дальше, когда остановиться.</w:t>
-      </w:r>
-    </w:p>
-    <w:p>
-      <w:pPr>
-        <w:pStyle w:val="BodyText"/>
-      </w:pPr>
-      <w:r>
-        <w:t xml:space="preserve">Клиент этого круга не видит. Он видит только итог: «агент сам довёл дело до конца». Но у такого сотрудника есть две главные беды.</w:t>
-      </w:r>
-      <w:r>
-        <w:t xml:space="preserve"> </w:t>
-      </w:r>
-      <w:r>
-        <w:rPr>
-          <w:bCs/>
-          <w:b/>
-        </w:rPr>
-        <w:t xml:space="preserve">Первая: стол, на котором он работает, слишком мал.</w:t>
+        <w:t xml:space="preserve">Представьте, что вы делаете карточку товара на маркетплейсе. Какие характеристики записали бы? У harness их четыре.</w:t>
+      </w:r>
+    </w:p>
+    <w:p>
+      <w:pPr>
+        <w:numPr>
+          <w:ilvl w:val="0"/>
+          <w:numId w:val="1005"/>
+        </w:numPr>
+        <w:pStyle w:val="Compact"/>
+      </w:pPr>
+      <w:r>
+        <w:rPr>
+          <w:bCs/>
+          <w:b/>
+        </w:rPr>
+        <w:t xml:space="preserve">Руки.</w:t>
+      </w:r>
+      <w:r>
+        <w:t xml:space="preserve"> </w:t>
+      </w:r>
+      <w:r>
+        <w:t xml:space="preserve">ИИ умеет не только говорить, но и делать: открывает файлы, ищет в интернете, запускает программы.</w:t>
+      </w:r>
+    </w:p>
+    <w:p>
+      <w:pPr>
+        <w:numPr>
+          <w:ilvl w:val="0"/>
+          <w:numId w:val="1005"/>
+        </w:numPr>
+        <w:pStyle w:val="Compact"/>
+      </w:pPr>
+      <w:r>
+        <w:rPr>
+          <w:bCs/>
+          <w:b/>
+        </w:rPr>
+        <w:t xml:space="preserve">Блокнот.</w:t>
+      </w:r>
+      <w:r>
+        <w:t xml:space="preserve"> </w:t>
+      </w:r>
+      <w:r>
+        <w:t xml:space="preserve">Он помнит, о чём договорились: хранит записи, ведёт список задач.</w:t>
+      </w:r>
+    </w:p>
+    <w:p>
+      <w:pPr>
+        <w:numPr>
+          <w:ilvl w:val="0"/>
+          <w:numId w:val="1005"/>
+        </w:numPr>
+        <w:pStyle w:val="Compact"/>
+      </w:pPr>
+      <w:r>
+        <w:rPr>
+          <w:bCs/>
+          <w:b/>
+        </w:rPr>
+        <w:t xml:space="preserve">Контролёр.</w:t>
+      </w:r>
+      <w:r>
+        <w:t xml:space="preserve"> </w:t>
+      </w:r>
+      <w:r>
+        <w:t xml:space="preserve">Проверяет свою работу и ловит ошибки до того, как их увидит клиент.</w:t>
+      </w:r>
+    </w:p>
+    <w:p>
+      <w:pPr>
+        <w:numPr>
+          <w:ilvl w:val="0"/>
+          <w:numId w:val="1005"/>
+        </w:numPr>
+        <w:pStyle w:val="Compact"/>
+      </w:pPr>
+      <w:r>
+        <w:rPr>
+          <w:bCs/>
+          <w:b/>
+        </w:rPr>
+        <w:t xml:space="preserve">Пропуск.</w:t>
+      </w:r>
+      <w:r>
+        <w:t xml:space="preserve"> </w:t>
+      </w:r>
+      <w:r>
+        <w:t xml:space="preserve">Знает, что ему разрешено: что делает сам, а что только с одобрения человека.</w:t>
+      </w:r>
+    </w:p>
+    <w:p>
+      <w:pPr>
+        <w:pStyle w:val="FirstParagraph"/>
+      </w:pPr>
+      <w:r>
+        <w:t xml:space="preserve">Это мой упрощённый вариант. В статье, по которой я готовил доклад, таких частей одиннадцать, я собрал их в четыре. И это именно характеристики для карточки сравнения.</w:t>
+      </w:r>
+      <w:r>
+        <w:t xml:space="preserve"> </w:t>
+      </w:r>
+      <w:r>
+        <w:rPr>
+          <w:bCs/>
+          <w:b/>
+        </w:rPr>
+        <w:t xml:space="preserve">Но как такой сотрудник работает?</w:t>
       </w:r>
     </w:p>
     <w:p>
@@ -759,13 +1004,13 @@
       </w:r>
     </w:p>
     <w:bookmarkEnd w:id="27"/>
-    <w:bookmarkStart w:id="28" w:name="слайд-8.-беда-1-места-на-столе-мало"/>
+    <w:bookmarkStart w:id="28" w:name="слайд-8.-рабочий-день-круг"/>
     <w:p>
       <w:pPr>
         <w:pStyle w:val="Heading2"/>
       </w:pPr>
       <w:r>
-        <w:t xml:space="preserve">Слайд 8. Беда №1: места на столе мало</w:t>
+        <w:t xml:space="preserve">Слайд 8. Рабочий день: круг</w:t>
       </w:r>
     </w:p>
     <w:p>
@@ -773,7 +1018,7 @@
         <w:pStyle w:val="FirstParagraph"/>
       </w:pPr>
       <w:r>
-        <w:t xml:space="preserve">У модели есть «рабочий стол»: то, что она одновременно держит в голове. И он ограничен.</w:t>
+        <w:t xml:space="preserve">Рабочий день агента — это простой круг. Он получил задание. Подумал, что делать. Сделал. Записал результат. И, если дело не готово, снова по кругу. Ровно это мы видели в примере с почтой.</w:t>
       </w:r>
     </w:p>
     <w:p>
@@ -781,7 +1026,7 @@
         <w:pStyle w:val="BodyText"/>
       </w:pPr>
       <w:r>
-        <w:t xml:space="preserve">Исследователи выяснили: если важное оказывается в середине длинного текста, качество падает на 30% и больше. Это знакомо любому студенту. Начало и конец лекции вы помните, а середина проваливается.</w:t>
+        <w:t xml:space="preserve">Самое неожиданное: сам этот круг — очень простая программа. В Anthropic её в шутку называют «тупым циклом». Весь ум в модели, а круг только следит за порядком: что сделано, что дальше, когда остановиться.</w:t>
       </w:r>
     </w:p>
     <w:p>
@@ -789,125 +1034,17 @@
         <w:pStyle w:val="BodyText"/>
       </w:pPr>
       <w:r>
-        <w:t xml:space="preserve">Как с этим справляются? Как в нормальном офисе.</w:t>
-      </w:r>
-    </w:p>
-    <w:p>
-      <w:pPr>
-        <w:numPr>
-          <w:ilvl w:val="0"/>
-          <w:numId w:val="1005"/>
-        </w:numPr>
-        <w:pStyle w:val="Compact"/>
-      </w:pPr>
-      <w:r>
-        <w:t xml:space="preserve">Переписку сжимают в</w:t>
-      </w:r>
-      <w:r>
-        <w:t xml:space="preserve"> </w:t>
-      </w:r>
-      <w:r>
-        <w:rPr>
-          <w:bCs/>
-          <w:b/>
-        </w:rPr>
-        <w:t xml:space="preserve">конспект</w:t>
-      </w:r>
-      <w:r>
-        <w:t xml:space="preserve">: важное остаётся, лишнее уходит.</w:t>
-      </w:r>
-    </w:p>
-    <w:p>
-      <w:pPr>
-        <w:numPr>
-          <w:ilvl w:val="0"/>
-          <w:numId w:val="1005"/>
-        </w:numPr>
-        <w:pStyle w:val="Compact"/>
-      </w:pPr>
-      <w:r>
-        <w:t xml:space="preserve">Старые бумаги</w:t>
-      </w:r>
-      <w:r>
-        <w:t xml:space="preserve"> </w:t>
-      </w:r>
-      <w:r>
-        <w:rPr>
-          <w:bCs/>
-          <w:b/>
-        </w:rPr>
-        <w:t xml:space="preserve">убирают со стола</w:t>
-      </w:r>
-      <w:r>
-        <w:t xml:space="preserve">, но помнят, что с ними было.</w:t>
-      </w:r>
-    </w:p>
-    <w:p>
-      <w:pPr>
-        <w:numPr>
-          <w:ilvl w:val="0"/>
-          <w:numId w:val="1005"/>
-        </w:numPr>
-        <w:pStyle w:val="Compact"/>
-      </w:pPr>
-      <w:r>
-        <w:t xml:space="preserve">Нужный документ</w:t>
-      </w:r>
-      <w:r>
-        <w:t xml:space="preserve"> </w:t>
-      </w:r>
-      <w:r>
-        <w:rPr>
-          <w:bCs/>
-          <w:b/>
-        </w:rPr>
-        <w:t xml:space="preserve">ищут, когда он нужен</w:t>
-      </w:r>
-      <w:r>
-        <w:t xml:space="preserve">, а не читают всё подряд.</w:t>
-      </w:r>
-    </w:p>
-    <w:p>
-      <w:pPr>
-        <w:numPr>
-          <w:ilvl w:val="0"/>
-          <w:numId w:val="1005"/>
-        </w:numPr>
-        <w:pStyle w:val="Compact"/>
-      </w:pPr>
-      <w:r>
-        <w:t xml:space="preserve">Для отдельной темы зовут</w:t>
-      </w:r>
-      <w:r>
-        <w:t xml:space="preserve"> </w:t>
-      </w:r>
-      <w:r>
-        <w:rPr>
-          <w:bCs/>
-          <w:b/>
-        </w:rPr>
-        <w:t xml:space="preserve">помощника</w:t>
-      </w:r>
-      <w:r>
-        <w:t xml:space="preserve">, который приносит короткую выжимку.</w:t>
-      </w:r>
-    </w:p>
-    <w:p>
-      <w:pPr>
-        <w:pStyle w:val="FirstParagraph"/>
-      </w:pPr>
-      <w:r>
-        <w:t xml:space="preserve">Клиент ощущает это так: «ИИ не тупеет к концу работы». Эту характеристику вы не увидите в названии модели. Она целиком от обвязки.</w:t>
-      </w:r>
-      <w:r>
-        <w:t xml:space="preserve"> </w:t>
-      </w:r>
-      <w:r>
-        <w:rPr>
-          <w:bCs/>
-          <w:b/>
-        </w:rPr>
-        <w:t xml:space="preserve">Беда вторая: сотрудник ошибается.</w:t>
+        <w:t xml:space="preserve">Клиент этого круга не видит. Он видит только итог: «агент сам довёл дело до конца». Но у такого сотрудника есть две главные беды.</w:t>
+      </w:r>
+      <w:r>
+        <w:t xml:space="preserve"> </w:t>
+      </w:r>
+      <w:r>
+        <w:rPr>
+          <w:bCs/>
+          <w:b/>
+        </w:rPr>
+        <w:t xml:space="preserve">Первая: стол, на котором он работает, слишком мал.</w:t>
       </w:r>
     </w:p>
     <w:p>
@@ -918,13 +1055,13 @@
       </w:r>
     </w:p>
     <w:bookmarkEnd w:id="28"/>
-    <w:bookmarkStart w:id="29" w:name="слайд-9.-беда-2-ошибки-копятся"/>
+    <w:bookmarkStart w:id="29" w:name="слайд-9.-беда-1-места-на-столе-мало"/>
     <w:p>
       <w:pPr>
         <w:pStyle w:val="Heading2"/>
       </w:pPr>
       <w:r>
-        <w:t xml:space="preserve">Слайд 9. Беда №2: ошибки копятся</w:t>
+        <w:t xml:space="preserve">Слайд 9. Беда №1: места на столе мало</w:t>
       </w:r>
     </w:p>
     <w:p>
@@ -932,7 +1069,7 @@
         <w:pStyle w:val="FirstParagraph"/>
       </w:pPr>
       <w:r>
-        <w:t xml:space="preserve">Посчитаем. Допустим, на каждом шаге ИИ не ошибается в 99 случаях из 100. Звучит прекрасно. Но дело состоит из десяти шагов. И тогда без единой ошибки доходит около 90 дел из ста. Каждое десятое идёт не так. Поэтому ошибки нужно ловить на ходу, а число повторных попыток ограничивать. В компании Stripe, например, больше двух повторов не разрешают.</w:t>
+        <w:t xml:space="preserve">У модели есть «рабочий стол»: то, что она одновременно держит в голове. И он ограничен.</w:t>
       </w:r>
     </w:p>
     <w:p>
@@ -940,7 +1077,7 @@
         <w:pStyle w:val="BodyText"/>
       </w:pPr>
       <w:r>
-        <w:t xml:space="preserve">Что с этим делают? Два способа.</w:t>
+        <w:t xml:space="preserve">Исследователи выяснили: если важное оказывается в середине длинного текста, качество падает на 30% и больше. Это знакомо любому студенту. Начало и конец лекции вы помните, а середина проваливается.</w:t>
       </w:r>
     </w:p>
     <w:p>
@@ -948,79 +1085,125 @@
         <w:pStyle w:val="BodyText"/>
       </w:pPr>
       <w:r>
-        <w:rPr>
-          <w:bCs/>
-          <w:b/>
-        </w:rPr>
-        <w:t xml:space="preserve">Первый: пусть сотрудник проверяет сам себя.</w:t>
-      </w:r>
-      <w:r>
-        <w:t xml:space="preserve"> </w:t>
-      </w:r>
-      <w:r>
-        <w:t xml:space="preserve">Создатель Claude Code Борис Черни говорит: если агент умеет проверить результат (прогнать тесты, посмотреть на экран или показать работу второму ИИ), качество растёт в два-три раза. Это как корректор в издательстве.</w:t>
-      </w:r>
-    </w:p>
-    <w:p>
-      <w:pPr>
-        <w:pStyle w:val="BodyText"/>
-      </w:pPr>
-      <w:r>
-        <w:rPr>
-          <w:bCs/>
-          <w:b/>
-        </w:rPr>
-        <w:t xml:space="preserve">Второй: границы.</w:t>
-      </w:r>
-      <w:r>
-        <w:t xml:space="preserve"> </w:t>
-      </w:r>
-      <w:r>
-        <w:t xml:space="preserve">Модель решает, что</w:t>
-      </w:r>
-      <w:r>
-        <w:t xml:space="preserve"> </w:t>
-      </w:r>
-      <w:r>
-        <w:rPr>
-          <w:iCs/>
-          <w:i/>
-        </w:rPr>
-        <w:t xml:space="preserve">попробовать</w:t>
-      </w:r>
-      <w:r>
-        <w:t xml:space="preserve">, а система решает, что</w:t>
-      </w:r>
-      <w:r>
-        <w:t xml:space="preserve"> </w:t>
-      </w:r>
-      <w:r>
-        <w:rPr>
-          <w:iCs/>
-          <w:i/>
-        </w:rPr>
-        <w:t xml:space="preserve">разрешить</w:t>
-      </w:r>
-      <w:r>
-        <w:t xml:space="preserve">. Как в любой компании: можно читать документы, нельзя удалять. В Claude Code так отдельно проверяют около сорока действий.</w:t>
-      </w:r>
-    </w:p>
-    <w:p>
-      <w:pPr>
-        <w:pStyle w:val="BodyText"/>
-      </w:pPr>
-      <w:r>
-        <w:t xml:space="preserve">Это готовые аргументы продаж: надёжность и безопасность.</w:t>
-      </w:r>
-      <w:r>
-        <w:t xml:space="preserve"> </w:t>
-      </w:r>
-      <w:r>
-        <w:rPr>
-          <w:bCs/>
-          <w:b/>
-        </w:rPr>
-        <w:t xml:space="preserve">А что, если дело настолько большое, что за один рабочий день его не сделать?</w:t>
+        <w:t xml:space="preserve">Как с этим справляется harness? Как в нормальном офисе.</w:t>
+      </w:r>
+    </w:p>
+    <w:p>
+      <w:pPr>
+        <w:numPr>
+          <w:ilvl w:val="0"/>
+          <w:numId w:val="1006"/>
+        </w:numPr>
+        <w:pStyle w:val="Compact"/>
+      </w:pPr>
+      <w:r>
+        <w:t xml:space="preserve">Переписку сжимает в</w:t>
+      </w:r>
+      <w:r>
+        <w:t xml:space="preserve"> </w:t>
+      </w:r>
+      <w:r>
+        <w:rPr>
+          <w:bCs/>
+          <w:b/>
+        </w:rPr>
+        <w:t xml:space="preserve">конспект</w:t>
+      </w:r>
+      <w:r>
+        <w:t xml:space="preserve">: важное остаётся, лишнее уходит.</w:t>
+      </w:r>
+    </w:p>
+    <w:p>
+      <w:pPr>
+        <w:numPr>
+          <w:ilvl w:val="0"/>
+          <w:numId w:val="1006"/>
+        </w:numPr>
+        <w:pStyle w:val="Compact"/>
+      </w:pPr>
+      <w:r>
+        <w:t xml:space="preserve">Старые бумаги</w:t>
+      </w:r>
+      <w:r>
+        <w:t xml:space="preserve"> </w:t>
+      </w:r>
+      <w:r>
+        <w:rPr>
+          <w:bCs/>
+          <w:b/>
+        </w:rPr>
+        <w:t xml:space="preserve">убирает со стола</w:t>
+      </w:r>
+      <w:r>
+        <w:t xml:space="preserve">, но помнит, что с ними было.</w:t>
+      </w:r>
+    </w:p>
+    <w:p>
+      <w:pPr>
+        <w:numPr>
+          <w:ilvl w:val="0"/>
+          <w:numId w:val="1006"/>
+        </w:numPr>
+        <w:pStyle w:val="Compact"/>
+      </w:pPr>
+      <w:r>
+        <w:t xml:space="preserve">Нужный документ</w:t>
+      </w:r>
+      <w:r>
+        <w:t xml:space="preserve"> </w:t>
+      </w:r>
+      <w:r>
+        <w:rPr>
+          <w:bCs/>
+          <w:b/>
+        </w:rPr>
+        <w:t xml:space="preserve">ищет, когда он нужен</w:t>
+      </w:r>
+      <w:r>
+        <w:t xml:space="preserve">, а не читает всё подряд.</w:t>
+      </w:r>
+    </w:p>
+    <w:p>
+      <w:pPr>
+        <w:numPr>
+          <w:ilvl w:val="0"/>
+          <w:numId w:val="1006"/>
+        </w:numPr>
+        <w:pStyle w:val="Compact"/>
+      </w:pPr>
+      <w:r>
+        <w:t xml:space="preserve">Для отдельной темы зовёт</w:t>
+      </w:r>
+      <w:r>
+        <w:t xml:space="preserve"> </w:t>
+      </w:r>
+      <w:r>
+        <w:rPr>
+          <w:bCs/>
+          <w:b/>
+        </w:rPr>
+        <w:t xml:space="preserve">помощника</w:t>
+      </w:r>
+      <w:r>
+        <w:t xml:space="preserve">, который приносит короткую выжимку.</w:t>
+      </w:r>
+    </w:p>
+    <w:p>
+      <w:pPr>
+        <w:pStyle w:val="FirstParagraph"/>
+      </w:pPr>
+      <w:r>
+        <w:t xml:space="preserve">Клиент ощущает это так: «ИИ не тупеет к концу работы». Эту характеристику вы не увидите в названии модели. Она целиком от harness.</w:t>
+      </w:r>
+      <w:r>
+        <w:t xml:space="preserve"> </w:t>
+      </w:r>
+      <w:r>
+        <w:rPr>
+          <w:bCs/>
+          <w:b/>
+        </w:rPr>
+        <w:t xml:space="preserve">Беда вторая: сотрудник ошибается.</w:t>
       </w:r>
     </w:p>
     <w:p>
@@ -1031,13 +1214,13 @@
       </w:r>
     </w:p>
     <w:bookmarkEnd w:id="29"/>
-    <w:bookmarkStart w:id="30" w:name="слайд-10.-большое-дело-журнал-смены"/>
+    <w:bookmarkStart w:id="30" w:name="слайд-10.-беда-2-ошибки-копятся"/>
     <w:p>
       <w:pPr>
         <w:pStyle w:val="Heading2"/>
       </w:pPr>
       <w:r>
-        <w:t xml:space="preserve">Слайд 10. Большое дело: журнал смены</w:t>
+        <w:t xml:space="preserve">Слайд 10. Беда №2: ошибки копятся</w:t>
       </w:r>
     </w:p>
     <w:p>
@@ -1045,7 +1228,7 @@
         <w:pStyle w:val="FirstParagraph"/>
       </w:pPr>
       <w:r>
-        <w:t xml:space="preserve">В Anthropic придумали решение, знакомое каждому, кто работал сменами. В больнице люди меняются, а журнал остаётся.</w:t>
+        <w:t xml:space="preserve">Посчитаем. Допустим, на каждом шаге ИИ не ошибается в 99 случаях из 100. Звучит прекрасно. Но дело состоит из десяти шагов. И тогда без единой ошибки доходит около 90 дел из ста. Каждое десятое идёт не так. Поэтому ошибки нужно ловить на ходу, а число повторных попыток ограничивать. В компании Stripe, например, больше двух повторов не разрешают.</w:t>
       </w:r>
     </w:p>
     <w:p>
@@ -1053,33 +1236,7 @@
         <w:pStyle w:val="BodyText"/>
       </w:pPr>
       <w:r>
-        <w:t xml:space="preserve">Сначала приходит</w:t>
-      </w:r>
-      <w:r>
-        <w:t xml:space="preserve"> </w:t>
-      </w:r>
-      <w:r>
-        <w:rPr>
-          <w:bCs/>
-          <w:b/>
-        </w:rPr>
-        <w:t xml:space="preserve">подготовщик</w:t>
-      </w:r>
-      <w:r>
-        <w:t xml:space="preserve">. Он один раз готовит рабочее место, составляет список задач, заводит отчёт и делает первое сохранение работы. Потом каждую смену приходит</w:t>
-      </w:r>
-      <w:r>
-        <w:t xml:space="preserve"> </w:t>
-      </w:r>
-      <w:r>
-        <w:rPr>
-          <w:bCs/>
-          <w:b/>
-        </w:rPr>
-        <w:t xml:space="preserve">исполнитель</w:t>
-      </w:r>
-      <w:r>
-        <w:t xml:space="preserve">. Он читает журнал и вспоминает, что уже сделано. Берёт самую важную задачу, выполняет её и записывает итог для следующей смены.</w:t>
+        <w:t xml:space="preserve">Что с этим делает harness? Два способа.</w:t>
       </w:r>
     </w:p>
     <w:p>
@@ -1087,17 +1244,79 @@
         <w:pStyle w:val="BodyText"/>
       </w:pPr>
       <w:r>
-        <w:t xml:space="preserve">Благодаря этому большое дело можно делать частями, и ничего не теряется. Для клиента это значит: непрерывность работы.</w:t>
-      </w:r>
-      <w:r>
-        <w:t xml:space="preserve"> </w:t>
-      </w:r>
-      <w:r>
-        <w:rPr>
-          <w:bCs/>
-          <w:b/>
-        </w:rPr>
-        <w:t xml:space="preserve">А что, если сотрудников нужно несколько?</w:t>
+        <w:rPr>
+          <w:bCs/>
+          <w:b/>
+        </w:rPr>
+        <w:t xml:space="preserve">Первый: пусть сотрудник проверяет сам себя.</w:t>
+      </w:r>
+      <w:r>
+        <w:t xml:space="preserve"> </w:t>
+      </w:r>
+      <w:r>
+        <w:t xml:space="preserve">Создатель Claude Code Борис Черни говорит: если агент умеет проверить результат (прогнать тесты, посмотреть на экран или показать работу второму ИИ), качество растёт в два-три раза. Это как корректор в издательстве.</w:t>
+      </w:r>
+    </w:p>
+    <w:p>
+      <w:pPr>
+        <w:pStyle w:val="BodyText"/>
+      </w:pPr>
+      <w:r>
+        <w:rPr>
+          <w:bCs/>
+          <w:b/>
+        </w:rPr>
+        <w:t xml:space="preserve">Второй: границы.</w:t>
+      </w:r>
+      <w:r>
+        <w:t xml:space="preserve"> </w:t>
+      </w:r>
+      <w:r>
+        <w:t xml:space="preserve">Модель решает, что</w:t>
+      </w:r>
+      <w:r>
+        <w:t xml:space="preserve"> </w:t>
+      </w:r>
+      <w:r>
+        <w:rPr>
+          <w:iCs/>
+          <w:i/>
+        </w:rPr>
+        <w:t xml:space="preserve">попробовать</w:t>
+      </w:r>
+      <w:r>
+        <w:t xml:space="preserve">, а harness решает, что</w:t>
+      </w:r>
+      <w:r>
+        <w:t xml:space="preserve"> </w:t>
+      </w:r>
+      <w:r>
+        <w:rPr>
+          <w:iCs/>
+          <w:i/>
+        </w:rPr>
+        <w:t xml:space="preserve">разрешить</w:t>
+      </w:r>
+      <w:r>
+        <w:t xml:space="preserve">. Как в любой компании: можно читать документы, нельзя удалять. В Claude Code так отдельно проверяют около сорока действий.</w:t>
+      </w:r>
+    </w:p>
+    <w:p>
+      <w:pPr>
+        <w:pStyle w:val="BodyText"/>
+      </w:pPr>
+      <w:r>
+        <w:t xml:space="preserve">Это готовые аргументы продаж: надёжность и безопасность.</w:t>
+      </w:r>
+      <w:r>
+        <w:t xml:space="preserve"> </w:t>
+      </w:r>
+      <w:r>
+        <w:rPr>
+          <w:bCs/>
+          <w:b/>
+        </w:rPr>
+        <w:t xml:space="preserve">А что, если дело настолько большое, что за один рабочий день его не сделать?</w:t>
       </w:r>
     </w:p>
     <w:p>
@@ -1108,13 +1327,13 @@
       </w:r>
     </w:p>
     <w:bookmarkEnd w:id="30"/>
-    <w:bookmarkStart w:id="31" w:name="слайд-11.-как-сотрудники-делят-работу"/>
+    <w:bookmarkStart w:id="31" w:name="слайд-11.-большое-дело-журнал-смены"/>
     <w:p>
       <w:pPr>
         <w:pStyle w:val="Heading2"/>
       </w:pPr>
       <w:r>
-        <w:t xml:space="preserve">Слайд 11. Как сотрудники делят работу</w:t>
+        <w:t xml:space="preserve">Слайд 11. Большое дело: журнал смены</w:t>
       </w:r>
     </w:p>
     <w:p>
@@ -1122,7 +1341,7 @@
         <w:pStyle w:val="FirstParagraph"/>
       </w:pPr>
       <w:r>
-        <w:t xml:space="preserve">Иногда главному агенту помогают другие. Посмотрите на слайд. В Claude Code это три способа: помощник получает копию всего, что знает главный; или работает как отдельный коллега и общается записками; или трудится в своей копии проекта и никому не мешает. У OpenAI два способа: специалист решает узкую задачу и возвращает результат, либо полностью берёт задачу на себя. А в LangGraph помощники — это маленькие схемы внутри большой.</w:t>
+        <w:t xml:space="preserve">В Anthropic придумали решение, знакомое каждому, кто работал сменами. В больнице люди меняются, а журнал остаётся.</w:t>
       </w:r>
     </w:p>
     <w:p>
@@ -1130,23 +1349,33 @@
         <w:pStyle w:val="BodyText"/>
       </w:pPr>
       <w:r>
-        <w:t xml:space="preserve">Главное в этом слайде внизу, и это совет против моды:</w:t>
-      </w:r>
-      <w:r>
-        <w:t xml:space="preserve"> </w:t>
-      </w:r>
-      <w:r>
-        <w:rPr>
-          <w:bCs/>
-          <w:b/>
-        </w:rPr>
-        <w:t xml:space="preserve">сначала один сотрудник.</w:t>
-      </w:r>
-      <w:r>
-        <w:t xml:space="preserve"> </w:t>
-      </w:r>
-      <w:r>
-        <w:t xml:space="preserve">И Anthropic, и OpenAI советуют выжать максимум из одного агента. Каждый новый помощник — это расходы и риск потерять часть информации при передаче дела. Не нанимайте целый отдел, пока один сотрудник не загружен.</w:t>
+        <w:t xml:space="preserve">Сначала приходит</w:t>
+      </w:r>
+      <w:r>
+        <w:t xml:space="preserve"> </w:t>
+      </w:r>
+      <w:r>
+        <w:rPr>
+          <w:bCs/>
+          <w:b/>
+        </w:rPr>
+        <w:t xml:space="preserve">подготовщик</w:t>
+      </w:r>
+      <w:r>
+        <w:t xml:space="preserve">. Он один раз готовит рабочее место, составляет список задач, заводит отчёт и делает первое сохранение работы. Потом каждую смену приходит</w:t>
+      </w:r>
+      <w:r>
+        <w:t xml:space="preserve"> </w:t>
+      </w:r>
+      <w:r>
+        <w:rPr>
+          <w:bCs/>
+          <w:b/>
+        </w:rPr>
+        <w:t xml:space="preserve">исполнитель</w:t>
+      </w:r>
+      <w:r>
+        <w:t xml:space="preserve">. Он читает журнал и вспоминает, что уже сделано. Берёт самую важную задачу, выполняет её и записывает итог для следующей смены.</w:t>
       </w:r>
     </w:p>
     <w:p>
@@ -1154,17 +1383,17 @@
         <w:pStyle w:val="BodyText"/>
       </w:pPr>
       <w:r>
-        <w:t xml:space="preserve">Теперь мы знаем, как устроен хороший ИИ-сотрудник.</w:t>
-      </w:r>
-      <w:r>
-        <w:t xml:space="preserve"> </w:t>
-      </w:r>
-      <w:r>
-        <w:rPr>
-          <w:bCs/>
-          <w:b/>
-        </w:rPr>
-        <w:t xml:space="preserve">Давайте посмотрим на рынок.</w:t>
+        <w:t xml:space="preserve">Благодаря этому большое дело можно делать частями, и ничего не теряется. Для клиента это значит: непрерывность работы.</w:t>
+      </w:r>
+      <w:r>
+        <w:t xml:space="preserve"> </w:t>
+      </w:r>
+      <w:r>
+        <w:rPr>
+          <w:bCs/>
+          <w:b/>
+        </w:rPr>
+        <w:t xml:space="preserve">Теперь посмотрим, как это продают на рынке.</w:t>
       </w:r>
     </w:p>
     <w:p>
@@ -1196,7 +1425,7 @@
       <w:pPr>
         <w:numPr>
           <w:ilvl w:val="0"/>
-          <w:numId w:val="1006"/>
+          <w:numId w:val="1007"/>
         </w:numPr>
         <w:pStyle w:val="Compact"/>
       </w:pPr>
@@ -1211,14 +1440,14 @@
         <w:t xml:space="preserve"> </w:t>
       </w:r>
       <w:r>
-        <w:t xml:space="preserve">от Anthropic: лёгкая обвязка. Ставка на то, что модель станет умнее, поэтому лишние шаги убирают.</w:t>
-      </w:r>
-    </w:p>
-    <w:p>
-      <w:pPr>
-        <w:numPr>
-          <w:ilvl w:val="0"/>
-          <w:numId w:val="1006"/>
+        <w:t xml:space="preserve">от Anthropic: лёгкий harness. Ставка на то, что модель станет умнее, поэтому лишние шаги убирают.</w:t>
+      </w:r>
+    </w:p>
+    <w:p>
+      <w:pPr>
+        <w:numPr>
+          <w:ilvl w:val="0"/>
+          <w:numId w:val="1007"/>
         </w:numPr>
         <w:pStyle w:val="Compact"/>
       </w:pPr>
@@ -1233,14 +1462,14 @@
         <w:t xml:space="preserve"> </w:t>
       </w:r>
       <w:r>
-        <w:t xml:space="preserve">от OpenAI: одна и та же обвязка работает в терминале, в редакторе и в браузере.</w:t>
-      </w:r>
-    </w:p>
-    <w:p>
-      <w:pPr>
-        <w:numPr>
-          <w:ilvl w:val="0"/>
-          <w:numId w:val="1006"/>
+        <w:t xml:space="preserve">от OpenAI: один и тот же harness работает в терминале, в редакторе и в браузере.</w:t>
+      </w:r>
+    </w:p>
+    <w:p>
+      <w:pPr>
+        <w:numPr>
+          <w:ilvl w:val="0"/>
+          <w:numId w:val="1007"/>
         </w:numPr>
         <w:pStyle w:val="Compact"/>
       </w:pPr>
@@ -1262,7 +1491,7 @@
       <w:pPr>
         <w:numPr>
           <w:ilvl w:val="0"/>
-          <w:numId w:val="1006"/>
+          <w:numId w:val="1007"/>
         </w:numPr>
         <w:pStyle w:val="Compact"/>
       </w:pPr>
@@ -1281,7 +1510,7 @@
       <w:pPr>
         <w:numPr>
           <w:ilvl w:val="0"/>
-          <w:numId w:val="1006"/>
+          <w:numId w:val="1007"/>
         </w:numPr>
         <w:pStyle w:val="Compact"/>
       </w:pPr>
@@ -1320,17 +1549,17 @@
         <w:t xml:space="preserve"> </w:t>
       </w:r>
       <w:r>
-        <w:t xml:space="preserve">Конкурентное различие живёт в обвязке.</w:t>
-      </w:r>
-      <w:r>
-        <w:t xml:space="preserve"> </w:t>
-      </w:r>
-      <w:r>
-        <w:rPr>
-          <w:bCs/>
-          <w:b/>
-        </w:rPr>
-        <w:t xml:space="preserve">Но можно ли построить хорошую обвязку один раз и успокоиться?</w:t>
+        <w:t xml:space="preserve">Конкурентное различие живёт в harness.</w:t>
+      </w:r>
+      <w:r>
+        <w:t xml:space="preserve"> </w:t>
+      </w:r>
+      <w:r>
+        <w:rPr>
+          <w:bCs/>
+          <w:b/>
+        </w:rPr>
+        <w:t xml:space="preserve">Но можно ли построить хороший harness один раз и успокоиться?</w:t>
       </w:r>
     </w:p>
     <w:p>
@@ -1363,7 +1592,7 @@
         <w:pStyle w:val="BodyText"/>
       </w:pPr>
       <w:r>
-        <w:t xml:space="preserve">С обвязкой то же. Модели умнеют, и обвязка должна становиться проще. Продукт Manus за полгода переделывали пять раз, и каждый раз убирали лишнее. В Claude Code убирают шаги, которые модель научилась делать сама. На графике видно: чем сильнее модель, тем тоньше нужна обвязка. Это схема по смыслу статьи, без точных цифр, я специально это подписал.</w:t>
+        <w:t xml:space="preserve">С harness то же. Модели умнеют, и harness должен становиться проще. Продукт Manus за полгода переделывали пять раз, и каждый раз убирали лишнее. В Claude Code убирают шаги, которые модель научилась делать сама. На графике видно: чем сильнее модель, тем тоньше нужен harness. Это схема по смыслу статьи, без точных цифр, я специально это подписал.</w:t>
       </w:r>
     </w:p>
     <w:p>
@@ -1381,7 +1610,7 @@
           <w:bCs/>
           <w:b/>
         </w:rPr>
-        <w:t xml:space="preserve">преимущество в обвязке нельзя создать один раз.</w:t>
+        <w:t xml:space="preserve">преимущество в harness нельзя создать один раз.</w:t>
       </w:r>
       <w:r>
         <w:t xml:space="preserve"> </w:t>
@@ -1398,13 +1627,13 @@
       </w:r>
     </w:p>
     <w:bookmarkEnd w:id="33"/>
-    <w:bookmarkStart w:id="34" w:name="X80a4a4adefed9ddc8503e3981517a5ef38c894a"/>
+    <w:bookmarkStart w:id="34" w:name="Xcc1f5c66928a36c5424a940df18088277c628fc"/>
     <w:p>
       <w:pPr>
         <w:pStyle w:val="Heading2"/>
       </w:pPr>
       <w:r>
-        <w:t xml:space="preserve">Слайд 14. Вывод: модель — товар, обвязка — продукт</w:t>
+        <w:t xml:space="preserve">Слайд 14. Вывод: модель — товар, harness — продукт</w:t>
       </w:r>
     </w:p>
     <w:p>
@@ -1419,7 +1648,7 @@
       <w:pPr>
         <w:numPr>
           <w:ilvl w:val="0"/>
-          <w:numId w:val="1007"/>
+          <w:numId w:val="1008"/>
         </w:numPr>
         <w:pStyle w:val="Compact"/>
       </w:pPr>
@@ -1444,24 +1673,24 @@
       <w:pPr>
         <w:numPr>
           <w:ilvl w:val="0"/>
-          <w:numId w:val="1007"/>
-        </w:numPr>
-        <w:pStyle w:val="Compact"/>
-      </w:pPr>
-      <w:r>
-        <w:t xml:space="preserve">Поэтому отличие уходит в обвязку: на одной и той же модели продукты работают по-разному.</w:t>
-      </w:r>
-    </w:p>
-    <w:p>
-      <w:pPr>
-        <w:numPr>
-          <w:ilvl w:val="0"/>
-          <w:numId w:val="1007"/>
-        </w:numPr>
-        <w:pStyle w:val="Compact"/>
-      </w:pPr>
-      <w:r>
-        <w:t xml:space="preserve">Обвязку трудно скопировать, в ней опыт и ошибки команды. Это и есть преимущество.</w:t>
+          <w:numId w:val="1008"/>
+        </w:numPr>
+        <w:pStyle w:val="Compact"/>
+      </w:pPr>
+      <w:r>
+        <w:t xml:space="preserve">Поэтому отличие уходит в harness: на одной и той же модели продукты работают по-разному.</w:t>
+      </w:r>
+    </w:p>
+    <w:p>
+      <w:pPr>
+        <w:numPr>
+          <w:ilvl w:val="0"/>
+          <w:numId w:val="1008"/>
+        </w:numPr>
+        <w:pStyle w:val="Compact"/>
+      </w:pPr>
+      <w:r>
+        <w:t xml:space="preserve">Harness трудно скопировать, в нём опыт и ошибки команды. Это и есть преимущество.</w:t>
       </w:r>
     </w:p>
     <w:p>
@@ -1476,7 +1705,7 @@
       <w:pPr>
         <w:numPr>
           <w:ilvl w:val="0"/>
-          <w:numId w:val="1008"/>
+          <w:numId w:val="1009"/>
         </w:numPr>
         <w:pStyle w:val="Compact"/>
       </w:pPr>
@@ -1504,7 +1733,7 @@
       <w:pPr>
         <w:numPr>
           <w:ilvl w:val="0"/>
-          <w:numId w:val="1008"/>
+          <w:numId w:val="1009"/>
         </w:numPr>
         <w:pStyle w:val="Compact"/>
       </w:pPr>
@@ -1532,7 +1761,7 @@
       <w:pPr>
         <w:numPr>
           <w:ilvl w:val="0"/>
-          <w:numId w:val="1008"/>
+          <w:numId w:val="1009"/>
         </w:numPr>
         <w:pStyle w:val="Compact"/>
       </w:pPr>
@@ -1560,7 +1789,7 @@
       <w:pPr>
         <w:numPr>
           <w:ilvl w:val="0"/>
-          <w:numId w:val="1008"/>
+          <w:numId w:val="1009"/>
         </w:numPr>
         <w:pStyle w:val="Compact"/>
       </w:pPr>
@@ -1586,7 +1815,7 @@
         <w:pStyle w:val="FirstParagraph"/>
       </w:pPr>
       <w:r>
-        <w:t xml:space="preserve">Если продавец уверенно отвечает, за красивой моделью стоит продуманная обвязка. Известная маркетинговая фраза говорит: людям нужна не дрель, а дырка в стене. Так и здесь: клиенту продают не «доступ к ИИ», а</w:t>
+        <w:t xml:space="preserve">Если продавец уверенно отвечает, за красивой моделью стоит продуманный harness. Известная маркетинговая фраза говорит: людям нужна не дрель, а дырка в стене. Так и здесь: клиенту продают не «доступ к ИИ», а</w:t>
       </w:r>
       <w:r>
         <w:t xml:space="preserve"> </w:t>
@@ -1631,7 +1860,7 @@
           <w:bCs/>
           <w:b/>
         </w:rPr>
-        <w:t xml:space="preserve">когда ИИ-агент в следующий раз даст сбой, не вините модель. Смотрите на обвязку.</w:t>
+        <w:t xml:space="preserve">когда ИИ-агент в следующий раз даст сбой, не вините модель. Смотрите на harness.</w:t>
       </w:r>
     </w:p>
     <w:p>
@@ -1678,6 +1907,24 @@
           <w:bCs/>
           <w:b/>
         </w:rPr>
+        <w:t xml:space="preserve">Что такое harness, если совсем коротко?</w:t>
+      </w:r>
+      <w:r>
+        <w:t xml:space="preserve"> </w:t>
+      </w:r>
+      <w:r>
+        <w:t xml:space="preserve">Программа, которая управляет ИИ-моделью: отправляет ей задачу, даёт инструменты, хранит память, проверяет результат и следит за правилами. Модель думает, harness действует.</w:t>
+      </w:r>
+    </w:p>
+    <w:p>
+      <w:pPr>
+        <w:pStyle w:val="BodyText"/>
+      </w:pPr>
+      <w:r>
+        <w:rPr>
+          <w:bCs/>
+          <w:b/>
+        </w:rPr>
         <w:t xml:space="preserve">Что такое «агент» простыми словами?</w:t>
       </w:r>
       <w:r>
@@ -1696,13 +1943,31 @@
           <w:bCs/>
           <w:b/>
         </w:rPr>
+        <w:t xml:space="preserve">Чем harness отличается от самой модели?</w:t>
+      </w:r>
+      <w:r>
+        <w:t xml:space="preserve"> </w:t>
+      </w:r>
+      <w:r>
+        <w:t xml:space="preserve">Модель — это «мозг»: она только читает и пишет текст. Всё, что связано с действиями (открыть почту, запомнить, проверить, спросить разрешение), делает harness.</w:t>
+      </w:r>
+    </w:p>
+    <w:p>
+      <w:pPr>
+        <w:pStyle w:val="BodyText"/>
+      </w:pPr>
+      <w:r>
+        <w:rPr>
+          <w:bCs/>
+          <w:b/>
+        </w:rPr>
         <w:t xml:space="preserve">Это только для программистов?</w:t>
       </w:r>
       <w:r>
         <w:t xml:space="preserve"> </w:t>
       </w:r>
       <w:r>
-        <w:t xml:space="preserve">Примеры в статье в основном из программирования: там проще измерять результат. Но принцип общий: если ИИ должен что-то делать сам, ему нужна обвязка.</w:t>
+        <w:t xml:space="preserve">Примеры в статье в основном из программирования: там проще измерять результат. Но принцип общий: если ИИ должен что-то делать сам, ему нужен harness. Пример с почтой — учебная иллюстрация.</w:t>
       </w:r>
     </w:p>
     <w:p>
@@ -1720,7 +1985,7 @@
         <w:t xml:space="preserve"> </w:t>
       </w:r>
       <w:r>
-        <w:t xml:space="preserve">Сильная модель в плохой обвязке проигрывает средней в хорошей. LangChain это показал: модель та же, место в рейтинге изменилось с 30+ на 5.</w:t>
+        <w:t xml:space="preserve">Сильная модель в плохом harness проигрывает средней в хорошем. LangChain это показал: модель та же, место в рейтинге изменилось с 30+ на 5.</w:t>
       </w:r>
     </w:p>
     <w:p>
@@ -1862,7 +2127,7 @@
               <w:jc w:val="left"/>
             </w:pPr>
             <w:r>
-              <w:t xml:space="preserve">Harness, обвязка</w:t>
+              <w:t xml:space="preserve">Harness</w:t>
             </w:r>
           </w:p>
         </w:tc>
@@ -1874,7 +2139,7 @@
               <w:jc w:val="left"/>
             </w:pPr>
             <w:r>
-              <w:t xml:space="preserve">Всё вокруг модели: инструменты, память, проверки, правила</w:t>
+              <w:t xml:space="preserve">Программа вокруг модели: даёт инструменты, хранит память, проверяет, следит за правилами</w:t>
             </w:r>
           </w:p>
         </w:tc>
@@ -1972,7 +2237,7 @@
       <w:pPr>
         <w:numPr>
           <w:ilvl w:val="0"/>
-          <w:numId w:val="1009"/>
+          <w:numId w:val="1010"/>
         </w:numPr>
         <w:pStyle w:val="Compact"/>
       </w:pPr>
@@ -1984,7 +2249,7 @@
       <w:pPr>
         <w:numPr>
           <w:ilvl w:val="0"/>
-          <w:numId w:val="1009"/>
+          <w:numId w:val="1010"/>
         </w:numPr>
         <w:pStyle w:val="Compact"/>
       </w:pPr>
@@ -1996,7 +2261,7 @@
       <w:pPr>
         <w:numPr>
           <w:ilvl w:val="0"/>
-          <w:numId w:val="1009"/>
+          <w:numId w:val="1010"/>
         </w:numPr>
         <w:pStyle w:val="Compact"/>
       </w:pPr>
@@ -2008,19 +2273,31 @@
       <w:pPr>
         <w:numPr>
           <w:ilvl w:val="0"/>
-          <w:numId w:val="1009"/>
-        </w:numPr>
-        <w:pStyle w:val="Compact"/>
-      </w:pPr>
-      <w:r>
-        <w:t xml:space="preserve">Если не хватает времени, слайды 10 и 11 рассказывайте за 30 секунд каждый.</w:t>
-      </w:r>
-    </w:p>
-    <w:p>
-      <w:pPr>
-        <w:numPr>
-          <w:ilvl w:val="0"/>
-          <w:numId w:val="1009"/>
+          <w:numId w:val="1010"/>
+        </w:numPr>
+        <w:pStyle w:val="Compact"/>
+      </w:pPr>
+      <w:r>
+        <w:t xml:space="preserve">Слайды 4 и 5 — самые важные для понимания: здесь не спешите.</w:t>
+      </w:r>
+    </w:p>
+    <w:p>
+      <w:pPr>
+        <w:numPr>
+          <w:ilvl w:val="0"/>
+          <w:numId w:val="1010"/>
+        </w:numPr>
+        <w:pStyle w:val="Compact"/>
+      </w:pPr>
+      <w:r>
+        <w:t xml:space="preserve">Если не хватает времени, слайды 11 и 13 рассказывайте за 30 секунд каждый.</w:t>
+      </w:r>
+    </w:p>
+    <w:p>
+      <w:pPr>
+        <w:numPr>
+          <w:ilvl w:val="0"/>
+          <w:numId w:val="1010"/>
         </w:numPr>
         <w:pStyle w:val="Compact"/>
       </w:pPr>
@@ -2304,7 +2581,34 @@
     <w:abstractNumId w:val="991"/>
   </w:num>
   <w:num w:numId="1002">
-    <w:abstractNumId w:val="991"/>
+    <w:abstractNumId w:val="99411"/>
+    <w:lvlOverride w:ilvl="0">
+      <w:startOverride w:val="1"/>
+    </w:lvlOverride>
+    <w:lvlOverride w:ilvl="1">
+      <w:startOverride w:val="1"/>
+    </w:lvlOverride>
+    <w:lvlOverride w:ilvl="2">
+      <w:startOverride w:val="1"/>
+    </w:lvlOverride>
+    <w:lvlOverride w:ilvl="3">
+      <w:startOverride w:val="1"/>
+    </w:lvlOverride>
+    <w:lvlOverride w:ilvl="4">
+      <w:startOverride w:val="1"/>
+    </w:lvlOverride>
+    <w:lvlOverride w:ilvl="5">
+      <w:startOverride w:val="1"/>
+    </w:lvlOverride>
+    <w:lvlOverride w:ilvl="6">
+      <w:startOverride w:val="1"/>
+    </w:lvlOverride>
+    <w:lvlOverride w:ilvl="7">
+      <w:startOverride w:val="1"/>
+    </w:lvlOverride>
+    <w:lvlOverride w:ilvl="8">
+      <w:startOverride w:val="1"/>
+    </w:lvlOverride>
   </w:num>
   <w:num w:numId="1003">
     <w:abstractNumId w:val="99411"/>
@@ -2397,9 +2701,39 @@
     </w:lvlOverride>
   </w:num>
   <w:num w:numId="1006">
+    <w:abstractNumId w:val="99411"/>
+    <w:lvlOverride w:ilvl="0">
+      <w:startOverride w:val="1"/>
+    </w:lvlOverride>
+    <w:lvlOverride w:ilvl="1">
+      <w:startOverride w:val="1"/>
+    </w:lvlOverride>
+    <w:lvlOverride w:ilvl="2">
+      <w:startOverride w:val="1"/>
+    </w:lvlOverride>
+    <w:lvlOverride w:ilvl="3">
+      <w:startOverride w:val="1"/>
+    </w:lvlOverride>
+    <w:lvlOverride w:ilvl="4">
+      <w:startOverride w:val="1"/>
+    </w:lvlOverride>
+    <w:lvlOverride w:ilvl="5">
+      <w:startOverride w:val="1"/>
+    </w:lvlOverride>
+    <w:lvlOverride w:ilvl="6">
+      <w:startOverride w:val="1"/>
+    </w:lvlOverride>
+    <w:lvlOverride w:ilvl="7">
+      <w:startOverride w:val="1"/>
+    </w:lvlOverride>
+    <w:lvlOverride w:ilvl="8">
+      <w:startOverride w:val="1"/>
+    </w:lvlOverride>
+  </w:num>
+  <w:num w:numId="1007">
     <w:abstractNumId w:val="991"/>
   </w:num>
-  <w:num w:numId="1007">
+  <w:num w:numId="1008">
     <w:abstractNumId w:val="99411"/>
     <w:lvlOverride w:ilvl="0">
       <w:startOverride w:val="1"/>
@@ -2429,10 +2763,10 @@
       <w:startOverride w:val="1"/>
     </w:lvlOverride>
   </w:num>
-  <w:num w:numId="1008">
+  <w:num w:numId="1009">
     <w:abstractNumId w:val="991"/>
   </w:num>
-  <w:num w:numId="1009">
+  <w:num w:numId="1010">
     <w:abstractNumId w:val="991"/>
   </w:num>
 </w:numbering>

</xml_diff>

<commit_message>
Slide 7: concrete component table based on Claude Code; update speech
Co-Authored-By: Claude Sonnet 5.5 <noreply@anthropic.com>
Claude-Session: https://claude.ai/code/session_01JHAi78QVA9c3PviMoRDJFz
</commit_message>
<xml_diff>
--- a/harness/Doklad-Harness.docx
+++ b/harness/Doklad-Harness.docx
@@ -873,13 +873,13 @@
       </w:r>
     </w:p>
     <w:bookmarkEnd w:id="26"/>
-    <w:bookmarkStart w:id="27" w:name="слайд-7.-из-чего-состоит-harness"/>
+    <w:bookmarkStart w:id="27" w:name="Xbb25d05dd0b7b840f6c598007f04731cb027f08"/>
     <w:p>
       <w:pPr>
         <w:pStyle w:val="Heading2"/>
       </w:pPr>
       <w:r>
-        <w:t xml:space="preserve">Слайд 7. Из чего состоит harness</w:t>
+        <w:t xml:space="preserve">Слайд 7. Из чего состоит harness: на примере Claude Code</w:t>
       </w:r>
     </w:p>
     <w:p>
@@ -887,7 +887,7 @@
         <w:pStyle w:val="FirstParagraph"/>
       </w:pPr>
       <w:r>
-        <w:t xml:space="preserve">Представьте, что вы делаете карточку товара на маркетплейсе. Какие характеристики записали бы? У harness их четыре.</w:t>
+        <w:t xml:space="preserve">Мы поняли, что harness — программа. Теперь заглянем внутрь, на реальном примере: Claude Code от Anthropic. Здесь шесть частей. Сначала самое важное, потом по таблице.</w:t>
       </w:r>
     </w:p>
     <w:p>
@@ -903,13 +903,25 @@
           <w:bCs/>
           <w:b/>
         </w:rPr>
-        <w:t xml:space="preserve">Руки.</w:t>
-      </w:r>
-      <w:r>
-        <w:t xml:space="preserve"> </w:t>
-      </w:r>
-      <w:r>
-        <w:t xml:space="preserve">ИИ умеет не только говорить, но и делать: открывает файлы, ищет в интернете, запускает программы.</w:t>
+        <w:t xml:space="preserve">Цикл.</w:t>
+      </w:r>
+      <w:r>
+        <w:t xml:space="preserve"> </w:t>
+      </w:r>
+      <w:r>
+        <w:t xml:space="preserve">Это обычный</w:t>
+      </w:r>
+      <w:r>
+        <w:t xml:space="preserve"> </w:t>
+      </w:r>
+      <w:r>
+        <w:rPr>
+          <w:rStyle w:val="VerbatimChar"/>
+        </w:rPr>
+        <w:t xml:space="preserve">while</w:t>
+      </w:r>
+      <w:r>
+        <w:t xml:space="preserve">, который повторяет «запрос → модель → инструмент», пока задача не решена. В Anthropic его в шутку называют «тупым»: весь ум в модели.</w:t>
       </w:r>
     </w:p>
     <w:p>
@@ -925,13 +937,13 @@
           <w:bCs/>
           <w:b/>
         </w:rPr>
-        <w:t xml:space="preserve">Блокнот.</w:t>
-      </w:r>
-      <w:r>
-        <w:t xml:space="preserve"> </w:t>
-      </w:r>
-      <w:r>
-        <w:t xml:space="preserve">Он помнит, о чём договорились: хранит записи, ведёт список задач.</w:t>
+        <w:t xml:space="preserve">Инструменты.</w:t>
+      </w:r>
+      <w:r>
+        <w:t xml:space="preserve"> </w:t>
+      </w:r>
+      <w:r>
+        <w:t xml:space="preserve">Модель сама ничего не запускает. Она просит: «вызови такой-то инструмент», а harness это выполняет. В Claude Code шесть групп инструментов: файлы, поиск, команды, веб, анализ кода и запуск субагентов.</w:t>
       </w:r>
     </w:p>
     <w:p>
@@ -947,13 +959,40 @@
           <w:bCs/>
           <w:b/>
         </w:rPr>
-        <w:t xml:space="preserve">Контролёр.</w:t>
-      </w:r>
-      <w:r>
-        <w:t xml:space="preserve"> </w:t>
-      </w:r>
-      <w:r>
-        <w:t xml:space="preserve">Проверяет свою работу и ловит ошибки до того, как их увидит клиент.</w:t>
+        <w:t xml:space="preserve">Память.</w:t>
+      </w:r>
+      <w:r>
+        <w:t xml:space="preserve"> </w:t>
+      </w:r>
+      <w:r>
+        <w:t xml:space="preserve">Это два файла,</w:t>
+      </w:r>
+      <w:r>
+        <w:t xml:space="preserve"> </w:t>
+      </w:r>
+      <w:r>
+        <w:rPr>
+          <w:rStyle w:val="VerbatimChar"/>
+        </w:rPr>
+        <w:t xml:space="preserve">CLAUDE.md</w:t>
+      </w:r>
+      <w:r>
+        <w:t xml:space="preserve"> </w:t>
+      </w:r>
+      <w:r>
+        <w:t xml:space="preserve">и</w:t>
+      </w:r>
+      <w:r>
+        <w:t xml:space="preserve"> </w:t>
+      </w:r>
+      <w:r>
+        <w:rPr>
+          <w:rStyle w:val="VerbatimChar"/>
+        </w:rPr>
+        <w:t xml:space="preserve">MEMORY.md</w:t>
+      </w:r>
+      <w:r>
+        <w:t xml:space="preserve">: короткий индекс, подробные файлы по темам и архив для поиска. Благодаря им агент помнит проект между сессиями.</w:t>
       </w:r>
     </w:p>
     <w:p>
@@ -969,13 +1008,69 @@
           <w:bCs/>
           <w:b/>
         </w:rPr>
-        <w:t xml:space="preserve">Пропуск.</w:t>
-      </w:r>
-      <w:r>
-        <w:t xml:space="preserve"> </w:t>
-      </w:r>
-      <w:r>
-        <w:t xml:space="preserve">Знает, что ему разрешено: что делает сам, а что только с одобрения человека.</w:t>
+        <w:t xml:space="preserve">Контекст.</w:t>
+      </w:r>
+      <w:r>
+        <w:t xml:space="preserve"> </w:t>
+      </w:r>
+      <w:r>
+        <w:t xml:space="preserve">Окно модели ограничено, поэтому harness сжимает историю и ищет нужное через</w:t>
+      </w:r>
+      <w:r>
+        <w:t xml:space="preserve"> </w:t>
+      </w:r>
+      <w:r>
+        <w:rPr>
+          <w:rStyle w:val="VerbatimChar"/>
+        </w:rPr>
+        <w:t xml:space="preserve">grep</w:t>
+      </w:r>
+      <w:r>
+        <w:t xml:space="preserve">, а не читает файлы целиком.</w:t>
+      </w:r>
+    </w:p>
+    <w:p>
+      <w:pPr>
+        <w:numPr>
+          <w:ilvl w:val="0"/>
+          <w:numId w:val="1005"/>
+        </w:numPr>
+        <w:pStyle w:val="Compact"/>
+      </w:pPr>
+      <w:r>
+        <w:rPr>
+          <w:bCs/>
+          <w:b/>
+        </w:rPr>
+        <w:t xml:space="preserve">Проверка.</w:t>
+      </w:r>
+      <w:r>
+        <w:t xml:space="preserve"> </w:t>
+      </w:r>
+      <w:r>
+        <w:t xml:space="preserve">Тесты, линтеры, скриншоты, а иногда второй ИИ как судья. Если инструмент упал, ошибка возвращается модели как обычный результат, и она может исправиться.</w:t>
+      </w:r>
+    </w:p>
+    <w:p>
+      <w:pPr>
+        <w:numPr>
+          <w:ilvl w:val="0"/>
+          <w:numId w:val="1005"/>
+        </w:numPr>
+        <w:pStyle w:val="Compact"/>
+      </w:pPr>
+      <w:r>
+        <w:rPr>
+          <w:bCs/>
+          <w:b/>
+        </w:rPr>
+        <w:t xml:space="preserve">Права.</w:t>
+      </w:r>
+      <w:r>
+        <w:t xml:space="preserve"> </w:t>
+      </w:r>
+      <w:r>
+        <w:t xml:space="preserve">Около сорока возможностей Claude Code проверяются отдельно, а для рискованных действий нужно подтверждение человека.</w:t>
       </w:r>
     </w:p>
     <w:p>
@@ -983,17 +1078,25 @@
         <w:pStyle w:val="FirstParagraph"/>
       </w:pPr>
       <w:r>
-        <w:t xml:space="preserve">Это мой упрощённый вариант. В статье, по которой я готовил доклад, таких частей одиннадцать, я собрал их в четыре. И это именно характеристики для карточки сравнения.</w:t>
-      </w:r>
-      <w:r>
-        <w:t xml:space="preserve"> </w:t>
-      </w:r>
-      <w:r>
-        <w:rPr>
-          <w:bCs/>
-          <w:b/>
-        </w:rPr>
-        <w:t xml:space="preserve">Но как такой сотрудник работает?</w:t>
+        <w:t xml:space="preserve">Для тех, кто любит полноту: в статье таких частей одиннадцать, я показал шесть главных. В скобках на слайде стоят наши образы: «руки», «блокнот», «контролёр», «пропуск». Они помогают запомнить, но настоящие названия вы видите слева.</w:t>
+      </w:r>
+    </w:p>
+    <w:p>
+      <w:pPr>
+        <w:pStyle w:val="BodyText"/>
+      </w:pPr>
+      <w:r>
+        <w:t xml:space="preserve">Маркетологу это даёт готовый список вопросов: когда вам продают ИИ-продукт, спрашивайте, какие из этих частей в нём есть и насколько они проработаны.</w:t>
+      </w:r>
+      <w:r>
+        <w:t xml:space="preserve"> </w:t>
+      </w:r>
+      <w:r>
+        <w:rPr>
+          <w:bCs/>
+          <w:b/>
+        </w:rPr>
+        <w:t xml:space="preserve">А как такой harness работает во времени?</w:t>
       </w:r>
     </w:p>
     <w:p>

</xml_diff>

<commit_message>
Rebuild presentation from scratch: blueprint/poster style, 18 slides with varied layouts; new speech
Co-Authored-By: Claude Sonnet 5.5 <noreply@anthropic.com>
Claude-Session: https://claude.ai/code/session_01JHAi78QVA9c3PviMoRDJFz
</commit_message>
<xml_diff>
--- a/harness/Doklad-Harness.docx
+++ b/harness/Doklad-Harness.docx
@@ -2,7 +2,7 @@
 <file path=word/document.xml><?xml version="1.0" encoding="utf-8"?>
 <w:document xmlns:w="http://schemas.openxmlformats.org/wordprocessingml/2006/main" xmlns:m="http://schemas.openxmlformats.org/officeDocument/2006/math" xmlns:r="http://schemas.openxmlformats.org/officeDocument/2006/relationships" xmlns:o="urn:schemas-microsoft-com:office:office" xmlns:v="urn:schemas-microsoft-com:vml" xmlns:w10="urn:schemas-microsoft-com:office:word" xmlns:a="http://schemas.openxmlformats.org/drawingml/2006/main" xmlns:pic="http://schemas.openxmlformats.org/drawingml/2006/picture" xmlns:wp="http://schemas.openxmlformats.org/drawingml/2006/wordprocessingDrawing">
   <w:body>
-    <w:bookmarkStart w:id="36" w:name="X629d0992977e639803607b7e6d671af564ee6f1"/>
+    <w:bookmarkStart w:id="39" w:name="X629d0992977e639803607b7e6d671af564ee6f1"/>
     <w:p>
       <w:pPr>
         <w:pStyle w:val="Heading1"/>
@@ -26,7 +26,7 @@
         <w:t xml:space="preserve"> </w:t>
       </w:r>
       <w:r>
-        <w:t xml:space="preserve">около 13 минут, 15 слайдов.</w:t>
+        <w:t xml:space="preserve">около 15 минут, 18 слайдов.</w:t>
       </w:r>
       <w:r>
         <w:t xml:space="preserve"> </w:t>
@@ -42,7 +42,23 @@
         <w:t xml:space="preserve"> </w:t>
       </w:r>
       <w:r>
-        <w:t xml:space="preserve">студенты и преподаватель по маркетингу. Код знать не нужно.</w:t>
+        <w:t xml:space="preserve">студенты БГУИР и преподаватель по маркетингу программных продуктов.</w:t>
+      </w:r>
+      <w:r>
+        <w:t xml:space="preserve"> </w:t>
+      </w:r>
+      <w:r>
+        <w:rPr>
+          <w:bCs/>
+          <w:b/>
+        </w:rPr>
+        <w:t xml:space="preserve">Формат:</w:t>
+      </w:r>
+      <w:r>
+        <w:t xml:space="preserve"> </w:t>
+      </w:r>
+      <w:r>
+        <w:t xml:space="preserve">теория → примеры → маркетинг. Эти три линии чередуются. На каждом слайде внизу оранжевая плашка «Для маркетолога»: её стоит произносить вслух, она связывает техническую часть с предметом.</w:t>
       </w:r>
     </w:p>
     <w:bookmarkStart w:id="20" w:name="красная-нить"/>
@@ -59,7 +75,7 @@
         <w:pStyle w:val="FirstParagraph"/>
       </w:pPr>
       <w:r>
-        <w:t xml:space="preserve">Весь доклад держится на одной картинке:</w:t>
+        <w:t xml:space="preserve">Доклад начинается с опроса (слайд 2) и заканчивается ответом на него (слайд 17). В середине один образ:</w:t>
       </w:r>
       <w:r>
         <w:t xml:space="preserve"> </w:t>
@@ -71,95 +87,19 @@
         </w:rPr>
         <w:t xml:space="preserve">ИИ — это новый сотрудник.</w:t>
       </w:r>
-    </w:p>
-    <w:p>
-      <w:pPr>
-        <w:numPr>
-          <w:ilvl w:val="0"/>
-          <w:numId w:val="1001"/>
-        </w:numPr>
-        <w:pStyle w:val="Compact"/>
-      </w:pPr>
-      <w:r>
-        <w:rPr>
-          <w:bCs/>
-          <w:b/>
-        </w:rPr>
-        <w:t xml:space="preserve">Модель</w:t>
-      </w:r>
-      <w:r>
-        <w:t xml:space="preserve"> </w:t>
-      </w:r>
-      <w:r>
-        <w:t xml:space="preserve">— гениальный выпускник. Прочитал все книги мира, но в пустой комнате работать не может.</w:t>
-      </w:r>
-    </w:p>
-    <w:p>
-      <w:pPr>
-        <w:numPr>
-          <w:ilvl w:val="0"/>
-          <w:numId w:val="1001"/>
-        </w:numPr>
-        <w:pStyle w:val="Compact"/>
-      </w:pPr>
-      <w:r>
-        <w:rPr>
-          <w:bCs/>
-          <w:b/>
-        </w:rPr>
-        <w:t xml:space="preserve">Harness</w:t>
-      </w:r>
-      <w:r>
-        <w:t xml:space="preserve"> </w:t>
-      </w:r>
-      <w:r>
-        <w:t xml:space="preserve">— его рабочее место: программа с инструментами, блокнотом, проверкой и доступами.</w:t>
-      </w:r>
-    </w:p>
-    <w:p>
-      <w:pPr>
-        <w:numPr>
-          <w:ilvl w:val="0"/>
-          <w:numId w:val="1001"/>
-        </w:numPr>
-        <w:pStyle w:val="Compact"/>
-      </w:pPr>
-      <w:r>
-        <w:rPr>
-          <w:bCs/>
-          <w:b/>
-        </w:rPr>
-        <w:t xml:space="preserve">Агент</w:t>
-      </w:r>
-      <w:r>
-        <w:t xml:space="preserve"> </w:t>
-      </w:r>
-      <w:r>
-        <w:t xml:space="preserve">— выпускник</w:t>
-      </w:r>
-      <w:r>
-        <w:t xml:space="preserve"> </w:t>
-      </w:r>
-      <w:r>
-        <w:rPr>
-          <w:iCs/>
-          <w:i/>
-        </w:rPr>
-        <w:t xml:space="preserve">плюс</w:t>
-      </w:r>
-      <w:r>
-        <w:t xml:space="preserve"> </w:t>
-      </w:r>
-      <w:r>
-        <w:t xml:space="preserve">рабочее место. То есть настоящий сотрудник, который доводит дело до конца.</w:t>
-      </w:r>
-    </w:p>
-    <w:p>
-      <w:pPr>
-        <w:pStyle w:val="FirstParagraph"/>
-      </w:pPr>
-      <w:r>
-        <w:t xml:space="preserve">Слово harness в докладе не заменяем: произносим его как есть. Перевод («обвязка», дословно «упряжь») называем</w:t>
+      <w:r>
+        <w:t xml:space="preserve"> </w:t>
+      </w:r>
+      <w:r>
+        <w:t xml:space="preserve">Модель — выпускник, harness — его рабочее место, агент — сотрудник.</w:t>
+      </w:r>
+    </w:p>
+    <w:p>
+      <w:pPr>
+        <w:pStyle w:val="BodyText"/>
+      </w:pPr>
+      <w:r>
+        <w:t xml:space="preserve">Слово harness не заменяем. Перевод «обвязка» называем</w:t>
       </w:r>
       <w:r>
         <w:t xml:space="preserve"> </w:t>
@@ -172,7 +112,7 @@
         <w:t xml:space="preserve">один раз</w:t>
       </w:r>
       <w:r>
-        <w:t xml:space="preserve">, на слайде 4.</w:t>
+        <w:t xml:space="preserve">, на слайде 5.</w:t>
       </w:r>
     </w:p>
     <w:p>
@@ -180,7 +120,7 @@
         <w:pStyle w:val="BodyText"/>
       </w:pPr>
       <w:r>
-        <w:t xml:space="preserve">Каждый слайд отвечает на вопрос, который родился на предыдущем. Эти вопросы-связки выделены</w:t>
+        <w:t xml:space="preserve">Вопросы-связки между слайдами выделены</w:t>
       </w:r>
       <w:r>
         <w:t xml:space="preserve"> </w:t>
@@ -193,7 +133,7 @@
         <w:t xml:space="preserve">жирным</w:t>
       </w:r>
       <w:r>
-        <w:t xml:space="preserve">: произносите их вслух. А на плашке «Маркетинг» внизу слайда есть вывод для вашего предмета: его тоже стоит произносить.</w:t>
+        <w:t xml:space="preserve">: говорите их вслух.</w:t>
       </w:r>
     </w:p>
     <w:p>
@@ -222,7 +162,7 @@
           <w:iCs/>
           <w:i/>
         </w:rPr>
-        <w:t xml:space="preserve">(Улыбнуться, пауза.)</w:t>
+        <w:t xml:space="preserve">(Пауза. Посмотреть в зал.)</w:t>
       </w:r>
     </w:p>
     <w:p>
@@ -230,15 +170,7 @@
         <w:pStyle w:val="BodyText"/>
       </w:pPr>
       <w:r>
-        <w:t xml:space="preserve">Добрый день! Меня зовут Владислав. Представьте, что вы директор компании и выбираете ИИ-помощника. Все предлагают вам «умную нейросеть». По какому признаку вы будете выбирать?</w:t>
-      </w:r>
-    </w:p>
-    <w:p>
-      <w:pPr>
-        <w:pStyle w:val="BodyText"/>
-      </w:pPr>
-      <w:r>
-        <w:t xml:space="preserve">Вот об этом мой доклад, и ответ может вас удивить.</w:t>
+        <w:t xml:space="preserve">Добрый день! Меня зовут Владислав, и сегодня я расскажу про слово, которого нет в рекламе ИИ-продуктов, но от которого зависит, хороший продукт или плохой. Слово называется harness. Прямо сейчас оно вам ничего не говорит, и это нормально. К концу доклада вы будете использовать его как термин.</w:t>
       </w:r>
     </w:p>
     <w:p>
@@ -249,13 +181,13 @@
       </w:r>
     </w:p>
     <w:bookmarkEnd w:id="21"/>
-    <w:bookmarkStart w:id="22" w:name="слайд-2.-вопрос-модель-у-всех-одна"/>
+    <w:bookmarkStart w:id="22" w:name="слайд-2.-опрос"/>
     <w:p>
       <w:pPr>
         <w:pStyle w:val="Heading2"/>
       </w:pPr>
       <w:r>
-        <w:t xml:space="preserve">Слайд 2. Вопрос: модель у всех одна</w:t>
+        <w:t xml:space="preserve">Слайд 2. Опрос</w:t>
       </w:r>
     </w:p>
     <w:p>
@@ -263,7 +195,85 @@
         <w:pStyle w:val="FirstParagraph"/>
       </w:pPr>
       <w:r>
-        <w:t xml:space="preserve">Начнём с факта. Самих «умных моделей» на рынке немного: GPT от OpenAI, Claude от Anthropic, Gemini от Google. И любая компания может встроить их в свой продукт.</w:t>
+        <w:t xml:space="preserve">Начну с вопроса. Представьте, что вы директор компании и выбираете ИИ-помощника. Все предлагают «умную нейросеть». По чему будете выбирать?</w:t>
+      </w:r>
+    </w:p>
+    <w:p>
+      <w:pPr>
+        <w:numPr>
+          <w:ilvl w:val="0"/>
+          <w:numId w:val="1001"/>
+        </w:numPr>
+        <w:pStyle w:val="Compact"/>
+      </w:pPr>
+      <w:r>
+        <w:rPr>
+          <w:bCs/>
+          <w:b/>
+        </w:rPr>
+        <w:t xml:space="preserve">A.</w:t>
+      </w:r>
+      <w:r>
+        <w:t xml:space="preserve"> </w:t>
+      </w:r>
+      <w:r>
+        <w:t xml:space="preserve">Какая модель внутри: GPT, Claude или Gemini.</w:t>
+      </w:r>
+    </w:p>
+    <w:p>
+      <w:pPr>
+        <w:numPr>
+          <w:ilvl w:val="0"/>
+          <w:numId w:val="1001"/>
+        </w:numPr>
+        <w:pStyle w:val="Compact"/>
+      </w:pPr>
+      <w:r>
+        <w:rPr>
+          <w:bCs/>
+          <w:b/>
+        </w:rPr>
+        <w:t xml:space="preserve">B.</w:t>
+      </w:r>
+      <w:r>
+        <w:t xml:space="preserve"> </w:t>
+      </w:r>
+      <w:r>
+        <w:t xml:space="preserve">Сколько он стоит.</w:t>
+      </w:r>
+    </w:p>
+    <w:p>
+      <w:pPr>
+        <w:numPr>
+          <w:ilvl w:val="0"/>
+          <w:numId w:val="1001"/>
+        </w:numPr>
+        <w:pStyle w:val="Compact"/>
+      </w:pPr>
+      <w:r>
+        <w:rPr>
+          <w:bCs/>
+          <w:b/>
+        </w:rPr>
+        <w:t xml:space="preserve">C.</w:t>
+      </w:r>
+      <w:r>
+        <w:t xml:space="preserve"> </w:t>
+      </w:r>
+      <w:r>
+        <w:t xml:space="preserve">Что он умеет делать сам и насколько надёжно.</w:t>
+      </w:r>
+    </w:p>
+    <w:p>
+      <w:pPr>
+        <w:pStyle w:val="FirstParagraph"/>
+      </w:pPr>
+      <w:r>
+        <w:rPr>
+          <w:iCs/>
+          <w:i/>
+        </w:rPr>
+        <w:t xml:space="preserve">(Поднять руки за каждый вариант. Запомнить, кого больше. Не комментировать ответ.)</w:t>
       </w:r>
     </w:p>
     <w:p>
@@ -271,33 +281,7 @@
         <w:pStyle w:val="BodyText"/>
       </w:pPr>
       <w:r>
-        <w:t xml:space="preserve">Это как мука. У всех пекарен она одна и та же, а хлеб получается разный.</w:t>
-      </w:r>
-    </w:p>
-    <w:p>
-      <w:pPr>
-        <w:pStyle w:val="BodyText"/>
-      </w:pPr>
-      <w:r>
-        <w:t xml:space="preserve">Поэтому главный вопрос доклада такой:</w:t>
-      </w:r>
-      <w:r>
-        <w:t xml:space="preserve"> </w:t>
-      </w:r>
-      <w:r>
-        <w:rPr>
-          <w:bCs/>
-          <w:b/>
-        </w:rPr>
-        <w:t xml:space="preserve">почему один ИИ-продукт работает лучше другого, если «мозг» у них одинаковый?</w:t>
-      </w:r>
-    </w:p>
-    <w:p>
-      <w:pPr>
-        <w:pStyle w:val="BodyText"/>
-      </w:pPr>
-      <w:r>
-        <w:t xml:space="preserve">Для маркетолога вывод сразу: клиент сравнивает продукты, а не модели.</w:t>
+        <w:t xml:space="preserve">Запомните свой выбор: я к нему вернусь в конце.</w:t>
       </w:r>
     </w:p>
     <w:p>
@@ -308,13 +292,13 @@
       </w:r>
     </w:p>
     <w:bookmarkEnd w:id="22"/>
-    <w:bookmarkStart w:id="23" w:name="X7536fdec3dd6b5ef3d64b7a56070f775d62b31f"/>
+    <w:bookmarkStart w:id="23" w:name="слайд-3.-одна-модель-много-продуктов"/>
     <w:p>
       <w:pPr>
         <w:pStyle w:val="Heading2"/>
       </w:pPr>
       <w:r>
-        <w:t xml:space="preserve">Слайд 3. Доказательство: та же модель, другой результат</w:t>
+        <w:t xml:space="preserve">Слайд 3. Одна модель, много продуктов</w:t>
       </w:r>
     </w:p>
     <w:p>
@@ -322,7 +306,7 @@
         <w:pStyle w:val="FirstParagraph"/>
       </w:pPr>
       <w:r>
-        <w:t xml:space="preserve">И это не теория, есть цифры. Компания LangChain взяла ИИ-агента для программистов. В рейтинге он был где-то за пределами первых тридцати. Они не меняли модель вообще. Поменяли только всё вокруг неё. Результат: пятое место.</w:t>
+        <w:t xml:space="preserve">Начнём с факта. Больших моделей на рынке единицы: GPT от OpenAI, Claude от Anthropic, Gemini от Google. А вот продуктов на них — десятки: Claude Code, Codex, LangGraph, CrewAI, AutoGen и многие другие. Любая компания может встроить модель в свой продукт.</w:t>
       </w:r>
     </w:p>
     <w:p>
@@ -330,11 +314,7 @@
         <w:pStyle w:val="BodyText"/>
       </w:pPr>
       <w:r>
-        <w:rPr>
-          <w:iCs/>
-          <w:i/>
-        </w:rPr>
-        <w:t xml:space="preserve">(Пауза после слов «пятое место».)</w:t>
+        <w:t xml:space="preserve">Это как мука. У всех пекарен она одна, а хлеб получается разный.</w:t>
       </w:r>
     </w:p>
     <w:p>
@@ -342,25 +322,17 @@
         <w:pStyle w:val="BodyText"/>
       </w:pPr>
       <w:r>
-        <w:t xml:space="preserve">Второй пример. В другом исследовании ИИ сам подобрал себе окружение, и оно решило больше задач без ошибок, чем системы, которые люди собирали вручную. Это 76,4% решённых задач.</w:t>
-      </w:r>
-    </w:p>
-    <w:p>
-      <w:pPr>
-        <w:pStyle w:val="BodyText"/>
-      </w:pPr>
-      <w:r>
-        <w:t xml:space="preserve">Значит, секрет не в модели.</w:t>
-      </w:r>
-      <w:r>
-        <w:t xml:space="preserve"> </w:t>
-      </w:r>
-      <w:r>
-        <w:rPr>
-          <w:bCs/>
-          <w:b/>
-        </w:rPr>
-        <w:t xml:space="preserve">А в чём?</w:t>
+        <w:t xml:space="preserve">Для маркетолога вывод сразу: клиент выбирает продукт, а не модель.</w:t>
+      </w:r>
+      <w:r>
+        <w:t xml:space="preserve"> </w:t>
+      </w:r>
+      <w:r>
+        <w:rPr>
+          <w:bCs/>
+          <w:b/>
+        </w:rPr>
+        <w:t xml:space="preserve">Но почему тогда продукты на одной и той же модели такие разные?</w:t>
       </w:r>
     </w:p>
     <w:p>
@@ -371,13 +343,13 @@
       </w:r>
     </w:p>
     <w:bookmarkEnd w:id="23"/>
-    <w:bookmarkStart w:id="24" w:name="слайд-4.-определение-что-такое-harness"/>
+    <w:bookmarkStart w:id="24" w:name="слайд-4.-доказательство"/>
     <w:p>
       <w:pPr>
         <w:pStyle w:val="Heading2"/>
       </w:pPr>
       <w:r>
-        <w:t xml:space="preserve">Слайд 4. Определение: что такое harness</w:t>
+        <w:t xml:space="preserve">Слайд 4. Доказательство</w:t>
       </w:r>
     </w:p>
     <w:p>
@@ -385,20 +357,19 @@
         <w:pStyle w:val="FirstParagraph"/>
       </w:pPr>
       <w:r>
-        <w:t xml:space="preserve">Секрет называется</w:t>
-      </w:r>
-      <w:r>
-        <w:t xml:space="preserve"> </w:t>
-      </w:r>
+        <w:t xml:space="preserve">И это не теория, а измеренный факт. Компания LangChain взяла своего ИИ-агента и поставила его в рейтинг агентов для программистов. Он был где-то за пределами первых тридцати. Они не меняли модель. Поменяли только всё вокруг неё. Результат: пятое место. Смотрите на ленту: больше двадцати пяти мест вверх без единого изменения «мозга».</w:t>
+      </w:r>
+    </w:p>
+    <w:p>
+      <w:pPr>
+        <w:pStyle w:val="BodyText"/>
+      </w:pPr>
       <w:r>
         <w:rPr>
           <w:iCs/>
           <w:i/>
         </w:rPr>
-        <w:t xml:space="preserve">harness</w:t>
-      </w:r>
-      <w:r>
-        <w:t xml:space="preserve">. По-русски это «обвязка», дословно «упряжь»: лошадь сильная, но без упряжи поле не вспашет. Дальше я буду говорить просто harness.</w:t>
+        <w:t xml:space="preserve">(Пауза после слов «пятое место».)</w:t>
       </w:r>
     </w:p>
     <w:p>
@@ -406,17 +377,7 @@
         <w:pStyle w:val="BodyText"/>
       </w:pPr>
       <w:r>
-        <w:t xml:space="preserve">А теперь самое важное: что это такое</w:t>
-      </w:r>
-      <w:r>
-        <w:t xml:space="preserve"> </w:t>
-      </w:r>
-      <w:r>
-        <w:rPr>
-          <w:bCs/>
-          <w:b/>
-        </w:rPr>
-        <w:t xml:space="preserve">конкретно.</w:t>
+        <w:t xml:space="preserve">Второй пример. В другом исследовании ИИ сам подобрал себе окружение вокруг модели и решил 76,4% задач без ошибок. Это лучше, чем системы, которые люди собирали вручную.</w:t>
       </w:r>
     </w:p>
     <w:p>
@@ -424,163 +385,17 @@
         <w:pStyle w:val="BodyText"/>
       </w:pPr>
       <w:r>
-        <w:t xml:space="preserve">Harness — это обычная компьютерная программа, которая управляет моделью. Не магия, а программа. Она делает пять вещей:</w:t>
-      </w:r>
-    </w:p>
-    <w:p>
-      <w:pPr>
-        <w:numPr>
-          <w:ilvl w:val="0"/>
-          <w:numId w:val="1002"/>
-        </w:numPr>
-        <w:pStyle w:val="Compact"/>
-      </w:pPr>
-      <w:r>
-        <w:rPr>
-          <w:bCs/>
-          <w:b/>
-        </w:rPr>
-        <w:t xml:space="preserve">Отправляет</w:t>
-      </w:r>
-      <w:r>
-        <w:t xml:space="preserve"> </w:t>
-      </w:r>
-      <w:r>
-        <w:t xml:space="preserve">модели задачу.</w:t>
-      </w:r>
-    </w:p>
-    <w:p>
-      <w:pPr>
-        <w:numPr>
-          <w:ilvl w:val="0"/>
-          <w:numId w:val="1002"/>
-        </w:numPr>
-        <w:pStyle w:val="Compact"/>
-      </w:pPr>
-      <w:r>
-        <w:rPr>
-          <w:bCs/>
-          <w:b/>
-        </w:rPr>
-        <w:t xml:space="preserve">Даёт</w:t>
-      </w:r>
-      <w:r>
-        <w:t xml:space="preserve"> </w:t>
-      </w:r>
-      <w:r>
-        <w:t xml:space="preserve">ей инструменты: почту, файлы, поиск в интернете.</w:t>
-      </w:r>
-    </w:p>
-    <w:p>
-      <w:pPr>
-        <w:numPr>
-          <w:ilvl w:val="0"/>
-          <w:numId w:val="1002"/>
-        </w:numPr>
-        <w:pStyle w:val="Compact"/>
-      </w:pPr>
-      <w:r>
-        <w:rPr>
-          <w:bCs/>
-          <w:b/>
-        </w:rPr>
-        <w:t xml:space="preserve">Хранит</w:t>
-      </w:r>
-      <w:r>
-        <w:t xml:space="preserve"> </w:t>
-      </w:r>
-      <w:r>
-        <w:t xml:space="preserve">память о прошлой работе.</w:t>
-      </w:r>
-    </w:p>
-    <w:p>
-      <w:pPr>
-        <w:numPr>
-          <w:ilvl w:val="0"/>
-          <w:numId w:val="1002"/>
-        </w:numPr>
-        <w:pStyle w:val="Compact"/>
-      </w:pPr>
-      <w:r>
-        <w:rPr>
-          <w:bCs/>
-          <w:b/>
-        </w:rPr>
-        <w:t xml:space="preserve">Проверяет</w:t>
-      </w:r>
-      <w:r>
-        <w:t xml:space="preserve"> </w:t>
-      </w:r>
-      <w:r>
-        <w:t xml:space="preserve">результат.</w:t>
-      </w:r>
-    </w:p>
-    <w:p>
-      <w:pPr>
-        <w:numPr>
-          <w:ilvl w:val="0"/>
-          <w:numId w:val="1002"/>
-        </w:numPr>
-        <w:pStyle w:val="Compact"/>
-      </w:pPr>
-      <w:r>
-        <w:rPr>
-          <w:bCs/>
-          <w:b/>
-        </w:rPr>
-        <w:t xml:space="preserve">Следит</w:t>
-      </w:r>
-      <w:r>
-        <w:t xml:space="preserve"> </w:t>
-      </w:r>
-      <w:r>
-        <w:t xml:space="preserve">за правилами и доступами.</w:t>
-      </w:r>
-    </w:p>
-    <w:p>
-      <w:pPr>
-        <w:pStyle w:val="FirstParagraph"/>
-      </w:pPr>
-      <w:r>
-        <w:t xml:space="preserve">Пример из жизни: Claude Code, который мы увидим на рынке, — это не модель. Это harness, который стоит вокруг модели Claude.</w:t>
-      </w:r>
-    </w:p>
-    <w:p>
-      <w:pPr>
-        <w:pStyle w:val="BodyText"/>
-      </w:pPr>
-      <w:r>
-        <w:t xml:space="preserve">Теперь вернёмся к нашему директору. Вы нанимаете гениального выпускника. Он знает всё из книг, но в пустой комнате ничего не сделает. Ему нужно рабочее место. Модель — это выпускник, harness — рабочее место, а вместе они дают сотрудника, то есть агента:</w:t>
-      </w:r>
-      <w:r>
-        <w:t xml:space="preserve"> </w:t>
-      </w:r>
-      <w:r>
-        <w:rPr>
-          <w:bCs/>
-          <w:b/>
-        </w:rPr>
-        <w:t xml:space="preserve">агент = модель + harness.</w:t>
-      </w:r>
-    </w:p>
-    <w:p>
-      <w:pPr>
-        <w:pStyle w:val="BodyText"/>
-      </w:pPr>
-      <w:r>
-        <w:t xml:space="preserve">Специалист из LangChain сказал это ещё короче: «Если ты не модель, ты харнесс». То есть всё, что не модель.</w:t>
-      </w:r>
-    </w:p>
-    <w:p>
-      <w:pPr>
-        <w:pStyle w:val="BodyText"/>
-      </w:pPr>
-      <w:r>
-        <w:rPr>
-          <w:bCs/>
-          <w:b/>
-        </w:rPr>
-        <w:t xml:space="preserve">Звучит понятно, но как это выглядит на деле?</w:t>
+        <w:t xml:space="preserve">Вывод: за результат отвечает не только модель.</w:t>
+      </w:r>
+      <w:r>
+        <w:t xml:space="preserve"> </w:t>
+      </w:r>
+      <w:r>
+        <w:rPr>
+          <w:bCs/>
+          <w:b/>
+        </w:rPr>
+        <w:t xml:space="preserve">Что же это за «всё вокруг»?</w:t>
       </w:r>
     </w:p>
     <w:p>
@@ -591,25 +406,34 @@
       </w:r>
     </w:p>
     <w:bookmarkEnd w:id="24"/>
-    <w:bookmarkStart w:id="25" w:name="слайд-5.-пример-ии-разбирает-вашу-почту"/>
+    <w:bookmarkStart w:id="25" w:name="слайд-5.-что-такое-harness-теория"/>
     <w:p>
       <w:pPr>
         <w:pStyle w:val="Heading2"/>
       </w:pPr>
       <w:r>
-        <w:t xml:space="preserve">Слайд 5. Пример: ИИ разбирает вашу почту</w:t>
+        <w:t xml:space="preserve">Слайд 5. Что такое harness (теория)</w:t>
       </w:r>
     </w:p>
     <w:p>
       <w:pPr>
         <w:pStyle w:val="FirstParagraph"/>
       </w:pPr>
+      <w:r>
+        <w:t xml:space="preserve">Это «всё вокруг» называется</w:t>
+      </w:r>
+      <w:r>
+        <w:t xml:space="preserve"> </w:t>
+      </w:r>
       <w:r>
         <w:rPr>
           <w:iCs/>
           <w:i/>
         </w:rPr>
-        <w:t xml:space="preserve">(Это учебная иллюстрация. В статье примеры в основном про программирование, но принцип тот же.)</w:t>
+        <w:t xml:space="preserve">harness</w:t>
+      </w:r>
+      <w:r>
+        <w:t xml:space="preserve">. По-русски это «обвязка», дословно «упряжь»: лошадь сильная, но без упряжи поле не вспашет. Дальше я говорю просто harness.</w:t>
       </w:r>
     </w:p>
     <w:p>
@@ -617,117 +441,130 @@
         <w:pStyle w:val="BodyText"/>
       </w:pPr>
       <w:r>
-        <w:t xml:space="preserve">Допустим, вы говорите ИИ-ассистенту: «Разбери утреннюю почту и ответь на срочные письма». Смотрите, что происходит. И заметьте, кто что делает.</w:t>
-      </w:r>
-    </w:p>
-    <w:p>
-      <w:pPr>
-        <w:numPr>
-          <w:ilvl w:val="0"/>
-          <w:numId w:val="1003"/>
-        </w:numPr>
-        <w:pStyle w:val="Compact"/>
-      </w:pPr>
-      <w:r>
-        <w:rPr>
-          <w:bCs/>
-          <w:b/>
-        </w:rPr>
-        <w:t xml:space="preserve">Harness</w:t>
-      </w:r>
-      <w:r>
-        <w:t xml:space="preserve"> </w:t>
-      </w:r>
-      <w:r>
-        <w:t xml:space="preserve">собирает задание: вашу просьбу, инструкции и записи прошлых дней. И отправляет модели.</w:t>
-      </w:r>
-    </w:p>
-    <w:p>
-      <w:pPr>
-        <w:numPr>
-          <w:ilvl w:val="0"/>
-          <w:numId w:val="1003"/>
-        </w:numPr>
-        <w:pStyle w:val="Compact"/>
-      </w:pPr>
-      <w:r>
-        <w:rPr>
-          <w:bCs/>
-          <w:b/>
-        </w:rPr>
-        <w:t xml:space="preserve">Модель</w:t>
-      </w:r>
-      <w:r>
-        <w:t xml:space="preserve"> </w:t>
-      </w:r>
-      <w:r>
-        <w:t xml:space="preserve">отвечает: «Открой почту».</w:t>
-      </w:r>
-    </w:p>
-    <w:p>
-      <w:pPr>
-        <w:numPr>
-          <w:ilvl w:val="0"/>
-          <w:numId w:val="1003"/>
-        </w:numPr>
-        <w:pStyle w:val="Compact"/>
-      </w:pPr>
-      <w:r>
-        <w:rPr>
-          <w:bCs/>
-          <w:b/>
-        </w:rPr>
-        <w:t xml:space="preserve">Harness</w:t>
-      </w:r>
-      <w:r>
-        <w:t xml:space="preserve"> </w:t>
-      </w:r>
-      <w:r>
-        <w:t xml:space="preserve">открывает почту и показывает модели письма.</w:t>
-      </w:r>
-    </w:p>
-    <w:p>
-      <w:pPr>
-        <w:numPr>
-          <w:ilvl w:val="0"/>
-          <w:numId w:val="1003"/>
-        </w:numPr>
-        <w:pStyle w:val="Compact"/>
-      </w:pPr>
-      <w:r>
-        <w:rPr>
-          <w:bCs/>
-          <w:b/>
-        </w:rPr>
-        <w:t xml:space="preserve">Модель</w:t>
-      </w:r>
-      <w:r>
-        <w:t xml:space="preserve"> </w:t>
-      </w:r>
-      <w:r>
-        <w:t xml:space="preserve">читает письма и пишет черновики ответов.</w:t>
-      </w:r>
-    </w:p>
-    <w:p>
-      <w:pPr>
-        <w:numPr>
-          <w:ilvl w:val="0"/>
-          <w:numId w:val="1003"/>
-        </w:numPr>
-        <w:pStyle w:val="Compact"/>
-      </w:pPr>
-      <w:r>
-        <w:rPr>
-          <w:bCs/>
-          <w:b/>
-        </w:rPr>
-        <w:t xml:space="preserve">Harness</w:t>
-      </w:r>
-      <w:r>
-        <w:t xml:space="preserve"> </w:t>
-      </w:r>
-      <w:r>
-        <w:t xml:space="preserve">проверяет черновики и спрашивает вас: «Отправить?» Письма уходят только после вашего «да».</w:t>
+        <w:t xml:space="preserve">Теперь</w:t>
+      </w:r>
+      <w:r>
+        <w:t xml:space="preserve"> </w:t>
+      </w:r>
+      <w:r>
+        <w:rPr>
+          <w:bCs/>
+          <w:b/>
+        </w:rPr>
+        <w:t xml:space="preserve">конкретно</w:t>
+      </w:r>
+      <w:r>
+        <w:t xml:space="preserve">, что это. Harness — это обычная программа, которая управляет моделью. Не магия, а программа. На схеме слева человек, в центре harness, а внутри него модель. Справа инструменты: почта, файлы, поиск. Программа делает пять вещей:</w:t>
+      </w:r>
+    </w:p>
+    <w:p>
+      <w:pPr>
+        <w:numPr>
+          <w:ilvl w:val="0"/>
+          <w:numId w:val="1002"/>
+        </w:numPr>
+        <w:pStyle w:val="Compact"/>
+      </w:pPr>
+      <w:r>
+        <w:rPr>
+          <w:bCs/>
+          <w:b/>
+        </w:rPr>
+        <w:t xml:space="preserve">Отправляет</w:t>
+      </w:r>
+      <w:r>
+        <w:t xml:space="preserve"> </w:t>
+      </w:r>
+      <w:r>
+        <w:t xml:space="preserve">модели задачу.</w:t>
+      </w:r>
+    </w:p>
+    <w:p>
+      <w:pPr>
+        <w:numPr>
+          <w:ilvl w:val="0"/>
+          <w:numId w:val="1002"/>
+        </w:numPr>
+        <w:pStyle w:val="Compact"/>
+      </w:pPr>
+      <w:r>
+        <w:rPr>
+          <w:bCs/>
+          <w:b/>
+        </w:rPr>
+        <w:t xml:space="preserve">Даёт</w:t>
+      </w:r>
+      <w:r>
+        <w:t xml:space="preserve"> </w:t>
+      </w:r>
+      <w:r>
+        <w:t xml:space="preserve">ей инструменты: почту, файлы, поиск.</w:t>
+      </w:r>
+    </w:p>
+    <w:p>
+      <w:pPr>
+        <w:numPr>
+          <w:ilvl w:val="0"/>
+          <w:numId w:val="1002"/>
+        </w:numPr>
+        <w:pStyle w:val="Compact"/>
+      </w:pPr>
+      <w:r>
+        <w:rPr>
+          <w:bCs/>
+          <w:b/>
+        </w:rPr>
+        <w:t xml:space="preserve">Хранит</w:t>
+      </w:r>
+      <w:r>
+        <w:t xml:space="preserve"> </w:t>
+      </w:r>
+      <w:r>
+        <w:t xml:space="preserve">память о прошлой работе.</w:t>
+      </w:r>
+    </w:p>
+    <w:p>
+      <w:pPr>
+        <w:numPr>
+          <w:ilvl w:val="0"/>
+          <w:numId w:val="1002"/>
+        </w:numPr>
+        <w:pStyle w:val="Compact"/>
+      </w:pPr>
+      <w:r>
+        <w:rPr>
+          <w:bCs/>
+          <w:b/>
+        </w:rPr>
+        <w:t xml:space="preserve">Проверяет</w:t>
+      </w:r>
+      <w:r>
+        <w:t xml:space="preserve"> </w:t>
+      </w:r>
+      <w:r>
+        <w:t xml:space="preserve">результат.</w:t>
+      </w:r>
+    </w:p>
+    <w:p>
+      <w:pPr>
+        <w:numPr>
+          <w:ilvl w:val="0"/>
+          <w:numId w:val="1002"/>
+        </w:numPr>
+        <w:pStyle w:val="Compact"/>
+      </w:pPr>
+      <w:r>
+        <w:rPr>
+          <w:bCs/>
+          <w:b/>
+        </w:rPr>
+        <w:t xml:space="preserve">Следит</w:t>
+      </w:r>
+      <w:r>
+        <w:t xml:space="preserve"> </w:t>
+      </w:r>
+      <w:r>
+        <w:t xml:space="preserve">за правилами и доступами.</w:t>
       </w:r>
     </w:p>
     <w:p>
@@ -735,7 +572,7 @@
         <w:pStyle w:val="FirstParagraph"/>
       </w:pPr>
       <w:r>
-        <w:t xml:space="preserve">Видите? Модель только читает и пишет текст. Почту открывает, письма отправляет и у вас спрашивает разрешение именно harness. Без него модель — просто собеседник в чате.</w:t>
+        <w:t xml:space="preserve">Специалист из LangChain сформулировал это короче: «Если ты не модель, ты харнесс». То есть всё, что не модель.</w:t>
       </w:r>
     </w:p>
     <w:p>
@@ -743,17 +580,17 @@
         <w:pStyle w:val="BodyText"/>
       </w:pPr>
       <w:r>
-        <w:t xml:space="preserve">Для маркетолога вывод: клиент платит за результат «почта разобрана», а не за «умную модель».</w:t>
-      </w:r>
-      <w:r>
-        <w:t xml:space="preserve"> </w:t>
-      </w:r>
-      <w:r>
-        <w:rPr>
-          <w:bCs/>
-          <w:b/>
-        </w:rPr>
-        <w:t xml:space="preserve">Но где у harness слои и как они связаны с тем, что вы уже слышали?</w:t>
+        <w:t xml:space="preserve">Для маркетолога: модель — товар, а harness — то, что отличает один продукт от другого.</w:t>
+      </w:r>
+      <w:r>
+        <w:t xml:space="preserve"> </w:t>
+      </w:r>
+      <w:r>
+        <w:rPr>
+          <w:bCs/>
+          <w:b/>
+        </w:rPr>
+        <w:t xml:space="preserve">Как это объяснить без кода?</w:t>
       </w:r>
     </w:p>
     <w:p>
@@ -764,13 +601,13 @@
       </w:r>
     </w:p>
     <w:bookmarkEnd w:id="25"/>
-    <w:bookmarkStart w:id="26" w:name="X0d2cbd5f1daa38a36f2b7861f3dafddc9284460"/>
+    <w:bookmarkStart w:id="26" w:name="слайд-6.-образ-сотрудник-теория"/>
     <w:p>
       <w:pPr>
         <w:pStyle w:val="Heading2"/>
       </w:pPr>
       <w:r>
-        <w:t xml:space="preserve">Слайд 6. Три слоя: промпт, контекст, harness</w:t>
+        <w:t xml:space="preserve">Слайд 6. Образ: сотрудник (теория)</w:t>
       </w:r>
     </w:p>
     <w:p>
@@ -778,91 +615,56 @@
         <w:pStyle w:val="FirstParagraph"/>
       </w:pPr>
       <w:r>
-        <w:t xml:space="preserve">Наверняка вы уже слышали слова «промпт» и «контекст». Вот как они соотносятся с harness. Опять возьмём нашего сотрудника.</w:t>
-      </w:r>
-    </w:p>
-    <w:p>
-      <w:pPr>
-        <w:numPr>
-          <w:ilvl w:val="0"/>
-          <w:numId w:val="1004"/>
-        </w:numPr>
-        <w:pStyle w:val="Compact"/>
-      </w:pPr>
-      <w:r>
-        <w:rPr>
-          <w:bCs/>
-          <w:b/>
-        </w:rPr>
-        <w:t xml:space="preserve">Промпт.</w:t>
-      </w:r>
-      <w:r>
-        <w:t xml:space="preserve"> </w:t>
-      </w:r>
-      <w:r>
-        <w:t xml:space="preserve">Как вы объяснили ему задачу.</w:t>
-      </w:r>
-    </w:p>
-    <w:p>
-      <w:pPr>
-        <w:numPr>
-          <w:ilvl w:val="0"/>
-          <w:numId w:val="1004"/>
-        </w:numPr>
-        <w:pStyle w:val="Compact"/>
-      </w:pPr>
-      <w:r>
-        <w:rPr>
-          <w:bCs/>
-          <w:b/>
-        </w:rPr>
-        <w:t xml:space="preserve">Контекст.</w:t>
-      </w:r>
-      <w:r>
-        <w:t xml:space="preserve"> </w:t>
-      </w:r>
-      <w:r>
-        <w:t xml:space="preserve">Какие бумаги вы положили ему на стол: документы, историю, записи.</w:t>
-      </w:r>
-    </w:p>
-    <w:p>
-      <w:pPr>
-        <w:numPr>
-          <w:ilvl w:val="0"/>
-          <w:numId w:val="1004"/>
-        </w:numPr>
-        <w:pStyle w:val="Compact"/>
-      </w:pPr>
-      <w:r>
-        <w:rPr>
-          <w:bCs/>
-          <w:b/>
-        </w:rPr>
-        <w:t xml:space="preserve">Harness.</w:t>
-      </w:r>
-      <w:r>
-        <w:t xml:space="preserve"> </w:t>
-      </w:r>
-      <w:r>
-        <w:t xml:space="preserve">Всё рабочее место целиком.</w:t>
-      </w:r>
-    </w:p>
-    <w:p>
-      <w:pPr>
-        <w:pStyle w:val="FirstParagraph"/>
-      </w:pPr>
-      <w:r>
-        <w:t xml:space="preserve">Каждый следующий слой включает предыдущий. Harness — это и промпт, и контекст, и всё остальное. Поэтому сегодня конкурируют не удачными формулировками, а целым рабочим местом.</w:t>
-      </w:r>
-      <w:r>
-        <w:t xml:space="preserve"> </w:t>
-      </w:r>
-      <w:r>
-        <w:rPr>
-          <w:bCs/>
-          <w:b/>
-        </w:rPr>
-        <w:t xml:space="preserve">А из чего оно состоит?</w:t>
+        <w:t xml:space="preserve">Давайте вернёмся к директору из начала. Вы нанимаете выпускника, который прочитал все книги мира. Но посадите его в пустую комнату, и он ничего не сделает: ему нужны компьютер, блокнот, проверка, доступы. Выпускник плюс рабочее место дают сотрудника.</w:t>
+      </w:r>
+    </w:p>
+    <w:p>
+      <w:pPr>
+        <w:pStyle w:val="BodyText"/>
+      </w:pPr>
+      <w:r>
+        <w:t xml:space="preserve">В нашей терминологии: модель — выпускник, harness — рабочее место, а вместе они дают</w:t>
+      </w:r>
+      <w:r>
+        <w:t xml:space="preserve"> </w:t>
+      </w:r>
+      <w:r>
+        <w:rPr>
+          <w:bCs/>
+          <w:b/>
+        </w:rPr>
+        <w:t xml:space="preserve">агента</w:t>
+      </w:r>
+      <w:r>
+        <w:t xml:space="preserve">. Формула:</w:t>
+      </w:r>
+      <w:r>
+        <w:t xml:space="preserve"> </w:t>
+      </w:r>
+      <w:r>
+        <w:rPr>
+          <w:bCs/>
+          <w:b/>
+        </w:rPr>
+        <w:t xml:space="preserve">агент = модель + harness.</w:t>
+      </w:r>
+    </w:p>
+    <w:p>
+      <w:pPr>
+        <w:pStyle w:val="BodyText"/>
+      </w:pPr>
+      <w:r>
+        <w:t xml:space="preserve">Покупают сотрудника, а не «выпускника».</w:t>
+      </w:r>
+      <w:r>
+        <w:t xml:space="preserve"> </w:t>
+      </w:r>
+      <w:r>
+        <w:rPr>
+          <w:bCs/>
+          <w:b/>
+        </w:rPr>
+        <w:t xml:space="preserve">Хорошо, а как это выглядит на реальной задаче?</w:t>
       </w:r>
     </w:p>
     <w:p>
@@ -873,13 +675,13 @@
       </w:r>
     </w:p>
     <w:bookmarkEnd w:id="26"/>
-    <w:bookmarkStart w:id="27" w:name="Xbb25d05dd0b7b840f6c598007f04731cb027f08"/>
+    <w:bookmarkStart w:id="27" w:name="слайд-7.-пример-ии-разбирает-почту"/>
     <w:p>
       <w:pPr>
         <w:pStyle w:val="Heading2"/>
       </w:pPr>
       <w:r>
-        <w:t xml:space="preserve">Слайд 7. Из чего состоит harness: на примере Claude Code</w:t>
+        <w:t xml:space="preserve">Слайд 7. Пример: ИИ разбирает почту</w:t>
       </w:r>
     </w:p>
     <w:p>
@@ -887,190 +689,127 @@
         <w:pStyle w:val="FirstParagraph"/>
       </w:pPr>
       <w:r>
-        <w:t xml:space="preserve">Мы поняли, что harness — программа. Теперь заглянем внутрь, на реальном примере: Claude Code от Anthropic. Здесь шесть частей. Сначала самое важное, потом по таблице.</w:t>
-      </w:r>
-    </w:p>
-    <w:p>
-      <w:pPr>
-        <w:numPr>
-          <w:ilvl w:val="0"/>
-          <w:numId w:val="1005"/>
-        </w:numPr>
-        <w:pStyle w:val="Compact"/>
-      </w:pPr>
-      <w:r>
-        <w:rPr>
-          <w:bCs/>
-          <w:b/>
-        </w:rPr>
-        <w:t xml:space="preserve">Цикл.</w:t>
-      </w:r>
-      <w:r>
-        <w:t xml:space="preserve"> </w:t>
-      </w:r>
-      <w:r>
-        <w:t xml:space="preserve">Это обычный</w:t>
-      </w:r>
-      <w:r>
-        <w:t xml:space="preserve"> </w:t>
-      </w:r>
-      <w:r>
-        <w:rPr>
-          <w:rStyle w:val="VerbatimChar"/>
-        </w:rPr>
-        <w:t xml:space="preserve">while</w:t>
-      </w:r>
-      <w:r>
-        <w:t xml:space="preserve">, который повторяет «запрос → модель → инструмент», пока задача не решена. В Anthropic его в шутку называют «тупым»: весь ум в модели.</w:t>
-      </w:r>
-    </w:p>
-    <w:p>
-      <w:pPr>
-        <w:numPr>
-          <w:ilvl w:val="0"/>
-          <w:numId w:val="1005"/>
-        </w:numPr>
-        <w:pStyle w:val="Compact"/>
-      </w:pPr>
-      <w:r>
-        <w:rPr>
-          <w:bCs/>
-          <w:b/>
-        </w:rPr>
-        <w:t xml:space="preserve">Инструменты.</w:t>
-      </w:r>
-      <w:r>
-        <w:t xml:space="preserve"> </w:t>
-      </w:r>
-      <w:r>
-        <w:t xml:space="preserve">Модель сама ничего не запускает. Она просит: «вызови такой-то инструмент», а harness это выполняет. В Claude Code шесть групп инструментов: файлы, поиск, команды, веб, анализ кода и запуск субагентов.</w:t>
-      </w:r>
-    </w:p>
-    <w:p>
-      <w:pPr>
-        <w:numPr>
-          <w:ilvl w:val="0"/>
-          <w:numId w:val="1005"/>
-        </w:numPr>
-        <w:pStyle w:val="Compact"/>
-      </w:pPr>
-      <w:r>
-        <w:rPr>
-          <w:bCs/>
-          <w:b/>
-        </w:rPr>
-        <w:t xml:space="preserve">Память.</w:t>
-      </w:r>
-      <w:r>
-        <w:t xml:space="preserve"> </w:t>
-      </w:r>
-      <w:r>
-        <w:t xml:space="preserve">Это два файла,</w:t>
-      </w:r>
-      <w:r>
-        <w:t xml:space="preserve"> </w:t>
-      </w:r>
-      <w:r>
-        <w:rPr>
-          <w:rStyle w:val="VerbatimChar"/>
-        </w:rPr>
-        <w:t xml:space="preserve">CLAUDE.md</w:t>
-      </w:r>
-      <w:r>
-        <w:t xml:space="preserve"> </w:t>
-      </w:r>
-      <w:r>
-        <w:t xml:space="preserve">и</w:t>
-      </w:r>
-      <w:r>
-        <w:t xml:space="preserve"> </w:t>
-      </w:r>
-      <w:r>
-        <w:rPr>
-          <w:rStyle w:val="VerbatimChar"/>
-        </w:rPr>
-        <w:t xml:space="preserve">MEMORY.md</w:t>
-      </w:r>
-      <w:r>
-        <w:t xml:space="preserve">: короткий индекс, подробные файлы по темам и архив для поиска. Благодаря им агент помнит проект между сессиями.</w:t>
-      </w:r>
-    </w:p>
-    <w:p>
-      <w:pPr>
-        <w:numPr>
-          <w:ilvl w:val="0"/>
-          <w:numId w:val="1005"/>
-        </w:numPr>
-        <w:pStyle w:val="Compact"/>
-      </w:pPr>
-      <w:r>
-        <w:rPr>
-          <w:bCs/>
-          <w:b/>
-        </w:rPr>
-        <w:t xml:space="preserve">Контекст.</w:t>
-      </w:r>
-      <w:r>
-        <w:t xml:space="preserve"> </w:t>
-      </w:r>
-      <w:r>
-        <w:t xml:space="preserve">Окно модели ограничено, поэтому harness сжимает историю и ищет нужное через</w:t>
-      </w:r>
-      <w:r>
-        <w:t xml:space="preserve"> </w:t>
-      </w:r>
-      <w:r>
-        <w:rPr>
-          <w:rStyle w:val="VerbatimChar"/>
-        </w:rPr>
-        <w:t xml:space="preserve">grep</w:t>
-      </w:r>
-      <w:r>
-        <w:t xml:space="preserve">, а не читает файлы целиком.</w:t>
-      </w:r>
-    </w:p>
-    <w:p>
-      <w:pPr>
-        <w:numPr>
-          <w:ilvl w:val="0"/>
-          <w:numId w:val="1005"/>
-        </w:numPr>
-        <w:pStyle w:val="Compact"/>
-      </w:pPr>
-      <w:r>
-        <w:rPr>
-          <w:bCs/>
-          <w:b/>
-        </w:rPr>
-        <w:t xml:space="preserve">Проверка.</w:t>
-      </w:r>
-      <w:r>
-        <w:t xml:space="preserve"> </w:t>
-      </w:r>
-      <w:r>
-        <w:t xml:space="preserve">Тесты, линтеры, скриншоты, а иногда второй ИИ как судья. Если инструмент упал, ошибка возвращается модели как обычный результат, и она может исправиться.</w:t>
-      </w:r>
-    </w:p>
-    <w:p>
-      <w:pPr>
-        <w:numPr>
-          <w:ilvl w:val="0"/>
-          <w:numId w:val="1005"/>
-        </w:numPr>
-        <w:pStyle w:val="Compact"/>
-      </w:pPr>
-      <w:r>
-        <w:rPr>
-          <w:bCs/>
-          <w:b/>
-        </w:rPr>
-        <w:t xml:space="preserve">Права.</w:t>
-      </w:r>
-      <w:r>
-        <w:t xml:space="preserve"> </w:t>
-      </w:r>
-      <w:r>
-        <w:t xml:space="preserve">Около сорока возможностей Claude Code проверяются отдельно, а для рискованных действий нужно подтверждение человека.</w:t>
+        <w:rPr>
+          <w:iCs/>
+          <w:i/>
+        </w:rPr>
+        <w:t xml:space="preserve">(Это учебная иллюстрация. В статье примеры в основном про программирование, но принцип тот же.)</w:t>
+      </w:r>
+    </w:p>
+    <w:p>
+      <w:pPr>
+        <w:pStyle w:val="BodyText"/>
+      </w:pPr>
+      <w:r>
+        <w:t xml:space="preserve">Допустим, вы говорите ИИ-ассистенту: «Разбери почту». Смотрим схему сверху вниз. Четыре участника: человек, harness, модель и почта.</w:t>
+      </w:r>
+    </w:p>
+    <w:p>
+      <w:pPr>
+        <w:numPr>
+          <w:ilvl w:val="0"/>
+          <w:numId w:val="1003"/>
+        </w:numPr>
+        <w:pStyle w:val="Compact"/>
+      </w:pPr>
+      <w:r>
+        <w:t xml:space="preserve">Человек говорит harness: «Разбери почту».</w:t>
+      </w:r>
+    </w:p>
+    <w:p>
+      <w:pPr>
+        <w:numPr>
+          <w:ilvl w:val="0"/>
+          <w:numId w:val="1003"/>
+        </w:numPr>
+        <w:pStyle w:val="Compact"/>
+      </w:pPr>
+      <w:r>
+        <w:t xml:space="preserve">Harness собирает задание, добавляет память и отправляет модели.</w:t>
+      </w:r>
+    </w:p>
+    <w:p>
+      <w:pPr>
+        <w:numPr>
+          <w:ilvl w:val="0"/>
+          <w:numId w:val="1003"/>
+        </w:numPr>
+        <w:pStyle w:val="Compact"/>
+      </w:pPr>
+      <w:r>
+        <w:t xml:space="preserve">Модель отвечает: «Открой почту».</w:t>
+      </w:r>
+    </w:p>
+    <w:p>
+      <w:pPr>
+        <w:numPr>
+          <w:ilvl w:val="0"/>
+          <w:numId w:val="1003"/>
+        </w:numPr>
+        <w:pStyle w:val="Compact"/>
+      </w:pPr>
+      <w:r>
+        <w:t xml:space="preserve">Harness идёт в почту и берёт письма.</w:t>
+      </w:r>
+    </w:p>
+    <w:p>
+      <w:pPr>
+        <w:numPr>
+          <w:ilvl w:val="0"/>
+          <w:numId w:val="1003"/>
+        </w:numPr>
+        <w:pStyle w:val="Compact"/>
+      </w:pPr>
+      <w:r>
+        <w:t xml:space="preserve">Harness показывает письма модели.</w:t>
+      </w:r>
+    </w:p>
+    <w:p>
+      <w:pPr>
+        <w:numPr>
+          <w:ilvl w:val="0"/>
+          <w:numId w:val="1003"/>
+        </w:numPr>
+        <w:pStyle w:val="Compact"/>
+      </w:pPr>
+      <w:r>
+        <w:t xml:space="preserve">Модель пишет черновики ответов.</w:t>
+      </w:r>
+    </w:p>
+    <w:p>
+      <w:pPr>
+        <w:numPr>
+          <w:ilvl w:val="0"/>
+          <w:numId w:val="1003"/>
+        </w:numPr>
+        <w:pStyle w:val="Compact"/>
+      </w:pPr>
+      <w:r>
+        <w:t xml:space="preserve">Harness спрашивает у человека: «Отправить?»</w:t>
+      </w:r>
+    </w:p>
+    <w:p>
+      <w:pPr>
+        <w:numPr>
+          <w:ilvl w:val="0"/>
+          <w:numId w:val="1003"/>
+        </w:numPr>
+        <w:pStyle w:val="Compact"/>
+      </w:pPr>
+      <w:r>
+        <w:t xml:space="preserve">Человек говорит «да».</w:t>
+      </w:r>
+    </w:p>
+    <w:p>
+      <w:pPr>
+        <w:numPr>
+          <w:ilvl w:val="0"/>
+          <w:numId w:val="1003"/>
+        </w:numPr>
+        <w:pStyle w:val="Compact"/>
+      </w:pPr>
+      <w:r>
+        <w:t xml:space="preserve">И только тогда harness отправляет письма.</w:t>
       </w:r>
     </w:p>
     <w:p>
@@ -1078,7 +817,17 @@
         <w:pStyle w:val="FirstParagraph"/>
       </w:pPr>
       <w:r>
-        <w:t xml:space="preserve">Для тех, кто любит полноту: в статье таких частей одиннадцать, я показал шесть главных. В скобках на слайде стоят наши образы: «руки», «блокнот», «контролёр», «пропуск». Они помогают запомнить, но настоящие названия вы видите слева.</w:t>
+        <w:rPr>
+          <w:iCs/>
+          <w:i/>
+        </w:rPr>
+        <w:t xml:space="preserve">(Показать на схеме.)</w:t>
+      </w:r>
+      <w:r>
+        <w:t xml:space="preserve"> </w:t>
+      </w:r>
+      <w:r>
+        <w:t xml:space="preserve">Найдите стрелку между «Модель» и «Почта». Её нет. Модель с почтой напрямую не общается вообще. Она только читает и пишет текст. Всё остальное делает harness.</w:t>
       </w:r>
     </w:p>
     <w:p>
@@ -1086,17 +835,17 @@
         <w:pStyle w:val="BodyText"/>
       </w:pPr>
       <w:r>
-        <w:t xml:space="preserve">Маркетологу это даёт готовый список вопросов: когда вам продают ИИ-продукт, спрашивайте, какие из этих частей в нём есть и насколько они проработаны.</w:t>
-      </w:r>
-      <w:r>
-        <w:t xml:space="preserve"> </w:t>
-      </w:r>
-      <w:r>
-        <w:rPr>
-          <w:bCs/>
-          <w:b/>
-        </w:rPr>
-        <w:t xml:space="preserve">А как такой harness работает во времени?</w:t>
+        <w:t xml:space="preserve">Клиент видит результат: «почта разобрана». Устройство он не видит.</w:t>
+      </w:r>
+      <w:r>
+        <w:t xml:space="preserve"> </w:t>
+      </w:r>
+      <w:r>
+        <w:rPr>
+          <w:bCs/>
+          <w:b/>
+        </w:rPr>
+        <w:t xml:space="preserve">А как harness это делает «внутри»?</w:t>
       </w:r>
     </w:p>
     <w:p>
@@ -1107,13 +856,13 @@
       </w:r>
     </w:p>
     <w:bookmarkEnd w:id="27"/>
-    <w:bookmarkStart w:id="28" w:name="слайд-8.-рабочий-день-круг"/>
+    <w:bookmarkStart w:id="28" w:name="слайд-8.-пример-цикл-в-коде"/>
     <w:p>
       <w:pPr>
         <w:pStyle w:val="Heading2"/>
       </w:pPr>
       <w:r>
-        <w:t xml:space="preserve">Слайд 8. Рабочий день: круг</w:t>
+        <w:t xml:space="preserve">Слайд 8. Пример: цикл в коде</w:t>
       </w:r>
     </w:p>
     <w:p>
@@ -1121,7 +870,7 @@
         <w:pStyle w:val="FirstParagraph"/>
       </w:pPr>
       <w:r>
-        <w:t xml:space="preserve">Рабочий день агента — это простой круг. Он получил задание. Подумал, что делать. Сделал. Записал результат. И, если дело не готово, снова по кругу. Ровно это мы видели в примере с почтой.</w:t>
+        <w:t xml:space="preserve">Инженерам покажу код. Это схема, а не настоящий код, и на слайде это написано. Всего десять строк.</w:t>
       </w:r>
     </w:p>
     <w:p>
@@ -1129,7 +878,17 @@
         <w:pStyle w:val="BodyText"/>
       </w:pPr>
       <w:r>
-        <w:t xml:space="preserve">Самое неожиданное: сам этот круг — очень простая программа. В Anthropic её в шутку называют «тупым циклом». Весь ум в модели, а круг только следит за порядком: что сделано, что дальше, когда остановиться.</w:t>
+        <w:rPr>
+          <w:iCs/>
+          <w:i/>
+        </w:rPr>
+        <w:t xml:space="preserve">(Идти по номерам.)</w:t>
+      </w:r>
+      <w:r>
+        <w:t xml:space="preserve"> </w:t>
+      </w:r>
+      <w:r>
+        <w:t xml:space="preserve">Бесконечный цикл. Первое: собираем запрос из истории. Второе: спрашиваем модель. Третье: если модель не просит ничего вызвать, это финальный ответ, и мы выходим. Если просит, четвёртое: проверяем права. Пятое: выполняем инструмент и записываем результат в историю. И по кругу.</w:t>
       </w:r>
     </w:p>
     <w:p>
@@ -1137,17 +896,25 @@
         <w:pStyle w:val="BodyText"/>
       </w:pPr>
       <w:r>
-        <w:t xml:space="preserve">Клиент этого круга не видит. Он видит только итог: «агент сам довёл дело до конца». Но у такого сотрудника есть две главные беды.</w:t>
-      </w:r>
-      <w:r>
-        <w:t xml:space="preserve"> </w:t>
-      </w:r>
-      <w:r>
-        <w:rPr>
-          <w:bCs/>
-          <w:b/>
-        </w:rPr>
-        <w:t xml:space="preserve">Первая: стол, на котором он работает, слишком мал.</w:t>
+        <w:t xml:space="preserve">В Anthropic этот цикл в шутку называют «тупым»: весь ум в модели, а цикл только следит за порядком. Снизу условия остановки: ответ без вызовов, лимит ходов, бюджет токенов, сработала защита, человек прервал или модель отказалась.</w:t>
+      </w:r>
+    </w:p>
+    <w:p>
+      <w:pPr>
+        <w:pStyle w:val="BodyText"/>
+      </w:pPr>
+      <w:r>
+        <w:t xml:space="preserve">Клиент этого цикла не видит, он видит итог.</w:t>
+      </w:r>
+      <w:r>
+        <w:t xml:space="preserve"> </w:t>
+      </w:r>
+      <w:r>
+        <w:rPr>
+          <w:bCs/>
+          <w:b/>
+        </w:rPr>
+        <w:t xml:space="preserve">Из каких частей состоит такая программа целиком?</w:t>
       </w:r>
     </w:p>
     <w:p>
@@ -1158,13 +925,13 @@
       </w:r>
     </w:p>
     <w:bookmarkEnd w:id="28"/>
-    <w:bookmarkStart w:id="29" w:name="слайд-9.-беда-1-места-на-столе-мало"/>
+    <w:bookmarkStart w:id="29" w:name="слайд-9.-из-чего-состоит-harness-теория"/>
     <w:p>
       <w:pPr>
         <w:pStyle w:val="Heading2"/>
       </w:pPr>
       <w:r>
-        <w:t xml:space="preserve">Слайд 9. Беда №1: места на столе мало</w:t>
+        <w:t xml:space="preserve">Слайд 9. Из чего состоит harness (теория)</w:t>
       </w:r>
     </w:p>
     <w:p>
@@ -1172,123 +939,181 @@
         <w:pStyle w:val="FirstParagraph"/>
       </w:pPr>
       <w:r>
-        <w:t xml:space="preserve">У модели есть «рабочий стол»: то, что она одновременно держит в голове. И он ограничен.</w:t>
-      </w:r>
-    </w:p>
-    <w:p>
-      <w:pPr>
-        <w:pStyle w:val="BodyText"/>
-      </w:pPr>
-      <w:r>
-        <w:t xml:space="preserve">Исследователи выяснили: если важное оказывается в середине длинного текста, качество падает на 30% и больше. Это знакомо любому студенту. Начало и конец лекции вы помните, а середина проваливается.</w:t>
-      </w:r>
-    </w:p>
-    <w:p>
-      <w:pPr>
-        <w:pStyle w:val="BodyText"/>
-      </w:pPr>
-      <w:r>
-        <w:t xml:space="preserve">Как с этим справляется harness? Как в нормальном офисе.</w:t>
-      </w:r>
-    </w:p>
-    <w:p>
-      <w:pPr>
-        <w:numPr>
-          <w:ilvl w:val="0"/>
-          <w:numId w:val="1006"/>
-        </w:numPr>
-        <w:pStyle w:val="Compact"/>
-      </w:pPr>
-      <w:r>
-        <w:t xml:space="preserve">Переписку сжимает в</w:t>
-      </w:r>
-      <w:r>
-        <w:t xml:space="preserve"> </w:t>
-      </w:r>
-      <w:r>
-        <w:rPr>
-          <w:bCs/>
-          <w:b/>
-        </w:rPr>
-        <w:t xml:space="preserve">конспект</w:t>
-      </w:r>
-      <w:r>
-        <w:t xml:space="preserve">: важное остаётся, лишнее уходит.</w:t>
-      </w:r>
-    </w:p>
-    <w:p>
-      <w:pPr>
-        <w:numPr>
-          <w:ilvl w:val="0"/>
-          <w:numId w:val="1006"/>
-        </w:numPr>
-        <w:pStyle w:val="Compact"/>
-      </w:pPr>
-      <w:r>
-        <w:t xml:space="preserve">Старые бумаги</w:t>
-      </w:r>
-      <w:r>
-        <w:t xml:space="preserve"> </w:t>
-      </w:r>
-      <w:r>
-        <w:rPr>
-          <w:bCs/>
-          <w:b/>
-        </w:rPr>
-        <w:t xml:space="preserve">убирает со стола</w:t>
-      </w:r>
-      <w:r>
-        <w:t xml:space="preserve">, но помнит, что с ними было.</w:t>
-      </w:r>
-    </w:p>
-    <w:p>
-      <w:pPr>
-        <w:numPr>
-          <w:ilvl w:val="0"/>
-          <w:numId w:val="1006"/>
-        </w:numPr>
-        <w:pStyle w:val="Compact"/>
-      </w:pPr>
-      <w:r>
-        <w:t xml:space="preserve">Нужный документ</w:t>
-      </w:r>
-      <w:r>
-        <w:t xml:space="preserve"> </w:t>
-      </w:r>
-      <w:r>
-        <w:rPr>
-          <w:bCs/>
-          <w:b/>
-        </w:rPr>
-        <w:t xml:space="preserve">ищет, когда он нужен</w:t>
-      </w:r>
-      <w:r>
-        <w:t xml:space="preserve">, а не читает всё подряд.</w:t>
-      </w:r>
-    </w:p>
-    <w:p>
-      <w:pPr>
-        <w:numPr>
-          <w:ilvl w:val="0"/>
-          <w:numId w:val="1006"/>
-        </w:numPr>
-        <w:pStyle w:val="Compact"/>
-      </w:pPr>
-      <w:r>
-        <w:t xml:space="preserve">Для отдельной темы зовёт</w:t>
-      </w:r>
-      <w:r>
-        <w:t xml:space="preserve"> </w:t>
-      </w:r>
-      <w:r>
-        <w:rPr>
-          <w:bCs/>
-          <w:b/>
-        </w:rPr>
-        <w:t xml:space="preserve">помощника</w:t>
-      </w:r>
-      <w:r>
-        <w:t xml:space="preserve">, который приносит короткую выжимку.</w:t>
+        <w:t xml:space="preserve">Если разобрать на части, то в Claude Code их шесть главных. На радаре вокруг модели.</w:t>
+      </w:r>
+    </w:p>
+    <w:p>
+      <w:pPr>
+        <w:numPr>
+          <w:ilvl w:val="0"/>
+          <w:numId w:val="1004"/>
+        </w:numPr>
+        <w:pStyle w:val="Compact"/>
+      </w:pPr>
+      <w:r>
+        <w:rPr>
+          <w:bCs/>
+          <w:b/>
+        </w:rPr>
+        <w:t xml:space="preserve">Цикл.</w:t>
+      </w:r>
+      <w:r>
+        <w:t xml:space="preserve"> </w:t>
+      </w:r>
+      <w:r>
+        <w:t xml:space="preserve">Обычный while.</w:t>
+      </w:r>
+    </w:p>
+    <w:p>
+      <w:pPr>
+        <w:numPr>
+          <w:ilvl w:val="0"/>
+          <w:numId w:val="1004"/>
+        </w:numPr>
+        <w:pStyle w:val="Compact"/>
+      </w:pPr>
+      <w:r>
+        <w:rPr>
+          <w:bCs/>
+          <w:b/>
+        </w:rPr>
+        <w:t xml:space="preserve">Инструменты.</w:t>
+      </w:r>
+      <w:r>
+        <w:t xml:space="preserve"> </w:t>
+      </w:r>
+      <w:r>
+        <w:t xml:space="preserve">В Claude Code шесть групп: файлы, поиск, команды, веб, анализ кода и запуск помощников.</w:t>
+      </w:r>
+    </w:p>
+    <w:p>
+      <w:pPr>
+        <w:numPr>
+          <w:ilvl w:val="0"/>
+          <w:numId w:val="1004"/>
+        </w:numPr>
+        <w:pStyle w:val="Compact"/>
+      </w:pPr>
+      <w:r>
+        <w:rPr>
+          <w:bCs/>
+          <w:b/>
+        </w:rPr>
+        <w:t xml:space="preserve">Память.</w:t>
+      </w:r>
+      <w:r>
+        <w:t xml:space="preserve"> </w:t>
+      </w:r>
+      <w:r>
+        <w:t xml:space="preserve">Два файла,</w:t>
+      </w:r>
+      <w:r>
+        <w:t xml:space="preserve"> </w:t>
+      </w:r>
+      <w:r>
+        <w:rPr>
+          <w:rStyle w:val="VerbatimChar"/>
+        </w:rPr>
+        <w:t xml:space="preserve">CLAUDE.md</w:t>
+      </w:r>
+      <w:r>
+        <w:t xml:space="preserve"> </w:t>
+      </w:r>
+      <w:r>
+        <w:t xml:space="preserve">и</w:t>
+      </w:r>
+      <w:r>
+        <w:t xml:space="preserve"> </w:t>
+      </w:r>
+      <w:r>
+        <w:rPr>
+          <w:rStyle w:val="VerbatimChar"/>
+        </w:rPr>
+        <w:t xml:space="preserve">MEMORY.md</w:t>
+      </w:r>
+      <w:r>
+        <w:t xml:space="preserve">: индекс, файлы по темам и архив.</w:t>
+      </w:r>
+    </w:p>
+    <w:p>
+      <w:pPr>
+        <w:numPr>
+          <w:ilvl w:val="0"/>
+          <w:numId w:val="1004"/>
+        </w:numPr>
+        <w:pStyle w:val="Compact"/>
+      </w:pPr>
+      <w:r>
+        <w:rPr>
+          <w:bCs/>
+          <w:b/>
+        </w:rPr>
+        <w:t xml:space="preserve">Контекст.</w:t>
+      </w:r>
+      <w:r>
+        <w:t xml:space="preserve"> </w:t>
+      </w:r>
+      <w:r>
+        <w:t xml:space="preserve">Сжатие истории и</w:t>
+      </w:r>
+      <w:r>
+        <w:t xml:space="preserve"> </w:t>
+      </w:r>
+      <w:r>
+        <w:rPr>
+          <w:rStyle w:val="VerbatimChar"/>
+        </w:rPr>
+        <w:t xml:space="preserve">grep</w:t>
+      </w:r>
+      <w:r>
+        <w:t xml:space="preserve"> </w:t>
+      </w:r>
+      <w:r>
+        <w:t xml:space="preserve">вместо чтения файлов целиком.</w:t>
+      </w:r>
+    </w:p>
+    <w:p>
+      <w:pPr>
+        <w:numPr>
+          <w:ilvl w:val="0"/>
+          <w:numId w:val="1004"/>
+        </w:numPr>
+        <w:pStyle w:val="Compact"/>
+      </w:pPr>
+      <w:r>
+        <w:rPr>
+          <w:bCs/>
+          <w:b/>
+        </w:rPr>
+        <w:t xml:space="preserve">Проверка.</w:t>
+      </w:r>
+      <w:r>
+        <w:t xml:space="preserve"> </w:t>
+      </w:r>
+      <w:r>
+        <w:t xml:space="preserve">Тесты, линтеры, скриншоты, ИИ-судья.</w:t>
+      </w:r>
+    </w:p>
+    <w:p>
+      <w:pPr>
+        <w:numPr>
+          <w:ilvl w:val="0"/>
+          <w:numId w:val="1004"/>
+        </w:numPr>
+        <w:pStyle w:val="Compact"/>
+      </w:pPr>
+      <w:r>
+        <w:rPr>
+          <w:bCs/>
+          <w:b/>
+        </w:rPr>
+        <w:t xml:space="preserve">Права.</w:t>
+      </w:r>
+      <w:r>
+        <w:t xml:space="preserve"> </w:t>
+      </w:r>
+      <w:r>
+        <w:t xml:space="preserve">Около сорока возможностей проверяются отдельно.</w:t>
       </w:r>
     </w:p>
     <w:p>
@@ -1296,17 +1121,17 @@
         <w:pStyle w:val="FirstParagraph"/>
       </w:pPr>
       <w:r>
-        <w:t xml:space="preserve">Клиент ощущает это так: «ИИ не тупеет к концу работы». Эту характеристику вы не увидите в названии модели. Она целиком от harness.</w:t>
-      </w:r>
-      <w:r>
-        <w:t xml:space="preserve"> </w:t>
-      </w:r>
-      <w:r>
-        <w:rPr>
-          <w:bCs/>
-          <w:b/>
-        </w:rPr>
-        <w:t xml:space="preserve">Беда вторая: сотрудник ошибается.</w:t>
+        <w:t xml:space="preserve">В статье таких частей одиннадцать, я показал шесть главных. Для маркетолога это список характеристик продукта, как в карточке товара. И к карточке мы ещё вернёмся.</w:t>
+      </w:r>
+      <w:r>
+        <w:t xml:space="preserve"> </w:t>
+      </w:r>
+      <w:r>
+        <w:rPr>
+          <w:bCs/>
+          <w:b/>
+        </w:rPr>
+        <w:t xml:space="preserve">Но у любой такой системы есть проблемы. Первая из них про память.</w:t>
       </w:r>
     </w:p>
     <w:p>
@@ -1317,13 +1142,13 @@
       </w:r>
     </w:p>
     <w:bookmarkEnd w:id="29"/>
-    <w:bookmarkStart w:id="30" w:name="слайд-10.-беда-2-ошибки-копятся"/>
+    <w:bookmarkStart w:id="30" w:name="слайд-10.-проблема-1-контекст"/>
     <w:p>
       <w:pPr>
         <w:pStyle w:val="Heading2"/>
       </w:pPr>
       <w:r>
-        <w:t xml:space="preserve">Слайд 10. Беда №2: ошибки копятся</w:t>
+        <w:t xml:space="preserve">Слайд 10. Проблема №1: контекст</w:t>
       </w:r>
     </w:p>
     <w:p>
@@ -1331,7 +1156,7 @@
         <w:pStyle w:val="FirstParagraph"/>
       </w:pPr>
       <w:r>
-        <w:t xml:space="preserve">Посчитаем. Допустим, на каждом шаге ИИ не ошибается в 99 случаях из 100. Звучит прекрасно. Но дело состоит из десяти шагов. И тогда без единой ошибки доходит около 90 дел из ста. Каждое десятое идёт не так. Поэтому ошибки нужно ловить на ходу, а число повторных попыток ограничивать. В компании Stripe, например, больше двух повторов не разрешают.</w:t>
+        <w:t xml:space="preserve">У модели есть «рабочий стол»: то, что она одновременно держит в голове. Он ограничен. Исследователи выяснили: если важная информация оказывается в середине длинного текста, качество падает на 30% и больше. Смотрите на кривую: начало и конец модель помнит хорошо, а середина проваливается. Это знакомо любому студенту: лекцию вы помните с начала и с конца.</w:t>
       </w:r>
     </w:p>
     <w:p>
@@ -1339,87 +1164,103 @@
         <w:pStyle w:val="BodyText"/>
       </w:pPr>
       <w:r>
-        <w:t xml:space="preserve">Что с этим делает harness? Два способа.</w:t>
-      </w:r>
-    </w:p>
-    <w:p>
-      <w:pPr>
-        <w:pStyle w:val="BodyText"/>
-      </w:pPr>
-      <w:r>
-        <w:rPr>
-          <w:bCs/>
-          <w:b/>
-        </w:rPr>
-        <w:t xml:space="preserve">Первый: пусть сотрудник проверяет сам себя.</w:t>
-      </w:r>
-      <w:r>
-        <w:t xml:space="preserve"> </w:t>
-      </w:r>
-      <w:r>
-        <w:t xml:space="preserve">Создатель Claude Code Борис Черни говорит: если агент умеет проверить результат (прогнать тесты, посмотреть на экран или показать работу второму ИИ), качество растёт в два-три раза. Это как корректор в издательстве.</w:t>
-      </w:r>
-    </w:p>
-    <w:p>
-      <w:pPr>
-        <w:pStyle w:val="BodyText"/>
-      </w:pPr>
-      <w:r>
-        <w:rPr>
-          <w:bCs/>
-          <w:b/>
-        </w:rPr>
-        <w:t xml:space="preserve">Второй: границы.</w:t>
-      </w:r>
-      <w:r>
-        <w:t xml:space="preserve"> </w:t>
-      </w:r>
-      <w:r>
-        <w:t xml:space="preserve">Модель решает, что</w:t>
-      </w:r>
-      <w:r>
-        <w:t xml:space="preserve"> </w:t>
-      </w:r>
-      <w:r>
-        <w:rPr>
-          <w:iCs/>
-          <w:i/>
-        </w:rPr>
-        <w:t xml:space="preserve">попробовать</w:t>
-      </w:r>
-      <w:r>
-        <w:t xml:space="preserve">, а harness решает, что</w:t>
-      </w:r>
-      <w:r>
-        <w:t xml:space="preserve"> </w:t>
-      </w:r>
-      <w:r>
-        <w:rPr>
-          <w:iCs/>
-          <w:i/>
-        </w:rPr>
-        <w:t xml:space="preserve">разрешить</w:t>
-      </w:r>
-      <w:r>
-        <w:t xml:space="preserve">. Как в любой компании: можно читать документы, нельзя удалять. В Claude Code так отдельно проверяют около сорока действий.</w:t>
-      </w:r>
-    </w:p>
-    <w:p>
-      <w:pPr>
-        <w:pStyle w:val="BodyText"/>
-      </w:pPr>
-      <w:r>
-        <w:t xml:space="preserve">Это готовые аргументы продаж: надёжность и безопасность.</w:t>
-      </w:r>
-      <w:r>
-        <w:t xml:space="preserve"> </w:t>
-      </w:r>
-      <w:r>
-        <w:rPr>
-          <w:bCs/>
-          <w:b/>
-        </w:rPr>
-        <w:t xml:space="preserve">А что, если дело настолько большое, что за один рабочий день его не сделать?</w:t>
+        <w:t xml:space="preserve">Что делает harness? Четыре приёма, по-английски они на слайде в подписях:</w:t>
+      </w:r>
+    </w:p>
+    <w:p>
+      <w:pPr>
+        <w:numPr>
+          <w:ilvl w:val="0"/>
+          <w:numId w:val="1005"/>
+        </w:numPr>
+        <w:pStyle w:val="Compact"/>
+      </w:pPr>
+      <w:r>
+        <w:t xml:space="preserve">Сжимает историю в конспект: решения оставляет, лишнее убирает.</w:t>
+      </w:r>
+    </w:p>
+    <w:p>
+      <w:pPr>
+        <w:numPr>
+          <w:ilvl w:val="0"/>
+          <w:numId w:val="1005"/>
+        </w:numPr>
+        <w:pStyle w:val="Compact"/>
+      </w:pPr>
+      <w:r>
+        <w:t xml:space="preserve">Прячет старое: старые результаты скрыты, а факт вызова виден.</w:t>
+      </w:r>
+    </w:p>
+    <w:p>
+      <w:pPr>
+        <w:numPr>
+          <w:ilvl w:val="0"/>
+          <w:numId w:val="1005"/>
+        </w:numPr>
+        <w:pStyle w:val="Compact"/>
+      </w:pPr>
+      <w:r>
+        <w:t xml:space="preserve">Ищет по мере нужды:</w:t>
+      </w:r>
+      <w:r>
+        <w:t xml:space="preserve"> </w:t>
+      </w:r>
+      <w:r>
+        <w:rPr>
+          <w:rStyle w:val="VerbatimChar"/>
+        </w:rPr>
+        <w:t xml:space="preserve">grep</w:t>
+      </w:r>
+      <w:r>
+        <w:t xml:space="preserve"> </w:t>
+      </w:r>
+      <w:r>
+        <w:t xml:space="preserve">и</w:t>
+      </w:r>
+      <w:r>
+        <w:t xml:space="preserve"> </w:t>
+      </w:r>
+      <w:r>
+        <w:rPr>
+          <w:rStyle w:val="VerbatimChar"/>
+        </w:rPr>
+        <w:t xml:space="preserve">glob</w:t>
+      </w:r>
+      <w:r>
+        <w:t xml:space="preserve"> </w:t>
+      </w:r>
+      <w:r>
+        <w:t xml:space="preserve">вместо чтения файлов целиком.</w:t>
+      </w:r>
+    </w:p>
+    <w:p>
+      <w:pPr>
+        <w:numPr>
+          <w:ilvl w:val="0"/>
+          <w:numId w:val="1005"/>
+        </w:numPr>
+        <w:pStyle w:val="Compact"/>
+      </w:pPr>
+      <w:r>
+        <w:t xml:space="preserve">Зовёт помощников: они возвращают краткое резюме на тысячу-две тысячи токенов.</w:t>
+      </w:r>
+    </w:p>
+    <w:p>
+      <w:pPr>
+        <w:pStyle w:val="FirstParagraph"/>
+      </w:pPr>
+      <w:r>
+        <w:t xml:space="preserve">Маркетологу: «ИИ не тупеет к концу работы» — это свойство harness, а не модели.</w:t>
+      </w:r>
+      <w:r>
+        <w:t xml:space="preserve"> </w:t>
+      </w:r>
+      <w:r>
+        <w:rPr>
+          <w:bCs/>
+          <w:b/>
+        </w:rPr>
+        <w:t xml:space="preserve">Проблема вторая: ошибки.</w:t>
       </w:r>
     </w:p>
     <w:p>
@@ -1430,13 +1271,13 @@
       </w:r>
     </w:p>
     <w:bookmarkEnd w:id="30"/>
-    <w:bookmarkStart w:id="31" w:name="слайд-11.-большое-дело-журнал-смены"/>
+    <w:bookmarkStart w:id="31" w:name="слайд-11.-проблема-2-ошибки"/>
     <w:p>
       <w:pPr>
         <w:pStyle w:val="Heading2"/>
       </w:pPr>
       <w:r>
-        <w:t xml:space="preserve">Слайд 11. Большое дело: журнал смены</w:t>
+        <w:t xml:space="preserve">Слайд 11. Проблема №2: ошибки</w:t>
       </w:r>
     </w:p>
     <w:p>
@@ -1444,7 +1285,7 @@
         <w:pStyle w:val="FirstParagraph"/>
       </w:pPr>
       <w:r>
-        <w:t xml:space="preserve">В Anthropic придумали решение, знакомое каждому, кто работал сменами. В больнице люди меняются, а журнал остаётся.</w:t>
+        <w:t xml:space="preserve">Посчитаем. Допустим, на каждом шаге ИИ не ошибается в 99 случаях из 100. Звучит прекрасно. Но дело состоит из десяти шагов: 0,99 в десятой степени — это около 0,904. То есть без единой ошибки дойдёт лишь около 90% дел. Для двадцати шагов уже 82%, для пятидесяти — 60%. Смотрите на столбики.</w:t>
       </w:r>
     </w:p>
     <w:p>
@@ -1452,33 +1293,7 @@
         <w:pStyle w:val="BodyText"/>
       </w:pPr>
       <w:r>
-        <w:t xml:space="preserve">Сначала приходит</w:t>
-      </w:r>
-      <w:r>
-        <w:t xml:space="preserve"> </w:t>
-      </w:r>
-      <w:r>
-        <w:rPr>
-          <w:bCs/>
-          <w:b/>
-        </w:rPr>
-        <w:t xml:space="preserve">подготовщик</w:t>
-      </w:r>
-      <w:r>
-        <w:t xml:space="preserve">. Он один раз готовит рабочее место, составляет список задач, заводит отчёт и делает первое сохранение работы. Потом каждую смену приходит</w:t>
-      </w:r>
-      <w:r>
-        <w:t xml:space="preserve"> </w:t>
-      </w:r>
-      <w:r>
-        <w:rPr>
-          <w:bCs/>
-          <w:b/>
-        </w:rPr>
-        <w:t xml:space="preserve">исполнитель</w:t>
-      </w:r>
-      <w:r>
-        <w:t xml:space="preserve">. Он читает журнал и вспоминает, что уже сделано. Берёт самую важную задачу, выполняет её и записывает итог для следующей смены.</w:t>
+        <w:t xml:space="preserve">Что делает harness: ловит сбой, возвращает его модели как обычный результат, чтобы она могла исправиться, и ограничивает число повторов. В компании Stripe, например, больше двух повторов не разрешают.</w:t>
       </w:r>
     </w:p>
     <w:p>
@@ -1486,17 +1301,17 @@
         <w:pStyle w:val="BodyText"/>
       </w:pPr>
       <w:r>
-        <w:t xml:space="preserve">Благодаря этому большое дело можно делать частями, и ничего не теряется. Для клиента это значит: непрерывность работы.</w:t>
-      </w:r>
-      <w:r>
-        <w:t xml:space="preserve"> </w:t>
-      </w:r>
-      <w:r>
-        <w:rPr>
-          <w:bCs/>
-          <w:b/>
-        </w:rPr>
-        <w:t xml:space="preserve">Теперь посмотрим, как это продают на рынке.</w:t>
+        <w:t xml:space="preserve">Для маркетолога: чем длиннее задача, тем дороже ошибка. Поэтому надёжность — это аргумент продаж.</w:t>
+      </w:r>
+      <w:r>
+        <w:t xml:space="preserve"> </w:t>
+      </w:r>
+      <w:r>
+        <w:rPr>
+          <w:bCs/>
+          <w:b/>
+        </w:rPr>
+        <w:t xml:space="preserve">Проблема третья: доверие.</w:t>
       </w:r>
     </w:p>
     <w:p>
@@ -1507,13 +1322,13 @@
       </w:r>
     </w:p>
     <w:bookmarkEnd w:id="31"/>
-    <w:bookmarkStart w:id="32" w:name="X65fb9b3cb2661b6842224564d3ff36ecc1efefb"/>
+    <w:bookmarkStart w:id="32" w:name="слайд-12.-проблема-3-проверка-и-права"/>
     <w:p>
       <w:pPr>
         <w:pStyle w:val="Heading2"/>
       </w:pPr>
       <w:r>
-        <w:t xml:space="preserve">Слайд 12. Рынок: одна модель, разные обещания</w:t>
+        <w:t xml:space="preserve">Слайд 12. Проблема №3: проверка и права</w:t>
       </w:r>
     </w:p>
     <w:p>
@@ -1521,148 +1336,67 @@
         <w:pStyle w:val="FirstParagraph"/>
       </w:pPr>
       <w:r>
-        <w:t xml:space="preserve">Вот пять известных продуктов, и у каждого своё «обещание».</w:t>
-      </w:r>
-    </w:p>
-    <w:p>
-      <w:pPr>
-        <w:numPr>
-          <w:ilvl w:val="0"/>
-          <w:numId w:val="1007"/>
-        </w:numPr>
-        <w:pStyle w:val="Compact"/>
-      </w:pPr>
-      <w:r>
-        <w:rPr>
-          <w:bCs/>
-          <w:b/>
-        </w:rPr>
-        <w:t xml:space="preserve">Claude Code</w:t>
-      </w:r>
-      <w:r>
-        <w:t xml:space="preserve"> </w:t>
-      </w:r>
-      <w:r>
-        <w:t xml:space="preserve">от Anthropic: лёгкий harness. Ставка на то, что модель станет умнее, поэтому лишние шаги убирают.</w:t>
-      </w:r>
-    </w:p>
-    <w:p>
-      <w:pPr>
-        <w:numPr>
-          <w:ilvl w:val="0"/>
-          <w:numId w:val="1007"/>
-        </w:numPr>
-        <w:pStyle w:val="Compact"/>
-      </w:pPr>
-      <w:r>
-        <w:rPr>
-          <w:bCs/>
-          <w:b/>
-        </w:rPr>
-        <w:t xml:space="preserve">Codex</w:t>
-      </w:r>
-      <w:r>
-        <w:t xml:space="preserve"> </w:t>
-      </w:r>
-      <w:r>
-        <w:t xml:space="preserve">от OpenAI: один и тот же harness работает в терминале, в редакторе и в браузере.</w:t>
-      </w:r>
-    </w:p>
-    <w:p>
-      <w:pPr>
-        <w:numPr>
-          <w:ilvl w:val="0"/>
-          <w:numId w:val="1007"/>
-        </w:numPr>
-        <w:pStyle w:val="Compact"/>
-      </w:pPr>
-      <w:r>
-        <w:rPr>
-          <w:bCs/>
-          <w:b/>
-        </w:rPr>
-        <w:t xml:space="preserve">LangGraph</w:t>
-      </w:r>
-      <w:r>
-        <w:t xml:space="preserve"> </w:t>
-      </w:r>
-      <w:r>
-        <w:t xml:space="preserve">от LangChain: работа расписана как схема, каждый шаг под контролем.</w:t>
-      </w:r>
-    </w:p>
-    <w:p>
-      <w:pPr>
-        <w:numPr>
-          <w:ilvl w:val="0"/>
-          <w:numId w:val="1007"/>
-        </w:numPr>
-        <w:pStyle w:val="Compact"/>
-      </w:pPr>
-      <w:r>
-        <w:rPr>
-          <w:bCs/>
-          <w:b/>
-        </w:rPr>
-        <w:t xml:space="preserve">CrewAI</w:t>
-      </w:r>
-      <w:r>
-        <w:t xml:space="preserve">: команда агентов, у каждого своя роль.</w:t>
-      </w:r>
-    </w:p>
-    <w:p>
-      <w:pPr>
-        <w:numPr>
-          <w:ilvl w:val="0"/>
-          <w:numId w:val="1007"/>
-        </w:numPr>
-        <w:pStyle w:val="Compact"/>
-      </w:pPr>
-      <w:r>
-        <w:rPr>
-          <w:bCs/>
-          <w:b/>
-        </w:rPr>
-        <w:t xml:space="preserve">AutoGen</w:t>
-      </w:r>
-      <w:r>
-        <w:t xml:space="preserve"> </w:t>
-      </w:r>
-      <w:r>
-        <w:t xml:space="preserve">от Microsoft: агенты решают задачу вместе, как в общем чате.</w:t>
-      </w:r>
-    </w:p>
-    <w:p>
-      <w:pPr>
-        <w:pStyle w:val="FirstParagraph"/>
-      </w:pPr>
-      <w:r>
-        <w:t xml:space="preserve">Модель можно взять одну и ту же. А продают разный подход: «лёгкий», «контролируемый», «командный». На языке маркетинга это</w:t>
-      </w:r>
-      <w:r>
-        <w:t xml:space="preserve"> </w:t>
-      </w:r>
-      <w:r>
-        <w:rPr>
-          <w:bCs/>
-          <w:b/>
-        </w:rPr>
-        <w:t xml:space="preserve">позиционирование.</w:t>
-      </w:r>
-      <w:r>
-        <w:t xml:space="preserve"> </w:t>
-      </w:r>
-      <w:r>
-        <w:t xml:space="preserve">Конкурентное различие живёт в harness.</w:t>
-      </w:r>
-      <w:r>
-        <w:t xml:space="preserve"> </w:t>
-      </w:r>
-      <w:r>
-        <w:rPr>
-          <w:bCs/>
-          <w:b/>
-        </w:rPr>
-        <w:t xml:space="preserve">Но можно ли построить хороший harness один раз и успокоиться?</w:t>
+        <w:t xml:space="preserve">Между «хочу» и «сделано» стоят три ворота. Модель предлагает действие. Первые ворота: доверие при открытии проекта. Вторые: проверка прав перед каждым вызовом. Третьи: подтверждение человеком для рискованных действий. Только после этого действие выполняется.</w:t>
+      </w:r>
+    </w:p>
+    <w:p>
+      <w:pPr>
+        <w:pStyle w:val="BodyText"/>
+      </w:pPr>
+      <w:r>
+        <w:t xml:space="preserve">Принцип: модель решает, что</w:t>
+      </w:r>
+      <w:r>
+        <w:t xml:space="preserve"> </w:t>
+      </w:r>
+      <w:r>
+        <w:rPr>
+          <w:iCs/>
+          <w:i/>
+        </w:rPr>
+        <w:t xml:space="preserve">попробовать</w:t>
+      </w:r>
+      <w:r>
+        <w:t xml:space="preserve">. Система решает, что</w:t>
+      </w:r>
+      <w:r>
+        <w:t xml:space="preserve"> </w:t>
+      </w:r>
+      <w:r>
+        <w:rPr>
+          <w:iCs/>
+          <w:i/>
+        </w:rPr>
+        <w:t xml:space="preserve">разрешено</w:t>
+      </w:r>
+      <w:r>
+        <w:t xml:space="preserve">. Как с доступами сотрудника: можно читать документы, нельзя удалять.</w:t>
+      </w:r>
+    </w:p>
+    <w:p>
+      <w:pPr>
+        <w:pStyle w:val="BodyText"/>
+      </w:pPr>
+      <w:r>
+        <w:t xml:space="preserve">Две цифры. Около сорока возможностей в Claude Code проверяются отдельно. А создатель Claude Code Борис Черни говорит, что когда агент умеет проверять сам себя (тесты, линтеры, скриншоты, второй ИИ как судья), качество растёт в два-три раза.</w:t>
+      </w:r>
+    </w:p>
+    <w:p>
+      <w:pPr>
+        <w:pStyle w:val="BodyText"/>
+      </w:pPr>
+      <w:r>
+        <w:t xml:space="preserve">Для маркетолога: безопасность — товарное свойство, а не опция.</w:t>
+      </w:r>
+      <w:r>
+        <w:t xml:space="preserve"> </w:t>
+      </w:r>
+      <w:r>
+        <w:rPr>
+          <w:bCs/>
+          <w:b/>
+        </w:rPr>
+        <w:t xml:space="preserve">Проблема четвёртая: большие задачи.</w:t>
       </w:r>
     </w:p>
     <w:p>
@@ -1673,13 +1407,13 @@
       </w:r>
     </w:p>
     <w:bookmarkEnd w:id="32"/>
-    <w:bookmarkStart w:id="33" w:name="слайд-13.-будущее-леса-убирают"/>
+    <w:bookmarkStart w:id="33" w:name="слайд-13.-проблема-4-большое-дело"/>
     <w:p>
       <w:pPr>
         <w:pStyle w:val="Heading2"/>
       </w:pPr>
       <w:r>
-        <w:t xml:space="preserve">Слайд 13. Будущее: леса убирают</w:t>
+        <w:t xml:space="preserve">Слайд 13. Проблема №4: большое дело</w:t>
       </w:r>
     </w:p>
     <w:p>
@@ -1687,7 +1421,7 @@
         <w:pStyle w:val="FirstParagraph"/>
       </w:pPr>
       <w:r>
-        <w:t xml:space="preserve">Автор статьи использует образ строительных лесов. Они нужны, чтобы добраться до верхних этажей, но сами ничего не строят. Когда здание готово, леса убирают.</w:t>
+        <w:t xml:space="preserve">Что если дело не помещается в один «рабочий стол»? Приём Anthropic знаком любому, кто работал сменами. В больнице люди меняются, а журнал остаётся.</w:t>
       </w:r>
     </w:p>
     <w:p>
@@ -1695,7 +1429,33 @@
         <w:pStyle w:val="BodyText"/>
       </w:pPr>
       <w:r>
-        <w:t xml:space="preserve">С harness то же. Модели умнеют, и harness должен становиться проще. Продукт Manus за полгода переделывали пять раз, и каждый раз убирали лишнее. В Claude Code убирают шаги, которые модель научилась делать сама. На графике видно: чем сильнее модель, тем тоньше нужен harness. Это схема по смыслу статьи, без точных цифр, я специально это подписал.</w:t>
+        <w:t xml:space="preserve">Сначала один раз приходит</w:t>
+      </w:r>
+      <w:r>
+        <w:t xml:space="preserve"> </w:t>
+      </w:r>
+      <w:r>
+        <w:rPr>
+          <w:bCs/>
+          <w:b/>
+        </w:rPr>
+        <w:t xml:space="preserve">подготовщик</w:t>
+      </w:r>
+      <w:r>
+        <w:t xml:space="preserve">: готовит рабочее место, список задач, файл прогресса и первое сохранение. Потом каждую смену приходит</w:t>
+      </w:r>
+      <w:r>
+        <w:t xml:space="preserve"> </w:t>
+      </w:r>
+      <w:r>
+        <w:rPr>
+          <w:bCs/>
+          <w:b/>
+        </w:rPr>
+        <w:t xml:space="preserve">исполнитель</w:t>
+      </w:r>
+      <w:r>
+        <w:t xml:space="preserve">. Он читает журнал, берёт самую важную задачу, делает её, сохраняет и пишет итог. Следующий исполнитель начнёт с этой записи.</w:t>
       </w:r>
     </w:p>
     <w:p>
@@ -1703,23 +1463,25 @@
         <w:pStyle w:val="BodyText"/>
       </w:pPr>
       <w:r>
-        <w:t xml:space="preserve">Предупреждение для маркетолога:</w:t>
-      </w:r>
-      <w:r>
-        <w:t xml:space="preserve"> </w:t>
-      </w:r>
-      <w:r>
-        <w:rPr>
-          <w:bCs/>
-          <w:b/>
-        </w:rPr>
-        <w:t xml:space="preserve">преимущество в harness нельзя создать один раз.</w:t>
-      </w:r>
-      <w:r>
-        <w:t xml:space="preserve"> </w:t>
-      </w:r>
-      <w:r>
-        <w:t xml:space="preserve">Его придётся пересобирать с каждой новой моделью. А теперь соберём всё вместе.</w:t>
+        <w:t xml:space="preserve">Журнал здесь — файл прогресса плюс git-коммиты. Память модели ограничена, а журнал остаётся между сменами.</w:t>
+      </w:r>
+    </w:p>
+    <w:p>
+      <w:pPr>
+        <w:pStyle w:val="BodyText"/>
+      </w:pPr>
+      <w:r>
+        <w:t xml:space="preserve">Маркетологу: непрерывность работы — тоже характеристика продукта.</w:t>
+      </w:r>
+      <w:r>
+        <w:t xml:space="preserve"> </w:t>
+      </w:r>
+      <w:r>
+        <w:rPr>
+          <w:bCs/>
+          <w:b/>
+        </w:rPr>
+        <w:t xml:space="preserve">Теперь посмотрим на рынок.</w:t>
       </w:r>
     </w:p>
     <w:p>
@@ -1730,13 +1492,13 @@
       </w:r>
     </w:p>
     <w:bookmarkEnd w:id="33"/>
-    <w:bookmarkStart w:id="34" w:name="Xcc1f5c66928a36c5424a940df18088277c628fc"/>
+    <w:bookmarkStart w:id="34" w:name="X203f63e880e5f6931c521286ffe01e13f9be5f2"/>
     <w:p>
       <w:pPr>
         <w:pStyle w:val="Heading2"/>
       </w:pPr>
       <w:r>
-        <w:t xml:space="preserve">Слайд 14. Вывод: модель — товар, harness — продукт</w:t>
+        <w:t xml:space="preserve">Слайд 14. Рынок: одна модель, разные обещания</w:t>
       </w:r>
     </w:p>
     <w:p>
@@ -1744,56 +1506,111 @@
         <w:pStyle w:val="FirstParagraph"/>
       </w:pPr>
       <w:r>
-        <w:t xml:space="preserve">Вернёмся к директору, который выбирал ИИ-помощника. Что мы выяснили?</w:t>
-      </w:r>
-    </w:p>
-    <w:p>
-      <w:pPr>
-        <w:numPr>
-          <w:ilvl w:val="0"/>
-          <w:numId w:val="1008"/>
-        </w:numPr>
-        <w:pStyle w:val="Compact"/>
-      </w:pPr>
-      <w:r>
-        <w:t xml:space="preserve">Модели доступны всем. Это почти</w:t>
-      </w:r>
-      <w:r>
-        <w:t xml:space="preserve"> </w:t>
-      </w:r>
-      <w:r>
-        <w:rPr>
-          <w:iCs/>
-          <w:i/>
-        </w:rPr>
-        <w:t xml:space="preserve">товар</w:t>
-      </w:r>
-      <w:r>
-        <w:t xml:space="preserve">, как мука.</w:t>
-      </w:r>
-    </w:p>
-    <w:p>
-      <w:pPr>
-        <w:numPr>
-          <w:ilvl w:val="0"/>
-          <w:numId w:val="1008"/>
-        </w:numPr>
-        <w:pStyle w:val="Compact"/>
-      </w:pPr>
-      <w:r>
-        <w:t xml:space="preserve">Поэтому отличие уходит в harness: на одной и той же модели продукты работают по-разному.</w:t>
-      </w:r>
-    </w:p>
-    <w:p>
-      <w:pPr>
-        <w:numPr>
-          <w:ilvl w:val="0"/>
-          <w:numId w:val="1008"/>
-        </w:numPr>
-        <w:pStyle w:val="Compact"/>
-      </w:pPr>
-      <w:r>
-        <w:t xml:space="preserve">Harness трудно скопировать, в нём опыт и ошибки команды. Это и есть преимущество.</w:t>
+        <w:t xml:space="preserve">Вот пять известных продуктов, как постеры. Слоганы мои, по описанию подходов в статье, они не официальные.</w:t>
+      </w:r>
+    </w:p>
+    <w:p>
+      <w:pPr>
+        <w:numPr>
+          <w:ilvl w:val="0"/>
+          <w:numId w:val="1006"/>
+        </w:numPr>
+        <w:pStyle w:val="Compact"/>
+      </w:pPr>
+      <w:r>
+        <w:rPr>
+          <w:bCs/>
+          <w:b/>
+        </w:rPr>
+        <w:t xml:space="preserve">Claude Code</w:t>
+      </w:r>
+      <w:r>
+        <w:t xml:space="preserve"> </w:t>
+      </w:r>
+      <w:r>
+        <w:t xml:space="preserve">от Anthropic: лёгкий harness. Ставка на то, что модель станет умнее.</w:t>
+      </w:r>
+    </w:p>
+    <w:p>
+      <w:pPr>
+        <w:numPr>
+          <w:ilvl w:val="0"/>
+          <w:numId w:val="1006"/>
+        </w:numPr>
+        <w:pStyle w:val="Compact"/>
+      </w:pPr>
+      <w:r>
+        <w:rPr>
+          <w:bCs/>
+          <w:b/>
+        </w:rPr>
+        <w:t xml:space="preserve">Codex</w:t>
+      </w:r>
+      <w:r>
+        <w:t xml:space="preserve"> </w:t>
+      </w:r>
+      <w:r>
+        <w:t xml:space="preserve">от OpenAI: один harness везде — в терминале, в редакторе, в браузере.</w:t>
+      </w:r>
+    </w:p>
+    <w:p>
+      <w:pPr>
+        <w:numPr>
+          <w:ilvl w:val="0"/>
+          <w:numId w:val="1006"/>
+        </w:numPr>
+        <w:pStyle w:val="Compact"/>
+      </w:pPr>
+      <w:r>
+        <w:rPr>
+          <w:bCs/>
+          <w:b/>
+        </w:rPr>
+        <w:t xml:space="preserve">LangGraph</w:t>
+      </w:r>
+      <w:r>
+        <w:t xml:space="preserve">: каждый шаг под контролем, работа расписана как схема.</w:t>
+      </w:r>
+    </w:p>
+    <w:p>
+      <w:pPr>
+        <w:numPr>
+          <w:ilvl w:val="0"/>
+          <w:numId w:val="1006"/>
+        </w:numPr>
+        <w:pStyle w:val="Compact"/>
+      </w:pPr>
+      <w:r>
+        <w:rPr>
+          <w:bCs/>
+          <w:b/>
+        </w:rPr>
+        <w:t xml:space="preserve">CrewAI</w:t>
+      </w:r>
+      <w:r>
+        <w:t xml:space="preserve">: целая команда агентов, у каждого своя роль.</w:t>
+      </w:r>
+    </w:p>
+    <w:p>
+      <w:pPr>
+        <w:numPr>
+          <w:ilvl w:val="0"/>
+          <w:numId w:val="1006"/>
+        </w:numPr>
+        <w:pStyle w:val="Compact"/>
+      </w:pPr>
+      <w:r>
+        <w:rPr>
+          <w:bCs/>
+          <w:b/>
+        </w:rPr>
+        <w:t xml:space="preserve">AutoGen</w:t>
+      </w:r>
+      <w:r>
+        <w:t xml:space="preserve"> </w:t>
+      </w:r>
+      <w:r>
+        <w:t xml:space="preserve">от Microsoft: агенты решают задачу вместе, как в общем чате.</w:t>
       </w:r>
     </w:p>
     <w:p>
@@ -1801,134 +1618,17 @@
         <w:pStyle w:val="FirstParagraph"/>
       </w:pPr>
       <w:r>
-        <w:t xml:space="preserve">И у вас теперь есть практический инструмент: четыре вопроса любому ИИ-продукту.</w:t>
-      </w:r>
-    </w:p>
-    <w:p>
-      <w:pPr>
-        <w:numPr>
-          <w:ilvl w:val="0"/>
-          <w:numId w:val="1009"/>
-        </w:numPr>
-        <w:pStyle w:val="Compact"/>
-      </w:pPr>
-      <w:r>
-        <w:t xml:space="preserve">Что он</w:t>
-      </w:r>
-      <w:r>
-        <w:t xml:space="preserve"> </w:t>
-      </w:r>
-      <w:r>
-        <w:rPr>
-          <w:bCs/>
-          <w:b/>
-        </w:rPr>
-        <w:t xml:space="preserve">помнит</w:t>
-      </w:r>
-      <w:r>
-        <w:t xml:space="preserve"> </w:t>
-      </w:r>
-      <w:r>
-        <w:t xml:space="preserve">между сессиями?</w:t>
-      </w:r>
-    </w:p>
-    <w:p>
-      <w:pPr>
-        <w:numPr>
-          <w:ilvl w:val="0"/>
-          <w:numId w:val="1009"/>
-        </w:numPr>
-        <w:pStyle w:val="Compact"/>
-      </w:pPr>
-      <w:r>
-        <w:t xml:space="preserve">Как</w:t>
-      </w:r>
-      <w:r>
-        <w:t xml:space="preserve"> </w:t>
-      </w:r>
-      <w:r>
-        <w:rPr>
-          <w:bCs/>
-          <w:b/>
-        </w:rPr>
-        <w:t xml:space="preserve">проверяет</w:t>
-      </w:r>
-      <w:r>
-        <w:t xml:space="preserve"> </w:t>
-      </w:r>
-      <w:r>
-        <w:t xml:space="preserve">свою работу?</w:t>
-      </w:r>
-    </w:p>
-    <w:p>
-      <w:pPr>
-        <w:numPr>
-          <w:ilvl w:val="0"/>
-          <w:numId w:val="1009"/>
-        </w:numPr>
-        <w:pStyle w:val="Compact"/>
-      </w:pPr>
-      <w:r>
-        <w:t xml:space="preserve">Что ему</w:t>
-      </w:r>
-      <w:r>
-        <w:t xml:space="preserve"> </w:t>
-      </w:r>
-      <w:r>
-        <w:rPr>
-          <w:bCs/>
-          <w:b/>
-        </w:rPr>
-        <w:t xml:space="preserve">разрешено</w:t>
-      </w:r>
-      <w:r>
-        <w:t xml:space="preserve"> </w:t>
-      </w:r>
-      <w:r>
-        <w:t xml:space="preserve">без человека?</w:t>
-      </w:r>
-    </w:p>
-    <w:p>
-      <w:pPr>
-        <w:numPr>
-          <w:ilvl w:val="0"/>
-          <w:numId w:val="1009"/>
-        </w:numPr>
-        <w:pStyle w:val="Compact"/>
-      </w:pPr>
-      <w:r>
-        <w:t xml:space="preserve">Что делает, когда</w:t>
-      </w:r>
-      <w:r>
-        <w:t xml:space="preserve"> </w:t>
-      </w:r>
-      <w:r>
-        <w:rPr>
-          <w:bCs/>
-          <w:b/>
-        </w:rPr>
-        <w:t xml:space="preserve">ошибается</w:t>
-      </w:r>
-      <w:r>
-        <w:t xml:space="preserve">?</w:t>
-      </w:r>
-    </w:p>
-    <w:p>
-      <w:pPr>
-        <w:pStyle w:val="FirstParagraph"/>
-      </w:pPr>
-      <w:r>
-        <w:t xml:space="preserve">Если продавец уверенно отвечает, за красивой моделью стоит продуманный harness. Известная маркетинговая фраза говорит: людям нужна не дрель, а дырка в стене. Так и здесь: клиенту продают не «доступ к ИИ», а</w:t>
-      </w:r>
-      <w:r>
-        <w:t xml:space="preserve"> </w:t>
-      </w:r>
-      <w:r>
-        <w:rPr>
-          <w:bCs/>
-          <w:b/>
-        </w:rPr>
-        <w:t xml:space="preserve">выполненную задачу.</w:t>
+        <w:t xml:space="preserve">Модель можно взять одну и ту же. А продают разный подход. На языке маркетинга это позиционирование.</w:t>
+      </w:r>
+      <w:r>
+        <w:t xml:space="preserve"> </w:t>
+      </w:r>
+      <w:r>
+        <w:rPr>
+          <w:bCs/>
+          <w:b/>
+        </w:rPr>
+        <w:t xml:space="preserve">Как этим пользоваться на практике?</w:t>
       </w:r>
     </w:p>
     <w:p>
@@ -1939,13 +1639,13 @@
       </w:r>
     </w:p>
     <w:bookmarkEnd w:id="34"/>
-    <w:bookmarkStart w:id="35" w:name="слайд-15.-спасибо"/>
+    <w:bookmarkStart w:id="35" w:name="слайд-15.-маркетинг-карточка-ии-продукта"/>
     <w:p>
       <w:pPr>
         <w:pStyle w:val="Heading2"/>
       </w:pPr>
       <w:r>
-        <w:t xml:space="preserve">Слайд 15. Спасибо</w:t>
+        <w:t xml:space="preserve">Слайд 15. Маркетинг: карточка ИИ-продукта</w:t>
       </w:r>
     </w:p>
     <w:p>
@@ -1953,17 +1653,7 @@
         <w:pStyle w:val="FirstParagraph"/>
       </w:pPr>
       <w:r>
-        <w:t xml:space="preserve">Запомните одну фразу:</w:t>
-      </w:r>
-      <w:r>
-        <w:t xml:space="preserve"> </w:t>
-      </w:r>
-      <w:r>
-        <w:rPr>
-          <w:bCs/>
-          <w:b/>
-        </w:rPr>
-        <w:t xml:space="preserve">когда ИИ-агент в следующий раз даст сбой, не вините модель. Смотрите на harness.</w:t>
+        <w:t xml:space="preserve">Представьте карточку товара на маркетплейсе. У ИИ-продукта в ней два поля: «модель» и «harness». Модель у многих одинаковая. А вот характеристики справа — память, проверка, права, поведение при сбое, работа с инструментами, непрерывность — это и есть конкурентное различие, и сегодня их часто не пишут.</w:t>
       </w:r>
     </w:p>
     <w:p>
@@ -1971,7 +1661,73 @@
         <w:pStyle w:val="BodyText"/>
       </w:pPr>
       <w:r>
-        <w:t xml:space="preserve">Спасибо за внимание! Буду рад вопросам.</w:t>
+        <w:t xml:space="preserve">Поэтому вместо «какая у вас модель?» спрашивайте продавца четыре вещи:</w:t>
+      </w:r>
+    </w:p>
+    <w:p>
+      <w:pPr>
+        <w:numPr>
+          <w:ilvl w:val="0"/>
+          <w:numId w:val="1007"/>
+        </w:numPr>
+        <w:pStyle w:val="Compact"/>
+      </w:pPr>
+      <w:r>
+        <w:t xml:space="preserve">Что он помнит между сессиями?</w:t>
+      </w:r>
+    </w:p>
+    <w:p>
+      <w:pPr>
+        <w:numPr>
+          <w:ilvl w:val="0"/>
+          <w:numId w:val="1007"/>
+        </w:numPr>
+        <w:pStyle w:val="Compact"/>
+      </w:pPr>
+      <w:r>
+        <w:t xml:space="preserve">Как проверяет свою работу?</w:t>
+      </w:r>
+    </w:p>
+    <w:p>
+      <w:pPr>
+        <w:numPr>
+          <w:ilvl w:val="0"/>
+          <w:numId w:val="1007"/>
+        </w:numPr>
+        <w:pStyle w:val="Compact"/>
+      </w:pPr>
+      <w:r>
+        <w:t xml:space="preserve">Что ему разрешено без человека?</w:t>
+      </w:r>
+    </w:p>
+    <w:p>
+      <w:pPr>
+        <w:numPr>
+          <w:ilvl w:val="0"/>
+          <w:numId w:val="1007"/>
+        </w:numPr>
+        <w:pStyle w:val="Compact"/>
+      </w:pPr>
+      <w:r>
+        <w:t xml:space="preserve">Что делает, когда ошибается?</w:t>
+      </w:r>
+    </w:p>
+    <w:p>
+      <w:pPr>
+        <w:pStyle w:val="FirstParagraph"/>
+      </w:pPr>
+      <w:r>
+        <w:t xml:space="preserve">Если продавец уверенно отвечает, за красивой моделью стоит продуманный harness.</w:t>
+      </w:r>
+      <w:r>
+        <w:t xml:space="preserve"> </w:t>
+      </w:r>
+      <w:r>
+        <w:rPr>
+          <w:bCs/>
+          <w:b/>
+        </w:rPr>
+        <w:t xml:space="preserve">Но можно ли построить хороший harness один раз и успокоиться?</w:t>
       </w:r>
     </w:p>
     <w:p>
@@ -1982,8 +1738,239 @@
       </w:r>
     </w:p>
     <w:bookmarkEnd w:id="35"/>
+    <w:bookmarkStart w:id="36" w:name="слайд-16.-будущее-леса-убирают"/>
+    <w:p>
+      <w:pPr>
+        <w:pStyle w:val="Heading2"/>
+      </w:pPr>
+      <w:r>
+        <w:t xml:space="preserve">Слайд 16. Будущее: леса убирают</w:t>
+      </w:r>
+    </w:p>
+    <w:p>
+      <w:pPr>
+        <w:pStyle w:val="FirstParagraph"/>
+      </w:pPr>
+      <w:r>
+        <w:t xml:space="preserve">Автор статьи использует образ строительных лесов. Они нужны, чтобы добраться до верхних этажей, но сами ничего не строят. Когда здание готово, леса убирают.</w:t>
+      </w:r>
+    </w:p>
+    <w:p>
+      <w:pPr>
+        <w:pStyle w:val="BodyText"/>
+      </w:pPr>
+      <w:r>
+        <w:t xml:space="preserve">С harness то же. Модели умнеют, и harness со временем должен становиться проще. Продукт Manus за полгода переделывали пять раз, и каждый раз убирали лишнее. В Anthropic убирают шаги из Claude Code, когда модель научилась делать их сама. График справа показывает идею: чем сильнее модель, тем тоньше нужен harness. Это схема по смыслу статьи, без точных цифр, она так и подписана.</w:t>
+      </w:r>
+    </w:p>
+    <w:p>
+      <w:pPr>
+        <w:pStyle w:val="BodyText"/>
+      </w:pPr>
+      <w:r>
+        <w:t xml:space="preserve">Предупреждение для маркетолога: преимущество в harness нельзя создать один раз. Его придётся пересобирать с каждой новой моделью.</w:t>
+      </w:r>
+      <w:r>
+        <w:t xml:space="preserve"> </w:t>
+      </w:r>
+      <w:r>
+        <w:rPr>
+          <w:bCs/>
+          <w:b/>
+        </w:rPr>
+        <w:t xml:space="preserve">Давайте подведём итог.</w:t>
+      </w:r>
+    </w:p>
+    <w:p>
+      <w:r>
+        <w:pict>
+          <v:rect style="width:0;height:1.5pt" o:hralign="center" o:hrstd="t" o:hr="t"/>
+        </w:pict>
+      </w:r>
+    </w:p>
     <w:bookmarkEnd w:id="36"/>
-    <w:bookmarkStart w:id="40" w:name="приложение"/>
+    <w:bookmarkStart w:id="37" w:name="слайд-17.-итоги-и-возвращение-к-опросу"/>
+    <w:p>
+      <w:pPr>
+        <w:pStyle w:val="Heading2"/>
+      </w:pPr>
+      <w:r>
+        <w:t xml:space="preserve">Слайд 17. Итоги и возвращение к опросу</w:t>
+      </w:r>
+    </w:p>
+    <w:p>
+      <w:pPr>
+        <w:pStyle w:val="FirstParagraph"/>
+      </w:pPr>
+      <w:r>
+        <w:t xml:space="preserve">Три вывода.</w:t>
+      </w:r>
+    </w:p>
+    <w:p>
+      <w:pPr>
+        <w:numPr>
+          <w:ilvl w:val="0"/>
+          <w:numId w:val="1008"/>
+        </w:numPr>
+        <w:pStyle w:val="Compact"/>
+      </w:pPr>
+      <w:r>
+        <w:rPr>
+          <w:bCs/>
+          <w:b/>
+        </w:rPr>
+        <w:t xml:space="preserve">Модель — товар, harness — продукт.</w:t>
+      </w:r>
+      <w:r>
+        <w:t xml:space="preserve"> </w:t>
+      </w:r>
+      <w:r>
+        <w:t xml:space="preserve">Модели доступны всем, а отличие живёт в программе вокруг модели.</w:t>
+      </w:r>
+    </w:p>
+    <w:p>
+      <w:pPr>
+        <w:numPr>
+          <w:ilvl w:val="0"/>
+          <w:numId w:val="1008"/>
+        </w:numPr>
+        <w:pStyle w:val="Compact"/>
+      </w:pPr>
+      <w:r>
+        <w:rPr>
+          <w:bCs/>
+          <w:b/>
+        </w:rPr>
+        <w:t xml:space="preserve">Harness — это конкретно:</w:t>
+      </w:r>
+      <w:r>
+        <w:t xml:space="preserve"> </w:t>
+      </w:r>
+      <w:r>
+        <w:t xml:space="preserve">цикл, инструменты, память, проверки, права. Не магия, а программа, которую можно разобрать по частям и сравнить.</w:t>
+      </w:r>
+    </w:p>
+    <w:p>
+      <w:pPr>
+        <w:numPr>
+          <w:ilvl w:val="0"/>
+          <w:numId w:val="1008"/>
+        </w:numPr>
+        <w:pStyle w:val="Compact"/>
+      </w:pPr>
+      <w:r>
+        <w:rPr>
+          <w:bCs/>
+          <w:b/>
+        </w:rPr>
+        <w:t xml:space="preserve">Сравнивайте продукты по четырём вопросам, а не по названию модели.</w:t>
+      </w:r>
+    </w:p>
+    <w:p>
+      <w:pPr>
+        <w:pStyle w:val="FirstParagraph"/>
+      </w:pPr>
+      <w:r>
+        <w:t xml:space="preserve">А теперь вернёмся к опросу.</w:t>
+      </w:r>
+      <w:r>
+        <w:t xml:space="preserve"> </w:t>
+      </w:r>
+      <w:r>
+        <w:rPr>
+          <w:iCs/>
+          <w:i/>
+        </w:rPr>
+        <w:t xml:space="preserve">(Показать на правую часть слайда.)</w:t>
+      </w:r>
+      <w:r>
+        <w:t xml:space="preserve"> </w:t>
+      </w:r>
+      <w:r>
+        <w:t xml:space="preserve">Вариант A — «какая модель внутри». Вариант B — «сколько стоит». Теперь вы понимаете, почему верный вариант C:</w:t>
+      </w:r>
+      <w:r>
+        <w:t xml:space="preserve"> </w:t>
+      </w:r>
+      <w:r>
+        <w:rPr>
+          <w:bCs/>
+          <w:b/>
+        </w:rPr>
+        <w:t xml:space="preserve">что он умеет делать сам и насколько надёжно.</w:t>
+      </w:r>
+      <w:r>
+        <w:t xml:space="preserve"> </w:t>
+      </w:r>
+      <w:r>
+        <w:t xml:space="preserve">Это и есть harness.</w:t>
+      </w:r>
+    </w:p>
+    <w:p>
+      <w:pPr>
+        <w:pStyle w:val="BodyText"/>
+      </w:pPr>
+      <w:r>
+        <w:rPr>
+          <w:iCs/>
+          <w:i/>
+        </w:rPr>
+        <w:t xml:space="preserve">(Спросить: «Кто поменял бы свой ответ?»)</w:t>
+      </w:r>
+    </w:p>
+    <w:p>
+      <w:r>
+        <w:pict>
+          <v:rect style="width:0;height:1.5pt" o:hralign="center" o:hrstd="t" o:hr="t"/>
+        </w:pict>
+      </w:r>
+    </w:p>
+    <w:bookmarkEnd w:id="37"/>
+    <w:bookmarkStart w:id="38" w:name="слайд-18.-спасибо"/>
+    <w:p>
+      <w:pPr>
+        <w:pStyle w:val="Heading2"/>
+      </w:pPr>
+      <w:r>
+        <w:t xml:space="preserve">Слайд 18. Спасибо</w:t>
+      </w:r>
+    </w:p>
+    <w:p>
+      <w:pPr>
+        <w:pStyle w:val="FirstParagraph"/>
+      </w:pPr>
+      <w:r>
+        <w:t xml:space="preserve">Запомните одну фразу:</w:t>
+      </w:r>
+      <w:r>
+        <w:t xml:space="preserve"> </w:t>
+      </w:r>
+      <w:r>
+        <w:rPr>
+          <w:bCs/>
+          <w:b/>
+        </w:rPr>
+        <w:t xml:space="preserve">когда ИИ-агент в следующий раз даст сбой, не вините модель. Смотрите на harness.</w:t>
+      </w:r>
+    </w:p>
+    <w:p>
+      <w:pPr>
+        <w:pStyle w:val="BodyText"/>
+      </w:pPr>
+      <w:r>
+        <w:t xml:space="preserve">Спасибо за внимание! Буду рад вопросам.</w:t>
+      </w:r>
+    </w:p>
+    <w:p>
+      <w:r>
+        <w:pict>
+          <v:rect style="width:0;height:1.5pt" o:hralign="center" o:hrstd="t" o:hr="t"/>
+        </w:pict>
+      </w:r>
+    </w:p>
+    <w:bookmarkEnd w:id="38"/>
+    <w:bookmarkEnd w:id="39"/>
+    <w:bookmarkStart w:id="43" w:name="приложение"/>
     <w:p>
       <w:pPr>
         <w:pStyle w:val="Heading1"/>
@@ -1992,7 +1979,7 @@
         <w:t xml:space="preserve">Приложение</w:t>
       </w:r>
     </w:p>
-    <w:bookmarkStart w:id="37" w:name="если-спросят"/>
+    <w:bookmarkStart w:id="40" w:name="если-спросят"/>
     <w:p>
       <w:pPr>
         <w:pStyle w:val="Heading2"/>
@@ -2028,13 +2015,13 @@
           <w:bCs/>
           <w:b/>
         </w:rPr>
-        <w:t xml:space="preserve">Что такое «агент» простыми словами?</w:t>
-      </w:r>
-      <w:r>
-        <w:t xml:space="preserve"> </w:t>
-      </w:r>
-      <w:r>
-        <w:t xml:space="preserve">ИИ, который не только отвечает на вопросы, но и сам делает работу: открывает файлы, ищет информацию, запускает программы, проверяет результат.</w:t>
+        <w:t xml:space="preserve">Чем harness отличается от самой модели?</w:t>
+      </w:r>
+      <w:r>
+        <w:t xml:space="preserve"> </w:t>
+      </w:r>
+      <w:r>
+        <w:t xml:space="preserve">Модель — «мозг»: она только читает и пишет текст. Всё, что связано с действиями (открыть почту, запомнить, проверить, спросить разрешение), делает harness.</w:t>
       </w:r>
     </w:p>
     <w:p>
@@ -2046,13 +2033,13 @@
           <w:bCs/>
           <w:b/>
         </w:rPr>
-        <w:t xml:space="preserve">Чем harness отличается от самой модели?</w:t>
-      </w:r>
-      <w:r>
-        <w:t xml:space="preserve"> </w:t>
-      </w:r>
-      <w:r>
-        <w:t xml:space="preserve">Модель — это «мозг»: она только читает и пишет текст. Всё, что связано с действиями (открыть почту, запомнить, проверить, спросить разрешение), делает harness.</w:t>
+        <w:t xml:space="preserve">Что такое «агент»?</w:t>
+      </w:r>
+      <w:r>
+        <w:t xml:space="preserve"> </w:t>
+      </w:r>
+      <w:r>
+        <w:t xml:space="preserve">ИИ, который сам выполняет задачу: открывает файлы, ищет информацию, запускает программы, проверяет результат. Агент = модель + harness.</w:t>
       </w:r>
     </w:p>
     <w:p>
@@ -2064,13 +2051,13 @@
           <w:bCs/>
           <w:b/>
         </w:rPr>
-        <w:t xml:space="preserve">Это только для программистов?</w:t>
-      </w:r>
-      <w:r>
-        <w:t xml:space="preserve"> </w:t>
-      </w:r>
-      <w:r>
-        <w:t xml:space="preserve">Примеры в статье в основном из программирования: там проще измерять результат. Но принцип общий: если ИИ должен что-то делать сам, ему нужен harness. Пример с почтой — учебная иллюстрация.</w:t>
+        <w:t xml:space="preserve">Пример с почтой — реальный?</w:t>
+      </w:r>
+      <w:r>
+        <w:t xml:space="preserve"> </w:t>
+      </w:r>
+      <w:r>
+        <w:t xml:space="preserve">Нет, это учебная иллюстрация, чтобы показать разделение ролей. В статье примеры в основном из программирования: там проще измерять результат. Принцип общий.</w:t>
       </w:r>
     </w:p>
     <w:p>
@@ -2082,6 +2069,24 @@
           <w:bCs/>
           <w:b/>
         </w:rPr>
+        <w:t xml:space="preserve">Код на слайде 8 — реальный?</w:t>
+      </w:r>
+      <w:r>
+        <w:t xml:space="preserve"> </w:t>
+      </w:r>
+      <w:r>
+        <w:t xml:space="preserve">Нет, это упрощённая схема цикла. Реальные harness’ы сложнее, но принцип тот же.</w:t>
+      </w:r>
+    </w:p>
+    <w:p>
+      <w:pPr>
+        <w:pStyle w:val="BodyText"/>
+      </w:pPr>
+      <w:r>
+        <w:rPr>
+          <w:bCs/>
+          <w:b/>
+        </w:rPr>
         <w:t xml:space="preserve">Почему не взять самую сильную модель?</w:t>
       </w:r>
       <w:r>
@@ -2100,13 +2105,13 @@
           <w:bCs/>
           <w:b/>
         </w:rPr>
-        <w:t xml:space="preserve">Как маркетологу этим пользоваться?</w:t>
-      </w:r>
-      <w:r>
-        <w:t xml:space="preserve"> </w:t>
-      </w:r>
-      <w:r>
-        <w:t xml:space="preserve">Сравнивать ИИ-продукты не по названию модели («у нас GPT!»), а по памяти, надёжности, безопасности и умению довести дело до конца. И формулировать свои преимущества именно так.</w:t>
+        <w:t xml:space="preserve">Откуда цифры?</w:t>
+      </w:r>
+      <w:r>
+        <w:t xml:space="preserve"> </w:t>
+      </w:r>
+      <w:r>
+        <w:t xml:space="preserve">Из статьи Akshay «Что такое Harness?» (перевод на Хабре). Это обзор публичных материалов Anthropic, OpenAI, LangChain и других. Часть чисел (76,4%, «2–3 раза», 30%) — заявления самих компаний и авторов, независимо я их не проверял. Столбики на слайде 11 — моё вычисление: 0,99 в степени n.</w:t>
       </w:r>
     </w:p>
     <w:p>
@@ -2118,13 +2123,13 @@
           <w:bCs/>
           <w:b/>
         </w:rPr>
-        <w:t xml:space="preserve">Откуда цифры?</w:t>
-      </w:r>
-      <w:r>
-        <w:t xml:space="preserve"> </w:t>
-      </w:r>
-      <w:r>
-        <w:t xml:space="preserve">Из статьи Akshay «Что такое Harness?» (перевод на Хабре). Это обзор публичных материалов Anthropic, OpenAI, LangChain и других. Часть чисел («2–3 раза», 76,4%) — заявления самих компаний и авторов, независимо я их не проверял.</w:t>
+        <w:t xml:space="preserve">Четыре характеристики и шесть частей — это точная классификация?</w:t>
+      </w:r>
+      <w:r>
+        <w:t xml:space="preserve"> </w:t>
+      </w:r>
+      <w:r>
+        <w:t xml:space="preserve">Нет, это упрощение. В статье перечислено одиннадцать компонентов (заявлено двенадцать). Для объяснения и карточки сравнения удобнее меньше.</w:t>
       </w:r>
     </w:p>
     <w:p>
@@ -2136,17 +2141,17 @@
           <w:bCs/>
           <w:b/>
         </w:rPr>
-        <w:t xml:space="preserve">Это точная классификация — четыре характеристики?</w:t>
-      </w:r>
-      <w:r>
-        <w:t xml:space="preserve"> </w:t>
-      </w:r>
-      <w:r>
-        <w:t xml:space="preserve">Нет, это моё упрощение. В статье перечислено одиннадцать технических компонентов (заявлено двенадцать). Четыре группы удобны для объяснения и для карточки сравнения.</w:t>
-      </w:r>
-    </w:p>
-    <w:bookmarkEnd w:id="37"/>
-    <w:bookmarkStart w:id="38" w:name="мини-словарик"/>
+        <w:t xml:space="preserve">Как маркетологу использовать эти знания?</w:t>
+      </w:r>
+      <w:r>
+        <w:t xml:space="preserve"> </w:t>
+      </w:r>
+      <w:r>
+        <w:t xml:space="preserve">Сравнивать ИИ-продукты по памяти, надёжности, безопасности и умению довести дело до конца. И формулировать свои преимущества в этих терминах. Четыре вопроса со слайда 15 можно использовать при выборе продукта.</w:t>
+      </w:r>
+    </w:p>
+    <w:bookmarkEnd w:id="40"/>
+    <w:bookmarkStart w:id="41" w:name="мини-словарик"/>
     <w:p>
       <w:pPr>
         <w:pStyle w:val="Heading2"/>
@@ -2282,32 +2287,6 @@
               <w:jc w:val="left"/>
             </w:pPr>
             <w:r>
-              <w:t xml:space="preserve">Промпт</w:t>
-            </w:r>
-          </w:p>
-        </w:tc>
-        <w:tc>
-          <w:tcPr/>
-          <w:p>
-            <w:pPr>
-              <w:pStyle w:val="Compact"/>
-              <w:jc w:val="left"/>
-            </w:pPr>
-            <w:r>
-              <w:t xml:space="preserve">Формулировка задачи для модели</w:t>
-            </w:r>
-          </w:p>
-        </w:tc>
-      </w:tr>
-      <w:tr>
-        <w:tc>
-          <w:tcPr/>
-          <w:p>
-            <w:pPr>
-              <w:pStyle w:val="Compact"/>
-              <w:jc w:val="left"/>
-            </w:pPr>
-            <w:r>
               <w:t xml:space="preserve">Контекст</w:t>
             </w:r>
           </w:p>
@@ -2325,9 +2304,61 @@
           </w:p>
         </w:tc>
       </w:tr>
+      <w:tr>
+        <w:tc>
+          <w:tcPr/>
+          <w:p>
+            <w:pPr>
+              <w:pStyle w:val="Compact"/>
+              <w:jc w:val="left"/>
+            </w:pPr>
+            <w:r>
+              <w:t xml:space="preserve">Инструмент</w:t>
+            </w:r>
+          </w:p>
+        </w:tc>
+        <w:tc>
+          <w:tcPr/>
+          <w:p>
+            <w:pPr>
+              <w:pStyle w:val="Compact"/>
+              <w:jc w:val="left"/>
+            </w:pPr>
+            <w:r>
+              <w:t xml:space="preserve">Действие, которое агенту разрешено: открыть файл, найти в интернете</w:t>
+            </w:r>
+          </w:p>
+        </w:tc>
+      </w:tr>
+      <w:tr>
+        <w:tc>
+          <w:tcPr/>
+          <w:p>
+            <w:pPr>
+              <w:pStyle w:val="Compact"/>
+              <w:jc w:val="left"/>
+            </w:pPr>
+            <w:r>
+              <w:t xml:space="preserve">Токен</w:t>
+            </w:r>
+          </w:p>
+        </w:tc>
+        <w:tc>
+          <w:tcPr/>
+          <w:p>
+            <w:pPr>
+              <w:pStyle w:val="Compact"/>
+              <w:jc w:val="left"/>
+            </w:pPr>
+            <w:r>
+              <w:t xml:space="preserve">Единица текста для модели (примерно слог или короткое слово)</w:t>
+            </w:r>
+          </w:p>
+        </w:tc>
+      </w:tr>
     </w:tbl>
-    <w:bookmarkEnd w:id="38"/>
-    <w:bookmarkStart w:id="39" w:name="как-выступать"/>
+    <w:bookmarkEnd w:id="41"/>
+    <w:bookmarkStart w:id="42" w:name="как-выступать"/>
     <w:p>
       <w:pPr>
         <w:pStyle w:val="Heading2"/>
@@ -2340,19 +2371,19 @@
       <w:pPr>
         <w:numPr>
           <w:ilvl w:val="0"/>
-          <w:numId w:val="1010"/>
-        </w:numPr>
-        <w:pStyle w:val="Compact"/>
-      </w:pPr>
-      <w:r>
-        <w:t xml:space="preserve">Не читайте слайды: на них короткие фразы, смысл — в ваших словах.</w:t>
-      </w:r>
-    </w:p>
-    <w:p>
-      <w:pPr>
-        <w:numPr>
-          <w:ilvl w:val="0"/>
-          <w:numId w:val="1010"/>
+          <w:numId w:val="1009"/>
+        </w:numPr>
+        <w:pStyle w:val="Compact"/>
+      </w:pPr>
+      <w:r>
+        <w:t xml:space="preserve">Не читайте слайды: на них схемы и короткие подписи, смысл в ваших словах.</w:t>
+      </w:r>
+    </w:p>
+    <w:p>
+      <w:pPr>
+        <w:numPr>
+          <w:ilvl w:val="0"/>
+          <w:numId w:val="1009"/>
         </w:numPr>
         <w:pStyle w:val="Compact"/>
       </w:pPr>
@@ -2364,43 +2395,55 @@
       <w:pPr>
         <w:numPr>
           <w:ilvl w:val="0"/>
-          <w:numId w:val="1010"/>
-        </w:numPr>
-        <w:pStyle w:val="Compact"/>
-      </w:pPr>
-      <w:r>
-        <w:t xml:space="preserve">Паузу делайте после цифр: «30+ → 5», «90%», «2–3 раза».</w:t>
-      </w:r>
-    </w:p>
-    <w:p>
-      <w:pPr>
-        <w:numPr>
-          <w:ilvl w:val="0"/>
-          <w:numId w:val="1010"/>
-        </w:numPr>
-        <w:pStyle w:val="Compact"/>
-      </w:pPr>
-      <w:r>
-        <w:t xml:space="preserve">Слайды 4 и 5 — самые важные для понимания: здесь не спешите.</w:t>
-      </w:r>
-    </w:p>
-    <w:p>
-      <w:pPr>
-        <w:numPr>
-          <w:ilvl w:val="0"/>
-          <w:numId w:val="1010"/>
-        </w:numPr>
-        <w:pStyle w:val="Compact"/>
-      </w:pPr>
-      <w:r>
-        <w:t xml:space="preserve">Если не хватает времени, слайды 11 и 13 рассказывайте за 30 секунд каждый.</w:t>
-      </w:r>
-    </w:p>
-    <w:p>
-      <w:pPr>
-        <w:numPr>
-          <w:ilvl w:val="0"/>
-          <w:numId w:val="1010"/>
+          <w:numId w:val="1009"/>
+        </w:numPr>
+        <w:pStyle w:val="Compact"/>
+      </w:pPr>
+      <w:r>
+        <w:t xml:space="preserve">Слайды 5, 7 и 8 — ключевые для понимания: не спешите.</w:t>
+      </w:r>
+    </w:p>
+    <w:p>
+      <w:pPr>
+        <w:numPr>
+          <w:ilvl w:val="0"/>
+          <w:numId w:val="1009"/>
+        </w:numPr>
+        <w:pStyle w:val="Compact"/>
+      </w:pPr>
+      <w:r>
+        <w:t xml:space="preserve">На слайде 7 показывайте пальцем на схему. Анимация рисует шаги по очереди: дайте ей закончиться.</w:t>
+      </w:r>
+    </w:p>
+    <w:p>
+      <w:pPr>
+        <w:numPr>
+          <w:ilvl w:val="0"/>
+          <w:numId w:val="1009"/>
+        </w:numPr>
+        <w:pStyle w:val="Compact"/>
+      </w:pPr>
+      <w:r>
+        <w:t xml:space="preserve">Если не хватает времени, слайды 12 и 13 рассказывайте за 40 секунд каждый.</w:t>
+      </w:r>
+    </w:p>
+    <w:p>
+      <w:pPr>
+        <w:numPr>
+          <w:ilvl w:val="0"/>
+          <w:numId w:val="1009"/>
+        </w:numPr>
+        <w:pStyle w:val="Compact"/>
+      </w:pPr>
+      <w:r>
+        <w:t xml:space="preserve">Слайд 15 — самый «маркетинговый»: оставьте на него побольше времени.</w:t>
+      </w:r>
+    </w:p>
+    <w:p>
+      <w:pPr>
+        <w:numPr>
+          <w:ilvl w:val="0"/>
+          <w:numId w:val="1009"/>
         </w:numPr>
         <w:pStyle w:val="Compact"/>
       </w:pPr>
@@ -2408,8 +2451,8 @@
         <w:t xml:space="preserve">Источники фото и логотипов указаны на последнем слайде.</w:t>
       </w:r>
     </w:p>
-    <w:bookmarkEnd w:id="39"/>
-    <w:bookmarkEnd w:id="40"/>
+    <w:bookmarkEnd w:id="42"/>
+    <w:bookmarkEnd w:id="43"/>
     <w:sectPr/>
   </w:body>
 </w:document>
@@ -2804,6 +2847,9 @@
     </w:lvlOverride>
   </w:num>
   <w:num w:numId="1006">
+    <w:abstractNumId w:val="991"/>
+  </w:num>
+  <w:num w:numId="1007">
     <w:abstractNumId w:val="99411"/>
     <w:lvlOverride w:ilvl="0">
       <w:startOverride w:val="1"/>
@@ -2832,9 +2878,6 @@
     <w:lvlOverride w:ilvl="8">
       <w:startOverride w:val="1"/>
     </w:lvlOverride>
-  </w:num>
-  <w:num w:numId="1007">
-    <w:abstractNumId w:val="991"/>
   </w:num>
   <w:num w:numId="1008">
     <w:abstractNumId w:val="99411"/>
@@ -2867,9 +2910,6 @@
     </w:lvlOverride>
   </w:num>
   <w:num w:numId="1009">
-    <w:abstractNumId w:val="991"/>
-  </w:num>
-  <w:num w:numId="1010">
     <w:abstractNumId w:val="991"/>
   </w:num>
 </w:numbering>

</xml_diff>

<commit_message>
Rework deck: no grid, no mono font, no code; new storyline with marketing exercises (16 slides)
Co-Authored-By: Claude Sonnet 5.5 <noreply@anthropic.com>
Claude-Session: https://claude.ai/code/session_01JHAi78QVA9c3PviMoRDJFz
</commit_message>
<xml_diff>
--- a/harness/Doklad-Harness.docx
+++ b/harness/Doklad-Harness.docx
@@ -2,7 +2,7 @@
 <file path=word/document.xml><?xml version="1.0" encoding="utf-8"?>
 <w:document xmlns:w="http://schemas.openxmlformats.org/wordprocessingml/2006/main" xmlns:m="http://schemas.openxmlformats.org/officeDocument/2006/math" xmlns:r="http://schemas.openxmlformats.org/officeDocument/2006/relationships" xmlns:o="urn:schemas-microsoft-com:office:office" xmlns:v="urn:schemas-microsoft-com:vml" xmlns:w10="urn:schemas-microsoft-com:office:word" xmlns:a="http://schemas.openxmlformats.org/drawingml/2006/main" xmlns:pic="http://schemas.openxmlformats.org/drawingml/2006/picture" xmlns:wp="http://schemas.openxmlformats.org/drawingml/2006/wordprocessingDrawing">
   <w:body>
-    <w:bookmarkStart w:id="39" w:name="X629d0992977e639803607b7e6d671af564ee6f1"/>
+    <w:bookmarkStart w:id="37" w:name="X629d0992977e639803607b7e6d671af564ee6f1"/>
     <w:p>
       <w:pPr>
         <w:pStyle w:val="Heading1"/>
@@ -26,7 +26,7 @@
         <w:t xml:space="preserve"> </w:t>
       </w:r>
       <w:r>
-        <w:t xml:space="preserve">около 15 минут, 18 слайдов.</w:t>
+        <w:t xml:space="preserve">около 14 минут, 16 слайдов.</w:t>
       </w:r>
       <w:r>
         <w:t xml:space="preserve"> </w:t>
@@ -52,13 +52,13 @@
           <w:bCs/>
           <w:b/>
         </w:rPr>
-        <w:t xml:space="preserve">Формат:</w:t>
-      </w:r>
-      <w:r>
-        <w:t xml:space="preserve"> </w:t>
-      </w:r>
-      <w:r>
-        <w:t xml:space="preserve">теория → примеры → маркетинг. Эти три линии чередуются. На каждом слайде внизу оранжевая плашка «Для маркетолога»: её стоит произносить вслух, она связывает техническую часть с предметом.</w:t>
+        <w:t xml:space="preserve">Идея:</w:t>
+      </w:r>
+      <w:r>
+        <w:t xml:space="preserve"> </w:t>
+      </w:r>
+      <w:r>
+        <w:t xml:space="preserve">теория, примеры и маркетинг идут вперемешку. На каждом слайде внизу оранжевая плашка «Для маркетолога»: её стоит прочитать вслух, она связывает тему с предметом.</w:t>
       </w:r>
     </w:p>
     <w:bookmarkStart w:id="20" w:name="красная-нить"/>
@@ -75,7 +75,7 @@
         <w:pStyle w:val="FirstParagraph"/>
       </w:pPr>
       <w:r>
-        <w:t xml:space="preserve">Доклад начинается с опроса (слайд 2) и заканчивается ответом на него (слайд 17). В середине один образ:</w:t>
+        <w:t xml:space="preserve">Доклад начинается с вопроса залу (слайд 2) и заканчивается ответом на него (слайд 15). В середине один образ:</w:t>
       </w:r>
       <w:r>
         <w:t xml:space="preserve"> </w:t>
@@ -162,7 +162,7 @@
           <w:iCs/>
           <w:i/>
         </w:rPr>
-        <w:t xml:space="preserve">(Пауза. Посмотреть в зал.)</w:t>
+        <w:t xml:space="preserve">(Пауза, посмотреть в зал.)</w:t>
       </w:r>
     </w:p>
     <w:p>
@@ -170,7 +170,7 @@
         <w:pStyle w:val="BodyText"/>
       </w:pPr>
       <w:r>
-        <w:t xml:space="preserve">Добрый день! Меня зовут Владислав, и сегодня я расскажу про слово, которого нет в рекламе ИИ-продуктов, но от которого зависит, хороший продукт или плохой. Слово называется harness. Прямо сейчас оно вам ничего не говорит, и это нормально. К концу доклада вы будете использовать его как термин.</w:t>
+        <w:t xml:space="preserve">Добрый день! Меня зовут Владислав. Сегодня я расскажу про слово, которого нет в рекламе ИИ-продуктов, но от которого зависит, хороший продукт или плохой. Слово называется harness. Сейчас оно вам ничего не говорит, и это нормально. К концу доклада вы сможете им пользоваться.</w:t>
       </w:r>
     </w:p>
     <w:p>
@@ -181,13 +181,13 @@
       </w:r>
     </w:p>
     <w:bookmarkEnd w:id="21"/>
-    <w:bookmarkStart w:id="22" w:name="слайд-2.-опрос"/>
+    <w:bookmarkStart w:id="22" w:name="слайд-2.-вопрос-к-залу"/>
     <w:p>
       <w:pPr>
         <w:pStyle w:val="Heading2"/>
       </w:pPr>
       <w:r>
-        <w:t xml:space="preserve">Слайд 2. Опрос</w:t>
+        <w:t xml:space="preserve">Слайд 2. Вопрос к залу</w:t>
       </w:r>
     </w:p>
     <w:p>
@@ -273,7 +273,7 @@
           <w:iCs/>
           <w:i/>
         </w:rPr>
-        <w:t xml:space="preserve">(Поднять руки за каждый вариант. Запомнить, кого больше. Не комментировать ответ.)</w:t>
+        <w:t xml:space="preserve">(Поднять руки за каждый вариант. Запомнить, кого больше. Не комментировать.)</w:t>
       </w:r>
     </w:p>
     <w:p>
@@ -292,13 +292,13 @@
       </w:r>
     </w:p>
     <w:bookmarkEnd w:id="22"/>
-    <w:bookmarkStart w:id="23" w:name="слайд-3.-одна-модель-много-продуктов"/>
+    <w:bookmarkStart w:id="23" w:name="Xad1931da98a3b5fb46ca125a7acf33519741c7b"/>
     <w:p>
       <w:pPr>
         <w:pStyle w:val="Heading2"/>
       </w:pPr>
       <w:r>
-        <w:t xml:space="preserve">Слайд 3. Одна модель, много продуктов</w:t>
+        <w:t xml:space="preserve">Слайд 3. Рынок: моделей единицы, продуктов десятки</w:t>
       </w:r>
     </w:p>
     <w:p>
@@ -306,7 +306,7 @@
         <w:pStyle w:val="FirstParagraph"/>
       </w:pPr>
       <w:r>
-        <w:t xml:space="preserve">Начнём с факта. Больших моделей на рынке единицы: GPT от OpenAI, Claude от Anthropic, Gemini от Google. А вот продуктов на них — десятки: Claude Code, Codex, LangGraph, CrewAI, AutoGen и многие другие. Любая компания может встроить модель в свой продукт.</w:t>
+        <w:t xml:space="preserve">Начнём с факта. Больших моделей на рынке единицы: GPT от OpenAI, Claude от Anthropic, Gemini от Google. А вот продуктов на них десятки: Claude Code, Codex, LangGraph, CrewAI, AutoGen и многие другие. Любая компания встраивает модель в свой продукт.</w:t>
       </w:r>
     </w:p>
     <w:p>
@@ -332,7 +332,7 @@
           <w:bCs/>
           <w:b/>
         </w:rPr>
-        <w:t xml:space="preserve">Но почему тогда продукты на одной и той же модели такие разные?</w:t>
+        <w:t xml:space="preserve">Но почему продукты на одной и той же модели такие разные?</w:t>
       </w:r>
     </w:p>
     <w:p>
@@ -357,7 +357,7 @@
         <w:pStyle w:val="FirstParagraph"/>
       </w:pPr>
       <w:r>
-        <w:t xml:space="preserve">И это не теория, а измеренный факт. Компания LangChain взяла своего ИИ-агента и поставила его в рейтинг агентов для программистов. Он был где-то за пределами первых тридцати. Они не меняли модель. Поменяли только всё вокруг неё. Результат: пятое место. Смотрите на ленту: больше двадцати пяти мест вверх без единого изменения «мозга».</w:t>
+        <w:t xml:space="preserve">Это не теория, а измеренный факт. Компания LangChain взяла своего ИИ-агента и поставила его в рейтинг агентов для программистов. Он был где-то за пределами первых тридцати. Они не меняли модель вообще. Поменяли только всё вокруг неё. Результат: пятое место. Смотрите на ленту: больше двадцати пяти мест вверх без единого изменения «мозга».</w:t>
       </w:r>
     </w:p>
     <w:p>
@@ -377,7 +377,7 @@
         <w:pStyle w:val="BodyText"/>
       </w:pPr>
       <w:r>
-        <w:t xml:space="preserve">Второй пример. В другом исследовании ИИ сам подобрал себе окружение вокруг модели и решил 76,4% задач без ошибок. Это лучше, чем системы, которые люди собирали вручную.</w:t>
+        <w:t xml:space="preserve">Второй пример. В другом исследовании ИИ сам подобрал себе окружение вокруг модели и решил 76,4% задач без ошибок. Это лучше, чем у систем, которые люди собирали вручную.</w:t>
       </w:r>
     </w:p>
     <w:p>
@@ -385,7 +385,7 @@
         <w:pStyle w:val="BodyText"/>
       </w:pPr>
       <w:r>
-        <w:t xml:space="preserve">Вывод: за результат отвечает не только модель.</w:t>
+        <w:t xml:space="preserve">Значит, за результат отвечает не только модель.</w:t>
       </w:r>
       <w:r>
         <w:t xml:space="preserve"> </w:t>
@@ -406,13 +406,13 @@
       </w:r>
     </w:p>
     <w:bookmarkEnd w:id="24"/>
-    <w:bookmarkStart w:id="25" w:name="слайд-5.-что-такое-harness-теория"/>
+    <w:bookmarkStart w:id="25" w:name="слайд-5.-что-такое-harness"/>
     <w:p>
       <w:pPr>
         <w:pStyle w:val="Heading2"/>
       </w:pPr>
       <w:r>
-        <w:t xml:space="preserve">Слайд 5. Что такое harness (теория)</w:t>
+        <w:t xml:space="preserve">Слайд 5. Что такое harness</w:t>
       </w:r>
     </w:p>
     <w:p>
@@ -441,20 +441,7 @@
         <w:pStyle w:val="BodyText"/>
       </w:pPr>
       <w:r>
-        <w:t xml:space="preserve">Теперь</w:t>
-      </w:r>
-      <w:r>
-        <w:t xml:space="preserve"> </w:t>
-      </w:r>
-      <w:r>
-        <w:rPr>
-          <w:bCs/>
-          <w:b/>
-        </w:rPr>
-        <w:t xml:space="preserve">конкретно</w:t>
-      </w:r>
-      <w:r>
-        <w:t xml:space="preserve">, что это. Harness — это обычная программа, которая управляет моделью. Не магия, а программа. На схеме слева человек, в центре harness, а внутри него модель. Справа инструменты: почта, файлы, поиск. Программа делает пять вещей:</w:t>
+        <w:t xml:space="preserve">Давайте на примере. Вы просите: «Ответь клиенту на письмо».</w:t>
       </w:r>
     </w:p>
     <w:p>
@@ -470,13 +457,13 @@
           <w:bCs/>
           <w:b/>
         </w:rPr>
-        <w:t xml:space="preserve">Отправляет</w:t>
-      </w:r>
-      <w:r>
-        <w:t xml:space="preserve"> </w:t>
-      </w:r>
-      <w:r>
-        <w:t xml:space="preserve">модели задачу.</w:t>
+        <w:t xml:space="preserve">Только модель</w:t>
+      </w:r>
+      <w:r>
+        <w:t xml:space="preserve"> </w:t>
+      </w:r>
+      <w:r>
+        <w:t xml:space="preserve">вернёт вам текст ответа: «Здравствуйте! Спасибо за обращение…» И всё. Открыть почту, найти письмо и отправить ответ вы делаете сами.</w:t>
       </w:r>
     </w:p>
     <w:p>
@@ -492,79 +479,13 @@
           <w:bCs/>
           <w:b/>
         </w:rPr>
-        <w:t xml:space="preserve">Даёт</w:t>
-      </w:r>
-      <w:r>
-        <w:t xml:space="preserve"> </w:t>
-      </w:r>
-      <w:r>
-        <w:t xml:space="preserve">ей инструменты: почту, файлы, поиск.</w:t>
-      </w:r>
-    </w:p>
-    <w:p>
-      <w:pPr>
-        <w:numPr>
-          <w:ilvl w:val="0"/>
-          <w:numId w:val="1002"/>
-        </w:numPr>
-        <w:pStyle w:val="Compact"/>
-      </w:pPr>
-      <w:r>
-        <w:rPr>
-          <w:bCs/>
-          <w:b/>
-        </w:rPr>
-        <w:t xml:space="preserve">Хранит</w:t>
-      </w:r>
-      <w:r>
-        <w:t xml:space="preserve"> </w:t>
-      </w:r>
-      <w:r>
-        <w:t xml:space="preserve">память о прошлой работе.</w:t>
-      </w:r>
-    </w:p>
-    <w:p>
-      <w:pPr>
-        <w:numPr>
-          <w:ilvl w:val="0"/>
-          <w:numId w:val="1002"/>
-        </w:numPr>
-        <w:pStyle w:val="Compact"/>
-      </w:pPr>
-      <w:r>
-        <w:rPr>
-          <w:bCs/>
-          <w:b/>
-        </w:rPr>
-        <w:t xml:space="preserve">Проверяет</w:t>
-      </w:r>
-      <w:r>
-        <w:t xml:space="preserve"> </w:t>
-      </w:r>
-      <w:r>
-        <w:t xml:space="preserve">результат.</w:t>
-      </w:r>
-    </w:p>
-    <w:p>
-      <w:pPr>
-        <w:numPr>
-          <w:ilvl w:val="0"/>
-          <w:numId w:val="1002"/>
-        </w:numPr>
-        <w:pStyle w:val="Compact"/>
-      </w:pPr>
-      <w:r>
-        <w:rPr>
-          <w:bCs/>
-          <w:b/>
-        </w:rPr>
-        <w:t xml:space="preserve">Следит</w:t>
-      </w:r>
-      <w:r>
-        <w:t xml:space="preserve"> </w:t>
-      </w:r>
-      <w:r>
-        <w:t xml:space="preserve">за правилами и доступами.</w:t>
+        <w:t xml:space="preserve">Модель плюс harness</w:t>
+      </w:r>
+      <w:r>
+        <w:t xml:space="preserve"> </w:t>
+      </w:r>
+      <w:r>
+        <w:t xml:space="preserve">сама открывает вашу почту, читает письмо клиента, пишет ответ, проверяет его и спрашивает вас: «Отправить?»</w:t>
       </w:r>
     </w:p>
     <w:p>
@@ -572,7 +493,7 @@
         <w:pStyle w:val="FirstParagraph"/>
       </w:pPr>
       <w:r>
-        <w:t xml:space="preserve">Специалист из LangChain сформулировал это короче: «Если ты не модель, ты харнесс». То есть всё, что не модель.</w:t>
+        <w:t xml:space="preserve">Видите разницу? Harness — это программа вокруг модели. Она даёт модели инструменты, память, проверку и правила. Специалист из LangChain сказал это ещё короче: «Если ты не модель, ты харнесс».</w:t>
       </w:r>
     </w:p>
     <w:p>
@@ -580,17 +501,17 @@
         <w:pStyle w:val="BodyText"/>
       </w:pPr>
       <w:r>
-        <w:t xml:space="preserve">Для маркетолога: модель — товар, а harness — то, что отличает один продукт от другого.</w:t>
-      </w:r>
-      <w:r>
-        <w:t xml:space="preserve"> </w:t>
-      </w:r>
-      <w:r>
-        <w:rPr>
-          <w:bCs/>
-          <w:b/>
-        </w:rPr>
-        <w:t xml:space="preserve">Как это объяснить без кода?</w:t>
+        <w:t xml:space="preserve">Для маркетолога: покупают не «умный текст», а результат работы.</w:t>
+      </w:r>
+      <w:r>
+        <w:t xml:space="preserve"> </w:t>
+      </w:r>
+      <w:r>
+        <w:rPr>
+          <w:bCs/>
+          <w:b/>
+        </w:rPr>
+        <w:t xml:space="preserve">Как это запомнить?</w:t>
       </w:r>
     </w:p>
     <w:p>
@@ -601,13 +522,13 @@
       </w:r>
     </w:p>
     <w:bookmarkEnd w:id="25"/>
-    <w:bookmarkStart w:id="26" w:name="слайд-6.-образ-сотрудник-теория"/>
+    <w:bookmarkStart w:id="26" w:name="слайд-6.-образ-сотрудник"/>
     <w:p>
       <w:pPr>
         <w:pStyle w:val="Heading2"/>
       </w:pPr>
       <w:r>
-        <w:t xml:space="preserve">Слайд 6. Образ: сотрудник (теория)</w:t>
+        <w:t xml:space="preserve">Слайд 6. Образ: сотрудник</w:t>
       </w:r>
     </w:p>
     <w:p>
@@ -615,7 +536,7 @@
         <w:pStyle w:val="FirstParagraph"/>
       </w:pPr>
       <w:r>
-        <w:t xml:space="preserve">Давайте вернёмся к директору из начала. Вы нанимаете выпускника, который прочитал все книги мира. Но посадите его в пустую комнату, и он ничего не сделает: ему нужны компьютер, блокнот, проверка, доступы. Выпускник плюс рабочее место дают сотрудника.</w:t>
+        <w:t xml:space="preserve">Вернёмся к директору из начала. Вы нанимаете выпускника, который прочитал все книги мира. Но посадите его в пустую комнату, и он ничего не сделает: ему нужны компьютер, блокнот, проверка, доступы. Выпускник плюс рабочее место дают сотрудника.</w:t>
       </w:r>
     </w:p>
     <w:p>
@@ -664,7 +585,7 @@
           <w:bCs/>
           <w:b/>
         </w:rPr>
-        <w:t xml:space="preserve">Хорошо, а как это выглядит на реальной задаче?</w:t>
+        <w:t xml:space="preserve">А как этот сотрудник проводит день?</w:t>
       </w:r>
     </w:p>
     <w:p>
@@ -675,13 +596,13 @@
       </w:r>
     </w:p>
     <w:bookmarkEnd w:id="26"/>
-    <w:bookmarkStart w:id="27" w:name="слайд-7.-пример-ии-разбирает-почту"/>
+    <w:bookmarkStart w:id="27" w:name="слайд-7.-один-день-ии-ассистента"/>
     <w:p>
       <w:pPr>
         <w:pStyle w:val="Heading2"/>
       </w:pPr>
       <w:r>
-        <w:t xml:space="preserve">Слайд 7. Пример: ИИ разбирает почту</w:t>
+        <w:t xml:space="preserve">Слайд 7. Один день ИИ-ассистента</w:t>
       </w:r>
     </w:p>
     <w:p>
@@ -701,7 +622,7 @@
         <w:pStyle w:val="BodyText"/>
       </w:pPr>
       <w:r>
-        <w:t xml:space="preserve">Допустим, вы говорите ИИ-ассистенту: «Разбери почту». Смотрим схему сверху вниз. Четыре участника: человек, harness, модель и почта.</w:t>
+        <w:t xml:space="preserve">Пять кадров. Смотрите, кто что делает: на каждой карточке подписан участник.</w:t>
       </w:r>
     </w:p>
     <w:p>
@@ -713,7 +634,17 @@
         <w:pStyle w:val="Compact"/>
       </w:pPr>
       <w:r>
-        <w:t xml:space="preserve">Человек говорит harness: «Разбери почту».</w:t>
+        <w:rPr>
+          <w:bCs/>
+          <w:b/>
+        </w:rPr>
+        <w:t xml:space="preserve">Человек.</w:t>
+      </w:r>
+      <w:r>
+        <w:t xml:space="preserve"> </w:t>
+      </w:r>
+      <w:r>
+        <w:t xml:space="preserve">Вы говорите: «Разбери утреннюю почту». Один раз, обычными словами.</w:t>
       </w:r>
     </w:p>
     <w:p>
@@ -725,7 +656,17 @@
         <w:pStyle w:val="Compact"/>
       </w:pPr>
       <w:r>
-        <w:t xml:space="preserve">Harness собирает задание, добавляет память и отправляет модели.</w:t>
+        <w:rPr>
+          <w:bCs/>
+          <w:b/>
+        </w:rPr>
+        <w:t xml:space="preserve">Harness.</w:t>
+      </w:r>
+      <w:r>
+        <w:t xml:space="preserve"> </w:t>
+      </w:r>
+      <w:r>
+        <w:t xml:space="preserve">Он собирает задание: добавляет ваши инструкции и записи прошлых дней и отправляет всё модели.</w:t>
       </w:r>
     </w:p>
     <w:p>
@@ -737,97 +678,82 @@
         <w:pStyle w:val="Compact"/>
       </w:pPr>
       <w:r>
-        <w:t xml:space="preserve">Модель отвечает: «Открой почту».</w:t>
-      </w:r>
-    </w:p>
-    <w:p>
-      <w:pPr>
-        <w:numPr>
-          <w:ilvl w:val="0"/>
-          <w:numId w:val="1003"/>
-        </w:numPr>
-        <w:pStyle w:val="Compact"/>
-      </w:pPr>
-      <w:r>
-        <w:t xml:space="preserve">Harness идёт в почту и берёт письма.</w:t>
-      </w:r>
-    </w:p>
-    <w:p>
-      <w:pPr>
-        <w:numPr>
-          <w:ilvl w:val="0"/>
-          <w:numId w:val="1003"/>
-        </w:numPr>
-        <w:pStyle w:val="Compact"/>
-      </w:pPr>
-      <w:r>
-        <w:t xml:space="preserve">Harness показывает письма модели.</w:t>
-      </w:r>
-    </w:p>
-    <w:p>
-      <w:pPr>
-        <w:numPr>
-          <w:ilvl w:val="0"/>
-          <w:numId w:val="1003"/>
-        </w:numPr>
-        <w:pStyle w:val="Compact"/>
-      </w:pPr>
-      <w:r>
-        <w:t xml:space="preserve">Модель пишет черновики ответов.</w:t>
-      </w:r>
-    </w:p>
-    <w:p>
-      <w:pPr>
-        <w:numPr>
-          <w:ilvl w:val="0"/>
-          <w:numId w:val="1003"/>
-        </w:numPr>
-        <w:pStyle w:val="Compact"/>
-      </w:pPr>
-      <w:r>
-        <w:t xml:space="preserve">Harness спрашивает у человека: «Отправить?»</w:t>
-      </w:r>
-    </w:p>
-    <w:p>
-      <w:pPr>
-        <w:numPr>
-          <w:ilvl w:val="0"/>
-          <w:numId w:val="1003"/>
-        </w:numPr>
-        <w:pStyle w:val="Compact"/>
-      </w:pPr>
-      <w:r>
-        <w:t xml:space="preserve">Человек говорит «да».</w:t>
-      </w:r>
-    </w:p>
-    <w:p>
-      <w:pPr>
-        <w:numPr>
-          <w:ilvl w:val="0"/>
-          <w:numId w:val="1003"/>
-        </w:numPr>
-        <w:pStyle w:val="Compact"/>
-      </w:pPr>
-      <w:r>
-        <w:t xml:space="preserve">И только тогда harness отправляет письма.</w:t>
-      </w:r>
-    </w:p>
-    <w:p>
-      <w:pPr>
-        <w:pStyle w:val="FirstParagraph"/>
-      </w:pPr>
+        <w:rPr>
+          <w:bCs/>
+          <w:b/>
+        </w:rPr>
+        <w:t xml:space="preserve">Модель.</w:t>
+      </w:r>
+      <w:r>
+        <w:t xml:space="preserve"> </w:t>
+      </w:r>
+      <w:r>
+        <w:t xml:space="preserve">Она отвечает: «Открой почту». Заметьте: она только</w:t>
+      </w:r>
+      <w:r>
+        <w:t xml:space="preserve"> </w:t>
+      </w:r>
       <w:r>
         <w:rPr>
           <w:iCs/>
           <w:i/>
         </w:rPr>
-        <w:t xml:space="preserve">(Показать на схеме.)</w:t>
-      </w:r>
-      <w:r>
-        <w:t xml:space="preserve"> </w:t>
-      </w:r>
-      <w:r>
-        <w:t xml:space="preserve">Найдите стрелку между «Модель» и «Почта». Её нет. Модель с почтой напрямую не общается вообще. Она только читает и пишет текст. Всё остальное делает harness.</w:t>
+        <w:t xml:space="preserve">просит</w:t>
+      </w:r>
+      <w:r>
+        <w:t xml:space="preserve">. Сама ничего не откроет.</w:t>
+      </w:r>
+    </w:p>
+    <w:p>
+      <w:pPr>
+        <w:numPr>
+          <w:ilvl w:val="0"/>
+          <w:numId w:val="1003"/>
+        </w:numPr>
+        <w:pStyle w:val="Compact"/>
+      </w:pPr>
+      <w:r>
+        <w:rPr>
+          <w:bCs/>
+          <w:b/>
+        </w:rPr>
+        <w:t xml:space="preserve">Harness.</w:t>
+      </w:r>
+      <w:r>
+        <w:t xml:space="preserve"> </w:t>
+      </w:r>
+      <w:r>
+        <w:t xml:space="preserve">Открывает почту, показывает письма модели, а она пишет черновики ответов.</w:t>
+      </w:r>
+    </w:p>
+    <w:p>
+      <w:pPr>
+        <w:numPr>
+          <w:ilvl w:val="0"/>
+          <w:numId w:val="1003"/>
+        </w:numPr>
+        <w:pStyle w:val="Compact"/>
+      </w:pPr>
+      <w:r>
+        <w:rPr>
+          <w:bCs/>
+          <w:b/>
+        </w:rPr>
+        <w:t xml:space="preserve">Harness.</w:t>
+      </w:r>
+      <w:r>
+        <w:t xml:space="preserve"> </w:t>
+      </w:r>
+      <w:r>
+        <w:t xml:space="preserve">Проверяет черновики и спрашивает вас: «Отправить?» Письма уходят только после вашего «да».</w:t>
+      </w:r>
+    </w:p>
+    <w:p>
+      <w:pPr>
+        <w:pStyle w:val="FirstParagraph"/>
+      </w:pPr>
+      <w:r>
+        <w:t xml:space="preserve">Модель с почтой напрямую не общается. Всё действие — это harness.</w:t>
       </w:r>
     </w:p>
     <w:p>
@@ -835,17 +761,17 @@
         <w:pStyle w:val="BodyText"/>
       </w:pPr>
       <w:r>
-        <w:t xml:space="preserve">Клиент видит результат: «почта разобрана». Устройство он не видит.</w:t>
-      </w:r>
-      <w:r>
-        <w:t xml:space="preserve"> </w:t>
-      </w:r>
-      <w:r>
-        <w:rPr>
-          <w:bCs/>
-          <w:b/>
-        </w:rPr>
-        <w:t xml:space="preserve">А как harness это делает «внутри»?</w:t>
+        <w:t xml:space="preserve">Клиент видит «почта разобрана» и платит за это.</w:t>
+      </w:r>
+      <w:r>
+        <w:t xml:space="preserve"> </w:t>
+      </w:r>
+      <w:r>
+        <w:rPr>
+          <w:bCs/>
+          <w:b/>
+        </w:rPr>
+        <w:t xml:space="preserve">Но что именно в этом дне стоит денег?</w:t>
       </w:r>
     </w:p>
     <w:p>
@@ -856,13 +782,13 @@
       </w:r>
     </w:p>
     <w:bookmarkEnd w:id="27"/>
-    <w:bookmarkStart w:id="28" w:name="слайд-8.-пример-цикл-в-коде"/>
+    <w:bookmarkStart w:id="28" w:name="слайд-8.-за-что-вы-платите-на-самом-деле"/>
     <w:p>
       <w:pPr>
         <w:pStyle w:val="Heading2"/>
       </w:pPr>
       <w:r>
-        <w:t xml:space="preserve">Слайд 8. Пример: цикл в коде</w:t>
+        <w:t xml:space="preserve">Слайд 8. За что вы платите на самом деле</w:t>
       </w:r>
     </w:p>
     <w:p>
@@ -870,51 +796,113 @@
         <w:pStyle w:val="FirstParagraph"/>
       </w:pPr>
       <w:r>
-        <w:t xml:space="preserve">Инженерам покажу код. Это схема, а не настоящий код, и на слайде это написано. Всего десять строк.</w:t>
-      </w:r>
-    </w:p>
-    <w:p>
-      <w:pPr>
-        <w:pStyle w:val="BodyText"/>
-      </w:pPr>
-      <w:r>
-        <w:rPr>
-          <w:iCs/>
-          <w:i/>
-        </w:rPr>
-        <w:t xml:space="preserve">(Идти по номерам.)</w:t>
-      </w:r>
-      <w:r>
-        <w:t xml:space="preserve"> </w:t>
-      </w:r>
-      <w:r>
-        <w:t xml:space="preserve">Бесконечный цикл. Первое: собираем запрос из истории. Второе: спрашиваем модель. Третье: если модель не просит ничего вызвать, это финальный ответ, и мы выходим. Если просит, четвёртое: проверяем права. Пятое: выполняем инструмент и записываем результат в историю. И по кругу.</w:t>
-      </w:r>
-    </w:p>
-    <w:p>
-      <w:pPr>
-        <w:pStyle w:val="BodyText"/>
-      </w:pPr>
-      <w:r>
-        <w:t xml:space="preserve">В Anthropic этот цикл в шутку называют «тупым»: весь ум в модели, а цикл только следит за порядком. Снизу условия остановки: ответ без вызовов, лимит ходов, бюджет токенов, сработала защита, человек прервал или модель отказалась.</w:t>
-      </w:r>
-    </w:p>
-    <w:p>
-      <w:pPr>
-        <w:pStyle w:val="BodyText"/>
-      </w:pPr>
-      <w:r>
-        <w:t xml:space="preserve">Клиент этого цикла не видит, он видит итог.</w:t>
-      </w:r>
-      <w:r>
-        <w:t xml:space="preserve"> </w:t>
-      </w:r>
-      <w:r>
-        <w:rPr>
-          <w:bCs/>
-          <w:b/>
-        </w:rPr>
-        <w:t xml:space="preserve">Из каких частей состоит такая программа целиком?</w:t>
+        <w:t xml:space="preserve">Четыре вопроса, которые можно задать любому ИИ-продукту. Каждый — это характеристика, как в карточке товара.</w:t>
+      </w:r>
+    </w:p>
+    <w:p>
+      <w:pPr>
+        <w:numPr>
+          <w:ilvl w:val="0"/>
+          <w:numId w:val="1004"/>
+        </w:numPr>
+        <w:pStyle w:val="Compact"/>
+      </w:pPr>
+      <w:r>
+        <w:rPr>
+          <w:bCs/>
+          <w:b/>
+        </w:rPr>
+        <w:t xml:space="preserve">Память.</w:t>
+      </w:r>
+      <w:r>
+        <w:t xml:space="preserve"> </w:t>
+      </w:r>
+      <w:r>
+        <w:t xml:space="preserve">Помнит ли он вас между днями? Например, Claude Code хранит заметки о вашем проекте в отдельных файлах и читает их при каждом запуске.</w:t>
+      </w:r>
+    </w:p>
+    <w:p>
+      <w:pPr>
+        <w:numPr>
+          <w:ilvl w:val="0"/>
+          <w:numId w:val="1004"/>
+        </w:numPr>
+        <w:pStyle w:val="Compact"/>
+      </w:pPr>
+      <w:r>
+        <w:rPr>
+          <w:bCs/>
+          <w:b/>
+        </w:rPr>
+        <w:t xml:space="preserve">Проверка.</w:t>
+      </w:r>
+      <w:r>
+        <w:t xml:space="preserve"> </w:t>
+      </w:r>
+      <w:r>
+        <w:t xml:space="preserve">Проверяет ли он себя, прежде чем сдать? Прогоняет тесты, смотрит на скриншот. По словам создателя Claude Code Бориса Черни, с самопроверкой качество растёт в два-три раза.</w:t>
+      </w:r>
+    </w:p>
+    <w:p>
+      <w:pPr>
+        <w:numPr>
+          <w:ilvl w:val="0"/>
+          <w:numId w:val="1004"/>
+        </w:numPr>
+        <w:pStyle w:val="Compact"/>
+      </w:pPr>
+      <w:r>
+        <w:rPr>
+          <w:bCs/>
+          <w:b/>
+        </w:rPr>
+        <w:t xml:space="preserve">Права.</w:t>
+      </w:r>
+      <w:r>
+        <w:t xml:space="preserve"> </w:t>
+      </w:r>
+      <w:r>
+        <w:t xml:space="preserve">Спросит ли он, прежде чем что-то удалить? В Claude Code около сорока действий проверяются отдельно, а рискованные требуют вашего согласия.</w:t>
+      </w:r>
+    </w:p>
+    <w:p>
+      <w:pPr>
+        <w:numPr>
+          <w:ilvl w:val="0"/>
+          <w:numId w:val="1004"/>
+        </w:numPr>
+        <w:pStyle w:val="Compact"/>
+      </w:pPr>
+      <w:r>
+        <w:rPr>
+          <w:bCs/>
+          <w:b/>
+        </w:rPr>
+        <w:t xml:space="preserve">Доведение до конца.</w:t>
+      </w:r>
+      <w:r>
+        <w:t xml:space="preserve"> </w:t>
+      </w:r>
+      <w:r>
+        <w:t xml:space="preserve">Остановится ли он на полпути? Агент повторяет «подумал, сделал, проверил», пока задача не решена.</w:t>
+      </w:r>
+    </w:p>
+    <w:p>
+      <w:pPr>
+        <w:pStyle w:val="FirstParagraph"/>
+      </w:pPr>
+      <w:r>
+        <w:t xml:space="preserve">Это и есть характеристики ИИ-продукта, и в рекламе их обычно нет.</w:t>
+      </w:r>
+      <w:r>
+        <w:t xml:space="preserve"> </w:t>
+      </w:r>
+      <w:r>
+        <w:rPr>
+          <w:bCs/>
+          <w:b/>
+        </w:rPr>
+        <w:t xml:space="preserve">Но у такого сотрудника есть две слабости. Первая: он забывчив.</w:t>
       </w:r>
     </w:p>
     <w:p>
@@ -925,13 +913,13 @@
       </w:r>
     </w:p>
     <w:bookmarkEnd w:id="28"/>
-    <w:bookmarkStart w:id="29" w:name="слайд-9.-из-чего-состоит-harness-теория"/>
+    <w:bookmarkStart w:id="29" w:name="слайд-9.-проблема-1-забывчивость"/>
     <w:p>
       <w:pPr>
         <w:pStyle w:val="Heading2"/>
       </w:pPr>
       <w:r>
-        <w:t xml:space="preserve">Слайд 9. Из чего состоит harness (теория)</w:t>
+        <w:t xml:space="preserve">Слайд 9. Проблема 1: забывчивость</w:t>
       </w:r>
     </w:p>
     <w:p>
@@ -939,181 +927,63 @@
         <w:pStyle w:val="FirstParagraph"/>
       </w:pPr>
       <w:r>
-        <w:t xml:space="preserve">Если разобрать на части, то в Claude Code их шесть главных. На радаре вокруг модели.</w:t>
-      </w:r>
-    </w:p>
-    <w:p>
-      <w:pPr>
-        <w:numPr>
-          <w:ilvl w:val="0"/>
-          <w:numId w:val="1004"/>
-        </w:numPr>
-        <w:pStyle w:val="Compact"/>
-      </w:pPr>
-      <w:r>
-        <w:rPr>
-          <w:bCs/>
-          <w:b/>
-        </w:rPr>
-        <w:t xml:space="preserve">Цикл.</w:t>
-      </w:r>
-      <w:r>
-        <w:t xml:space="preserve"> </w:t>
-      </w:r>
-      <w:r>
-        <w:t xml:space="preserve">Обычный while.</w:t>
-      </w:r>
-    </w:p>
-    <w:p>
-      <w:pPr>
-        <w:numPr>
-          <w:ilvl w:val="0"/>
-          <w:numId w:val="1004"/>
-        </w:numPr>
-        <w:pStyle w:val="Compact"/>
-      </w:pPr>
-      <w:r>
-        <w:rPr>
-          <w:bCs/>
-          <w:b/>
-        </w:rPr>
-        <w:t xml:space="preserve">Инструменты.</w:t>
-      </w:r>
-      <w:r>
-        <w:t xml:space="preserve"> </w:t>
-      </w:r>
-      <w:r>
-        <w:t xml:space="preserve">В Claude Code шесть групп: файлы, поиск, команды, веб, анализ кода и запуск помощников.</w:t>
-      </w:r>
-    </w:p>
-    <w:p>
-      <w:pPr>
-        <w:numPr>
-          <w:ilvl w:val="0"/>
-          <w:numId w:val="1004"/>
-        </w:numPr>
-        <w:pStyle w:val="Compact"/>
-      </w:pPr>
-      <w:r>
-        <w:rPr>
-          <w:bCs/>
-          <w:b/>
-        </w:rPr>
-        <w:t xml:space="preserve">Память.</w:t>
-      </w:r>
-      <w:r>
-        <w:t xml:space="preserve"> </w:t>
-      </w:r>
-      <w:r>
-        <w:t xml:space="preserve">Два файла,</w:t>
-      </w:r>
-      <w:r>
-        <w:t xml:space="preserve"> </w:t>
-      </w:r>
-      <w:r>
-        <w:rPr>
-          <w:rStyle w:val="VerbatimChar"/>
-        </w:rPr>
-        <w:t xml:space="preserve">CLAUDE.md</w:t>
-      </w:r>
-      <w:r>
-        <w:t xml:space="preserve"> </w:t>
-      </w:r>
-      <w:r>
-        <w:t xml:space="preserve">и</w:t>
-      </w:r>
-      <w:r>
-        <w:t xml:space="preserve"> </w:t>
-      </w:r>
-      <w:r>
-        <w:rPr>
-          <w:rStyle w:val="VerbatimChar"/>
-        </w:rPr>
-        <w:t xml:space="preserve">MEMORY.md</w:t>
-      </w:r>
-      <w:r>
-        <w:t xml:space="preserve">: индекс, файлы по темам и архив.</w:t>
-      </w:r>
-    </w:p>
-    <w:p>
-      <w:pPr>
-        <w:numPr>
-          <w:ilvl w:val="0"/>
-          <w:numId w:val="1004"/>
-        </w:numPr>
-        <w:pStyle w:val="Compact"/>
-      </w:pPr>
-      <w:r>
-        <w:rPr>
-          <w:bCs/>
-          <w:b/>
-        </w:rPr>
-        <w:t xml:space="preserve">Контекст.</w:t>
-      </w:r>
-      <w:r>
-        <w:t xml:space="preserve"> </w:t>
-      </w:r>
-      <w:r>
-        <w:t xml:space="preserve">Сжатие истории и</w:t>
-      </w:r>
-      <w:r>
-        <w:t xml:space="preserve"> </w:t>
-      </w:r>
-      <w:r>
-        <w:rPr>
-          <w:rStyle w:val="VerbatimChar"/>
-        </w:rPr>
-        <w:t xml:space="preserve">grep</w:t>
-      </w:r>
-      <w:r>
-        <w:t xml:space="preserve"> </w:t>
-      </w:r>
-      <w:r>
-        <w:t xml:space="preserve">вместо чтения файлов целиком.</w:t>
-      </w:r>
-    </w:p>
-    <w:p>
-      <w:pPr>
-        <w:numPr>
-          <w:ilvl w:val="0"/>
-          <w:numId w:val="1004"/>
-        </w:numPr>
-        <w:pStyle w:val="Compact"/>
-      </w:pPr>
-      <w:r>
-        <w:rPr>
-          <w:bCs/>
-          <w:b/>
-        </w:rPr>
-        <w:t xml:space="preserve">Проверка.</w:t>
-      </w:r>
-      <w:r>
-        <w:t xml:space="preserve"> </w:t>
-      </w:r>
-      <w:r>
-        <w:t xml:space="preserve">Тесты, линтеры, скриншоты, ИИ-судья.</w:t>
-      </w:r>
-    </w:p>
-    <w:p>
-      <w:pPr>
-        <w:numPr>
-          <w:ilvl w:val="0"/>
-          <w:numId w:val="1004"/>
-        </w:numPr>
-        <w:pStyle w:val="Compact"/>
-      </w:pPr>
-      <w:r>
-        <w:rPr>
-          <w:bCs/>
-          <w:b/>
-        </w:rPr>
-        <w:t xml:space="preserve">Права.</w:t>
-      </w:r>
-      <w:r>
-        <w:t xml:space="preserve"> </w:t>
-      </w:r>
-      <w:r>
-        <w:t xml:space="preserve">Около сорока возможностей проверяются отдельно.</w:t>
+        <w:t xml:space="preserve">У модели есть «рабочий стол»: то, что она одновременно держит в голове. Он ограничен. Исследователи выяснили: если важное оказывается в середине длинного текста, качество падает на 30% и больше. Смотрите на кривую: начало и конец модель помнит хорошо, а середина проваливается. Знакомо любому студенту: лекцию вы помните с начала и с конца.</w:t>
+      </w:r>
+    </w:p>
+    <w:p>
+      <w:pPr>
+        <w:pStyle w:val="BodyText"/>
+      </w:pPr>
+      <w:r>
+        <w:t xml:space="preserve">Что делает harness? Как хороший помощник в офисе:</w:t>
+      </w:r>
+    </w:p>
+    <w:p>
+      <w:pPr>
+        <w:numPr>
+          <w:ilvl w:val="0"/>
+          <w:numId w:val="1005"/>
+        </w:numPr>
+        <w:pStyle w:val="Compact"/>
+      </w:pPr>
+      <w:r>
+        <w:t xml:space="preserve">Пишет конспект: решения оставляет, лишнее убирает.</w:t>
+      </w:r>
+    </w:p>
+    <w:p>
+      <w:pPr>
+        <w:numPr>
+          <w:ilvl w:val="0"/>
+          <w:numId w:val="1005"/>
+        </w:numPr>
+        <w:pStyle w:val="Compact"/>
+      </w:pPr>
+      <w:r>
+        <w:t xml:space="preserve">Убирает старое со стола, но помнит, что с ним было.</w:t>
+      </w:r>
+    </w:p>
+    <w:p>
+      <w:pPr>
+        <w:numPr>
+          <w:ilvl w:val="0"/>
+          <w:numId w:val="1005"/>
+        </w:numPr>
+        <w:pStyle w:val="Compact"/>
+      </w:pPr>
+      <w:r>
+        <w:t xml:space="preserve">Ищет нужное в момент нужды, а не читает всё подряд.</w:t>
+      </w:r>
+    </w:p>
+    <w:p>
+      <w:pPr>
+        <w:numPr>
+          <w:ilvl w:val="0"/>
+          <w:numId w:val="1005"/>
+        </w:numPr>
+        <w:pStyle w:val="Compact"/>
+      </w:pPr>
+      <w:r>
+        <w:t xml:space="preserve">Зовёт помощника: он изучает тему и приносит выжимку.</w:t>
       </w:r>
     </w:p>
     <w:p>
@@ -1121,17 +991,17 @@
         <w:pStyle w:val="FirstParagraph"/>
       </w:pPr>
       <w:r>
-        <w:t xml:space="preserve">В статье таких частей одиннадцать, я показал шесть главных. Для маркетолога это список характеристик продукта, как в карточке товара. И к карточке мы ещё вернёмся.</w:t>
-      </w:r>
-      <w:r>
-        <w:t xml:space="preserve"> </w:t>
-      </w:r>
-      <w:r>
-        <w:rPr>
-          <w:bCs/>
-          <w:b/>
-        </w:rPr>
-        <w:t xml:space="preserve">Но у любой такой системы есть проблемы. Первая из них про память.</w:t>
+        <w:t xml:space="preserve">Для маркетолога: «ИИ не тупеет к концу работы» — это свойство harness, а не модели.</w:t>
+      </w:r>
+      <w:r>
+        <w:t xml:space="preserve"> </w:t>
+      </w:r>
+      <w:r>
+        <w:rPr>
+          <w:bCs/>
+          <w:b/>
+        </w:rPr>
+        <w:t xml:space="preserve">Вторая слабость: ошибки.</w:t>
       </w:r>
     </w:p>
     <w:p>
@@ -1142,13 +1012,13 @@
       </w:r>
     </w:p>
     <w:bookmarkEnd w:id="29"/>
-    <w:bookmarkStart w:id="30" w:name="слайд-10.-проблема-1-контекст"/>
+    <w:bookmarkStart w:id="30" w:name="слайд-10.-проблема-2-ошибки-копятся"/>
     <w:p>
       <w:pPr>
         <w:pStyle w:val="Heading2"/>
       </w:pPr>
       <w:r>
-        <w:t xml:space="preserve">Слайд 10. Проблема №1: контекст</w:t>
+        <w:t xml:space="preserve">Слайд 10. Проблема 2: ошибки копятся</w:t>
       </w:r>
     </w:p>
     <w:p>
@@ -1156,7 +1026,7 @@
         <w:pStyle w:val="FirstParagraph"/>
       </w:pPr>
       <w:r>
-        <w:t xml:space="preserve">У модели есть «рабочий стол»: то, что она одновременно держит в голове. Он ограничен. Исследователи выяснили: если важная информация оказывается в середине длинного текста, качество падает на 30% и больше. Смотрите на кривую: начало и конец модель помнит хорошо, а середина проваливается. Это знакомо любому студенту: лекцию вы помните с начала и с конца.</w:t>
+        <w:t xml:space="preserve">Допустим, на каждом шаге ИИ не ошибается в 99 случаях из 100. Звучит прекрасно. Но дело состоит из десяти шагов. И тогда без единой ошибки заканчивается лишь около 90 дел из 100. Смотрите на квадраты: оранжевые — дела с ошибкой. Для 50 шагов уже 6 из 10.</w:t>
       </w:r>
     </w:p>
     <w:p>
@@ -1164,103 +1034,37 @@
         <w:pStyle w:val="BodyText"/>
       </w:pPr>
       <w:r>
-        <w:t xml:space="preserve">Что делает harness? Четыре приёма, по-английски они на слайде в подписях:</w:t>
-      </w:r>
-    </w:p>
-    <w:p>
-      <w:pPr>
-        <w:numPr>
-          <w:ilvl w:val="0"/>
-          <w:numId w:val="1005"/>
-        </w:numPr>
-        <w:pStyle w:val="Compact"/>
-      </w:pPr>
-      <w:r>
-        <w:t xml:space="preserve">Сжимает историю в конспект: решения оставляет, лишнее убирает.</w:t>
-      </w:r>
-    </w:p>
-    <w:p>
-      <w:pPr>
-        <w:numPr>
-          <w:ilvl w:val="0"/>
-          <w:numId w:val="1005"/>
-        </w:numPr>
-        <w:pStyle w:val="Compact"/>
-      </w:pPr>
-      <w:r>
-        <w:t xml:space="preserve">Прячет старое: старые результаты скрыты, а факт вызова виден.</w:t>
-      </w:r>
-    </w:p>
-    <w:p>
-      <w:pPr>
-        <w:numPr>
-          <w:ilvl w:val="0"/>
-          <w:numId w:val="1005"/>
-        </w:numPr>
-        <w:pStyle w:val="Compact"/>
-      </w:pPr>
-      <w:r>
-        <w:t xml:space="preserve">Ищет по мере нужды:</w:t>
-      </w:r>
-      <w:r>
-        <w:t xml:space="preserve"> </w:t>
-      </w:r>
-      <w:r>
-        <w:rPr>
-          <w:rStyle w:val="VerbatimChar"/>
-        </w:rPr>
-        <w:t xml:space="preserve">grep</w:t>
-      </w:r>
-      <w:r>
-        <w:t xml:space="preserve"> </w:t>
-      </w:r>
-      <w:r>
-        <w:t xml:space="preserve">и</w:t>
-      </w:r>
-      <w:r>
-        <w:t xml:space="preserve"> </w:t>
-      </w:r>
-      <w:r>
-        <w:rPr>
-          <w:rStyle w:val="VerbatimChar"/>
-        </w:rPr>
-        <w:t xml:space="preserve">glob</w:t>
-      </w:r>
-      <w:r>
-        <w:t xml:space="preserve"> </w:t>
-      </w:r>
-      <w:r>
-        <w:t xml:space="preserve">вместо чтения файлов целиком.</w:t>
-      </w:r>
-    </w:p>
-    <w:p>
-      <w:pPr>
-        <w:numPr>
-          <w:ilvl w:val="0"/>
-          <w:numId w:val="1005"/>
-        </w:numPr>
-        <w:pStyle w:val="Compact"/>
-      </w:pPr>
-      <w:r>
-        <w:t xml:space="preserve">Зовёт помощников: они возвращают краткое резюме на тысячу-две тысячи токенов.</w:t>
-      </w:r>
-    </w:p>
-    <w:p>
-      <w:pPr>
-        <w:pStyle w:val="FirstParagraph"/>
-      </w:pPr>
-      <w:r>
-        <w:t xml:space="preserve">Маркетологу: «ИИ не тупеет к концу работы» — это свойство harness, а не модели.</w:t>
-      </w:r>
-      <w:r>
-        <w:t xml:space="preserve"> </w:t>
-      </w:r>
-      <w:r>
-        <w:rPr>
-          <w:bCs/>
-          <w:b/>
-        </w:rPr>
-        <w:t xml:space="preserve">Проблема вторая: ошибки.</w:t>
+        <w:rPr>
+          <w:iCs/>
+          <w:i/>
+        </w:rPr>
+        <w:t xml:space="preserve">(Посчитано как 0,99 в степени числа шагов. Это моё вычисление, а не цифра из статьи.)</w:t>
+      </w:r>
+    </w:p>
+    <w:p>
+      <w:pPr>
+        <w:pStyle w:val="BodyText"/>
+      </w:pPr>
+      <w:r>
+        <w:t xml:space="preserve">Что делает harness: ловит сбой, возвращает его модели как обычный результат, чтобы она исправилась, и ограничивает число повторов. В компании Stripe, например, больше двух не разрешают.</w:t>
+      </w:r>
+    </w:p>
+    <w:p>
+      <w:pPr>
+        <w:pStyle w:val="BodyText"/>
+      </w:pPr>
+      <w:r>
+        <w:t xml:space="preserve">Для маркетолога: чем длиннее задача, тем дороже ошибка. Надёжность продаёт.</w:t>
+      </w:r>
+      <w:r>
+        <w:t xml:space="preserve"> </w:t>
+      </w:r>
+      <w:r>
+        <w:rPr>
+          <w:bCs/>
+          <w:b/>
+        </w:rPr>
+        <w:t xml:space="preserve">А что происходит, когда продукт взрослеет?</w:t>
       </w:r>
     </w:p>
     <w:p>
@@ -1271,13 +1075,13 @@
       </w:r>
     </w:p>
     <w:bookmarkEnd w:id="30"/>
-    <w:bookmarkStart w:id="31" w:name="слайд-11.-проблема-2-ошибки"/>
+    <w:bookmarkStart w:id="31" w:name="X0498a9ddcf3a4509222bbb3166d52c2c51e4221"/>
     <w:p>
       <w:pPr>
         <w:pStyle w:val="Heading2"/>
       </w:pPr>
       <w:r>
-        <w:t xml:space="preserve">Слайд 11. Проблема №2: ошибки</w:t>
+        <w:t xml:space="preserve">Слайд 11. Парадокс: лучшие продукты становятся проще</w:t>
       </w:r>
     </w:p>
     <w:p>
@@ -1285,7 +1089,81 @@
         <w:pStyle w:val="FirstParagraph"/>
       </w:pPr>
       <w:r>
-        <w:t xml:space="preserve">Посчитаем. Допустим, на каждом шаге ИИ не ошибается в 99 случаях из 100. Звучит прекрасно. Но дело состоит из десяти шагов: 0,99 в десятой степени — это около 0,904. То есть без единой ошибки дойдёт лишь около 90% дел. Для двадцати шагов уже 82%, для пятидесяти — 60%. Смотрите на столбики.</w:t>
+        <w:t xml:space="preserve">Тут неожиданный вывод. Вы думаете, что хороший продукт — это больше функций. Но три цифры говорят обратное.</w:t>
+      </w:r>
+    </w:p>
+    <w:p>
+      <w:pPr>
+        <w:numPr>
+          <w:ilvl w:val="0"/>
+          <w:numId w:val="1006"/>
+        </w:numPr>
+        <w:pStyle w:val="Compact"/>
+      </w:pPr>
+      <w:r>
+        <w:rPr>
+          <w:bCs/>
+          <w:b/>
+        </w:rPr>
+        <w:t xml:space="preserve">80%.</w:t>
+      </w:r>
+      <w:r>
+        <w:t xml:space="preserve"> </w:t>
+      </w:r>
+      <w:r>
+        <w:t xml:space="preserve">Столько инструментов убрал Vercel из своего продукта v0, и результат стал лучше.</w:t>
+      </w:r>
+    </w:p>
+    <w:p>
+      <w:pPr>
+        <w:numPr>
+          <w:ilvl w:val="0"/>
+          <w:numId w:val="1006"/>
+        </w:numPr>
+        <w:pStyle w:val="Compact"/>
+      </w:pPr>
+      <w:r>
+        <w:rPr>
+          <w:bCs/>
+          <w:b/>
+        </w:rPr>
+        <w:t xml:space="preserve">5.</w:t>
+      </w:r>
+      <w:r>
+        <w:t xml:space="preserve"> </w:t>
+      </w:r>
+      <w:r>
+        <w:t xml:space="preserve">Столько раз за полгода переделывали Manus, и каждый раз убирали сложность.</w:t>
+      </w:r>
+    </w:p>
+    <w:p>
+      <w:pPr>
+        <w:numPr>
+          <w:ilvl w:val="0"/>
+          <w:numId w:val="1006"/>
+        </w:numPr>
+        <w:pStyle w:val="Compact"/>
+      </w:pPr>
+      <w:r>
+        <w:rPr>
+          <w:bCs/>
+          <w:b/>
+        </w:rPr>
+        <w:t xml:space="preserve">95%.</w:t>
+      </w:r>
+      <w:r>
+        <w:t xml:space="preserve"> </w:t>
+      </w:r>
+      <w:r>
+        <w:t xml:space="preserve">Столько контекста экономит Claude Code, потому что грузит инструменты только по мере нужды.</w:t>
+      </w:r>
+    </w:p>
+    <w:p>
+      <w:pPr>
+        <w:pStyle w:val="FirstParagraph"/>
+      </w:pPr>
+      <w:r>
+        <w:t xml:space="preserve">Автор статьи сравнивает это со строительными лесами: нужны, пока здание строят. Модель умнеет — лишнее убирают.</w:t>
       </w:r>
     </w:p>
     <w:p>
@@ -1293,25 +1171,17 @@
         <w:pStyle w:val="BodyText"/>
       </w:pPr>
       <w:r>
-        <w:t xml:space="preserve">Что делает harness: ловит сбой, возвращает его модели как обычный результат, чтобы она могла исправиться, и ограничивает число повторов. В компании Stripe, например, больше двух повторов не разрешают.</w:t>
-      </w:r>
-    </w:p>
-    <w:p>
-      <w:pPr>
-        <w:pStyle w:val="BodyText"/>
-      </w:pPr>
-      <w:r>
-        <w:t xml:space="preserve">Для маркетолога: чем длиннее задача, тем дороже ошибка. Поэтому надёжность — это аргумент продаж.</w:t>
-      </w:r>
-      <w:r>
-        <w:t xml:space="preserve"> </w:t>
-      </w:r>
-      <w:r>
-        <w:rPr>
-          <w:bCs/>
-          <w:b/>
-        </w:rPr>
-        <w:t xml:space="preserve">Проблема третья: доверие.</w:t>
+        <w:t xml:space="preserve">Для маркетолога: меньше функций не значит слабее продукт. Простота — тоже позиционирование.</w:t>
+      </w:r>
+      <w:r>
+        <w:t xml:space="preserve"> </w:t>
+      </w:r>
+      <w:r>
+        <w:rPr>
+          <w:bCs/>
+          <w:b/>
+        </w:rPr>
+        <w:t xml:space="preserve">Посмотрим, как это выглядит на рынке.</w:t>
       </w:r>
     </w:p>
     <w:p>
@@ -1322,13 +1192,13 @@
       </w:r>
     </w:p>
     <w:bookmarkEnd w:id="31"/>
-    <w:bookmarkStart w:id="32" w:name="слайд-12.-проблема-3-проверка-и-права"/>
+    <w:bookmarkStart w:id="32" w:name="X65fb9b3cb2661b6842224564d3ff36ecc1efefb"/>
     <w:p>
       <w:pPr>
         <w:pStyle w:val="Heading2"/>
       </w:pPr>
       <w:r>
-        <w:t xml:space="preserve">Слайд 12. Проблема №3: проверка и права</w:t>
+        <w:t xml:space="preserve">Слайд 12. Рынок: одна модель, разные обещания</w:t>
       </w:r>
     </w:p>
     <w:p>
@@ -1336,67 +1206,129 @@
         <w:pStyle w:val="FirstParagraph"/>
       </w:pPr>
       <w:r>
-        <w:t xml:space="preserve">Между «хочу» и «сделано» стоят три ворота. Модель предлагает действие. Первые ворота: доверие при открытии проекта. Вторые: проверка прав перед каждым вызовом. Третьи: подтверждение человеком для рискованных действий. Только после этого действие выполняется.</w:t>
-      </w:r>
-    </w:p>
-    <w:p>
-      <w:pPr>
-        <w:pStyle w:val="BodyText"/>
-      </w:pPr>
-      <w:r>
-        <w:t xml:space="preserve">Принцип: модель решает, что</w:t>
-      </w:r>
-      <w:r>
-        <w:t xml:space="preserve"> </w:t>
-      </w:r>
-      <w:r>
-        <w:rPr>
-          <w:iCs/>
-          <w:i/>
-        </w:rPr>
-        <w:t xml:space="preserve">попробовать</w:t>
-      </w:r>
-      <w:r>
-        <w:t xml:space="preserve">. Система решает, что</w:t>
-      </w:r>
-      <w:r>
-        <w:t xml:space="preserve"> </w:t>
-      </w:r>
-      <w:r>
-        <w:rPr>
-          <w:iCs/>
-          <w:i/>
-        </w:rPr>
-        <w:t xml:space="preserve">разрешено</w:t>
-      </w:r>
-      <w:r>
-        <w:t xml:space="preserve">. Как с доступами сотрудника: можно читать документы, нельзя удалять.</w:t>
-      </w:r>
-    </w:p>
-    <w:p>
-      <w:pPr>
-        <w:pStyle w:val="BodyText"/>
-      </w:pPr>
-      <w:r>
-        <w:t xml:space="preserve">Две цифры. Около сорока возможностей в Claude Code проверяются отдельно. А создатель Claude Code Борис Черни говорит, что когда агент умеет проверять сам себя (тесты, линтеры, скриншоты, второй ИИ как судья), качество растёт в два-три раза.</w:t>
-      </w:r>
-    </w:p>
-    <w:p>
-      <w:pPr>
-        <w:pStyle w:val="BodyText"/>
-      </w:pPr>
-      <w:r>
-        <w:t xml:space="preserve">Для маркетолога: безопасность — товарное свойство, а не опция.</w:t>
-      </w:r>
-      <w:r>
-        <w:t xml:space="preserve"> </w:t>
-      </w:r>
-      <w:r>
-        <w:rPr>
-          <w:bCs/>
-          <w:b/>
-        </w:rPr>
-        <w:t xml:space="preserve">Проблема четвёртая: большие задачи.</w:t>
+        <w:t xml:space="preserve">Вот пять известных продуктов, как постеры. Слоганы мои, по описанию подходов в статье, они не официальные.</w:t>
+      </w:r>
+    </w:p>
+    <w:p>
+      <w:pPr>
+        <w:numPr>
+          <w:ilvl w:val="0"/>
+          <w:numId w:val="1007"/>
+        </w:numPr>
+        <w:pStyle w:val="Compact"/>
+      </w:pPr>
+      <w:r>
+        <w:rPr>
+          <w:bCs/>
+          <w:b/>
+        </w:rPr>
+        <w:t xml:space="preserve">Claude Code</w:t>
+      </w:r>
+      <w:r>
+        <w:t xml:space="preserve"> </w:t>
+      </w:r>
+      <w:r>
+        <w:t xml:space="preserve">от Anthropic: лёгкий harness. Ставка на то, что модель станет умнее.</w:t>
+      </w:r>
+    </w:p>
+    <w:p>
+      <w:pPr>
+        <w:numPr>
+          <w:ilvl w:val="0"/>
+          <w:numId w:val="1007"/>
+        </w:numPr>
+        <w:pStyle w:val="Compact"/>
+      </w:pPr>
+      <w:r>
+        <w:rPr>
+          <w:bCs/>
+          <w:b/>
+        </w:rPr>
+        <w:t xml:space="preserve">Codex</w:t>
+      </w:r>
+      <w:r>
+        <w:t xml:space="preserve"> </w:t>
+      </w:r>
+      <w:r>
+        <w:t xml:space="preserve">от OpenAI: один harness везде — в терминале, в редакторе, в браузере.</w:t>
+      </w:r>
+    </w:p>
+    <w:p>
+      <w:pPr>
+        <w:numPr>
+          <w:ilvl w:val="0"/>
+          <w:numId w:val="1007"/>
+        </w:numPr>
+        <w:pStyle w:val="Compact"/>
+      </w:pPr>
+      <w:r>
+        <w:rPr>
+          <w:bCs/>
+          <w:b/>
+        </w:rPr>
+        <w:t xml:space="preserve">LangGraph</w:t>
+      </w:r>
+      <w:r>
+        <w:t xml:space="preserve">: каждый шаг под контролем.</w:t>
+      </w:r>
+    </w:p>
+    <w:p>
+      <w:pPr>
+        <w:numPr>
+          <w:ilvl w:val="0"/>
+          <w:numId w:val="1007"/>
+        </w:numPr>
+        <w:pStyle w:val="Compact"/>
+      </w:pPr>
+      <w:r>
+        <w:rPr>
+          <w:bCs/>
+          <w:b/>
+        </w:rPr>
+        <w:t xml:space="preserve">CrewAI</w:t>
+      </w:r>
+      <w:r>
+        <w:t xml:space="preserve">: целая команда агентов, у каждого роль.</w:t>
+      </w:r>
+    </w:p>
+    <w:p>
+      <w:pPr>
+        <w:numPr>
+          <w:ilvl w:val="0"/>
+          <w:numId w:val="1007"/>
+        </w:numPr>
+        <w:pStyle w:val="Compact"/>
+      </w:pPr>
+      <w:r>
+        <w:rPr>
+          <w:bCs/>
+          <w:b/>
+        </w:rPr>
+        <w:t xml:space="preserve">AutoGen</w:t>
+      </w:r>
+      <w:r>
+        <w:t xml:space="preserve"> </w:t>
+      </w:r>
+      <w:r>
+        <w:t xml:space="preserve">от Microsoft: агенты договариваются сами, как в общем чате.</w:t>
+      </w:r>
+    </w:p>
+    <w:p>
+      <w:pPr>
+        <w:pStyle w:val="FirstParagraph"/>
+      </w:pPr>
+      <w:r>
+        <w:t xml:space="preserve">Модель можно взять одну и ту же. А продают разный подход. На языке маркетинга это позиционирование.</w:t>
+      </w:r>
+      <w:r>
+        <w:t xml:space="preserve"> </w:t>
+      </w:r>
+      <w:r>
+        <w:rPr>
+          <w:bCs/>
+          <w:b/>
+        </w:rPr>
+        <w:t xml:space="preserve">А теперь попробуйте сами.</w:t>
       </w:r>
     </w:p>
     <w:p>
@@ -1407,13 +1339,13 @@
       </w:r>
     </w:p>
     <w:bookmarkEnd w:id="32"/>
-    <w:bookmarkStart w:id="33" w:name="слайд-13.-проблема-4-большое-дело"/>
+    <w:bookmarkStart w:id="33" w:name="слайд-13.-практика-как-это-продавать"/>
     <w:p>
       <w:pPr>
         <w:pStyle w:val="Heading2"/>
       </w:pPr>
       <w:r>
-        <w:t xml:space="preserve">Слайд 13. Проблема №4: большое дело</w:t>
+        <w:t xml:space="preserve">Слайд 13. Практика: как это продавать</w:t>
       </w:r>
     </w:p>
     <w:p>
@@ -1421,7 +1353,11 @@
         <w:pStyle w:val="FirstParagraph"/>
       </w:pPr>
       <w:r>
-        <w:t xml:space="preserve">Что если дело не помещается в один «рабочий стол»? Приём Anthropic знаком любому, кто работал сменами. В больнице люди меняются, а журнал остаётся.</w:t>
+        <w:rPr>
+          <w:iCs/>
+          <w:i/>
+        </w:rPr>
+        <w:t xml:space="preserve">(Это задание для зала. Формулировки на слайде мои, не из статьи.)</w:t>
       </w:r>
     </w:p>
     <w:p>
@@ -1429,33 +1365,7 @@
         <w:pStyle w:val="BodyText"/>
       </w:pPr>
       <w:r>
-        <w:t xml:space="preserve">Сначала один раз приходит</w:t>
-      </w:r>
-      <w:r>
-        <w:t xml:space="preserve"> </w:t>
-      </w:r>
-      <w:r>
-        <w:rPr>
-          <w:bCs/>
-          <w:b/>
-        </w:rPr>
-        <w:t xml:space="preserve">подготовщик</w:t>
-      </w:r>
-      <w:r>
-        <w:t xml:space="preserve">: готовит рабочее место, список задач, файл прогресса и первое сохранение. Потом каждую смену приходит</w:t>
-      </w:r>
-      <w:r>
-        <w:t xml:space="preserve"> </w:t>
-      </w:r>
-      <w:r>
-        <w:rPr>
-          <w:bCs/>
-          <w:b/>
-        </w:rPr>
-        <w:t xml:space="preserve">исполнитель</w:t>
-      </w:r>
-      <w:r>
-        <w:t xml:space="preserve">. Он читает журнал, берёт самую важную задачу, делает её, сохраняет и пишет итог. Следующий исполнитель начнёт с этой записи.</w:t>
+        <w:t xml:space="preserve">Слева то, что пишут все: «Работает на самой мощной нейросети». Клиент не видит разницы. Справа то, что сработает: «Помнит ваш проект. Проверяет себя. Спросит, прежде чем что-то удалить». Это свойства harness: память, проверка, права. Их можно проверить, поэтому им верят.</w:t>
       </w:r>
     </w:p>
     <w:p>
@@ -1463,7 +1373,17 @@
         <w:pStyle w:val="BodyText"/>
       </w:pPr>
       <w:r>
-        <w:t xml:space="preserve">Журнал здесь — файл прогресса плюс git-коммиты. Память модели ограничена, а журнал остаётся между сменами.</w:t>
+        <w:rPr>
+          <w:bCs/>
+          <w:b/>
+        </w:rPr>
+        <w:t xml:space="preserve">Задание на минуту:</w:t>
+      </w:r>
+      <w:r>
+        <w:t xml:space="preserve"> </w:t>
+      </w:r>
+      <w:r>
+        <w:t xml:space="preserve">придумайте УТП для ИИ-помощника по своему профилю: бухгалтерии, поддержки клиентов или рекламы. Опирайтесь на четыре пункта со слайда 8.</w:t>
       </w:r>
     </w:p>
     <w:p>
@@ -1471,17 +1391,29 @@
         <w:pStyle w:val="BodyText"/>
       </w:pPr>
       <w:r>
-        <w:t xml:space="preserve">Маркетологу: непрерывность работы — тоже характеристика продукта.</w:t>
-      </w:r>
-      <w:r>
-        <w:t xml:space="preserve"> </w:t>
-      </w:r>
-      <w:r>
-        <w:rPr>
-          <w:bCs/>
-          <w:b/>
-        </w:rPr>
-        <w:t xml:space="preserve">Теперь посмотрим на рынок.</w:t>
+        <w:rPr>
+          <w:iCs/>
+          <w:i/>
+        </w:rPr>
+        <w:t xml:space="preserve">(Дать минуту. Спросить двух-трёх человек.)</w:t>
+      </w:r>
+    </w:p>
+    <w:p>
+      <w:pPr>
+        <w:pStyle w:val="BodyText"/>
+      </w:pPr>
+      <w:r>
+        <w:t xml:space="preserve">Продаётся не «мощная модель», а проверяемые свойства.</w:t>
+      </w:r>
+      <w:r>
+        <w:t xml:space="preserve"> </w:t>
+      </w:r>
+      <w:r>
+        <w:rPr>
+          <w:bCs/>
+          <w:b/>
+        </w:rPr>
+        <w:t xml:space="preserve">А как покупателю не ошибиться?</w:t>
       </w:r>
     </w:p>
     <w:p>
@@ -1492,13 +1424,13 @@
       </w:r>
     </w:p>
     <w:bookmarkEnd w:id="33"/>
-    <w:bookmarkStart w:id="34" w:name="X203f63e880e5f6931c521286ffe01e13f9be5f2"/>
+    <w:bookmarkStart w:id="34" w:name="слайд-14.-практика-как-выбирать"/>
     <w:p>
       <w:pPr>
         <w:pStyle w:val="Heading2"/>
       </w:pPr>
       <w:r>
-        <w:t xml:space="preserve">Слайд 14. Рынок: одна модель, разные обещания</w:t>
+        <w:t xml:space="preserve">Слайд 14. Практика: как выбирать</w:t>
       </w:r>
     </w:p>
     <w:p>
@@ -1506,111 +1438,63 @@
         <w:pStyle w:val="FirstParagraph"/>
       </w:pPr>
       <w:r>
-        <w:t xml:space="preserve">Вот пять известных продуктов, как постеры. Слоганы мои, по описанию подходов в статье, они не официальные.</w:t>
-      </w:r>
-    </w:p>
-    <w:p>
-      <w:pPr>
-        <w:numPr>
-          <w:ilvl w:val="0"/>
-          <w:numId w:val="1006"/>
-        </w:numPr>
-        <w:pStyle w:val="Compact"/>
-      </w:pPr>
-      <w:r>
-        <w:rPr>
-          <w:bCs/>
-          <w:b/>
-        </w:rPr>
-        <w:t xml:space="preserve">Claude Code</w:t>
-      </w:r>
-      <w:r>
-        <w:t xml:space="preserve"> </w:t>
-      </w:r>
-      <w:r>
-        <w:t xml:space="preserve">от Anthropic: лёгкий harness. Ставка на то, что модель станет умнее.</w:t>
-      </w:r>
-    </w:p>
-    <w:p>
-      <w:pPr>
-        <w:numPr>
-          <w:ilvl w:val="0"/>
-          <w:numId w:val="1006"/>
-        </w:numPr>
-        <w:pStyle w:val="Compact"/>
-      </w:pPr>
-      <w:r>
-        <w:rPr>
-          <w:bCs/>
-          <w:b/>
-        </w:rPr>
-        <w:t xml:space="preserve">Codex</w:t>
-      </w:r>
-      <w:r>
-        <w:t xml:space="preserve"> </w:t>
-      </w:r>
-      <w:r>
-        <w:t xml:space="preserve">от OpenAI: один harness везде — в терминале, в редакторе, в браузере.</w:t>
-      </w:r>
-    </w:p>
-    <w:p>
-      <w:pPr>
-        <w:numPr>
-          <w:ilvl w:val="0"/>
-          <w:numId w:val="1006"/>
-        </w:numPr>
-        <w:pStyle w:val="Compact"/>
-      </w:pPr>
-      <w:r>
-        <w:rPr>
-          <w:bCs/>
-          <w:b/>
-        </w:rPr>
-        <w:t xml:space="preserve">LangGraph</w:t>
-      </w:r>
-      <w:r>
-        <w:t xml:space="preserve">: каждый шаг под контролем, работа расписана как схема.</w:t>
-      </w:r>
-    </w:p>
-    <w:p>
-      <w:pPr>
-        <w:numPr>
-          <w:ilvl w:val="0"/>
-          <w:numId w:val="1006"/>
-        </w:numPr>
-        <w:pStyle w:val="Compact"/>
-      </w:pPr>
-      <w:r>
-        <w:rPr>
-          <w:bCs/>
-          <w:b/>
-        </w:rPr>
-        <w:t xml:space="preserve">CrewAI</w:t>
-      </w:r>
-      <w:r>
-        <w:t xml:space="preserve">: целая команда агентов, у каждого своя роль.</w:t>
-      </w:r>
-    </w:p>
-    <w:p>
-      <w:pPr>
-        <w:numPr>
-          <w:ilvl w:val="0"/>
-          <w:numId w:val="1006"/>
-        </w:numPr>
-        <w:pStyle w:val="Compact"/>
-      </w:pPr>
-      <w:r>
-        <w:rPr>
-          <w:bCs/>
-          <w:b/>
-        </w:rPr>
-        <w:t xml:space="preserve">AutoGen</w:t>
-      </w:r>
-      <w:r>
-        <w:t xml:space="preserve"> </w:t>
-      </w:r>
-      <w:r>
-        <w:t xml:space="preserve">от Microsoft: агенты решают задачу вместе, как в общем чате.</w:t>
+        <w:t xml:space="preserve">Теперь с другой стороны, глазами покупателя. Слева карточка товара: в ней два поля, «модель» и «harness». Модель у многих одинаковая. А вот строки ниже (память, проверка, права, поведение при сбое, работа с инструментами, непрерывность большого дела) и есть конкурентное различие. Сегодня их часто не пишут.</w:t>
+      </w:r>
+    </w:p>
+    <w:p>
+      <w:pPr>
+        <w:pStyle w:val="BodyText"/>
+      </w:pPr>
+      <w:r>
+        <w:t xml:space="preserve">Поэтому вместо «какая у вас модель?» спросите продавца четыре вещи:</w:t>
+      </w:r>
+    </w:p>
+    <w:p>
+      <w:pPr>
+        <w:numPr>
+          <w:ilvl w:val="0"/>
+          <w:numId w:val="1008"/>
+        </w:numPr>
+        <w:pStyle w:val="Compact"/>
+      </w:pPr>
+      <w:r>
+        <w:t xml:space="preserve">Что он помнит между сессиями?</w:t>
+      </w:r>
+    </w:p>
+    <w:p>
+      <w:pPr>
+        <w:numPr>
+          <w:ilvl w:val="0"/>
+          <w:numId w:val="1008"/>
+        </w:numPr>
+        <w:pStyle w:val="Compact"/>
+      </w:pPr>
+      <w:r>
+        <w:t xml:space="preserve">Как проверяет свою работу?</w:t>
+      </w:r>
+    </w:p>
+    <w:p>
+      <w:pPr>
+        <w:numPr>
+          <w:ilvl w:val="0"/>
+          <w:numId w:val="1008"/>
+        </w:numPr>
+        <w:pStyle w:val="Compact"/>
+      </w:pPr>
+      <w:r>
+        <w:t xml:space="preserve">Что ему разрешено без человека?</w:t>
+      </w:r>
+    </w:p>
+    <w:p>
+      <w:pPr>
+        <w:numPr>
+          <w:ilvl w:val="0"/>
+          <w:numId w:val="1008"/>
+        </w:numPr>
+        <w:pStyle w:val="Compact"/>
+      </w:pPr>
+      <w:r>
+        <w:t xml:space="preserve">Что делает, когда ошибается?</w:t>
       </w:r>
     </w:p>
     <w:p>
@@ -1618,17 +1502,17 @@
         <w:pStyle w:val="FirstParagraph"/>
       </w:pPr>
       <w:r>
-        <w:t xml:space="preserve">Модель можно взять одну и ту же. А продают разный подход. На языке маркетинга это позиционирование.</w:t>
-      </w:r>
-      <w:r>
-        <w:t xml:space="preserve"> </w:t>
-      </w:r>
-      <w:r>
-        <w:rPr>
-          <w:bCs/>
-          <w:b/>
-        </w:rPr>
-        <w:t xml:space="preserve">Как этим пользоваться на практике?</w:t>
+        <w:t xml:space="preserve">Если продавец уверенно отвечает, за красивой моделью стоит продуманный harness.</w:t>
+      </w:r>
+      <w:r>
+        <w:t xml:space="preserve"> </w:t>
+      </w:r>
+      <w:r>
+        <w:rPr>
+          <w:bCs/>
+          <w:b/>
+        </w:rPr>
+        <w:t xml:space="preserve">Давайте подведём итог.</w:t>
       </w:r>
     </w:p>
     <w:p>
@@ -1639,13 +1523,13 @@
       </w:r>
     </w:p>
     <w:bookmarkEnd w:id="34"/>
-    <w:bookmarkStart w:id="35" w:name="слайд-15.-маркетинг-карточка-ии-продукта"/>
+    <w:bookmarkStart w:id="35" w:name="слайд-15.-итоги-и-возвращение-к-вопросу"/>
     <w:p>
       <w:pPr>
         <w:pStyle w:val="Heading2"/>
       </w:pPr>
       <w:r>
-        <w:t xml:space="preserve">Слайд 15. Маркетинг: карточка ИИ-продукта</w:t>
+        <w:t xml:space="preserve">Слайд 15. Итоги и возвращение к вопросу</w:t>
       </w:r>
     </w:p>
     <w:p>
@@ -1653,7 +1537,97 @@
         <w:pStyle w:val="FirstParagraph"/>
       </w:pPr>
       <w:r>
-        <w:t xml:space="preserve">Представьте карточку товара на маркетплейсе. У ИИ-продукта в ней два поля: «модель» и «harness». Модель у многих одинаковая. А вот характеристики справа — память, проверка, права, поведение при сбое, работа с инструментами, непрерывность — это и есть конкурентное различие, и сегодня их часто не пишут.</w:t>
+        <w:t xml:space="preserve">Три вывода.</w:t>
+      </w:r>
+    </w:p>
+    <w:p>
+      <w:pPr>
+        <w:numPr>
+          <w:ilvl w:val="0"/>
+          <w:numId w:val="1009"/>
+        </w:numPr>
+        <w:pStyle w:val="Compact"/>
+      </w:pPr>
+      <w:r>
+        <w:rPr>
+          <w:bCs/>
+          <w:b/>
+        </w:rPr>
+        <w:t xml:space="preserve">Модель — товар, harness — продукт.</w:t>
+      </w:r>
+      <w:r>
+        <w:t xml:space="preserve"> </w:t>
+      </w:r>
+      <w:r>
+        <w:t xml:space="preserve">Модели доступны всем, а отличие живёт в программе вокруг модели.</w:t>
+      </w:r>
+    </w:p>
+    <w:p>
+      <w:pPr>
+        <w:numPr>
+          <w:ilvl w:val="0"/>
+          <w:numId w:val="1009"/>
+        </w:numPr>
+        <w:pStyle w:val="Compact"/>
+      </w:pPr>
+      <w:r>
+        <w:rPr>
+          <w:bCs/>
+          <w:b/>
+        </w:rPr>
+        <w:t xml:space="preserve">Harness — это память, проверка, права и доведение до конца.</w:t>
+      </w:r>
+      <w:r>
+        <w:t xml:space="preserve"> </w:t>
+      </w:r>
+      <w:r>
+        <w:t xml:space="preserve">Не магия, а свойства, которые можно проверить и сравнить.</w:t>
+      </w:r>
+    </w:p>
+    <w:p>
+      <w:pPr>
+        <w:numPr>
+          <w:ilvl w:val="0"/>
+          <w:numId w:val="1009"/>
+        </w:numPr>
+        <w:pStyle w:val="Compact"/>
+      </w:pPr>
+      <w:r>
+        <w:rPr>
+          <w:bCs/>
+          <w:b/>
+        </w:rPr>
+        <w:t xml:space="preserve">Продавайте и выбирайте по этим свойствам, а не по названию модели.</w:t>
+      </w:r>
+      <w:r>
+        <w:t xml:space="preserve"> </w:t>
+      </w:r>
+      <w:r>
+        <w:t xml:space="preserve">Простота тоже преимущество: лишнее со временем убирают.</w:t>
+      </w:r>
+    </w:p>
+    <w:p>
+      <w:pPr>
+        <w:pStyle w:val="FirstParagraph"/>
+      </w:pPr>
+      <w:r>
+        <w:t xml:space="preserve">А теперь вернёмся к вопросу из начала. Вариант A — «какая модель внутри». Вариант B — «сколько стоит». Теперь вы понимаете, почему верный вариант C:</w:t>
+      </w:r>
+      <w:r>
+        <w:t xml:space="preserve"> </w:t>
+      </w:r>
+      <w:r>
+        <w:rPr>
+          <w:bCs/>
+          <w:b/>
+        </w:rPr>
+        <w:t xml:space="preserve">что он умеет делать сам и насколько надёжно.</w:t>
+      </w:r>
+      <w:r>
+        <w:t xml:space="preserve"> </w:t>
+      </w:r>
+      <w:r>
+        <w:t xml:space="preserve">Это и есть harness.</w:t>
       </w:r>
     </w:p>
     <w:p>
@@ -1661,73 +1635,11 @@
         <w:pStyle w:val="BodyText"/>
       </w:pPr>
       <w:r>
-        <w:t xml:space="preserve">Поэтому вместо «какая у вас модель?» спрашивайте продавца четыре вещи:</w:t>
-      </w:r>
-    </w:p>
-    <w:p>
-      <w:pPr>
-        <w:numPr>
-          <w:ilvl w:val="0"/>
-          <w:numId w:val="1007"/>
-        </w:numPr>
-        <w:pStyle w:val="Compact"/>
-      </w:pPr>
-      <w:r>
-        <w:t xml:space="preserve">Что он помнит между сессиями?</w:t>
-      </w:r>
-    </w:p>
-    <w:p>
-      <w:pPr>
-        <w:numPr>
-          <w:ilvl w:val="0"/>
-          <w:numId w:val="1007"/>
-        </w:numPr>
-        <w:pStyle w:val="Compact"/>
-      </w:pPr>
-      <w:r>
-        <w:t xml:space="preserve">Как проверяет свою работу?</w:t>
-      </w:r>
-    </w:p>
-    <w:p>
-      <w:pPr>
-        <w:numPr>
-          <w:ilvl w:val="0"/>
-          <w:numId w:val="1007"/>
-        </w:numPr>
-        <w:pStyle w:val="Compact"/>
-      </w:pPr>
-      <w:r>
-        <w:t xml:space="preserve">Что ему разрешено без человека?</w:t>
-      </w:r>
-    </w:p>
-    <w:p>
-      <w:pPr>
-        <w:numPr>
-          <w:ilvl w:val="0"/>
-          <w:numId w:val="1007"/>
-        </w:numPr>
-        <w:pStyle w:val="Compact"/>
-      </w:pPr>
-      <w:r>
-        <w:t xml:space="preserve">Что делает, когда ошибается?</w:t>
-      </w:r>
-    </w:p>
-    <w:p>
-      <w:pPr>
-        <w:pStyle w:val="FirstParagraph"/>
-      </w:pPr>
-      <w:r>
-        <w:t xml:space="preserve">Если продавец уверенно отвечает, за красивой моделью стоит продуманный harness.</w:t>
-      </w:r>
-      <w:r>
-        <w:t xml:space="preserve"> </w:t>
-      </w:r>
-      <w:r>
-        <w:rPr>
-          <w:bCs/>
-          <w:b/>
-        </w:rPr>
-        <w:t xml:space="preserve">Но можно ли построить хороший harness один раз и успокоиться?</w:t>
+        <w:rPr>
+          <w:iCs/>
+          <w:i/>
+        </w:rPr>
+        <w:t xml:space="preserve">(Спросить: «Кто поменял бы свой ответ?»)</w:t>
       </w:r>
     </w:p>
     <w:p>
@@ -1738,13 +1650,13 @@
       </w:r>
     </w:p>
     <w:bookmarkEnd w:id="35"/>
-    <w:bookmarkStart w:id="36" w:name="слайд-16.-будущее-леса-убирают"/>
+    <w:bookmarkStart w:id="36" w:name="слайд-16.-спасибо"/>
     <w:p>
       <w:pPr>
         <w:pStyle w:val="Heading2"/>
       </w:pPr>
       <w:r>
-        <w:t xml:space="preserve">Слайд 16. Будущее: леса убирают</w:t>
+        <w:t xml:space="preserve">Слайд 16. Спасибо</w:t>
       </w:r>
     </w:p>
     <w:p>
@@ -1752,7 +1664,17 @@
         <w:pStyle w:val="FirstParagraph"/>
       </w:pPr>
       <w:r>
-        <w:t xml:space="preserve">Автор статьи использует образ строительных лесов. Они нужны, чтобы добраться до верхних этажей, но сами ничего не строят. Когда здание готово, леса убирают.</w:t>
+        <w:t xml:space="preserve">Запомните одну фразу:</w:t>
+      </w:r>
+      <w:r>
+        <w:t xml:space="preserve"> </w:t>
+      </w:r>
+      <w:r>
+        <w:rPr>
+          <w:bCs/>
+          <w:b/>
+        </w:rPr>
+        <w:t xml:space="preserve">когда ИИ-агент в следующий раз даст сбой, не вините модель. Смотрите на harness.</w:t>
       </w:r>
     </w:p>
     <w:p>
@@ -1760,25 +1682,7 @@
         <w:pStyle w:val="BodyText"/>
       </w:pPr>
       <w:r>
-        <w:t xml:space="preserve">С harness то же. Модели умнеют, и harness со временем должен становиться проще. Продукт Manus за полгода переделывали пять раз, и каждый раз убирали лишнее. В Anthropic убирают шаги из Claude Code, когда модель научилась делать их сама. График справа показывает идею: чем сильнее модель, тем тоньше нужен harness. Это схема по смыслу статьи, без точных цифр, она так и подписана.</w:t>
-      </w:r>
-    </w:p>
-    <w:p>
-      <w:pPr>
-        <w:pStyle w:val="BodyText"/>
-      </w:pPr>
-      <w:r>
-        <w:t xml:space="preserve">Предупреждение для маркетолога: преимущество в harness нельзя создать один раз. Его придётся пересобирать с каждой новой моделью.</w:t>
-      </w:r>
-      <w:r>
-        <w:t xml:space="preserve"> </w:t>
-      </w:r>
-      <w:r>
-        <w:rPr>
-          <w:bCs/>
-          <w:b/>
-        </w:rPr>
-        <w:t xml:space="preserve">Давайте подведём итог.</w:t>
+        <w:t xml:space="preserve">Спасибо за внимание! Буду рад вопросам.</w:t>
       </w:r>
     </w:p>
     <w:p>
@@ -1789,13 +1693,23 @@
       </w:r>
     </w:p>
     <w:bookmarkEnd w:id="36"/>
-    <w:bookmarkStart w:id="37" w:name="слайд-17.-итоги-и-возвращение-к-опросу"/>
+    <w:bookmarkEnd w:id="37"/>
+    <w:bookmarkStart w:id="41" w:name="приложение"/>
+    <w:p>
+      <w:pPr>
+        <w:pStyle w:val="Heading1"/>
+      </w:pPr>
+      <w:r>
+        <w:t xml:space="preserve">Приложение</w:t>
+      </w:r>
+    </w:p>
+    <w:bookmarkStart w:id="38" w:name="если-спросят"/>
     <w:p>
       <w:pPr>
         <w:pStyle w:val="Heading2"/>
       </w:pPr>
       <w:r>
-        <w:t xml:space="preserve">Слайд 17. Итоги и возвращение к опросу</w:t>
+        <w:t xml:space="preserve">Если спросят</w:t>
       </w:r>
     </w:p>
     <w:p>
@@ -1803,107 +1717,17 @@
         <w:pStyle w:val="FirstParagraph"/>
       </w:pPr>
       <w:r>
-        <w:t xml:space="preserve">Три вывода.</w:t>
-      </w:r>
-    </w:p>
-    <w:p>
-      <w:pPr>
-        <w:numPr>
-          <w:ilvl w:val="0"/>
-          <w:numId w:val="1008"/>
-        </w:numPr>
-        <w:pStyle w:val="Compact"/>
-      </w:pPr>
-      <w:r>
-        <w:rPr>
-          <w:bCs/>
-          <w:b/>
-        </w:rPr>
-        <w:t xml:space="preserve">Модель — товар, harness — продукт.</w:t>
-      </w:r>
-      <w:r>
-        <w:t xml:space="preserve"> </w:t>
-      </w:r>
-      <w:r>
-        <w:t xml:space="preserve">Модели доступны всем, а отличие живёт в программе вокруг модели.</w:t>
-      </w:r>
-    </w:p>
-    <w:p>
-      <w:pPr>
-        <w:numPr>
-          <w:ilvl w:val="0"/>
-          <w:numId w:val="1008"/>
-        </w:numPr>
-        <w:pStyle w:val="Compact"/>
-      </w:pPr>
-      <w:r>
-        <w:rPr>
-          <w:bCs/>
-          <w:b/>
-        </w:rPr>
-        <w:t xml:space="preserve">Harness — это конкретно:</w:t>
-      </w:r>
-      <w:r>
-        <w:t xml:space="preserve"> </w:t>
-      </w:r>
-      <w:r>
-        <w:t xml:space="preserve">цикл, инструменты, память, проверки, права. Не магия, а программа, которую можно разобрать по частям и сравнить.</w:t>
-      </w:r>
-    </w:p>
-    <w:p>
-      <w:pPr>
-        <w:numPr>
-          <w:ilvl w:val="0"/>
-          <w:numId w:val="1008"/>
-        </w:numPr>
-        <w:pStyle w:val="Compact"/>
-      </w:pPr>
-      <w:r>
-        <w:rPr>
-          <w:bCs/>
-          <w:b/>
-        </w:rPr>
-        <w:t xml:space="preserve">Сравнивайте продукты по четырём вопросам, а не по названию модели.</w:t>
-      </w:r>
-    </w:p>
-    <w:p>
-      <w:pPr>
-        <w:pStyle w:val="FirstParagraph"/>
-      </w:pPr>
-      <w:r>
-        <w:t xml:space="preserve">А теперь вернёмся к опросу.</w:t>
-      </w:r>
-      <w:r>
-        <w:t xml:space="preserve"> </w:t>
-      </w:r>
-      <w:r>
-        <w:rPr>
-          <w:iCs/>
-          <w:i/>
-        </w:rPr>
-        <w:t xml:space="preserve">(Показать на правую часть слайда.)</w:t>
-      </w:r>
-      <w:r>
-        <w:t xml:space="preserve"> </w:t>
-      </w:r>
-      <w:r>
-        <w:t xml:space="preserve">Вариант A — «какая модель внутри». Вариант B — «сколько стоит». Теперь вы понимаете, почему верный вариант C:</w:t>
-      </w:r>
-      <w:r>
-        <w:t xml:space="preserve"> </w:t>
-      </w:r>
-      <w:r>
-        <w:rPr>
-          <w:bCs/>
-          <w:b/>
-        </w:rPr>
-        <w:t xml:space="preserve">что он умеет делать сам и насколько надёжно.</w:t>
-      </w:r>
-      <w:r>
-        <w:t xml:space="preserve"> </w:t>
-      </w:r>
-      <w:r>
-        <w:t xml:space="preserve">Это и есть harness.</w:t>
+        <w:rPr>
+          <w:bCs/>
+          <w:b/>
+        </w:rPr>
+        <w:t xml:space="preserve">Что такое harness, если совсем коротко?</w:t>
+      </w:r>
+      <w:r>
+        <w:t xml:space="preserve"> </w:t>
+      </w:r>
+      <w:r>
+        <w:t xml:space="preserve">Программа, которая управляет ИИ-моделью: отправляет ей задачу, даёт инструменты, хранит память, проверяет результат и следит за правилами. Модель думает, harness действует.</w:t>
       </w:r>
     </w:p>
     <w:p>
@@ -1912,45 +1736,16 @@
       </w:pPr>
       <w:r>
         <w:rPr>
-          <w:iCs/>
-          <w:i/>
-        </w:rPr>
-        <w:t xml:space="preserve">(Спросить: «Кто поменял бы свой ответ?»)</w:t>
-      </w:r>
-    </w:p>
-    <w:p>
-      <w:r>
-        <w:pict>
-          <v:rect style="width:0;height:1.5pt" o:hralign="center" o:hrstd="t" o:hr="t"/>
-        </w:pict>
-      </w:r>
-    </w:p>
-    <w:bookmarkEnd w:id="37"/>
-    <w:bookmarkStart w:id="38" w:name="слайд-18.-спасибо"/>
-    <w:p>
-      <w:pPr>
-        <w:pStyle w:val="Heading2"/>
-      </w:pPr>
-      <w:r>
-        <w:t xml:space="preserve">Слайд 18. Спасибо</w:t>
-      </w:r>
-    </w:p>
-    <w:p>
-      <w:pPr>
-        <w:pStyle w:val="FirstParagraph"/>
-      </w:pPr>
-      <w:r>
-        <w:t xml:space="preserve">Запомните одну фразу:</w:t>
-      </w:r>
-      <w:r>
-        <w:t xml:space="preserve"> </w:t>
-      </w:r>
-      <w:r>
-        <w:rPr>
-          <w:bCs/>
-          <w:b/>
-        </w:rPr>
-        <w:t xml:space="preserve">когда ИИ-агент в следующий раз даст сбой, не вините модель. Смотрите на harness.</w:t>
+          <w:bCs/>
+          <w:b/>
+        </w:rPr>
+        <w:t xml:space="preserve">Чем harness отличается от самой модели?</w:t>
+      </w:r>
+      <w:r>
+        <w:t xml:space="preserve"> </w:t>
+      </w:r>
+      <w:r>
+        <w:t xml:space="preserve">Модель — «мозг»: она только читает и пишет текст. Всё, что связано с действиями (открыть почту, запомнить, проверить, спросить разрешение), делает harness.</w:t>
       </w:r>
     </w:p>
     <w:p>
@@ -1958,200 +1753,111 @@
         <w:pStyle w:val="BodyText"/>
       </w:pPr>
       <w:r>
-        <w:t xml:space="preserve">Спасибо за внимание! Буду рад вопросам.</w:t>
-      </w:r>
-    </w:p>
-    <w:p>
-      <w:r>
-        <w:pict>
-          <v:rect style="width:0;height:1.5pt" o:hralign="center" o:hrstd="t" o:hr="t"/>
-        </w:pict>
+        <w:rPr>
+          <w:bCs/>
+          <w:b/>
+        </w:rPr>
+        <w:t xml:space="preserve">Что такое «агент»?</w:t>
+      </w:r>
+      <w:r>
+        <w:t xml:space="preserve"> </w:t>
+      </w:r>
+      <w:r>
+        <w:t xml:space="preserve">ИИ, который сам выполняет задачу: открывает файлы, ищет информацию, запускает программы, проверяет результат. Агент = модель + harness.</w:t>
+      </w:r>
+    </w:p>
+    <w:p>
+      <w:pPr>
+        <w:pStyle w:val="BodyText"/>
+      </w:pPr>
+      <w:r>
+        <w:rPr>
+          <w:bCs/>
+          <w:b/>
+        </w:rPr>
+        <w:t xml:space="preserve">Пример с почтой — реальный?</w:t>
+      </w:r>
+      <w:r>
+        <w:t xml:space="preserve"> </w:t>
+      </w:r>
+      <w:r>
+        <w:t xml:space="preserve">Нет, это учебная иллюстрация, чтобы показать разделение ролей. В статье примеры в основном из программирования: там проще измерять результат. Принцип общий.</w:t>
+      </w:r>
+    </w:p>
+    <w:p>
+      <w:pPr>
+        <w:pStyle w:val="BodyText"/>
+      </w:pPr>
+      <w:r>
+        <w:rPr>
+          <w:bCs/>
+          <w:b/>
+        </w:rPr>
+        <w:t xml:space="preserve">Почему не взять самую сильную модель?</w:t>
+      </w:r>
+      <w:r>
+        <w:t xml:space="preserve"> </w:t>
+      </w:r>
+      <w:r>
+        <w:t xml:space="preserve">Сильная модель в плохом harness проигрывает средней в хорошем. LangChain это показал: модель та же, место в рейтинге изменилось с 30+ на 5.</w:t>
+      </w:r>
+    </w:p>
+    <w:p>
+      <w:pPr>
+        <w:pStyle w:val="BodyText"/>
+      </w:pPr>
+      <w:r>
+        <w:rPr>
+          <w:bCs/>
+          <w:b/>
+        </w:rPr>
+        <w:t xml:space="preserve">Откуда цифры?</w:t>
+      </w:r>
+      <w:r>
+        <w:t xml:space="preserve"> </w:t>
+      </w:r>
+      <w:r>
+        <w:t xml:space="preserve">Из статьи Akshay «Что такое Harness?» (перевод на Хабре). Это обзор публичных материалов Anthropic, OpenAI, LangChain и других. Часть чисел (76,4%, «2–3 раза», 30%, 80%, 95%) — заявления самих компаний и авторов, независимо я их не проверял. Квадраты на слайде 10 — моё вычисление: 0,99 в степени числа шагов.</w:t>
+      </w:r>
+    </w:p>
+    <w:p>
+      <w:pPr>
+        <w:pStyle w:val="BodyText"/>
+      </w:pPr>
+      <w:r>
+        <w:rPr>
+          <w:bCs/>
+          <w:b/>
+        </w:rPr>
+        <w:t xml:space="preserve">Четыре «за что платят» — это точная классификация?</w:t>
+      </w:r>
+      <w:r>
+        <w:t xml:space="preserve"> </w:t>
+      </w:r>
+      <w:r>
+        <w:t xml:space="preserve">Нет, это моё упрощение. В статье перечислено одиннадцать технических компонентов (заявлено двенадцать). Четыре группы удобны для объяснения и для карточки сравнения.</w:t>
+      </w:r>
+    </w:p>
+    <w:p>
+      <w:pPr>
+        <w:pStyle w:val="BodyText"/>
+      </w:pPr>
+      <w:r>
+        <w:rPr>
+          <w:bCs/>
+          <w:b/>
+        </w:rPr>
+        <w:t xml:space="preserve">Как маркетологу использовать эти знания?</w:t>
+      </w:r>
+      <w:r>
+        <w:t xml:space="preserve"> </w:t>
+      </w:r>
+      <w:r>
+        <w:t xml:space="preserve">Сравнивать ИИ-продукты по памяти, надёжности, безопасности и умению довести дело до конца. И формулировать свои преимущества именно так. Четыре вопроса со слайда 14 можно использовать при выборе продукта.</w:t>
       </w:r>
     </w:p>
     <w:bookmarkEnd w:id="38"/>
-    <w:bookmarkEnd w:id="39"/>
-    <w:bookmarkStart w:id="43" w:name="приложение"/>
-    <w:p>
-      <w:pPr>
-        <w:pStyle w:val="Heading1"/>
-      </w:pPr>
-      <w:r>
-        <w:t xml:space="preserve">Приложение</w:t>
-      </w:r>
-    </w:p>
-    <w:bookmarkStart w:id="40" w:name="если-спросят"/>
-    <w:p>
-      <w:pPr>
-        <w:pStyle w:val="Heading2"/>
-      </w:pPr>
-      <w:r>
-        <w:t xml:space="preserve">Если спросят</w:t>
-      </w:r>
-    </w:p>
-    <w:p>
-      <w:pPr>
-        <w:pStyle w:val="FirstParagraph"/>
-      </w:pPr>
-      <w:r>
-        <w:rPr>
-          <w:bCs/>
-          <w:b/>
-        </w:rPr>
-        <w:t xml:space="preserve">Что такое harness, если совсем коротко?</w:t>
-      </w:r>
-      <w:r>
-        <w:t xml:space="preserve"> </w:t>
-      </w:r>
-      <w:r>
-        <w:t xml:space="preserve">Программа, которая управляет ИИ-моделью: отправляет ей задачу, даёт инструменты, хранит память, проверяет результат и следит за правилами. Модель думает, harness действует.</w:t>
-      </w:r>
-    </w:p>
-    <w:p>
-      <w:pPr>
-        <w:pStyle w:val="BodyText"/>
-      </w:pPr>
-      <w:r>
-        <w:rPr>
-          <w:bCs/>
-          <w:b/>
-        </w:rPr>
-        <w:t xml:space="preserve">Чем harness отличается от самой модели?</w:t>
-      </w:r>
-      <w:r>
-        <w:t xml:space="preserve"> </w:t>
-      </w:r>
-      <w:r>
-        <w:t xml:space="preserve">Модель — «мозг»: она только читает и пишет текст. Всё, что связано с действиями (открыть почту, запомнить, проверить, спросить разрешение), делает harness.</w:t>
-      </w:r>
-    </w:p>
-    <w:p>
-      <w:pPr>
-        <w:pStyle w:val="BodyText"/>
-      </w:pPr>
-      <w:r>
-        <w:rPr>
-          <w:bCs/>
-          <w:b/>
-        </w:rPr>
-        <w:t xml:space="preserve">Что такое «агент»?</w:t>
-      </w:r>
-      <w:r>
-        <w:t xml:space="preserve"> </w:t>
-      </w:r>
-      <w:r>
-        <w:t xml:space="preserve">ИИ, который сам выполняет задачу: открывает файлы, ищет информацию, запускает программы, проверяет результат. Агент = модель + harness.</w:t>
-      </w:r>
-    </w:p>
-    <w:p>
-      <w:pPr>
-        <w:pStyle w:val="BodyText"/>
-      </w:pPr>
-      <w:r>
-        <w:rPr>
-          <w:bCs/>
-          <w:b/>
-        </w:rPr>
-        <w:t xml:space="preserve">Пример с почтой — реальный?</w:t>
-      </w:r>
-      <w:r>
-        <w:t xml:space="preserve"> </w:t>
-      </w:r>
-      <w:r>
-        <w:t xml:space="preserve">Нет, это учебная иллюстрация, чтобы показать разделение ролей. В статье примеры в основном из программирования: там проще измерять результат. Принцип общий.</w:t>
-      </w:r>
-    </w:p>
-    <w:p>
-      <w:pPr>
-        <w:pStyle w:val="BodyText"/>
-      </w:pPr>
-      <w:r>
-        <w:rPr>
-          <w:bCs/>
-          <w:b/>
-        </w:rPr>
-        <w:t xml:space="preserve">Код на слайде 8 — реальный?</w:t>
-      </w:r>
-      <w:r>
-        <w:t xml:space="preserve"> </w:t>
-      </w:r>
-      <w:r>
-        <w:t xml:space="preserve">Нет, это упрощённая схема цикла. Реальные harness’ы сложнее, но принцип тот же.</w:t>
-      </w:r>
-    </w:p>
-    <w:p>
-      <w:pPr>
-        <w:pStyle w:val="BodyText"/>
-      </w:pPr>
-      <w:r>
-        <w:rPr>
-          <w:bCs/>
-          <w:b/>
-        </w:rPr>
-        <w:t xml:space="preserve">Почему не взять самую сильную модель?</w:t>
-      </w:r>
-      <w:r>
-        <w:t xml:space="preserve"> </w:t>
-      </w:r>
-      <w:r>
-        <w:t xml:space="preserve">Сильная модель в плохом harness проигрывает средней в хорошем. LangChain это показал: модель та же, место в рейтинге изменилось с 30+ на 5.</w:t>
-      </w:r>
-    </w:p>
-    <w:p>
-      <w:pPr>
-        <w:pStyle w:val="BodyText"/>
-      </w:pPr>
-      <w:r>
-        <w:rPr>
-          <w:bCs/>
-          <w:b/>
-        </w:rPr>
-        <w:t xml:space="preserve">Откуда цифры?</w:t>
-      </w:r>
-      <w:r>
-        <w:t xml:space="preserve"> </w:t>
-      </w:r>
-      <w:r>
-        <w:t xml:space="preserve">Из статьи Akshay «Что такое Harness?» (перевод на Хабре). Это обзор публичных материалов Anthropic, OpenAI, LangChain и других. Часть чисел (76,4%, «2–3 раза», 30%) — заявления самих компаний и авторов, независимо я их не проверял. Столбики на слайде 11 — моё вычисление: 0,99 в степени n.</w:t>
-      </w:r>
-    </w:p>
-    <w:p>
-      <w:pPr>
-        <w:pStyle w:val="BodyText"/>
-      </w:pPr>
-      <w:r>
-        <w:rPr>
-          <w:bCs/>
-          <w:b/>
-        </w:rPr>
-        <w:t xml:space="preserve">Четыре характеристики и шесть частей — это точная классификация?</w:t>
-      </w:r>
-      <w:r>
-        <w:t xml:space="preserve"> </w:t>
-      </w:r>
-      <w:r>
-        <w:t xml:space="preserve">Нет, это упрощение. В статье перечислено одиннадцать компонентов (заявлено двенадцать). Для объяснения и карточки сравнения удобнее меньше.</w:t>
-      </w:r>
-    </w:p>
-    <w:p>
-      <w:pPr>
-        <w:pStyle w:val="BodyText"/>
-      </w:pPr>
-      <w:r>
-        <w:rPr>
-          <w:bCs/>
-          <w:b/>
-        </w:rPr>
-        <w:t xml:space="preserve">Как маркетологу использовать эти знания?</w:t>
-      </w:r>
-      <w:r>
-        <w:t xml:space="preserve"> </w:t>
-      </w:r>
-      <w:r>
-        <w:t xml:space="preserve">Сравнивать ИИ-продукты по памяти, надёжности, безопасности и умению довести дело до конца. И формулировать свои преимущества в этих терминах. Четыре вопроса со слайда 15 можно использовать при выборе продукта.</w:t>
-      </w:r>
-    </w:p>
-    <w:bookmarkEnd w:id="40"/>
-    <w:bookmarkStart w:id="41" w:name="мини-словарик"/>
+    <w:bookmarkStart w:id="39" w:name="мини-словарик"/>
     <w:p>
       <w:pPr>
         <w:pStyle w:val="Heading2"/>
@@ -2330,129 +2036,91 @@
           </w:p>
         </w:tc>
       </w:tr>
-      <w:tr>
-        <w:tc>
-          <w:tcPr/>
-          <w:p>
-            <w:pPr>
-              <w:pStyle w:val="Compact"/>
-              <w:jc w:val="left"/>
-            </w:pPr>
-            <w:r>
-              <w:t xml:space="preserve">Токен</w:t>
-            </w:r>
-          </w:p>
-        </w:tc>
-        <w:tc>
-          <w:tcPr/>
-          <w:p>
-            <w:pPr>
-              <w:pStyle w:val="Compact"/>
-              <w:jc w:val="left"/>
-            </w:pPr>
-            <w:r>
-              <w:t xml:space="preserve">Единица текста для модели (примерно слог или короткое слово)</w:t>
-            </w:r>
-          </w:p>
-        </w:tc>
-      </w:tr>
     </w:tbl>
+    <w:bookmarkEnd w:id="39"/>
+    <w:bookmarkStart w:id="40" w:name="как-выступать"/>
+    <w:p>
+      <w:pPr>
+        <w:pStyle w:val="Heading2"/>
+      </w:pPr>
+      <w:r>
+        <w:t xml:space="preserve">Как выступать</w:t>
+      </w:r>
+    </w:p>
+    <w:p>
+      <w:pPr>
+        <w:numPr>
+          <w:ilvl w:val="0"/>
+          <w:numId w:val="1010"/>
+        </w:numPr>
+        <w:pStyle w:val="Compact"/>
+      </w:pPr>
+      <w:r>
+        <w:t xml:space="preserve">Не читайте слайды: на них короткие подписи, смысл в ваших словах.</w:t>
+      </w:r>
+    </w:p>
+    <w:p>
+      <w:pPr>
+        <w:numPr>
+          <w:ilvl w:val="0"/>
+          <w:numId w:val="1010"/>
+        </w:numPr>
+        <w:pStyle w:val="Compact"/>
+      </w:pPr>
+      <w:r>
+        <w:t xml:space="preserve">Вопросы-связки (жирные) произносите вслух и делайте паузу.</w:t>
+      </w:r>
+    </w:p>
+    <w:p>
+      <w:pPr>
+        <w:numPr>
+          <w:ilvl w:val="0"/>
+          <w:numId w:val="1010"/>
+        </w:numPr>
+        <w:pStyle w:val="Compact"/>
+      </w:pPr>
+      <w:r>
+        <w:t xml:space="preserve">Слайды 5 и 7 — ключевые для понимания: не спешите.</w:t>
+      </w:r>
+    </w:p>
+    <w:p>
+      <w:pPr>
+        <w:numPr>
+          <w:ilvl w:val="0"/>
+          <w:numId w:val="1010"/>
+        </w:numPr>
+        <w:pStyle w:val="Compact"/>
+      </w:pPr>
+      <w:r>
+        <w:t xml:space="preserve">Слайд 13 — это задание для зала. Дайте людям минуту: так доклад запомнится.</w:t>
+      </w:r>
+    </w:p>
+    <w:p>
+      <w:pPr>
+        <w:numPr>
+          <w:ilvl w:val="0"/>
+          <w:numId w:val="1010"/>
+        </w:numPr>
+        <w:pStyle w:val="Compact"/>
+      </w:pPr>
+      <w:r>
+        <w:t xml:space="preserve">Если не хватает времени, слайды 9 и 10 рассказывайте за 40 секунд каждый.</w:t>
+      </w:r>
+    </w:p>
+    <w:p>
+      <w:pPr>
+        <w:numPr>
+          <w:ilvl w:val="0"/>
+          <w:numId w:val="1010"/>
+        </w:numPr>
+        <w:pStyle w:val="Compact"/>
+      </w:pPr>
+      <w:r>
+        <w:t xml:space="preserve">Источники фото и логотипов указаны на последнем слайде.</w:t>
+      </w:r>
+    </w:p>
+    <w:bookmarkEnd w:id="40"/>
     <w:bookmarkEnd w:id="41"/>
-    <w:bookmarkStart w:id="42" w:name="как-выступать"/>
-    <w:p>
-      <w:pPr>
-        <w:pStyle w:val="Heading2"/>
-      </w:pPr>
-      <w:r>
-        <w:t xml:space="preserve">Как выступать</w:t>
-      </w:r>
-    </w:p>
-    <w:p>
-      <w:pPr>
-        <w:numPr>
-          <w:ilvl w:val="0"/>
-          <w:numId w:val="1009"/>
-        </w:numPr>
-        <w:pStyle w:val="Compact"/>
-      </w:pPr>
-      <w:r>
-        <w:t xml:space="preserve">Не читайте слайды: на них схемы и короткие подписи, смысл в ваших словах.</w:t>
-      </w:r>
-    </w:p>
-    <w:p>
-      <w:pPr>
-        <w:numPr>
-          <w:ilvl w:val="0"/>
-          <w:numId w:val="1009"/>
-        </w:numPr>
-        <w:pStyle w:val="Compact"/>
-      </w:pPr>
-      <w:r>
-        <w:t xml:space="preserve">Вопросы-связки (жирные) произносите вслух и делайте паузу.</w:t>
-      </w:r>
-    </w:p>
-    <w:p>
-      <w:pPr>
-        <w:numPr>
-          <w:ilvl w:val="0"/>
-          <w:numId w:val="1009"/>
-        </w:numPr>
-        <w:pStyle w:val="Compact"/>
-      </w:pPr>
-      <w:r>
-        <w:t xml:space="preserve">Слайды 5, 7 и 8 — ключевые для понимания: не спешите.</w:t>
-      </w:r>
-    </w:p>
-    <w:p>
-      <w:pPr>
-        <w:numPr>
-          <w:ilvl w:val="0"/>
-          <w:numId w:val="1009"/>
-        </w:numPr>
-        <w:pStyle w:val="Compact"/>
-      </w:pPr>
-      <w:r>
-        <w:t xml:space="preserve">На слайде 7 показывайте пальцем на схему. Анимация рисует шаги по очереди: дайте ей закончиться.</w:t>
-      </w:r>
-    </w:p>
-    <w:p>
-      <w:pPr>
-        <w:numPr>
-          <w:ilvl w:val="0"/>
-          <w:numId w:val="1009"/>
-        </w:numPr>
-        <w:pStyle w:val="Compact"/>
-      </w:pPr>
-      <w:r>
-        <w:t xml:space="preserve">Если не хватает времени, слайды 12 и 13 рассказывайте за 40 секунд каждый.</w:t>
-      </w:r>
-    </w:p>
-    <w:p>
-      <w:pPr>
-        <w:numPr>
-          <w:ilvl w:val="0"/>
-          <w:numId w:val="1009"/>
-        </w:numPr>
-        <w:pStyle w:val="Compact"/>
-      </w:pPr>
-      <w:r>
-        <w:t xml:space="preserve">Слайд 15 — самый «маркетинговый»: оставьте на него побольше времени.</w:t>
-      </w:r>
-    </w:p>
-    <w:p>
-      <w:pPr>
-        <w:numPr>
-          <w:ilvl w:val="0"/>
-          <w:numId w:val="1009"/>
-        </w:numPr>
-        <w:pStyle w:val="Compact"/>
-      </w:pPr>
-      <w:r>
-        <w:t xml:space="preserve">Источники фото и логотипов указаны на последнем слайде.</w:t>
-      </w:r>
-    </w:p>
-    <w:bookmarkEnd w:id="42"/>
-    <w:bookmarkEnd w:id="43"/>
     <w:sectPr/>
   </w:body>
 </w:document>
@@ -2727,34 +2395,7 @@
     <w:abstractNumId w:val="991"/>
   </w:num>
   <w:num w:numId="1002">
-    <w:abstractNumId w:val="99411"/>
-    <w:lvlOverride w:ilvl="0">
-      <w:startOverride w:val="1"/>
-    </w:lvlOverride>
-    <w:lvlOverride w:ilvl="1">
-      <w:startOverride w:val="1"/>
-    </w:lvlOverride>
-    <w:lvlOverride w:ilvl="2">
-      <w:startOverride w:val="1"/>
-    </w:lvlOverride>
-    <w:lvlOverride w:ilvl="3">
-      <w:startOverride w:val="1"/>
-    </w:lvlOverride>
-    <w:lvlOverride w:ilvl="4">
-      <w:startOverride w:val="1"/>
-    </w:lvlOverride>
-    <w:lvlOverride w:ilvl="5">
-      <w:startOverride w:val="1"/>
-    </w:lvlOverride>
-    <w:lvlOverride w:ilvl="6">
-      <w:startOverride w:val="1"/>
-    </w:lvlOverride>
-    <w:lvlOverride w:ilvl="7">
-      <w:startOverride w:val="1"/>
-    </w:lvlOverride>
-    <w:lvlOverride w:ilvl="8">
-      <w:startOverride w:val="1"/>
-    </w:lvlOverride>
+    <w:abstractNumId w:val="991"/>
   </w:num>
   <w:num w:numId="1003">
     <w:abstractNumId w:val="99411"/>
@@ -2850,34 +2491,7 @@
     <w:abstractNumId w:val="991"/>
   </w:num>
   <w:num w:numId="1007">
-    <w:abstractNumId w:val="99411"/>
-    <w:lvlOverride w:ilvl="0">
-      <w:startOverride w:val="1"/>
-    </w:lvlOverride>
-    <w:lvlOverride w:ilvl="1">
-      <w:startOverride w:val="1"/>
-    </w:lvlOverride>
-    <w:lvlOverride w:ilvl="2">
-      <w:startOverride w:val="1"/>
-    </w:lvlOverride>
-    <w:lvlOverride w:ilvl="3">
-      <w:startOverride w:val="1"/>
-    </w:lvlOverride>
-    <w:lvlOverride w:ilvl="4">
-      <w:startOverride w:val="1"/>
-    </w:lvlOverride>
-    <w:lvlOverride w:ilvl="5">
-      <w:startOverride w:val="1"/>
-    </w:lvlOverride>
-    <w:lvlOverride w:ilvl="6">
-      <w:startOverride w:val="1"/>
-    </w:lvlOverride>
-    <w:lvlOverride w:ilvl="7">
-      <w:startOverride w:val="1"/>
-    </w:lvlOverride>
-    <w:lvlOverride w:ilvl="8">
-      <w:startOverride w:val="1"/>
-    </w:lvlOverride>
+    <w:abstractNumId w:val="991"/>
   </w:num>
   <w:num w:numId="1008">
     <w:abstractNumId w:val="99411"/>
@@ -2910,6 +2524,36 @@
     </w:lvlOverride>
   </w:num>
   <w:num w:numId="1009">
+    <w:abstractNumId w:val="99411"/>
+    <w:lvlOverride w:ilvl="0">
+      <w:startOverride w:val="1"/>
+    </w:lvlOverride>
+    <w:lvlOverride w:ilvl="1">
+      <w:startOverride w:val="1"/>
+    </w:lvlOverride>
+    <w:lvlOverride w:ilvl="2">
+      <w:startOverride w:val="1"/>
+    </w:lvlOverride>
+    <w:lvlOverride w:ilvl="3">
+      <w:startOverride w:val="1"/>
+    </w:lvlOverride>
+    <w:lvlOverride w:ilvl="4">
+      <w:startOverride w:val="1"/>
+    </w:lvlOverride>
+    <w:lvlOverride w:ilvl="5">
+      <w:startOverride w:val="1"/>
+    </w:lvlOverride>
+    <w:lvlOverride w:ilvl="6">
+      <w:startOverride w:val="1"/>
+    </w:lvlOverride>
+    <w:lvlOverride w:ilvl="7">
+      <w:startOverride w:val="1"/>
+    </w:lvlOverride>
+    <w:lvlOverride w:ilvl="8">
+      <w:startOverride w:val="1"/>
+    </w:lvlOverride>
+  </w:num>
+  <w:num w:numId="1010">
     <w:abstractNumId w:val="991"/>
   </w:num>
 </w:numbering>

</xml_diff>

<commit_message>
Slide 2: director scenario with three vendor offers instead of audience poll; update slide 15 and speech
Co-Authored-By: Claude Sonnet 5.5 <noreply@anthropic.com>
Claude-Session: https://claude.ai/code/session_01JHAi78QVA9c3PviMoRDJFz
</commit_message>
<xml_diff>
--- a/harness/Doklad-Harness.docx
+++ b/harness/Doklad-Harness.docx
@@ -75,7 +75,7 @@
         <w:pStyle w:val="FirstParagraph"/>
       </w:pPr>
       <w:r>
-        <w:t xml:space="preserve">Доклад начинается с вопроса залу (слайд 2) и заканчивается ответом на него (слайд 15). В середине один образ:</w:t>
+        <w:t xml:space="preserve">Доклад начинается с директора и трёх предложений на его столе (слайд 2) и заканчивается его выбором (слайд 15). В середине один образ:</w:t>
       </w:r>
       <w:r>
         <w:t xml:space="preserve"> </w:t>
@@ -181,13 +181,13 @@
       </w:r>
     </w:p>
     <w:bookmarkEnd w:id="21"/>
-    <w:bookmarkStart w:id="22" w:name="слайд-2.-вопрос-к-залу"/>
+    <w:bookmarkStart w:id="22" w:name="слайд-2.-вы-директор"/>
     <w:p>
       <w:pPr>
         <w:pStyle w:val="Heading2"/>
       </w:pPr>
       <w:r>
-        <w:t xml:space="preserve">Слайд 2. Вопрос к залу</w:t>
+        <w:t xml:space="preserve">Слайд 2. Вы — директор</w:t>
       </w:r>
     </w:p>
     <w:p>
@@ -195,7 +195,7 @@
         <w:pStyle w:val="FirstParagraph"/>
       </w:pPr>
       <w:r>
-        <w:t xml:space="preserve">Начну с вопроса. Представьте, что вы директор компании и выбираете ИИ-помощника. Все предлагают «умную нейросеть». По чему будете выбирать?</w:t>
+        <w:t xml:space="preserve">Представьте, что вы директор компании. Вам нужен ИИ-помощник, и на вашем столе лежат три предложения. Читаем, что говорят продавцы.</w:t>
       </w:r>
     </w:p>
     <w:p>
@@ -217,7 +217,7 @@
         <w:t xml:space="preserve"> </w:t>
       </w:r>
       <w:r>
-        <w:t xml:space="preserve">Какая модель внутри: GPT, Claude или Gemini.</w:t>
+        <w:t xml:space="preserve">«У нас самая мощная модель: GPT, Claude или Gemini».</w:t>
       </w:r>
     </w:p>
     <w:p>
@@ -239,7 +239,7 @@
         <w:t xml:space="preserve"> </w:t>
       </w:r>
       <w:r>
-        <w:t xml:space="preserve">Сколько он стоит.</w:t>
+        <w:t xml:space="preserve">«Дешевле всех на рынке».</w:t>
       </w:r>
     </w:p>
     <w:p>
@@ -261,7 +261,7 @@
         <w:t xml:space="preserve"> </w:t>
       </w:r>
       <w:r>
-        <w:t xml:space="preserve">Что он умеет делать сам и насколько надёжно.</w:t>
+        <w:t xml:space="preserve">«Берёт задачу и доводит до конца. Покажем, как он проверяет себя».</w:t>
       </w:r>
     </w:p>
     <w:p>
@@ -273,7 +273,7 @@
           <w:iCs/>
           <w:i/>
         </w:rPr>
-        <w:t xml:space="preserve">(Поднять руки за каждый вариант. Запомнить, кого больше. Не комментировать.)</w:t>
+        <w:t xml:space="preserve">(Читать с интонацией продавцов. Не спрашивать зал и не просить поднять руки. Оставить паузу и идти дальше.)</w:t>
       </w:r>
     </w:p>
     <w:p>
@@ -281,7 +281,7 @@
         <w:pStyle w:val="BodyText"/>
       </w:pPr>
       <w:r>
-        <w:t xml:space="preserve">Запомните свой выбор: я к нему вернусь в конце.</w:t>
+        <w:t xml:space="preserve">Три продавца, три разных довода. Запомним их: к директору мы вернёмся в самом конце.</w:t>
       </w:r>
     </w:p>
     <w:p>
@@ -306,7 +306,7 @@
         <w:pStyle w:val="FirstParagraph"/>
       </w:pPr>
       <w:r>
-        <w:t xml:space="preserve">Начнём с факта. Больших моделей на рынке единицы: GPT от OpenAI, Claude от Anthropic, Gemini от Google. А вот продуктов на них десятки: Claude Code, Codex, LangGraph, CrewAI, AutoGen и многие другие. Любая компания встраивает модель в свой продукт.</w:t>
+        <w:t xml:space="preserve">Посмотрим на рынок. Больших моделей на рынке единицы: GPT от OpenAI, Claude от Anthropic, Gemini от Google. А вот продуктов на них десятки: Claude Code, Codex, LangGraph, CrewAI, AutoGen и многие другие. Любая компания встраивает модель в свой продукт.</w:t>
       </w:r>
     </w:p>
     <w:p>
@@ -1611,23 +1611,7 @@
         <w:pStyle w:val="FirstParagraph"/>
       </w:pPr>
       <w:r>
-        <w:t xml:space="preserve">А теперь вернёмся к вопросу из начала. Вариант A — «какая модель внутри». Вариант B — «сколько стоит». Теперь вы понимаете, почему верный вариант C:</w:t>
-      </w:r>
-      <w:r>
-        <w:t xml:space="preserve"> </w:t>
-      </w:r>
-      <w:r>
-        <w:rPr>
-          <w:bCs/>
-          <w:b/>
-        </w:rPr>
-        <w:t xml:space="preserve">что он умеет делать сам и насколько надёжно.</w:t>
-      </w:r>
-      <w:r>
-        <w:t xml:space="preserve"> </w:t>
-      </w:r>
-      <w:r>
-        <w:t xml:space="preserve">Это и есть harness.</w:t>
+        <w:t xml:space="preserve">А теперь вернёмся к директору из начала. У него на столе три предложения. Продавец A хвастается моделью, но вы знаете: модель есть у всех. Продавец B обещает низкую цену, но не говорит, что получит клиент. Продавец C говорит о том, что человек реально покупает: дело доведено до конца, и проверка показана. Это и есть harness. Директор выбирает C.</w:t>
       </w:r>
     </w:p>
     <w:p>
@@ -1639,7 +1623,7 @@
           <w:iCs/>
           <w:i/>
         </w:rPr>
-        <w:t xml:space="preserve">(Спросить: «Кто поменял бы свой ответ?»)</w:t>
+        <w:t xml:space="preserve">(Можно спросить: «Чем бы вы ответили продавцу C, чтобы проверить, что он не обманывает?» Ответ: четыре вопроса со слайда 14.)</w:t>
       </w:r>
     </w:p>
     <w:p>

</xml_diff>

<commit_message>
Slide 4: simple was / same model / now layout
</commit_message>
<xml_diff>
--- a/harness/Doklad-Harness.docx
+++ b/harness/Doklad-Harness.docx
@@ -357,7 +357,31 @@
         <w:pStyle w:val="FirstParagraph"/>
       </w:pPr>
       <w:r>
-        <w:t xml:space="preserve">Это не теория, а измеренный факт. Компания LangChain взяла своего ИИ-агента и поставила его в рейтинг агентов для программистов. Он был где-то за пределами первых тридцати. Они не меняли модель вообще. Поменяли только всё вокруг неё. Результат: пятое место. Смотрите на ленту: больше двадцати пяти мест вверх без единого изменения «мозга».</w:t>
+        <w:t xml:space="preserve">Это не теория, а измеренный факт. Компания LangChain взяла своего ИИ-агента и поставила его в рейтинг агентов для программистов. Слева «было»: он был где-то за пределами первых тридцати. Справа «стало»: пятое место. А посередине главное:</w:t>
+      </w:r>
+      <w:r>
+        <w:t xml:space="preserve"> </w:t>
+      </w:r>
+      <w:r>
+        <w:rPr>
+          <w:bCs/>
+          <w:b/>
+        </w:rPr>
+        <w:t xml:space="preserve">модель та же.</w:t>
+      </w:r>
+      <w:r>
+        <w:t xml:space="preserve"> </w:t>
+      </w:r>
+      <w:r>
+        <w:t xml:space="preserve">Те же веса, их не трогали.</w:t>
+      </w:r>
+    </w:p>
+    <w:p>
+      <w:pPr>
+        <w:pStyle w:val="BodyText"/>
+      </w:pPr>
+      <w:r>
+        <w:t xml:space="preserve">Поменяли только всё вокруг модели. Это и есть harness.</w:t>
       </w:r>
     </w:p>
     <w:p>
@@ -377,7 +401,7 @@
         <w:pStyle w:val="BodyText"/>
       </w:pPr>
       <w:r>
-        <w:t xml:space="preserve">Второй пример. В другом исследовании ИИ сам подобрал себе окружение вокруг модели и решил 76,4% задач без ошибок. Это лучше, чем у систем, которые люди собирали вручную.</w:t>
+        <w:t xml:space="preserve">Ещё пример внизу. В другом исследовании ИИ сам подобрал себе окружение вокруг модели и решил 76,4% задач без ошибок. Это лучше, чем у систем, которые люди собирали вручную.</w:t>
       </w:r>
     </w:p>
     <w:p>

</xml_diff>

<commit_message>
Title slide: dictionary-entry concept
</commit_message>
<xml_diff>
--- a/harness/Doklad-Harness.docx
+++ b/harness/Doklad-Harness.docx
@@ -162,7 +162,7 @@
           <w:iCs/>
           <w:i/>
         </w:rPr>
-        <w:t xml:space="preserve">(Пауза, посмотреть в зал.)</w:t>
+        <w:t xml:space="preserve">(Пауза, посмотреть в зал. Не читать название: дать залу прочитать самому.)</w:t>
       </w:r>
     </w:p>
     <w:p>
@@ -170,7 +170,23 @@
         <w:pStyle w:val="BodyText"/>
       </w:pPr>
       <w:r>
-        <w:t xml:space="preserve">Добрый день! Меня зовут Владислав. Сегодня я расскажу про слово, которого нет в рекламе ИИ-продуктов, но от которого зависит, хороший продукт или плохой. Слово называется harness. Сейчас оно вам ничего не говорит, и это нормально. К концу доклада вы сможете им пользоваться.</w:t>
+        <w:t xml:space="preserve">Добрый день! Меня зовут Владислав. На экране слово, которое вы наверняка не знаете: harness, читается «харнис». Оно из словаря, и у него два значения.</w:t>
+      </w:r>
+    </w:p>
+    <w:p>
+      <w:pPr>
+        <w:pStyle w:val="BodyText"/>
+      </w:pPr>
+      <w:r>
+        <w:t xml:space="preserve">Первое, обычное: упряжь, то есть ремни, которые направляют силу лошади. Второе, про которое мой доклад: в ИИ это всё, что направляет силу модели и превращает её в работника.</w:t>
+      </w:r>
+    </w:p>
+    <w:p>
+      <w:pPr>
+        <w:pStyle w:val="BodyText"/>
+      </w:pPr>
+      <w:r>
+        <w:t xml:space="preserve">Сегодня я расскажу, что на самом деле покупает клиент, когда покупает ИИ-продукт. И почему ответ связан с упряжью.</w:t>
       </w:r>
     </w:p>
     <w:p>

</xml_diff>

<commit_message>
Plain title slide; slide 5 leads with the harness definition
</commit_message>
<xml_diff>
--- a/harness/Doklad-Harness.docx
+++ b/harness/Doklad-Harness.docx
@@ -162,7 +162,7 @@
           <w:iCs/>
           <w:i/>
         </w:rPr>
-        <w:t xml:space="preserve">(Пауза, посмотреть в зал. Не читать название: дать залу прочитать самому.)</w:t>
+        <w:t xml:space="preserve">(Пауза, посмотреть в зал.)</w:t>
       </w:r>
     </w:p>
     <w:p>
@@ -170,23 +170,7 @@
         <w:pStyle w:val="BodyText"/>
       </w:pPr>
       <w:r>
-        <w:t xml:space="preserve">Добрый день! Меня зовут Владислав. На экране слово, которое вы наверняка не знаете: harness, читается «харнис». Оно из словаря, и у него два значения.</w:t>
-      </w:r>
-    </w:p>
-    <w:p>
-      <w:pPr>
-        <w:pStyle w:val="BodyText"/>
-      </w:pPr>
-      <w:r>
-        <w:t xml:space="preserve">Первое, обычное: упряжь, то есть ремни, которые направляют силу лошади. Второе, про которое мой доклад: в ИИ это всё, что направляет силу модели и превращает её в работника.</w:t>
-      </w:r>
-    </w:p>
-    <w:p>
-      <w:pPr>
-        <w:pStyle w:val="BodyText"/>
-      </w:pPr>
-      <w:r>
-        <w:t xml:space="preserve">Сегодня я расскажу, что на самом деле покупает клиент, когда покупает ИИ-продукт. И почему ответ связан с упряжью.</w:t>
+        <w:t xml:space="preserve">Добрый день! Меня зовут Владислав. Сегодня я расскажу про слово, которого нет в рекламе ИИ-продуктов, но от которого зависит, хороший продукт или плохой. Слово называется harness. Сейчас оно вам ничего не говорит, и это нормально. К концу доклада вы сможете им пользоваться.</w:t>
       </w:r>
     </w:p>
     <w:p>
@@ -473,7 +457,7 @@
         <w:t xml:space="preserve">harness</w:t>
       </w:r>
       <w:r>
-        <w:t xml:space="preserve">. По-русски это «обвязка», дословно «упряжь»: лошадь сильная, но без упряжи поле не вспашет. Дальше я говорю просто harness.</w:t>
+        <w:t xml:space="preserve">, читается «харнис». Определение вынесено наверх, прочитайте его вслух:</w:t>
       </w:r>
     </w:p>
     <w:p>
@@ -481,7 +465,33 @@
         <w:pStyle w:val="BodyText"/>
       </w:pPr>
       <w:r>
-        <w:t xml:space="preserve">Давайте на примере. Вы просите: «Ответь клиенту на письмо».</w:t>
+        <w:rPr>
+          <w:bCs/>
+          <w:b/>
+        </w:rPr>
+        <w:t xml:space="preserve">Harness — это программа, которая управляет моделью.</w:t>
+      </w:r>
+      <w:r>
+        <w:t xml:space="preserve"> </w:t>
+      </w:r>
+      <w:r>
+        <w:t xml:space="preserve">Она даёт модели инструменты, память, проверку и правила. По-русски это «обвязка», дословно «упряжь»: лошадь сильная, но без упряжи поле не вспашет. Дальше я говорю просто harness.</w:t>
+      </w:r>
+    </w:p>
+    <w:p>
+      <w:pPr>
+        <w:pStyle w:val="BodyText"/>
+      </w:pPr>
+      <w:r>
+        <w:t xml:space="preserve">Специалист из LangChain сказал это короче: «Если ты не модель, ты харнесс». То есть всё, что не модель.</w:t>
+      </w:r>
+    </w:p>
+    <w:p>
+      <w:pPr>
+        <w:pStyle w:val="BodyText"/>
+      </w:pPr>
+      <w:r>
+        <w:t xml:space="preserve">А теперь пример, чтобы определение не повисло в воздухе. Вы просите: «Ответь клиенту на письмо».</w:t>
       </w:r>
     </w:p>
     <w:p>
@@ -503,7 +513,7 @@
         <w:t xml:space="preserve"> </w:t>
       </w:r>
       <w:r>
-        <w:t xml:space="preserve">вернёт вам текст ответа: «Здравствуйте! Спасибо за обращение…» И всё. Открыть почту, найти письмо и отправить ответ вы делаете сами.</w:t>
+        <w:t xml:space="preserve">вернёт текст ответа: «Здравствуйте!..» И всё. Остальное вы делаете сами.</w:t>
       </w:r>
     </w:p>
     <w:p>
@@ -533,7 +543,7 @@
         <w:pStyle w:val="FirstParagraph"/>
       </w:pPr>
       <w:r>
-        <w:t xml:space="preserve">Видите разницу? Harness — это программа вокруг модели. Она даёт модели инструменты, память, проверку и правила. Специалист из LangChain сказал это ещё короче: «Если ты не модель, ты харнесс».</w:t>
+        <w:t xml:space="preserve">Разница между этими двумя карточками и есть harness.</w:t>
       </w:r>
     </w:p>
     <w:p>

</xml_diff>

<commit_message>
Rewrite speech in natural spoken style; drop Russian variant of the term
</commit_message>
<xml_diff>
--- a/harness/Doklad-Harness.docx
+++ b/harness/Doklad-Harness.docx
@@ -2,7 +2,7 @@
 <file path=word/document.xml><?xml version="1.0" encoding="utf-8"?>
 <w:document xmlns:w="http://schemas.openxmlformats.org/wordprocessingml/2006/main" xmlns:m="http://schemas.openxmlformats.org/officeDocument/2006/math" xmlns:r="http://schemas.openxmlformats.org/officeDocument/2006/relationships" xmlns:o="urn:schemas-microsoft-com:office:office" xmlns:v="urn:schemas-microsoft-com:vml" xmlns:w10="urn:schemas-microsoft-com:office:word" xmlns:a="http://schemas.openxmlformats.org/drawingml/2006/main" xmlns:pic="http://schemas.openxmlformats.org/drawingml/2006/picture" xmlns:wp="http://schemas.openxmlformats.org/drawingml/2006/wordprocessingDrawing">
   <w:body>
-    <w:bookmarkStart w:id="37" w:name="X629d0992977e639803607b7e6d671af564ee6f1"/>
+    <w:bookmarkStart w:id="36" w:name="X629d0992977e639803607b7e6d671af564ee6f1"/>
     <w:p>
       <w:pPr>
         <w:pStyle w:val="Heading1"/>
@@ -26,7 +26,7 @@
         <w:t xml:space="preserve"> </w:t>
       </w:r>
       <w:r>
-        <w:t xml:space="preserve">около 20 минут, 16 слайдов.</w:t>
+        <w:t xml:space="preserve">около 18–20 минут, 16 слайдов.</w:t>
       </w:r>
       <w:r>
         <w:t xml:space="preserve"> </w:t>
@@ -44,161 +44,59 @@
       <w:r>
         <w:t xml:space="preserve">студенты БГУИР и преподаватель по маркетингу программных продуктов.</w:t>
       </w:r>
-      <w:r>
-        <w:t xml:space="preserve"> </w:t>
-      </w:r>
-      <w:r>
-        <w:rPr>
-          <w:bCs/>
-          <w:b/>
-        </w:rPr>
-        <w:t xml:space="preserve">Как пользоваться текстом:</w:t>
-      </w:r>
-      <w:r>
-        <w:t xml:space="preserve"> </w:t>
-      </w:r>
-      <w:r>
-        <w:t xml:space="preserve">это не сценарий для заучивания, а опора. На слайде короткая мысль, здесь она раскрыта другими словами, с примерами и связками. Курсивом в скобках даны пометки «что сделать».</w:t>
-      </w:r>
-    </w:p>
-    <w:bookmarkStart w:id="20" w:name="красная-нить"/>
-    <w:p>
-      <w:pPr>
-        <w:pStyle w:val="Heading2"/>
-      </w:pPr>
-      <w:r>
-        <w:t xml:space="preserve">Красная нить</w:t>
-      </w:r>
-    </w:p>
-    <w:p>
-      <w:pPr>
-        <w:pStyle w:val="FirstParagraph"/>
-      </w:pPr>
-      <w:r>
-        <w:t xml:space="preserve">Весь доклад держится на одном образе:</w:t>
-      </w:r>
-      <w:r>
-        <w:t xml:space="preserve"> </w:t>
-      </w:r>
-      <w:r>
-        <w:rPr>
-          <w:bCs/>
-          <w:b/>
-        </w:rPr>
-        <w:t xml:space="preserve">ИИ — это новый сотрудник.</w:t>
-      </w:r>
-    </w:p>
-    <w:p>
-      <w:pPr>
-        <w:numPr>
-          <w:ilvl w:val="0"/>
-          <w:numId w:val="1001"/>
-        </w:numPr>
-        <w:pStyle w:val="Compact"/>
-      </w:pPr>
-      <w:r>
-        <w:rPr>
-          <w:bCs/>
-          <w:b/>
-        </w:rPr>
-        <w:t xml:space="preserve">Модель</w:t>
-      </w:r>
-      <w:r>
-        <w:t xml:space="preserve"> </w:t>
-      </w:r>
-      <w:r>
-        <w:t xml:space="preserve">— гениальный выпускник. Прочитал все книги мира, но в пустой комнате работать не может.</w:t>
-      </w:r>
-    </w:p>
-    <w:p>
-      <w:pPr>
-        <w:numPr>
-          <w:ilvl w:val="0"/>
-          <w:numId w:val="1001"/>
-        </w:numPr>
-        <w:pStyle w:val="Compact"/>
-      </w:pPr>
-      <w:r>
-        <w:rPr>
-          <w:bCs/>
-          <w:b/>
-        </w:rPr>
-        <w:t xml:space="preserve">Harness</w:t>
-      </w:r>
-      <w:r>
-        <w:t xml:space="preserve"> </w:t>
-      </w:r>
-      <w:r>
-        <w:t xml:space="preserve">— его рабочее место: программа, которая даёт инструменты, блокнот, проверку и доступы.</w:t>
-      </w:r>
-    </w:p>
-    <w:p>
-      <w:pPr>
-        <w:numPr>
-          <w:ilvl w:val="0"/>
-          <w:numId w:val="1001"/>
-        </w:numPr>
-        <w:pStyle w:val="Compact"/>
-      </w:pPr>
-      <w:r>
-        <w:rPr>
-          <w:bCs/>
-          <w:b/>
-        </w:rPr>
-        <w:t xml:space="preserve">Агент</w:t>
-      </w:r>
-      <w:r>
-        <w:t xml:space="preserve"> </w:t>
-      </w:r>
-      <w:r>
-        <w:t xml:space="preserve">— выпускник плюс рабочее место, то есть настоящий сотрудник.</w:t>
-      </w:r>
-    </w:p>
-    <w:p>
-      <w:pPr>
-        <w:pStyle w:val="FirstParagraph"/>
-      </w:pPr>
-      <w:r>
-        <w:t xml:space="preserve">Слово harness не заменяем. Перевод «обвязка» называем</w:t>
-      </w:r>
-      <w:r>
-        <w:t xml:space="preserve"> </w:t>
-      </w:r>
-      <w:r>
-        <w:rPr>
-          <w:bCs/>
-          <w:b/>
-        </w:rPr>
-        <w:t xml:space="preserve">один раз</w:t>
-      </w:r>
-      <w:r>
-        <w:t xml:space="preserve">, на слайде 5.</w:t>
-      </w:r>
-    </w:p>
-    <w:p>
-      <w:pPr>
-        <w:pStyle w:val="BodyText"/>
-      </w:pPr>
-      <w:r>
-        <w:t xml:space="preserve">Если докладывают трое, удобно поделить так: слайды 1–5 — первый докладчик (проблема и определение), 6–11 — второй (как это устроено и в чём слабости), 12–16 — третий (рынок, маркетинг, выводы).</w:t>
-      </w:r>
-    </w:p>
-    <w:p>
-      <w:pPr>
-        <w:pStyle w:val="BodyText"/>
-      </w:pPr>
-      <w:r>
-        <w:rPr>
-          <w:bCs/>
-          <w:b/>
-        </w:rPr>
-        <w:t xml:space="preserve">Вопросы-связки</w:t>
-      </w:r>
-      <w:r>
-        <w:t xml:space="preserve"> </w:t>
-      </w:r>
-      <w:r>
-        <w:t xml:space="preserve">между слайдами выделены жирным. Говорите их вслух, они держат внимание.</w:t>
+    </w:p>
+    <w:p>
+      <w:pPr>
+        <w:pStyle w:val="BodyText"/>
+      </w:pPr>
+      <w:r>
+        <w:rPr>
+          <w:bCs/>
+          <w:b/>
+        </w:rPr>
+        <w:t xml:space="preserve">Как пользоваться.</w:t>
+      </w:r>
+      <w:r>
+        <w:t xml:space="preserve"> </w:t>
+      </w:r>
+      <w:r>
+        <w:t xml:space="preserve">Это не текст для заучивания, а живая опора: на слайде короткая мысль, здесь она рассказана своими словами. Курсивом в скобках даны пометки «что сделать». Фразы жирным — связки между слайдами, их стоит произносить вслух.</w:t>
+      </w:r>
+    </w:p>
+    <w:p>
+      <w:pPr>
+        <w:pStyle w:val="BodyText"/>
+      </w:pPr>
+      <w:r>
+        <w:rPr>
+          <w:bCs/>
+          <w:b/>
+        </w:rPr>
+        <w:t xml:space="preserve">Главный образ доклада:</w:t>
+      </w:r>
+      <w:r>
+        <w:t xml:space="preserve"> </w:t>
+      </w:r>
+      <w:r>
+        <w:t xml:space="preserve">ИИ — это новый сотрудник. Модель — талантливый выпускник, harness — его рабочее место, агент — выпускник на рабочем месте, то есть полноценный работник.</w:t>
+      </w:r>
+    </w:p>
+    <w:p>
+      <w:pPr>
+        <w:pStyle w:val="BodyText"/>
+      </w:pPr>
+      <w:r>
+        <w:rPr>
+          <w:bCs/>
+          <w:b/>
+        </w:rPr>
+        <w:t xml:space="preserve">Если выступают трое:</w:t>
+      </w:r>
+      <w:r>
+        <w:t xml:space="preserve"> </w:t>
+      </w:r>
+      <w:r>
+        <w:t xml:space="preserve">слайды 1–5 — первый (проблема и определение), 6–11 — второй (как это устроено и где слабые места), 12–16 — третий (рынок, маркетинг, выводы).</w:t>
       </w:r>
     </w:p>
     <w:p>
@@ -208,8 +106,7 @@
         </w:pict>
       </w:r>
     </w:p>
-    <w:bookmarkEnd w:id="20"/>
-    <w:bookmarkStart w:id="21" w:name="слайд-1.-титул"/>
+    <w:bookmarkStart w:id="20" w:name="слайд-1.-титул"/>
     <w:p>
       <w:pPr>
         <w:pStyle w:val="Heading2"/>
@@ -227,23 +124,23 @@
           <w:iCs/>
           <w:i/>
         </w:rPr>
-        <w:t xml:space="preserve">(Выйти, дождаться тишины. Не начинать со слов «тема нашего доклада».)</w:t>
-      </w:r>
-    </w:p>
-    <w:p>
-      <w:pPr>
-        <w:pStyle w:val="BodyText"/>
-      </w:pPr>
-      <w:r>
-        <w:t xml:space="preserve">Добрый день! Нас зовут Влад, Антон и София, и мы хотим начать с признания: когда мы впервые увидели это слово, мы тоже не знали, как его читать. Harness, по-русски «харнис». В рекламе ИИ-сервисов вы его не встретите. Там другие слова: «мощный», «умный», «на основе самой современной модели».</w:t>
-      </w:r>
-    </w:p>
-    <w:p>
-      <w:pPr>
-        <w:pStyle w:val="BodyText"/>
-      </w:pPr>
-      <w:r>
-        <w:t xml:space="preserve">А между тем именно это слово объясняет, почему одни ИИ-продукты работают отлично, а другие разочаровывают, хотя внутри у них одна и та же нейросеть. Тема доклада лежит на стыке технологий и маркетинга: что на самом деле покупает клиент, когда покупает ИИ-продукт. Мы постараемся, чтобы к концу вы могли объяснить это даже другу, который никогда не писал код.</w:t>
+        <w:t xml:space="preserve">(Выйти, дождаться тишины.)</w:t>
+      </w:r>
+    </w:p>
+    <w:p>
+      <w:pPr>
+        <w:pStyle w:val="BodyText"/>
+      </w:pPr>
+      <w:r>
+        <w:t xml:space="preserve">Добрый день! Нас зовут Влад, Антон и София. Начнём с честного признания: когда мы впервые увидели слово на экране, мы не знали, как его произносить. Harness, читается «харнис». В рекламе ИИ-сервисов вы его не найдёте, там совсем другие слова: «мощный», «умный», «на самой современной модели».</w:t>
+      </w:r>
+    </w:p>
+    <w:p>
+      <w:pPr>
+        <w:pStyle w:val="BodyText"/>
+      </w:pPr>
+      <w:r>
+        <w:t xml:space="preserve">А между тем именно это слово объясняет, почему одни ИИ-продукты работают отлично, а другие разочаровывают, хотя внутри у них одна и та же нейросеть. Наша тема находится на стыке технологий и маркетинга: за что на самом деле клиент платит деньги, когда покупает ИИ-продукт. К концу доклада вы сможете объяснить это даже тому, кто никогда не видел код.</w:t>
       </w:r>
     </w:p>
     <w:p>
@@ -253,8 +150,8 @@
         </w:pict>
       </w:r>
     </w:p>
-    <w:bookmarkEnd w:id="21"/>
-    <w:bookmarkStart w:id="22" w:name="слайд-2.-вы-директор"/>
+    <w:bookmarkEnd w:id="20"/>
+    <w:bookmarkStart w:id="21" w:name="слайд-2.-вы-директор"/>
     <w:p>
       <w:pPr>
         <w:pStyle w:val="Heading2"/>
@@ -268,7 +165,7 @@
         <w:pStyle w:val="FirstParagraph"/>
       </w:pPr>
       <w:r>
-        <w:t xml:space="preserve">Давайте сразу поставим себя на чьё-то место. Вы директор компании. Вам нужен ИИ-помощник: разбирать почту, отвечать клиентам, готовить отчёты. К вам приходят три продавца, и каждый кладёт на стол своё предложение.</w:t>
+        <w:t xml:space="preserve">Для начала примерьте на себя чужую роль. Вы директор компании, вам нужен ИИ-помощник: разбирать почту, отвечать клиентам, готовить отчёты. И вот к вам один за другим приходят три продавца.</w:t>
       </w:r>
     </w:p>
     <w:p>
@@ -280,15 +177,15 @@
           <w:iCs/>
           <w:i/>
         </w:rPr>
-        <w:t xml:space="preserve">(Читать с интонацией разных продавцов.)</w:t>
-      </w:r>
-    </w:p>
-    <w:p>
-      <w:pPr>
-        <w:pStyle w:val="BodyText"/>
-      </w:pPr>
-      <w:r>
-        <w:t xml:space="preserve">Первый уверенно говорит: «У нас самая мощная модель. Внутри GPT, Claude или Gemini». Второй не тратит слов на технологии: «Дешевле всех на рынке». А третий формулирует иначе: «Берёт задачу и доводит до конца. Покажем, как он проверяет себя».</w:t>
+        <w:t xml:space="preserve">(Читать с интонацией продавцов.)</w:t>
+      </w:r>
+    </w:p>
+    <w:p>
+      <w:pPr>
+        <w:pStyle w:val="BodyText"/>
+      </w:pPr>
+      <w:r>
+        <w:t xml:space="preserve">Первый говорит гордо: «У нас самая мощная модель, внутри GPT, Claude или Gemini». Второй обходится без технологий: «Мы дешевле всех на рынке». Третий начинает с другого: «Наш помощник берёт задачу и доводит её до конца. И мы покажем, как он проверяет себя».</w:t>
       </w:r>
     </w:p>
     <w:p>
@@ -300,15 +197,15 @@
           <w:iCs/>
           <w:i/>
         </w:rPr>
-        <w:t xml:space="preserve">(Пауза. Не спрашивать зал, не просить поднять руки.)</w:t>
-      </w:r>
-    </w:p>
-    <w:p>
-      <w:pPr>
-        <w:pStyle w:val="BodyText"/>
-      </w:pPr>
-      <w:r>
-        <w:t xml:space="preserve">Запомните этих трёх. Пока вопрос оставим открытым: мы вернёмся к директору в самом конце, и к тому времени у него будет всё, чтобы принять решение. А сейчас разберёмся, откуда вообще берутся такие разные предложения.</w:t>
+        <w:t xml:space="preserve">(Пауза. Зал ни о чём не спрашивать.)</w:t>
+      </w:r>
+    </w:p>
+    <w:p>
+      <w:pPr>
+        <w:pStyle w:val="BodyText"/>
+      </w:pPr>
+      <w:r>
+        <w:t xml:space="preserve">Запомните этих троих. Мы к ним ещё вернёмся, и к тому моменту у директора будет всё необходимое, чтобы сделать выбор. А пока выясним, откуда вообще берутся такие разные предложения.</w:t>
       </w:r>
     </w:p>
     <w:p>
@@ -318,8 +215,8 @@
         </w:pict>
       </w:r>
     </w:p>
-    <w:bookmarkEnd w:id="22"/>
-    <w:bookmarkStart w:id="23" w:name="Xad1931da98a3b5fb46ca125a7acf33519741c7b"/>
+    <w:bookmarkEnd w:id="21"/>
+    <w:bookmarkStart w:id="22" w:name="Xad1931da98a3b5fb46ca125a7acf33519741c7b"/>
     <w:p>
       <w:pPr>
         <w:pStyle w:val="Heading2"/>
@@ -333,41 +230,41 @@
         <w:pStyle w:val="FirstParagraph"/>
       </w:pPr>
       <w:r>
-        <w:t xml:space="preserve">Начнём с картины рынка. Больших моделей, которые на слуху, считанные единицы: GPT от компании OpenAI, Claude от Anthropic, Gemini от Google. Их разрабатывают несколько компаний на всей планете.</w:t>
-      </w:r>
-    </w:p>
-    <w:p>
-      <w:pPr>
-        <w:pStyle w:val="BodyText"/>
-      </w:pPr>
-      <w:r>
-        <w:t xml:space="preserve">А теперь посмотрите на правую часть слайда. Продуктов на этих моделях десятки: Claude Code, Codex, LangGraph, CrewAI, AutoGen, и это только те, которые мы успели поместить на слайд. Любая компания может взять модель, встроить в свой сервис и назвать это своим продуктом.</w:t>
-      </w:r>
-    </w:p>
-    <w:p>
-      <w:pPr>
-        <w:pStyle w:val="BodyText"/>
-      </w:pPr>
-      <w:r>
-        <w:t xml:space="preserve">Представьте пекарни в вашем городе. Муку они, как правило, покупают у одних и тех же поставщиков. Мука у всех почти одинаковая. Но в одной пекарне вы стоите в очереди за хлебом, а в соседней он вчерашний. Разница не в муке, а в том, как работает пекарня: рецепт, печь, контроль, свежесть.</w:t>
-      </w:r>
-    </w:p>
-    <w:p>
-      <w:pPr>
-        <w:pStyle w:val="BodyText"/>
-      </w:pPr>
-      <w:r>
-        <w:t xml:space="preserve">Маркетологу здесь важна простая мысль: клиент выбирает продукт, а не модель. Но тогда возникает неудобный вопрос.</w:t>
-      </w:r>
-      <w:r>
-        <w:t xml:space="preserve"> </w:t>
-      </w:r>
-      <w:r>
-        <w:rPr>
-          <w:bCs/>
-          <w:b/>
-        </w:rPr>
-        <w:t xml:space="preserve">Если мука одна, почему хлеб такой разный?</w:t>
+        <w:t xml:space="preserve">Начнём с того, как устроен рынок. Известных больших моделей совсем немного: GPT от OpenAI, Claude от Anthropic, Gemini от Google. Их создают несколько компаний на всей планете.</w:t>
+      </w:r>
+    </w:p>
+    <w:p>
+      <w:pPr>
+        <w:pStyle w:val="BodyText"/>
+      </w:pPr>
+      <w:r>
+        <w:t xml:space="preserve">Теперь посмотрите на правую часть слайда: продуктов на этих моделях десятки. Claude Code, Codex, LangGraph, CrewAI, AutoGen, и это лишь те, что поместились на слайд. Любая компания может взять готовую модель, встроить в свой сервис и выпустить его под своим именем.</w:t>
+      </w:r>
+    </w:p>
+    <w:p>
+      <w:pPr>
+        <w:pStyle w:val="BodyText"/>
+      </w:pPr>
+      <w:r>
+        <w:t xml:space="preserve">Сравните с пекарнями в вашем городе. Муку они часто берут у одних и тех же поставщиков, и мука у всех примерно одинаковая. Но в одной пекарне за хлебом стоит очередь, а в соседней он вчерашний. Разница вовсе не в муке, а в том, как организована работа: рецепт, печь, контроль качества.</w:t>
+      </w:r>
+    </w:p>
+    <w:p>
+      <w:pPr>
+        <w:pStyle w:val="BodyText"/>
+      </w:pPr>
+      <w:r>
+        <w:t xml:space="preserve">Маркетологу тут сразу видна мысль: клиент выбирает продукт, а не модель. Но тогда становится любопытно.</w:t>
+      </w:r>
+      <w:r>
+        <w:t xml:space="preserve"> </w:t>
+      </w:r>
+      <w:r>
+        <w:rPr>
+          <w:bCs/>
+          <w:b/>
+        </w:rPr>
+        <w:t xml:space="preserve">Если мука у всех одна, откуда берётся разница в хлебе?</w:t>
       </w:r>
     </w:p>
     <w:p>
@@ -377,8 +274,8 @@
         </w:pict>
       </w:r>
     </w:p>
-    <w:bookmarkEnd w:id="23"/>
-    <w:bookmarkStart w:id="24" w:name="слайд-4.-доказательство"/>
+    <w:bookmarkEnd w:id="22"/>
+    <w:bookmarkStart w:id="23" w:name="слайд-4.-доказательство"/>
     <w:p>
       <w:pPr>
         <w:pStyle w:val="Heading2"/>
@@ -392,15 +289,15 @@
         <w:pStyle w:val="FirstParagraph"/>
       </w:pPr>
       <w:r>
-        <w:t xml:space="preserve">Вопрос мог бы остаться красивой метафорой, но у него есть измеренный ответ. Компания LangChain делает инструменты для ИИ-агентов. Они взяли своего агента для программирования и проверили его в открытом рейтинге таких агентов. Результат был скромный: место за пределами первых тридцати.</w:t>
-      </w:r>
-    </w:p>
-    <w:p>
-      <w:pPr>
-        <w:pStyle w:val="BodyText"/>
-      </w:pPr>
-      <w:r>
-        <w:t xml:space="preserve">Дальше самое интересное. Они не заменили модель на более мощную и не обучали её заново. Модель осталась прежней, с теми же весами, то есть с теми же внутренними настройками. Они изменили только то, что окружает модель. И агент оказался на пятом месте.</w:t>
+        <w:t xml:space="preserve">Звучит красиво, но можно ли это измерить? Оказывается, можно. Компания LangChain делает инструменты для ИИ-агентов. Они взяли своего агента для программирования и проверили его в открытом рейтинге таких агентов. Результат был не самый лестный: место за пределами первых тридцати.</w:t>
+      </w:r>
+    </w:p>
+    <w:p>
+      <w:pPr>
+        <w:pStyle w:val="BodyText"/>
+      </w:pPr>
+      <w:r>
+        <w:t xml:space="preserve">А дальше произошло главное. Модель они не меняли: не взяли более мощную и не обучали её заново. Веса остались прежними, то есть внутренние настройки модели были теми же. Поменяли только то, что вокруг неё. И агент поднялся на пятое место.</w:t>
       </w:r>
     </w:p>
     <w:p>
@@ -420,33 +317,33 @@
         <w:pStyle w:val="BodyText"/>
       </w:pPr>
       <w:r>
-        <w:t xml:space="preserve">Обратите внимание на середину слайда: «модель та же». Это ключевая карточка. Если бы дело было в модели, место не могло бы так измениться. Значит, в окружении модели скрыто что-то очень важное.</w:t>
-      </w:r>
-    </w:p>
-    <w:p>
-      <w:pPr>
-        <w:pStyle w:val="BodyText"/>
-      </w:pPr>
-      <w:r>
-        <w:t xml:space="preserve">Есть и второй пример, внизу слайда, он даже необычнее. В отдельном исследовании ИИ сам подбирал себе такое окружение. Результат: 76,4% задач решены без ошибок, и это лучше, чем у систем, которые люди настраивали вручную. То есть окружение модели оказалось настолько значимым, что его начали оптимизировать отдельно.</w:t>
-      </w:r>
-    </w:p>
-    <w:p>
-      <w:pPr>
-        <w:pStyle w:val="BodyText"/>
-      </w:pPr>
-      <w:r>
-        <w:t xml:space="preserve">Теперь осталось дать этому окружению название.</w:t>
-      </w:r>
-      <w:r>
-        <w:t xml:space="preserve"> </w:t>
-      </w:r>
-      <w:r>
-        <w:rPr>
-          <w:bCs/>
-          <w:b/>
-        </w:rPr>
-        <w:t xml:space="preserve">Что же это за «всё вокруг»?</w:t>
+        <w:t xml:space="preserve">Обратите внимание на карточку посередине слайда: «модель та же». Именно на ней всё держится. Если бы решала модель, результат не мог бы так измениться. Значит, вокруг модели спрятано что-то очень важное.</w:t>
+      </w:r>
+    </w:p>
+    <w:p>
+      <w:pPr>
+        <w:pStyle w:val="BodyText"/>
+      </w:pPr>
+      <w:r>
+        <w:t xml:space="preserve">Внизу слайда второй пример, и он ещё интереснее. В одном исследовании ИИ сам подбирал себе окружение, и в результате решал 76,4% задач без ошибок. Это лучше, чем у систем, которые люди настраивали вручную. То есть окружение модели настолько важно, что его начали оптимизировать отдельно.</w:t>
+      </w:r>
+    </w:p>
+    <w:p>
+      <w:pPr>
+        <w:pStyle w:val="BodyText"/>
+      </w:pPr>
+      <w:r>
+        <w:t xml:space="preserve">Осталось дать этому окружению имя.</w:t>
+      </w:r>
+      <w:r>
+        <w:t xml:space="preserve"> </w:t>
+      </w:r>
+      <w:r>
+        <w:rPr>
+          <w:bCs/>
+          <w:b/>
+        </w:rPr>
+        <w:t xml:space="preserve">Так что же это за «всё вокруг»?</w:t>
       </w:r>
     </w:p>
     <w:p>
@@ -456,8 +353,8 @@
         </w:pict>
       </w:r>
     </w:p>
-    <w:bookmarkEnd w:id="24"/>
-    <w:bookmarkStart w:id="25" w:name="слайд-5.-что-такое-harness"/>
+    <w:bookmarkEnd w:id="23"/>
+    <w:bookmarkStart w:id="24" w:name="слайд-5.-что-такое-harness"/>
     <w:p>
       <w:pPr>
         <w:pStyle w:val="Heading2"/>
@@ -471,7 +368,7 @@
         <w:pStyle w:val="FirstParagraph"/>
       </w:pPr>
       <w:r>
-        <w:t xml:space="preserve">Это окружение называется</w:t>
+        <w:t xml:space="preserve">Оно называется</w:t>
       </w:r>
       <w:r>
         <w:t xml:space="preserve"> </w:t>
@@ -484,7 +381,7 @@
         <w:t xml:space="preserve">harness</w:t>
       </w:r>
       <w:r>
-        <w:t xml:space="preserve">. Давайте дадим определение, которое можно выучить за секунду:</w:t>
+        <w:t xml:space="preserve">. В переводе с английского это «упряжь»: лошадь сильная, но без упряжи она не вспашет поле, ей нужно, чтобы кто-то направлял эту силу. Определение уместится в одну строку:</w:t>
       </w:r>
       <w:r>
         <w:t xml:space="preserve"> </w:t>
@@ -500,57 +397,49 @@
         <w:t xml:space="preserve"> </w:t>
       </w:r>
       <w:r>
-        <w:t xml:space="preserve">Не магия и не загадочная технология, а обычная программа, написанная людьми.</w:t>
-      </w:r>
-    </w:p>
-    <w:p>
-      <w:pPr>
-        <w:pStyle w:val="BodyText"/>
-      </w:pPr>
-      <w:r>
-        <w:t xml:space="preserve">Слово переводится как «упряжь». По-русски его иногда называют «обвязка», и это единственный раз, когда мы используем русский вариант. Образ понятен: лошадь сильная, но поле сама не вспашет. Нужна упряжь, которая направляет её силу в нужную сторону.</w:t>
-      </w:r>
-    </w:p>
-    <w:p>
-      <w:pPr>
-        <w:pStyle w:val="BodyText"/>
-      </w:pPr>
-      <w:r>
-        <w:t xml:space="preserve">Что же делает эта программа? Она даёт модели инструменты, то есть возможность что-то делать. Она хранит память, чтобы работа не начиналась каждый раз с нуля. Она проверяет результат. И она следит за правилами: что можно, а что нельзя.</w:t>
-      </w:r>
-    </w:p>
-    <w:p>
-      <w:pPr>
-        <w:pStyle w:val="BodyText"/>
-      </w:pPr>
-      <w:r>
-        <w:t xml:space="preserve">Один из специалистов LangChain, Vivek Trivedy, сказал об этом ещё короче: «Если ты не модель, ты харнесс». Всё, что не модель, и есть harness.</w:t>
-      </w:r>
-    </w:p>
-    <w:p>
-      <w:pPr>
-        <w:pStyle w:val="BodyText"/>
-      </w:pPr>
-      <w:r>
-        <w:t xml:space="preserve">Теперь посмотрите на пример внизу. Допустим, вы просите ИИ: «Ответь клиенту на письмо». Если у вас только модель, вы получите красивый текст: «Здравствуйте, спасибо за обращение…» И всё. Дальше вы сами открываете почту, находите письмо, вставляете текст и отправляете. Модель написала, остальное делаете вы. А если у модели есть harness, она сама откроет почту, прочитает письмо клиента, напишет ответ, проверит его и спросит вас: «Отправить?» Разница между двумя карточками на слайде и есть harness.</w:t>
-      </w:r>
-    </w:p>
-    <w:p>
-      <w:pPr>
-        <w:pStyle w:val="BodyText"/>
-      </w:pPr>
-      <w:r>
-        <w:t xml:space="preserve">Для маркетолога здесь поворотный момент: клиент платит не за умный текст, а за результат работы.</w:t>
-      </w:r>
-      <w:r>
-        <w:t xml:space="preserve"> </w:t>
-      </w:r>
-      <w:r>
-        <w:rPr>
-          <w:bCs/>
-          <w:b/>
-        </w:rPr>
-        <w:t xml:space="preserve">Как же это проще запомнить?</w:t>
+        <w:t xml:space="preserve">Не магия и не секретная технология, а обычная программа, которую написали люди.</w:t>
+      </w:r>
+    </w:p>
+    <w:p>
+      <w:pPr>
+        <w:pStyle w:val="BodyText"/>
+      </w:pPr>
+      <w:r>
+        <w:t xml:space="preserve">Что она делает? Во-первых, даёт модели инструменты, то есть возможность действовать. Во-вторых, хранит память, чтобы каждый раз не начинать с нуля. В-третьих, проверяет результат. И в-четвёртых, следит за правилами: что разрешено, а что нет.</w:t>
+      </w:r>
+    </w:p>
+    <w:p>
+      <w:pPr>
+        <w:pStyle w:val="BodyText"/>
+      </w:pPr>
+      <w:r>
+        <w:t xml:space="preserve">Специалист из LangChain Vivek Trivedy выразил это совсем коротко: «Если ты не модель, ты харнесс». Всё, что не модель, и есть harness.</w:t>
+      </w:r>
+    </w:p>
+    <w:p>
+      <w:pPr>
+        <w:pStyle w:val="BodyText"/>
+      </w:pPr>
+      <w:r>
+        <w:t xml:space="preserve">Теперь пример в нижней части слайда. Вы просите ИИ: «Ответь клиенту на письмо». Если у вас одна модель, вы получите аккуратный текст: «Здравствуйте, спасибо за обращение…» На этом её работа заканчивается. Открыть почту, найти письмо, вставить ответ и нажать «отправить» придётся вам. А с harness всё иначе: ИИ сам открывает почту, читает письмо, пишет ответ, перечитывает его и спрашивает вас: «Отправить?» Вот эта разница между левой и правой карточками и есть harness.</w:t>
+      </w:r>
+    </w:p>
+    <w:p>
+      <w:pPr>
+        <w:pStyle w:val="BodyText"/>
+      </w:pPr>
+      <w:r>
+        <w:t xml:space="preserve">Для маркетолога здесь главное вот что: клиент платит не за красивый текст, а за сделанную работу.</w:t>
+      </w:r>
+      <w:r>
+        <w:t xml:space="preserve"> </w:t>
+      </w:r>
+      <w:r>
+        <w:rPr>
+          <w:bCs/>
+          <w:b/>
+        </w:rPr>
+        <w:t xml:space="preserve">Как это проще запомнить?</w:t>
       </w:r>
     </w:p>
     <w:p>
@@ -560,8 +449,8 @@
         </w:pict>
       </w:r>
     </w:p>
-    <w:bookmarkEnd w:id="25"/>
-    <w:bookmarkStart w:id="26" w:name="слайд-6.-образ-сотрудник"/>
+    <w:bookmarkEnd w:id="24"/>
+    <w:bookmarkStart w:id="25" w:name="слайд-6.-образ-сотрудник"/>
     <w:p>
       <w:pPr>
         <w:pStyle w:val="Heading2"/>
@@ -575,23 +464,23 @@
         <w:pStyle w:val="FirstParagraph"/>
       </w:pPr>
       <w:r>
-        <w:t xml:space="preserve">Давайте вернёмся к нашему директору. Представьте, что вы нанимаете выпускника, который прочитал все книги мира. Он знает юриспруденцию, бухгалтерию, программирование, языки. Но вот вы посадили его в пустую комнату: без компьютера, без доступа к почте, без блокнота, без начальника, который проверит работу. Что он сделает? Ничего. Знаний полно, а делать нечем.</w:t>
-      </w:r>
-    </w:p>
-    <w:p>
-      <w:pPr>
-        <w:pStyle w:val="BodyText"/>
-      </w:pPr>
-      <w:r>
-        <w:t xml:space="preserve">А теперь представьте тот же ум, но в нормальном офисе. Компьютер, доступ к нужным системам, блокнот для записей, регламент, по которому он сдаёт работу. Теперь это не выпускник, а полноценный сотрудник.</w:t>
-      </w:r>
-    </w:p>
-    <w:p>
-      <w:pPr>
-        <w:pStyle w:val="BodyText"/>
-      </w:pPr>
-      <w:r>
-        <w:t xml:space="preserve">В нашей терминологии: модель — выпускник, harness — рабочее место, а вместе они дают агента. Получилась простая формула, которую стоит записать:</w:t>
+        <w:t xml:space="preserve">Вернёмся к нашему директору. Допустим, вы приняли на работу выпускника, который прочитал все книги мира. Он разбирается в праве, бухгалтерии, программировании, знает языки. Но вы посадили его в пустую комнату: нет компьютера, нет доступа к почте, нет блокнота, и никто не проверяет, что он сделал. Что получится? Ничего. Знаний масса, а сделать с ними нечего.</w:t>
+      </w:r>
+    </w:p>
+    <w:p>
+      <w:pPr>
+        <w:pStyle w:val="BodyText"/>
+      </w:pPr>
+      <w:r>
+        <w:t xml:space="preserve">Теперь тот же человек, но в нормальном офисе: компьютер, доступы к нужным системам, блокнот, понятные правила сдачи работы. Перед вами уже не выпускник, а сотрудник.</w:t>
+      </w:r>
+    </w:p>
+    <w:p>
+      <w:pPr>
+        <w:pStyle w:val="BodyText"/>
+      </w:pPr>
+      <w:r>
+        <w:t xml:space="preserve">В нашей терминологии выпускник — это модель, рабочее место — это harness, а вместе они составляют агента. Формулу можно записать одной строкой:</w:t>
       </w:r>
       <w:r>
         <w:t xml:space="preserve"> </w:t>
@@ -609,17 +498,17 @@
         <w:pStyle w:val="BodyText"/>
       </w:pPr>
       <w:r>
-        <w:t xml:space="preserve">И ещё одно маркетинговое наблюдение: компании продают вам сотрудника, а не выпускника. Умный выпускник сам по себе мало что даёт, а вот сотрудник, который доводит работу до конца, ценится высоко.</w:t>
-      </w:r>
-      <w:r>
-        <w:t xml:space="preserve"> </w:t>
-      </w:r>
-      <w:r>
-        <w:rPr>
-          <w:bCs/>
-          <w:b/>
-        </w:rPr>
-        <w:t xml:space="preserve">Хорошо, а как этот сотрудник проводит свой день?</w:t>
+        <w:t xml:space="preserve">И маркетинговое замечание: вам продают сотрудника, а не выпускника. Умный выпускник сам по себе мало что даёт, а вот сотрудник, который доводит дело до конца, стоит дорого.</w:t>
+      </w:r>
+      <w:r>
+        <w:t xml:space="preserve"> </w:t>
+      </w:r>
+      <w:r>
+        <w:rPr>
+          <w:bCs/>
+          <w:b/>
+        </w:rPr>
+        <w:t xml:space="preserve">Хорошо, а как этот сотрудник работает в течение дня?</w:t>
       </w:r>
     </w:p>
     <w:p>
@@ -629,8 +518,8 @@
         </w:pict>
       </w:r>
     </w:p>
-    <w:bookmarkEnd w:id="26"/>
-    <w:bookmarkStart w:id="27" w:name="слайд-7.-один-день-ии-ассистента"/>
+    <w:bookmarkEnd w:id="25"/>
+    <w:bookmarkStart w:id="26" w:name="слайд-7.-один-день-ии-ассистента"/>
     <w:p>
       <w:pPr>
         <w:pStyle w:val="Heading2"/>
@@ -656,7 +545,7 @@
         <w:pStyle w:val="BodyText"/>
       </w:pPr>
       <w:r>
-        <w:t xml:space="preserve">Давайте проследим один рабочий день на примере разбора почты. На экране пять кадров, и на каждом подписано, кто действует.</w:t>
+        <w:t xml:space="preserve">Проследим один рабочий день на примере разбора почты. Пять кадров, и под каждым подписано, кто действует.</w:t>
       </w:r>
     </w:p>
     <w:p>
@@ -680,15 +569,15 @@
         <w:t xml:space="preserve"> </w:t>
       </w:r>
       <w:r>
-        <w:t xml:space="preserve">ставит задачу: «Разбери утреннюю почту». Один раз и обычными словами, без инструкций и настроек.</w:t>
-      </w:r>
-    </w:p>
-    <w:p>
-      <w:pPr>
-        <w:pStyle w:val="BodyText"/>
-      </w:pPr>
-      <w:r>
-        <w:t xml:space="preserve">Кадр второй. Включается</w:t>
+        <w:t xml:space="preserve">ставит задачу: «Разбери утреннюю почту». Один раз, обычными словами, без настроек и инструкций.</w:t>
+      </w:r>
+    </w:p>
+    <w:p>
+      <w:pPr>
+        <w:pStyle w:val="BodyText"/>
+      </w:pPr>
+      <w:r>
+        <w:t xml:space="preserve">Кадр второй. Подключается</w:t>
       </w:r>
       <w:r>
         <w:t xml:space="preserve"> </w:t>
@@ -701,7 +590,7 @@
         <w:t xml:space="preserve">harness</w:t>
       </w:r>
       <w:r>
-        <w:t xml:space="preserve">. Он собирает полное задание: берёт вашу просьбу, добавляет инструкции и записи о том, что было вчера, и отправляет всё модели.</w:t>
+        <w:t xml:space="preserve">. Он собирает полное задание: берёт вашу просьбу, добавляет инструкции и записи о том, что было вчера, и отправляет это модели.</w:t>
       </w:r>
     </w:p>
     <w:p>
@@ -722,7 +611,7 @@
         <w:t xml:space="preserve">модель</w:t>
       </w:r>
       <w:r>
-        <w:t xml:space="preserve">. Заметьте, что именно она говорит: «Открой почту». Она не открывает почту сама, она только просит. У модели нет рук, только голова.</w:t>
+        <w:t xml:space="preserve">. Обратите внимание, что именно она говорит: «Открой почту». Сама она почту не открывает, а только просит. У модели есть голова, но нет рук.</w:t>
       </w:r>
     </w:p>
     <w:p>
@@ -743,15 +632,15 @@
         <w:t xml:space="preserve">harness</w:t>
       </w:r>
       <w:r>
-        <w:t xml:space="preserve">: он действительно открывает почту, показывает письма модели, а та пишет черновики ответов.</w:t>
-      </w:r>
-    </w:p>
-    <w:p>
-      <w:pPr>
-        <w:pStyle w:val="BodyText"/>
-      </w:pPr>
-      <w:r>
-        <w:t xml:space="preserve">Кадр пятый. Черновики готовы, но письма ещё никуда не ушли.</w:t>
+        <w:t xml:space="preserve">: он на самом деле открывает почту и показывает письма модели, а она пишет черновики ответов.</w:t>
+      </w:r>
+    </w:p>
+    <w:p>
+      <w:pPr>
+        <w:pStyle w:val="BodyText"/>
+      </w:pPr>
+      <w:r>
+        <w:t xml:space="preserve">Кадр пятый. Черновики готовы, но письма пока не отправлены.</w:t>
       </w:r>
       <w:r>
         <w:t xml:space="preserve"> </w:t>
@@ -767,33 +656,33 @@
         <w:t xml:space="preserve"> </w:t>
       </w:r>
       <w:r>
-        <w:t xml:space="preserve">проверяет их и спрашивает вас: «Отправить?» Письма уходят только после вашего «да».</w:t>
-      </w:r>
-    </w:p>
-    <w:p>
-      <w:pPr>
-        <w:pStyle w:val="BodyText"/>
-      </w:pPr>
-      <w:r>
-        <w:t xml:space="preserve">Теперь самое главное. Посмотрите на последние слова слайда: модель с почтой напрямую не общается. Всё действие, от открытия письма до отправки, происходит через harness. Модель только думает и пишет, а делает и контролирует программа вокруг неё.</w:t>
-      </w:r>
-    </w:p>
-    <w:p>
-      <w:pPr>
-        <w:pStyle w:val="BodyText"/>
-      </w:pPr>
-      <w:r>
-        <w:t xml:space="preserve">Клиент в этой истории видит одно: «почта разобрана». Он не видит ни пяти кадров, ни программы, и всё равно платит именно за это.</w:t>
-      </w:r>
-      <w:r>
-        <w:t xml:space="preserve"> </w:t>
-      </w:r>
-      <w:r>
-        <w:rPr>
-          <w:bCs/>
-          <w:b/>
-        </w:rPr>
-        <w:t xml:space="preserve">Но если разложить этот день на части, за что именно он платит?</w:t>
+        <w:t xml:space="preserve">проверяет их и спрашивает вас: «Отправить?» Отправка происходит только после вашего «да».</w:t>
+      </w:r>
+    </w:p>
+    <w:p>
+      <w:pPr>
+        <w:pStyle w:val="BodyText"/>
+      </w:pPr>
+      <w:r>
+        <w:t xml:space="preserve">И вот главный вывод слайда: модель с почтой напрямую вообще не работает. Всё действие, от открытия письма до отправки, проходит через harness. Модель размышляет и пишет, а делает и контролирует программа вокруг неё.</w:t>
+      </w:r>
+    </w:p>
+    <w:p>
+      <w:pPr>
+        <w:pStyle w:val="BodyText"/>
+      </w:pPr>
+      <w:r>
+        <w:t xml:space="preserve">А клиент видит только результат: «почта разобрана». Ни пяти кадров, ни программы он не видит, но платит именно за них.</w:t>
+      </w:r>
+      <w:r>
+        <w:t xml:space="preserve"> </w:t>
+      </w:r>
+      <w:r>
+        <w:rPr>
+          <w:bCs/>
+          <w:b/>
+        </w:rPr>
+        <w:t xml:space="preserve">Из чего складывается это «разобрано»?</w:t>
       </w:r>
     </w:p>
     <w:p>
@@ -803,8 +692,8 @@
         </w:pict>
       </w:r>
     </w:p>
-    <w:bookmarkEnd w:id="27"/>
-    <w:bookmarkStart w:id="28" w:name="слайд-8.-за-что-вы-платите-на-самом-деле"/>
+    <w:bookmarkEnd w:id="26"/>
+    <w:bookmarkStart w:id="27" w:name="слайд-8.-за-что-вы-платите-на-самом-деле"/>
     <w:p>
       <w:pPr>
         <w:pStyle w:val="Heading2"/>
@@ -818,121 +707,97 @@
         <w:pStyle w:val="FirstParagraph"/>
       </w:pPr>
       <w:r>
-        <w:t xml:space="preserve">Четыре вопроса, которые можно задать любому ИИ-продукту. Каждый из них одновременно характеристика, как в карточке товара на маркетплейсе.</w:t>
-      </w:r>
-    </w:p>
-    <w:p>
-      <w:pPr>
-        <w:pStyle w:val="BodyText"/>
-      </w:pPr>
-      <w:r>
-        <w:t xml:space="preserve">Первая:</w:t>
-      </w:r>
-      <w:r>
-        <w:t xml:space="preserve"> </w:t>
-      </w:r>
-      <w:r>
-        <w:rPr>
-          <w:bCs/>
-          <w:b/>
-        </w:rPr>
-        <w:t xml:space="preserve">память.</w:t>
-      </w:r>
-      <w:r>
-        <w:t xml:space="preserve"> </w:t>
-      </w:r>
-      <w:r>
-        <w:t xml:space="preserve">Помнит ли помощник вас между днями? Человек-сотрудник не просит объяснять задачу заново каждое утро. Например, Claude Code хранит заметки о вашем проекте в отдельных файлах и читает их при каждом запуске. Благодаря этому он «в курсе дела» с первой минуты.</w:t>
-      </w:r>
-    </w:p>
-    <w:p>
-      <w:pPr>
-        <w:pStyle w:val="BodyText"/>
-      </w:pPr>
-      <w:r>
-        <w:t xml:space="preserve">Вторая:</w:t>
-      </w:r>
-      <w:r>
-        <w:t xml:space="preserve"> </w:t>
-      </w:r>
-      <w:r>
-        <w:rPr>
-          <w:bCs/>
-          <w:b/>
-        </w:rPr>
-        <w:t xml:space="preserve">проверка.</w:t>
-      </w:r>
-      <w:r>
-        <w:t xml:space="preserve"> </w:t>
-      </w:r>
-      <w:r>
-        <w:t xml:space="preserve">Проверяет ли он себя, прежде чем сдать работу? Он может прогнать тесты или посмотреть на скриншот того, что получилось. Создатель Claude Code Борис Черни говорит, что когда агент умеет проверять свою работу, качество растёт в два-три раза. Для сравнения: корректор в издательстве не пишет книгу, но без него книга выходит с опечатками.</w:t>
-      </w:r>
-    </w:p>
-    <w:p>
-      <w:pPr>
-        <w:pStyle w:val="BodyText"/>
-      </w:pPr>
-      <w:r>
-        <w:t xml:space="preserve">Третья:</w:t>
-      </w:r>
-      <w:r>
-        <w:t xml:space="preserve"> </w:t>
-      </w:r>
-      <w:r>
-        <w:rPr>
-          <w:bCs/>
-          <w:b/>
-        </w:rPr>
-        <w:t xml:space="preserve">права.</w:t>
-      </w:r>
-      <w:r>
-        <w:t xml:space="preserve"> </w:t>
-      </w:r>
-      <w:r>
-        <w:t xml:space="preserve">Спросит ли он разрешения, прежде чем что-то удалить? В Claude Code около сорока разных действий проверяются отдельно, а рискованные требуют вашего согласия. Как в компании: рядовой сотрудник может читать документы, но удалять базу данных ему нельзя.</w:t>
-      </w:r>
-    </w:p>
-    <w:p>
-      <w:pPr>
-        <w:pStyle w:val="BodyText"/>
-      </w:pPr>
-      <w:r>
-        <w:t xml:space="preserve">Четвёртая:</w:t>
-      </w:r>
-      <w:r>
-        <w:t xml:space="preserve"> </w:t>
-      </w:r>
-      <w:r>
-        <w:rPr>
-          <w:bCs/>
-          <w:b/>
-        </w:rPr>
-        <w:t xml:space="preserve">доведение до конца.</w:t>
-      </w:r>
-      <w:r>
-        <w:t xml:space="preserve"> </w:t>
-      </w:r>
-      <w:r>
-        <w:t xml:space="preserve">Остановится ли он на полпути? Агент работает по кругу: подумал, сделал, проверил. И продолжает, пока задача не решена.</w:t>
-      </w:r>
-    </w:p>
-    <w:p>
-      <w:pPr>
-        <w:pStyle w:val="BodyText"/>
-      </w:pPr>
-      <w:r>
-        <w:t xml:space="preserve">Заметьте, что ни одного слова про «мощность модели» здесь нет. Всё это характеристики, которые в рекламе обычно не пишут, хотя именно по ним продукты и различаются.</w:t>
-      </w:r>
-      <w:r>
-        <w:t xml:space="preserve"> </w:t>
-      </w:r>
-      <w:r>
-        <w:rPr>
-          <w:bCs/>
-          <w:b/>
-        </w:rPr>
-        <w:t xml:space="preserve">Но даже у хорошего сотрудника есть слабости. Первая из них: он забывчив.</w:t>
+        <w:t xml:space="preserve">Здесь четыре вопроса, которые можно задать любому ИИ-продукту. Каждый из них заодно и характеристика, как в карточке товара на маркетплейсе.</w:t>
+      </w:r>
+    </w:p>
+    <w:p>
+      <w:pPr>
+        <w:pStyle w:val="BodyText"/>
+      </w:pPr>
+      <w:r>
+        <w:rPr>
+          <w:bCs/>
+          <w:b/>
+        </w:rPr>
+        <w:t xml:space="preserve">Память.</w:t>
+      </w:r>
+      <w:r>
+        <w:t xml:space="preserve"> </w:t>
+      </w:r>
+      <w:r>
+        <w:t xml:space="preserve">Помнит ли помощник вас от одного дня к другому? Живой сотрудник не просит объяснять задачу заново каждое утро. Например, Claude Code хранит заметки о вашем проекте в отдельных файлах и читает их при каждом запуске, поэтому с первой минуты он в курсе дел.</w:t>
+      </w:r>
+    </w:p>
+    <w:p>
+      <w:pPr>
+        <w:pStyle w:val="BodyText"/>
+      </w:pPr>
+      <w:r>
+        <w:rPr>
+          <w:bCs/>
+          <w:b/>
+        </w:rPr>
+        <w:t xml:space="preserve">Проверка.</w:t>
+      </w:r>
+      <w:r>
+        <w:t xml:space="preserve"> </w:t>
+      </w:r>
+      <w:r>
+        <w:t xml:space="preserve">Проверяет ли он себя, прежде чем сдать работу? Например, прогоняет тесты или смотрит на скриншот результата. Борис Черни, создатель Claude Code, говорит, что когда агент умеет проверять свою работу, качество растёт в два-три раза. Это как корректор в издательстве: он не пишет книгу, но без него она выходит с опечатками.</w:t>
+      </w:r>
+    </w:p>
+    <w:p>
+      <w:pPr>
+        <w:pStyle w:val="BodyText"/>
+      </w:pPr>
+      <w:r>
+        <w:rPr>
+          <w:bCs/>
+          <w:b/>
+        </w:rPr>
+        <w:t xml:space="preserve">Права.</w:t>
+      </w:r>
+      <w:r>
+        <w:t xml:space="preserve"> </w:t>
+      </w:r>
+      <w:r>
+        <w:t xml:space="preserve">Спросит ли он разрешения, прежде чем что-то удалить? В Claude Code около сорока действий проверяются отдельно, а рискованные требуют вашего согласия. Всё как в нормальной компании: рядовой сотрудник читает документы, но стереть базу данных не может.</w:t>
+      </w:r>
+    </w:p>
+    <w:p>
+      <w:pPr>
+        <w:pStyle w:val="BodyText"/>
+      </w:pPr>
+      <w:r>
+        <w:rPr>
+          <w:bCs/>
+          <w:b/>
+        </w:rPr>
+        <w:t xml:space="preserve">Доведение до конца.</w:t>
+      </w:r>
+      <w:r>
+        <w:t xml:space="preserve"> </w:t>
+      </w:r>
+      <w:r>
+        <w:t xml:space="preserve">Остановится ли он на полпути? Агент работает по кругу: подумал, сделал, проверил, и так пока задача не решена.</w:t>
+      </w:r>
+    </w:p>
+    <w:p>
+      <w:pPr>
+        <w:pStyle w:val="BodyText"/>
+      </w:pPr>
+      <w:r>
+        <w:t xml:space="preserve">Заметьте, что в этом списке нет ни слова о «мощности модели». Всё это характеристики, которые в рекламе обычно не упоминают, хотя продукты различаются именно ими.</w:t>
+      </w:r>
+      <w:r>
+        <w:t xml:space="preserve"> </w:t>
+      </w:r>
+      <w:r>
+        <w:rPr>
+          <w:bCs/>
+          <w:b/>
+        </w:rPr>
+        <w:t xml:space="preserve">Но и у хорошего сотрудника есть слабые места. Первое: он забывчив.</w:t>
       </w:r>
     </w:p>
     <w:p>
@@ -942,8 +807,8 @@
         </w:pict>
       </w:r>
     </w:p>
-    <w:bookmarkEnd w:id="28"/>
-    <w:bookmarkStart w:id="29" w:name="слайд-9.-проблема-1-забывчивость"/>
+    <w:bookmarkEnd w:id="27"/>
+    <w:bookmarkStart w:id="28" w:name="слайд-9.-проблема-1-забывчивость"/>
     <w:p>
       <w:pPr>
         <w:pStyle w:val="Heading2"/>
@@ -957,49 +822,49 @@
         <w:pStyle w:val="FirstParagraph"/>
       </w:pPr>
       <w:r>
-        <w:t xml:space="preserve">У модели есть «рабочий стол»: всё, что она может одновременно держать в голове. И этот стол ограничен по размеру. Чем длиннее разговор и чем больше документов, тем теснее на столе.</w:t>
-      </w:r>
-    </w:p>
-    <w:p>
-      <w:pPr>
-        <w:pStyle w:val="BodyText"/>
-      </w:pPr>
-      <w:r>
-        <w:t xml:space="preserve">Исследователи обнаружили любопытную закономерность. Если важная информация оказывается в середине длинного текста, качество работы модели падает на 30% и больше. Посмотрите на кривую на слайде: у начала и конца модель отличная, а середина проваливается. Это знакомо любому студенту. Лекцию вы помните с первых минут и с последних, а вот что было посередине, уже не восстановить.</w:t>
-      </w:r>
-    </w:p>
-    <w:p>
-      <w:pPr>
-        <w:pStyle w:val="BodyText"/>
-      </w:pPr>
-      <w:r>
-        <w:t xml:space="preserve">Что с этим делает harness? Он ведёт себя как хороший помощник в офисе.</w:t>
-      </w:r>
-    </w:p>
-    <w:p>
-      <w:pPr>
-        <w:pStyle w:val="BodyText"/>
-      </w:pPr>
-      <w:r>
-        <w:t xml:space="preserve">Во-первых, пишет конспект: длинную переписку превращает в короткие заметки, где решения остаются, а лишнее уходит. Во-вторых, убирает старые бумаги со стола, но помнит, что с ними было. В-третьих, не читает всё подряд, а ищет нужный документ в момент, когда он понадобился. И, наконец, когда тема большая, зовёт помощника: тот изучает её отдельно и приносит короткую выжимку.</w:t>
-      </w:r>
-    </w:p>
-    <w:p>
-      <w:pPr>
-        <w:pStyle w:val="BodyText"/>
-      </w:pPr>
-      <w:r>
-        <w:t xml:space="preserve">Для маркетолога это очень сильная формулировка: «ИИ не тупеет к концу работы». Это обещание клиенту, но выполняет его не модель, а harness.</w:t>
-      </w:r>
-      <w:r>
-        <w:t xml:space="preserve"> </w:t>
-      </w:r>
-      <w:r>
-        <w:rPr>
-          <w:bCs/>
-          <w:b/>
-        </w:rPr>
-        <w:t xml:space="preserve">Вторая слабость сотрудника: он ошибается.</w:t>
+        <w:t xml:space="preserve">У модели есть «рабочий стол»: всё, что она может держать в голове одновременно. Размер стола ограничен. Чем длиннее разговор и чем больше документов, тем на нём теснее.</w:t>
+      </w:r>
+    </w:p>
+    <w:p>
+      <w:pPr>
+        <w:pStyle w:val="BodyText"/>
+      </w:pPr>
+      <w:r>
+        <w:t xml:space="preserve">Исследователи заметили интересную закономерность. Если важная информация оказывается в середине длинного текста, качество работы модели падает на 30% и больше. Посмотрите на кривую: начало и конец модель помнит отлично, а середина проваливается. Любой студент это узнает. Лекцию вы помните с первых и с последних минут, а то, что было посередине, куда-то исчезает.</w:t>
+      </w:r>
+    </w:p>
+    <w:p>
+      <w:pPr>
+        <w:pStyle w:val="BodyText"/>
+      </w:pPr>
+      <w:r>
+        <w:t xml:space="preserve">Что с этим делает harness? Он ведёт себя как толковый помощник в офисе.</w:t>
+      </w:r>
+    </w:p>
+    <w:p>
+      <w:pPr>
+        <w:pStyle w:val="BodyText"/>
+      </w:pPr>
+      <w:r>
+        <w:t xml:space="preserve">Сначала составляет конспект: длинную переписку сжимает до коротких заметок, где важное остаётся, а лишнее уходит. Потом убирает старые бумаги со стола, но помнит, что с ними было. Не читает всё подряд, а находит нужный документ тогда, когда он понадобился. А если тема большая, поручает её помощнику, который изучит всё отдельно и принесёт короткую выжимку.</w:t>
+      </w:r>
+    </w:p>
+    <w:p>
+      <w:pPr>
+        <w:pStyle w:val="BodyText"/>
+      </w:pPr>
+      <w:r>
+        <w:t xml:space="preserve">Для маркетолога это готовое обещание клиенту: «ИИ не тупеет к концу работы». Выполняет его не модель, а harness.</w:t>
+      </w:r>
+      <w:r>
+        <w:t xml:space="preserve"> </w:t>
+      </w:r>
+      <w:r>
+        <w:rPr>
+          <w:bCs/>
+          <w:b/>
+        </w:rPr>
+        <w:t xml:space="preserve">Второе слабое место: сотрудник ошибается.</w:t>
       </w:r>
     </w:p>
     <w:p>
@@ -1009,8 +874,8 @@
         </w:pict>
       </w:r>
     </w:p>
-    <w:bookmarkEnd w:id="29"/>
-    <w:bookmarkStart w:id="30" w:name="слайд-10.-проблема-2-ошибки-копятся"/>
+    <w:bookmarkEnd w:id="28"/>
+    <w:bookmarkStart w:id="29" w:name="слайд-10.-проблема-2-ошибки-копятся"/>
     <w:p>
       <w:pPr>
         <w:pStyle w:val="Heading2"/>
@@ -1024,15 +889,15 @@
         <w:pStyle w:val="FirstParagraph"/>
       </w:pPr>
       <w:r>
-        <w:t xml:space="preserve">Тут нужна небольшая арифметика, но она того стоит. Допустим, на каждом шаге ИИ не ошибается в 99 случаях из 100. Звучит почти идеально. Теперь вспомним, что задача состоит не из одного шага, а, скажем, из десяти. Вероятность пройти все десять без единой ошибки: 0,99 в десятой степени, то есть около 90%. Каждое десятое дело заканчивается с ошибкой.</w:t>
-      </w:r>
-    </w:p>
-    <w:p>
-      <w:pPr>
-        <w:pStyle w:val="BodyText"/>
-      </w:pPr>
-      <w:r>
-        <w:t xml:space="preserve">Посмотрите на слайд: сто квадратов, и примерно десять из них оранжевые. Это дела, где что-то пошло не так. А если шагов пятьдесят, без ошибок доходят лишь шесть дел из десяти.</w:t>
+        <w:t xml:space="preserve">Немного арифметики, но она стоит внимания. Допустим, на каждом шаге ИИ не ошибается в 99 случаях из 100. Звучит почти идеально. Но задача редко состоит из одного шага, скажем, их десять. Тогда шанс пройти все десять без единой ошибки равен 0,99 в десятой степени, то есть около 90%. Каждое десятое дело заканчивается ошибкой.</w:t>
+      </w:r>
+    </w:p>
+    <w:p>
+      <w:pPr>
+        <w:pStyle w:val="BodyText"/>
+      </w:pPr>
+      <w:r>
+        <w:t xml:space="preserve">На слайде сто квадратов, около десяти из них оранжевые: это дела, где что-то пошло не так. А если шагов пятьдесят, без ошибок доходят только шесть дел из десяти.</w:t>
       </w:r>
       <w:r>
         <w:t xml:space="preserve"> </w:t>
@@ -1050,25 +915,25 @@
         <w:pStyle w:val="BodyText"/>
       </w:pPr>
       <w:r>
-        <w:t xml:space="preserve">Мысль простая: ошибки не складываются, а накапливаются, как проценты. Чем длиннее задача, тем она дороже по риску. Что делает harness? Он ловит сбой и возвращает его модели как обычный результат, чтобы она могла исправиться. И он ограничивает число повторов: в компании Stripe, например, разрешают не больше двух попыток. Бесконечные повторы никому не нужны: они стоят денег и не гарантируют результат.</w:t>
-      </w:r>
-    </w:p>
-    <w:p>
-      <w:pPr>
-        <w:pStyle w:val="BodyText"/>
-      </w:pPr>
-      <w:r>
-        <w:t xml:space="preserve">Для маркетолога: когда задача длинная, надёжность становится главным аргументом. Покупатель платит за уверенность, что дело дойдёт до конца.</w:t>
-      </w:r>
-      <w:r>
-        <w:t xml:space="preserve"> </w:t>
-      </w:r>
-      <w:r>
-        <w:rPr>
-          <w:bCs/>
-          <w:b/>
-        </w:rPr>
-        <w:t xml:space="preserve">А что происходит, когда продукт взрослеет?</w:t>
+        <w:t xml:space="preserve">Смысл в том, что ошибки не просто складываются, а накапливаются, как проценты. Чем длиннее задача, тем рискованнее. Что тут делает harness? Он перехватывает сбой и возвращает его модели как обычный результат, чтобы она могла исправиться. И он ограничивает число повторов: в компании Stripe, например, разрешают не больше двух попыток. Бесконечные повторы никому не нужны: они стоят денег и не гарантируют результата.</w:t>
+      </w:r>
+    </w:p>
+    <w:p>
+      <w:pPr>
+        <w:pStyle w:val="BodyText"/>
+      </w:pPr>
+      <w:r>
+        <w:t xml:space="preserve">Для маркетолога вывод такой: чем длиннее задача, тем важнее надёжность, а значит, это один из главных аргументов продаж. Покупатель платит за уверенность, что дело дойдёт до конца.</w:t>
+      </w:r>
+      <w:r>
+        <w:t xml:space="preserve"> </w:t>
+      </w:r>
+      <w:r>
+        <w:rPr>
+          <w:bCs/>
+          <w:b/>
+        </w:rPr>
+        <w:t xml:space="preserve">Что же дальше происходит с продуктом, когда он взрослеет?</w:t>
       </w:r>
     </w:p>
     <w:p>
@@ -1078,8 +943,8 @@
         </w:pict>
       </w:r>
     </w:p>
-    <w:bookmarkEnd w:id="30"/>
-    <w:bookmarkStart w:id="31" w:name="X0498a9ddcf3a4509222bbb3166d52c2c51e4221"/>
+    <w:bookmarkEnd w:id="29"/>
+    <w:bookmarkStart w:id="30" w:name="X0498a9ddcf3a4509222bbb3166d52c2c51e4221"/>
     <w:p>
       <w:pPr>
         <w:pStyle w:val="Heading2"/>
@@ -1093,41 +958,41 @@
         <w:pStyle w:val="FirstParagraph"/>
       </w:pPr>
       <w:r>
-        <w:t xml:space="preserve">Здесь нас ждёт неожиданность. Принято считать, что хороший продукт тот, где больше функций. Но три цифры на слайде говорят об обратном.</w:t>
-      </w:r>
-    </w:p>
-    <w:p>
-      <w:pPr>
-        <w:pStyle w:val="BodyText"/>
-      </w:pPr>
-      <w:r>
-        <w:t xml:space="preserve">Компания Vercel убрала 80% инструментов из своего продукта v0, и результат стал лучше. Не хуже, не такой же, а лучше. Продукт Manus за полгода переделывали пять раз, и каждый раз упрощали, убирая сложность. А в Claude Code благодаря тому, что инструменты подгружаются только когда нужны, экономится около 95% контекста.</w:t>
-      </w:r>
-    </w:p>
-    <w:p>
-      <w:pPr>
-        <w:pStyle w:val="BodyText"/>
-      </w:pPr>
-      <w:r>
-        <w:t xml:space="preserve">Автор статьи приводит образ строительных лесов. Они нужны, пока здание строят: рабочие по ним добираются до верхних этажей. Но сами по себе ничего не строят и, когда здание готово, их убирают. С harness так же: пока модели слабые, нужна сложная конструкция. Модели умнеют, и часть лесов можно убрать.</w:t>
-      </w:r>
-    </w:p>
-    <w:p>
-      <w:pPr>
-        <w:pStyle w:val="BodyText"/>
-      </w:pPr>
-      <w:r>
-        <w:t xml:space="preserve">Для маркетолога вывод обратный привычному: меньше функций не значит слабее продукт. Простота тоже работает как позиционирование: «делает меньше, но лучше».</w:t>
-      </w:r>
-      <w:r>
-        <w:t xml:space="preserve"> </w:t>
-      </w:r>
-      <w:r>
-        <w:rPr>
-          <w:bCs/>
-          <w:b/>
-        </w:rPr>
-        <w:t xml:space="preserve">Посмотрим, как это выглядит на рынке.</w:t>
+        <w:t xml:space="preserve">Здесь нас ждёт неожиданность. Обычно кажется, что хороший продукт — это много функций. Три цифры на слайде говорят об обратном.</w:t>
+      </w:r>
+    </w:p>
+    <w:p>
+      <w:pPr>
+        <w:pStyle w:val="BodyText"/>
+      </w:pPr>
+      <w:r>
+        <w:t xml:space="preserve">Компания Vercel убрала 80% инструментов из своего продукта v0, и результат стал лучше. Не такой же, а именно лучше. Продукт Manus за полгода переделывали пять раз, и каждый раз упрощали, убирая лишнее. А Claude Code экономит около 95% контекста за счёт того, что подгружает инструменты только тогда, когда они нужны.</w:t>
+      </w:r>
+    </w:p>
+    <w:p>
+      <w:pPr>
+        <w:pStyle w:val="BodyText"/>
+      </w:pPr>
+      <w:r>
+        <w:t xml:space="preserve">Автор статьи сравнивает это со строительными лесами. Они нужны, пока здание строят: по ним рабочие добираются до верхних этажей. Сами по себе леса ничего не строят, и когда дом готов, их разбирают. С harness похоже: пока модели слабее, нужна сложная конструкция вокруг них. Модели умнеют, и часть лесов можно убрать.</w:t>
+      </w:r>
+    </w:p>
+    <w:p>
+      <w:pPr>
+        <w:pStyle w:val="BodyText"/>
+      </w:pPr>
+      <w:r>
+        <w:t xml:space="preserve">Для маркетолога вывод непривычный: меньше функций не значит слабее продукт. Простота тоже может быть позиционированием: «делаем меньше, но лучше».</w:t>
+      </w:r>
+      <w:r>
+        <w:t xml:space="preserve"> </w:t>
+      </w:r>
+      <w:r>
+        <w:rPr>
+          <w:bCs/>
+          <w:b/>
+        </w:rPr>
+        <w:t xml:space="preserve">Теперь посмотрим, как это выглядит на реальном рынке.</w:t>
       </w:r>
     </w:p>
     <w:p>
@@ -1137,8 +1002,8 @@
         </w:pict>
       </w:r>
     </w:p>
-    <w:bookmarkEnd w:id="31"/>
-    <w:bookmarkStart w:id="32" w:name="X65fb9b3cb2661b6842224564d3ff36ecc1efefb"/>
+    <w:bookmarkEnd w:id="30"/>
+    <w:bookmarkStart w:id="31" w:name="X65fb9b3cb2661b6842224564d3ff36ecc1efefb"/>
     <w:p>
       <w:pPr>
         <w:pStyle w:val="Heading2"/>
@@ -1152,7 +1017,7 @@
         <w:pStyle w:val="FirstParagraph"/>
       </w:pPr>
       <w:r>
-        <w:t xml:space="preserve">Перед вами пять известных продуктов, оформленных как постеры. И сразу оговорка: слоганы на них наши, составленные по описанию подходов в статье, официальных у этих компаний таких фраз нет.</w:t>
+        <w:t xml:space="preserve">Перед вами пять известных продуктов в виде постеров. Сразу оговоримся: слоганы наши, мы придумали их по описанию подходов в статье, у самих компаний таких фраз нет.</w:t>
       </w:r>
     </w:p>
     <w:p>
@@ -1170,7 +1035,7 @@
         <w:t xml:space="preserve"> </w:t>
       </w:r>
       <w:r>
-        <w:t xml:space="preserve">от Anthropic — лёгкий harness. Ставка на то, что модель со временем станет умнее, поэтому лишние шаги убирают.</w:t>
+        <w:t xml:space="preserve">от Anthropic — лёгкий harness. Ставка на то, что модель будет умнеть, поэтому лишние шаги убирают.</w:t>
       </w:r>
       <w:r>
         <w:t xml:space="preserve"> </w:t>
@@ -1202,7 +1067,7 @@
         <w:t xml:space="preserve"> </w:t>
       </w:r>
       <w:r>
-        <w:t xml:space="preserve">от LangChain делает ставку на контроль: работа расписана как схема, и каждый шаг можно проследить.</w:t>
+        <w:t xml:space="preserve">от LangChain делает ставку на контроль: работа расписана как схема, и каждый шаг можно отследить.</w:t>
       </w:r>
       <w:r>
         <w:t xml:space="preserve"> </w:t>
@@ -1234,15 +1099,15 @@
         <w:t xml:space="preserve"> </w:t>
       </w:r>
       <w:r>
-        <w:t xml:space="preserve">от Microsoft устроен как общий чат: агенты договариваются между собой и решают задачу вместе.</w:t>
-      </w:r>
-    </w:p>
-    <w:p>
-      <w:pPr>
-        <w:pStyle w:val="BodyText"/>
-      </w:pPr>
-      <w:r>
-        <w:t xml:space="preserve">Теперь обратите внимание: модель можно взять одну и ту же, а продают совсем разное. «Лёгкий», «везде», «под контролем», «команда», «договорятся сами». На языке маркетинга это позиционирование: ответ на вопрос «чем мы отличаемся от других». И отличие строится не на модели, а на harness.</w:t>
+        <w:t xml:space="preserve">от Microsoft похож на общий чат: агенты договариваются друг с другом и решают задачу вместе.</w:t>
+      </w:r>
+    </w:p>
+    <w:p>
+      <w:pPr>
+        <w:pStyle w:val="BodyText"/>
+      </w:pPr>
+      <w:r>
+        <w:t xml:space="preserve">Обратите внимание: модель можно взять одну и ту же, а продают совершенно разное. «Лёгкий», «везде», «под контролем», «команда», «договорятся сами». На языке маркетинга это позиционирование, то есть ответ на вопрос «чем мы отличаемся». И отличие строится не на модели, а на harness.</w:t>
       </w:r>
       <w:r>
         <w:t xml:space="preserve"> </w:t>
@@ -1262,8 +1127,8 @@
         </w:pict>
       </w:r>
     </w:p>
-    <w:bookmarkEnd w:id="32"/>
-    <w:bookmarkStart w:id="33" w:name="слайд-13.-практика-как-это-продавать"/>
+    <w:bookmarkEnd w:id="31"/>
+    <w:bookmarkStart w:id="32" w:name="слайд-13.-практика-как-это-продавать"/>
     <w:p>
       <w:pPr>
         <w:pStyle w:val="Heading2"/>
@@ -1289,15 +1154,15 @@
         <w:pStyle w:val="BodyText"/>
       </w:pPr>
       <w:r>
-        <w:t xml:space="preserve">Посмотрите на слайд. Слева то, что пишут почти все: «Работает на самой мощной нейросети». Проблема в том, что это пишут все, и клиент не видит разницы. А то, что нельзя проверить, люди обычно просто не принимают на веру.</w:t>
-      </w:r>
-    </w:p>
-    <w:p>
-      <w:pPr>
-        <w:pStyle w:val="BodyText"/>
-      </w:pPr>
-      <w:r>
-        <w:t xml:space="preserve">Справа вариант, который сработает: «Помнит ваш проект. Проверяет себя. Спросит, прежде чем что-то удалить». Это три свойства harness: память, проверка и права. И, что важно, их можно проверить: показать, как продукт помнит, как проверяет, как спрашивает разрешение.</w:t>
+        <w:t xml:space="preserve">Посмотрите на слайд. Слева то, что пишут почти все: «Работает на самой мощной нейросети». Проблема в том, что так пишут все, и клиент не видит разницы. А то, что нельзя проверить, люди обычно не принимают на веру.</w:t>
+      </w:r>
+    </w:p>
+    <w:p>
+      <w:pPr>
+        <w:pStyle w:val="BodyText"/>
+      </w:pPr>
+      <w:r>
+        <w:t xml:space="preserve">Справа вариант, который сработает: «Помнит ваш проект. Проверяет себя. Спросит, прежде чем что-то удалить». За этим стоят три свойства harness: память, проверка и права. И главное, их можно продемонстрировать: показать, как продукт помнит, как проверяет, как спрашивает разрешение.</w:t>
       </w:r>
     </w:p>
     <w:p>
@@ -1321,7 +1186,7 @@
         <w:t xml:space="preserve"> </w:t>
       </w:r>
       <w:r>
-        <w:t xml:space="preserve">придумайте уникальное торговое предложение для ИИ-помощника по своему профилю. Например, для бухгалтерии, службы поддержки клиентов или рекламного агентства. Опирайтесь на четыре пункта со слайда 8: память, проверка, права и доведение до конца.</w:t>
+        <w:t xml:space="preserve">придумайте торговое предложение для ИИ-помощника по своему профилю, например для бухгалтерии, службы поддержки или рекламного агентства. Опирайтесь на четыре пункта со слайда 8: память, проверка, права и доведение до конца.</w:t>
       </w:r>
     </w:p>
     <w:p>
@@ -1333,25 +1198,25 @@
           <w:iCs/>
           <w:i/>
         </w:rPr>
-        <w:t xml:space="preserve">(Дать минуту. Выслушать двух-трёх человек. Если нужно, подсказать: «Что он помнит? Что проверяет? Что не делает без вас?»)</w:t>
-      </w:r>
-    </w:p>
-    <w:p>
-      <w:pPr>
-        <w:pStyle w:val="BodyText"/>
-      </w:pPr>
-      <w:r>
-        <w:t xml:space="preserve">Хорошее УТП говорит не о технологии, а о свойстве, которое клиент может проверить.</w:t>
-      </w:r>
-      <w:r>
-        <w:t xml:space="preserve"> </w:t>
-      </w:r>
-      <w:r>
-        <w:rPr>
-          <w:bCs/>
-          <w:b/>
-        </w:rPr>
-        <w:t xml:space="preserve">А теперь с другой стороны: как покупателю не ошибиться?</w:t>
+        <w:t xml:space="preserve">(Дать минуту. Выслушать двоих-троих. Если зависли, подсказать: «Что он помнит? Что проверяет? Чего не делает без вас?»)</w:t>
+      </w:r>
+    </w:p>
+    <w:p>
+      <w:pPr>
+        <w:pStyle w:val="BodyText"/>
+      </w:pPr>
+      <w:r>
+        <w:t xml:space="preserve">Хорошее предложение говорит не о технологии, а о свойстве, которое клиент может проверить.</w:t>
+      </w:r>
+      <w:r>
+        <w:t xml:space="preserve"> </w:t>
+      </w:r>
+      <w:r>
+        <w:rPr>
+          <w:bCs/>
+          <w:b/>
+        </w:rPr>
+        <w:t xml:space="preserve">А теперь посмотрим на то же самое глазами покупателя.</w:t>
       </w:r>
     </w:p>
     <w:p>
@@ -1361,8 +1226,8 @@
         </w:pict>
       </w:r>
     </w:p>
-    <w:bookmarkEnd w:id="33"/>
-    <w:bookmarkStart w:id="34" w:name="слайд-14.-практика-как-выбирать"/>
+    <w:bookmarkEnd w:id="32"/>
+    <w:bookmarkStart w:id="33" w:name="слайд-14.-практика-как-выбирать"/>
     <w:p>
       <w:pPr>
         <w:pStyle w:val="Heading2"/>
@@ -1376,41 +1241,41 @@
         <w:pStyle w:val="FirstParagraph"/>
       </w:pPr>
       <w:r>
-        <w:t xml:space="preserve">Мы только что были продавцами, теперь побудем покупателями. Слева на слайде карточка товара, как на маркетплейсе. Название: «ИИ-сотрудник Почта». Но посмотрите на строки характеристик: рядом с каждой стоит вопросительный знак. Модель, как правило, указана, а вот что у него с памятью, проверкой, правами, поведением при сбое и непрерывностью работы, обычно не сказано.</w:t>
-      </w:r>
-    </w:p>
-    <w:p>
-      <w:pPr>
-        <w:pStyle w:val="BodyText"/>
-      </w:pPr>
-      <w:r>
-        <w:t xml:space="preserve">Именно эти вопросительные знаки и есть конкурентное различие. Поэтому вместо «какая у вас модель?» мы предлагаем задать продавцу четыре вопроса.</w:t>
-      </w:r>
-    </w:p>
-    <w:p>
-      <w:pPr>
-        <w:pStyle w:val="BodyText"/>
-      </w:pPr>
-      <w:r>
-        <w:t xml:space="preserve">Первый: что он помнит между сессиями? Второй: как проверяет свою работу? Третий: что ему разрешено делать без вас? И четвёртый: что он делает, когда ошибается?</w:t>
-      </w:r>
-    </w:p>
-    <w:p>
-      <w:pPr>
-        <w:pStyle w:val="BodyText"/>
-      </w:pPr>
-      <w:r>
-        <w:t xml:space="preserve">Если продавец отвечает уверенно и конкретно, за красивой моделью стоит продуманный harness. Если уходит в общие слова про мощность нейросети, это повод насторожиться.</w:t>
-      </w:r>
-      <w:r>
-        <w:t xml:space="preserve"> </w:t>
-      </w:r>
-      <w:r>
-        <w:rPr>
-          <w:bCs/>
-          <w:b/>
-        </w:rPr>
-        <w:t xml:space="preserve">Давайте подведём итог.</w:t>
+        <w:t xml:space="preserve">Мы только что побыли продавцами, теперь побудем покупателями. Слева на слайде карточка товара, как на маркетплейсе: «ИИ-сотрудник Почта». Посмотрите на строки характеристик: возле каждой вопросительный знак. Модель обычно указана, а вот что с памятью, проверкой, правами, поведением при сбое и непрерывностью работы, чаще всего не сказано.</w:t>
+      </w:r>
+    </w:p>
+    <w:p>
+      <w:pPr>
+        <w:pStyle w:val="BodyText"/>
+      </w:pPr>
+      <w:r>
+        <w:t xml:space="preserve">Эти вопросительные знаки и есть место, где продукты различаются. Поэтому вместо «какая у вас модель?» мы предлагаем четыре вопроса продавцу.</w:t>
+      </w:r>
+    </w:p>
+    <w:p>
+      <w:pPr>
+        <w:pStyle w:val="BodyText"/>
+      </w:pPr>
+      <w:r>
+        <w:t xml:space="preserve">Первый: что он помнит между сессиями? Второй: как проверяет свою работу? Третий: что ему разрешено делать без вас? Четвёртый: что он делает, когда ошибается?</w:t>
+      </w:r>
+    </w:p>
+    <w:p>
+      <w:pPr>
+        <w:pStyle w:val="BodyText"/>
+      </w:pPr>
+      <w:r>
+        <w:t xml:space="preserve">Если продавец отвечает уверенно и конкретно, за красивой моделью, скорее всего, стоит продуманный harness. Если уходит в общие разговоры про мощность нейросети, стоит насторожиться.</w:t>
+      </w:r>
+      <w:r>
+        <w:t xml:space="preserve"> </w:t>
+      </w:r>
+      <w:r>
+        <w:rPr>
+          <w:bCs/>
+          <w:b/>
+        </w:rPr>
+        <w:t xml:space="preserve">Пора подводить итог.</w:t>
       </w:r>
     </w:p>
     <w:p>
@@ -1420,8 +1285,8 @@
         </w:pict>
       </w:r>
     </w:p>
-    <w:bookmarkEnd w:id="34"/>
-    <w:bookmarkStart w:id="35" w:name="слайд-15.-итоги"/>
+    <w:bookmarkEnd w:id="33"/>
+    <w:bookmarkStart w:id="34" w:name="слайд-15.-итоги"/>
     <w:p>
       <w:pPr>
         <w:pStyle w:val="Heading2"/>
@@ -1477,10 +1342,13 @@
           <w:bCs/>
           <w:b/>
         </w:rPr>
-        <w:t xml:space="preserve">harness — не магия, а набор свойств</w:t>
-      </w:r>
-      <w:r>
-        <w:t xml:space="preserve">: память, проверка, права и доведение до конца. Их можно проверить и сравнить, как характеристики в обычной карточке товара.</w:t>
+        <w:t xml:space="preserve">harness — не магия, а набор свойств:</w:t>
+      </w:r>
+      <w:r>
+        <w:t xml:space="preserve"> </w:t>
+      </w:r>
+      <w:r>
+        <w:t xml:space="preserve">память, проверка, права и доведение до конца. Их можно проверить и сравнить, как характеристики любого товара.</w:t>
       </w:r>
     </w:p>
     <w:p>
@@ -1512,7 +1380,7 @@
         <w:pStyle w:val="BodyText"/>
       </w:pPr>
       <w:r>
-        <w:t xml:space="preserve">А теперь вернёмся к директору, с которого мы начали. На его столе по-прежнему три предложения. Первый продавец хвастается моделью, но вы уже знаете, что модель есть у всех. Второй обещает низкую цену, но не говорит, что получит клиент за эти деньги. Третий говорит о том, что человек на самом деле покупает: дело доведено до конца и проверка показана. Это и есть harness, и директор выбирает третьего.</w:t>
+        <w:t xml:space="preserve">А теперь вернёмся к директору, с которого начали. На его столе всё те же три предложения. Первый продавец хвастается моделью, но вы уже знаете, что модель есть у всех. Второй обещает низкую цену, но не говорит, что клиент получит за эти деньги. Третий говорит о том, что человек на самом деле покупает: дело доведено до конца, и проверка показана. Это и есть harness. Директор выбирает третьего.</w:t>
       </w:r>
     </w:p>
     <w:p>
@@ -1524,7 +1392,7 @@
           <w:iCs/>
           <w:i/>
         </w:rPr>
-        <w:t xml:space="preserve">(Можно спросить зал: «Кто поменял бы своё мнение за эти двадцать минут?» А если останется время: «Что бы вы спросили у третьего продавца, чтобы убедиться, что он не обманывает?» Ответ: четыре вопроса со слайда 14.)</w:t>
+        <w:t xml:space="preserve">(Можно спросить зал: «Кто поменял бы своё мнение за эти двадцать минут?» Если есть время: «Что вы спросили бы у третьего продавца, чтобы убедиться, что он не обманывает?» Ответ: четыре вопроса со слайда 14.)</w:t>
       </w:r>
     </w:p>
     <w:p>
@@ -1534,8 +1402,8 @@
         </w:pict>
       </w:r>
     </w:p>
-    <w:bookmarkEnd w:id="35"/>
-    <w:bookmarkStart w:id="36" w:name="слайд-16.-спасибо"/>
+    <w:bookmarkEnd w:id="34"/>
+    <w:bookmarkStart w:id="35" w:name="слайд-16.-спасибо"/>
     <w:p>
       <w:pPr>
         <w:pStyle w:val="Heading2"/>
@@ -1549,7 +1417,7 @@
         <w:pStyle w:val="FirstParagraph"/>
       </w:pPr>
       <w:r>
-        <w:t xml:space="preserve">Если запомнить из доклада только одно, пусть это будет такая фраза:</w:t>
+        <w:t xml:space="preserve">Если из всего доклада запомнится одна фраза, пусть это будет эта:</w:t>
       </w:r>
       <w:r>
         <w:t xml:space="preserve"> </w:t>
@@ -1567,7 +1435,7 @@
         <w:pStyle w:val="BodyText"/>
       </w:pPr>
       <w:r>
-        <w:t xml:space="preserve">Спасибо за внимание! Мы будем рады вопросам.</w:t>
+        <w:t xml:space="preserve">Спасибо за внимание! Будем рады вопросам.</w:t>
       </w:r>
     </w:p>
     <w:p>
@@ -1577,172 +1445,190 @@
         </w:pict>
       </w:r>
     </w:p>
+    <w:bookmarkEnd w:id="35"/>
     <w:bookmarkEnd w:id="36"/>
+    <w:bookmarkStart w:id="40" w:name="приложение"/>
+    <w:p>
+      <w:pPr>
+        <w:pStyle w:val="Heading1"/>
+      </w:pPr>
+      <w:r>
+        <w:t xml:space="preserve">Приложение</w:t>
+      </w:r>
+    </w:p>
+    <w:bookmarkStart w:id="37" w:name="если-спросят"/>
+    <w:p>
+      <w:pPr>
+        <w:pStyle w:val="Heading2"/>
+      </w:pPr>
+      <w:r>
+        <w:t xml:space="preserve">Если спросят</w:t>
+      </w:r>
+    </w:p>
+    <w:p>
+      <w:pPr>
+        <w:pStyle w:val="FirstParagraph"/>
+      </w:pPr>
+      <w:r>
+        <w:rPr>
+          <w:bCs/>
+          <w:b/>
+        </w:rPr>
+        <w:t xml:space="preserve">Что такое harness, если совсем коротко?</w:t>
+      </w:r>
+      <w:r>
+        <w:t xml:space="preserve"> </w:t>
+      </w:r>
+      <w:r>
+        <w:t xml:space="preserve">Программа, которая управляет ИИ-моделью: отправляет ей задачу, даёт инструменты, хранит память, проверяет результат и следит за правилами. Модель думает, harness действует.</w:t>
+      </w:r>
+    </w:p>
+    <w:p>
+      <w:pPr>
+        <w:pStyle w:val="BodyText"/>
+      </w:pPr>
+      <w:r>
+        <w:rPr>
+          <w:bCs/>
+          <w:b/>
+        </w:rPr>
+        <w:t xml:space="preserve">Чем harness отличается от самой модели?</w:t>
+      </w:r>
+      <w:r>
+        <w:t xml:space="preserve"> </w:t>
+      </w:r>
+      <w:r>
+        <w:t xml:space="preserve">Модель — «мозг»: она только читает и пишет текст. Всё, что связано с действиями (открыть почту, запомнить, проверить, спросить разрешение), делает harness.</w:t>
+      </w:r>
+    </w:p>
+    <w:p>
+      <w:pPr>
+        <w:pStyle w:val="BodyText"/>
+      </w:pPr>
+      <w:r>
+        <w:rPr>
+          <w:bCs/>
+          <w:b/>
+        </w:rPr>
+        <w:t xml:space="preserve">Что такое «агент»?</w:t>
+      </w:r>
+      <w:r>
+        <w:t xml:space="preserve"> </w:t>
+      </w:r>
+      <w:r>
+        <w:t xml:space="preserve">ИИ, который сам выполняет задачу: открывает файлы, ищет информацию, запускает программы, проверяет результат. Агент = модель + harness.</w:t>
+      </w:r>
+    </w:p>
+    <w:p>
+      <w:pPr>
+        <w:pStyle w:val="BodyText"/>
+      </w:pPr>
+      <w:r>
+        <w:rPr>
+          <w:bCs/>
+          <w:b/>
+        </w:rPr>
+        <w:t xml:space="preserve">Пример с почтой — реальный?</w:t>
+      </w:r>
+      <w:r>
+        <w:t xml:space="preserve"> </w:t>
+      </w:r>
+      <w:r>
+        <w:t xml:space="preserve">Нет, это учебная иллюстрация, чтобы показать разделение ролей. В статье примеры в основном из программирования, потому что там проще измерять результат. Принцип общий.</w:t>
+      </w:r>
+    </w:p>
+    <w:p>
+      <w:pPr>
+        <w:pStyle w:val="BodyText"/>
+      </w:pPr>
+      <w:r>
+        <w:rPr>
+          <w:bCs/>
+          <w:b/>
+        </w:rPr>
+        <w:t xml:space="preserve">Почему не взять самую сильную модель?</w:t>
+      </w:r>
+      <w:r>
+        <w:t xml:space="preserve"> </w:t>
+      </w:r>
+      <w:r>
+        <w:t xml:space="preserve">Сильная модель в плохом harness проигрывает средней в хорошем. LangChain это показал: модель та же, место в рейтинге изменилось с «за пределами тридцатки» на пятое.</w:t>
+      </w:r>
+    </w:p>
+    <w:p>
+      <w:pPr>
+        <w:pStyle w:val="BodyText"/>
+      </w:pPr>
+      <w:r>
+        <w:rPr>
+          <w:bCs/>
+          <w:b/>
+        </w:rPr>
+        <w:t xml:space="preserve">Откуда цифры?</w:t>
+      </w:r>
+      <w:r>
+        <w:t xml:space="preserve"> </w:t>
+      </w:r>
+      <w:r>
+        <w:t xml:space="preserve">Из статьи Akshay «Что такое Harness?» (перевод на Хабре). Это обзор публичных материалов Anthropic, OpenAI, LangChain и других. Часть чисел (76,4%, «в 2–3 раза», 30%, 80%, 95%) — заявления самих компаний и авторов, независимо мы их не проверяли. Квадраты на слайде 10 — наше вычисление: 0,99 в степени числа шагов.</w:t>
+      </w:r>
+    </w:p>
+    <w:p>
+      <w:pPr>
+        <w:pStyle w:val="BodyText"/>
+      </w:pPr>
+      <w:r>
+        <w:rPr>
+          <w:bCs/>
+          <w:b/>
+        </w:rPr>
+        <w:t xml:space="preserve">Четыре «за что платят» — это точная классификация?</w:t>
+      </w:r>
+      <w:r>
+        <w:t xml:space="preserve"> </w:t>
+      </w:r>
+      <w:r>
+        <w:t xml:space="preserve">Нет, это наше упрощение. В статье перечислено одиннадцать технических компонентов (заявлено двенадцать). Четыре группы удобны для объяснения и для карточки сравнения.</w:t>
+      </w:r>
+    </w:p>
+    <w:p>
+      <w:pPr>
+        <w:pStyle w:val="BodyText"/>
+      </w:pPr>
+      <w:r>
+        <w:rPr>
+          <w:bCs/>
+          <w:b/>
+        </w:rPr>
+        <w:t xml:space="preserve">Как маркетологу использовать эти знания?</w:t>
+      </w:r>
+      <w:r>
+        <w:t xml:space="preserve"> </w:t>
+      </w:r>
+      <w:r>
+        <w:t xml:space="preserve">Сравнивать ИИ-продукты по памяти, надёжности, безопасности и умению довести дело до конца и формулировать свои преимущества именно в этих терминах. Четыре вопроса со слайда 14 можно использовать при выборе продукта.</w:t>
+      </w:r>
+    </w:p>
+    <w:p>
+      <w:pPr>
+        <w:pStyle w:val="BodyText"/>
+      </w:pPr>
+      <w:r>
+        <w:rPr>
+          <w:bCs/>
+          <w:b/>
+        </w:rPr>
+        <w:t xml:space="preserve">Не заменит ли harness разработчика или маркетолога?</w:t>
+      </w:r>
+      <w:r>
+        <w:t xml:space="preserve"> </w:t>
+      </w:r>
+      <w:r>
+        <w:t xml:space="preserve">В статье об этом речи нет, поэтому утверждать мы не будем. Из сказанного следует лишь то, что результат зависит не только от модели, но и от того, как вокруг неё всё устроено, а это работа людей.</w:t>
+      </w:r>
+    </w:p>
     <w:bookmarkEnd w:id="37"/>
-    <w:bookmarkStart w:id="41" w:name="приложение"/>
-    <w:p>
-      <w:pPr>
-        <w:pStyle w:val="Heading1"/>
-      </w:pPr>
-      <w:r>
-        <w:t xml:space="preserve">Приложение</w:t>
-      </w:r>
-    </w:p>
-    <w:bookmarkStart w:id="38" w:name="если-спросят"/>
-    <w:p>
-      <w:pPr>
-        <w:pStyle w:val="Heading2"/>
-      </w:pPr>
-      <w:r>
-        <w:t xml:space="preserve">Если спросят</w:t>
-      </w:r>
-    </w:p>
-    <w:p>
-      <w:pPr>
-        <w:pStyle w:val="FirstParagraph"/>
-      </w:pPr>
-      <w:r>
-        <w:rPr>
-          <w:bCs/>
-          <w:b/>
-        </w:rPr>
-        <w:t xml:space="preserve">Что такое harness, если совсем коротко?</w:t>
-      </w:r>
-      <w:r>
-        <w:t xml:space="preserve"> </w:t>
-      </w:r>
-      <w:r>
-        <w:t xml:space="preserve">Программа, которая управляет ИИ-моделью: отправляет ей задачу, даёт инструменты, хранит память, проверяет результат и следит за правилами. Модель думает, harness действует.</w:t>
-      </w:r>
-    </w:p>
-    <w:p>
-      <w:pPr>
-        <w:pStyle w:val="BodyText"/>
-      </w:pPr>
-      <w:r>
-        <w:rPr>
-          <w:bCs/>
-          <w:b/>
-        </w:rPr>
-        <w:t xml:space="preserve">Чем harness отличается от самой модели?</w:t>
-      </w:r>
-      <w:r>
-        <w:t xml:space="preserve"> </w:t>
-      </w:r>
-      <w:r>
-        <w:t xml:space="preserve">Модель — «мозг»: она только читает и пишет текст. Всё, что связано с действиями (открыть почту, запомнить, проверить, спросить разрешение), делает harness.</w:t>
-      </w:r>
-    </w:p>
-    <w:p>
-      <w:pPr>
-        <w:pStyle w:val="BodyText"/>
-      </w:pPr>
-      <w:r>
-        <w:rPr>
-          <w:bCs/>
-          <w:b/>
-        </w:rPr>
-        <w:t xml:space="preserve">Что такое «агент»?</w:t>
-      </w:r>
-      <w:r>
-        <w:t xml:space="preserve"> </w:t>
-      </w:r>
-      <w:r>
-        <w:t xml:space="preserve">ИИ, который сам выполняет задачу: открывает файлы, ищет информацию, запускает программы, проверяет результат. Агент = модель + harness.</w:t>
-      </w:r>
-    </w:p>
-    <w:p>
-      <w:pPr>
-        <w:pStyle w:val="BodyText"/>
-      </w:pPr>
-      <w:r>
-        <w:rPr>
-          <w:bCs/>
-          <w:b/>
-        </w:rPr>
-        <w:t xml:space="preserve">Пример с почтой — реальный?</w:t>
-      </w:r>
-      <w:r>
-        <w:t xml:space="preserve"> </w:t>
-      </w:r>
-      <w:r>
-        <w:t xml:space="preserve">Нет, это учебная иллюстрация, чтобы показать разделение ролей. В статье примеры в основном из программирования, потому что там проще измерять результат. Принцип общий.</w:t>
-      </w:r>
-    </w:p>
-    <w:p>
-      <w:pPr>
-        <w:pStyle w:val="BodyText"/>
-      </w:pPr>
-      <w:r>
-        <w:rPr>
-          <w:bCs/>
-          <w:b/>
-        </w:rPr>
-        <w:t xml:space="preserve">Почему не взять самую сильную модель?</w:t>
-      </w:r>
-      <w:r>
-        <w:t xml:space="preserve"> </w:t>
-      </w:r>
-      <w:r>
-        <w:t xml:space="preserve">Сильная модель в плохом harness проигрывает средней в хорошем. LangChain это показал: модель та же, место в рейтинге изменилось с «за пределами тридцатки» на пятое.</w:t>
-      </w:r>
-    </w:p>
-    <w:p>
-      <w:pPr>
-        <w:pStyle w:val="BodyText"/>
-      </w:pPr>
-      <w:r>
-        <w:rPr>
-          <w:bCs/>
-          <w:b/>
-        </w:rPr>
-        <w:t xml:space="preserve">Откуда цифры?</w:t>
-      </w:r>
-      <w:r>
-        <w:t xml:space="preserve"> </w:t>
-      </w:r>
-      <w:r>
-        <w:t xml:space="preserve">Из статьи Akshay «Что такое Harness?» (перевод на Хабре). Это обзор публичных материалов Anthropic, OpenAI, LangChain и других. Часть чисел (76,4%, «в 2–3 раза», 30%, 80%, 95%) — заявления самих компаний и авторов, независимо мы их не проверяли. Квадраты на слайде 10 — наше вычисление: 0,99 в степени числа шагов.</w:t>
-      </w:r>
-    </w:p>
-    <w:p>
-      <w:pPr>
-        <w:pStyle w:val="BodyText"/>
-      </w:pPr>
-      <w:r>
-        <w:rPr>
-          <w:bCs/>
-          <w:b/>
-        </w:rPr>
-        <w:t xml:space="preserve">Четыре «за что платят» — это точная классификация?</w:t>
-      </w:r>
-      <w:r>
-        <w:t xml:space="preserve"> </w:t>
-      </w:r>
-      <w:r>
-        <w:t xml:space="preserve">Нет, это наше упрощение. В статье перечислено одиннадцать технических компонентов (заявлено двенадцать). Четыре группы удобны для объяснения и для карточки сравнения.</w:t>
-      </w:r>
-    </w:p>
-    <w:p>
-      <w:pPr>
-        <w:pStyle w:val="BodyText"/>
-      </w:pPr>
-      <w:r>
-        <w:rPr>
-          <w:bCs/>
-          <w:b/>
-        </w:rPr>
-        <w:t xml:space="preserve">Как маркетологу использовать эти знания?</w:t>
-      </w:r>
-      <w:r>
-        <w:t xml:space="preserve"> </w:t>
-      </w:r>
-      <w:r>
-        <w:t xml:space="preserve">Сравнивать ИИ-продукты по памяти, надёжности, безопасности и умению довести дело до конца и формулировать свои преимущества именно в этих терминах. Четыре вопроса со слайда 14 можно использовать при выборе продукта.</w:t>
-      </w:r>
-    </w:p>
-    <w:bookmarkEnd w:id="38"/>
-    <w:bookmarkStart w:id="39" w:name="мини-словарик"/>
+    <w:bookmarkStart w:id="38" w:name="мини-словарик"/>
     <w:p>
       <w:pPr>
         <w:pStyle w:val="Heading2"/>
@@ -1838,7 +1724,7 @@
               <w:jc w:val="left"/>
             </w:pPr>
             <w:r>
-              <w:t xml:space="preserve">Программа вокруг модели: даёт инструменты, хранит память, проверяет, следит за правилами</w:t>
+              <w:t xml:space="preserve">Программа, которая управляет моделью: даёт инструменты, хранит память, проверяет, следит за правилами</w:t>
             </w:r>
           </w:p>
         </w:tc>
@@ -1974,8 +1860,8 @@
         </w:tc>
       </w:tr>
     </w:tbl>
-    <w:bookmarkEnd w:id="39"/>
-    <w:bookmarkStart w:id="40" w:name="как-выступать"/>
+    <w:bookmarkEnd w:id="38"/>
+    <w:bookmarkStart w:id="39" w:name="как-выступать"/>
     <w:p>
       <w:pPr>
         <w:pStyle w:val="Heading2"/>
@@ -1988,31 +1874,31 @@
       <w:pPr>
         <w:numPr>
           <w:ilvl w:val="0"/>
-          <w:numId w:val="1002"/>
+          <w:numId w:val="1001"/>
         </w:numPr>
         <w:pStyle w:val="Compact"/>
       </w:pPr>
       <w:r>
-        <w:t xml:space="preserve">Не читайте слайды: на них короткие подписи, смысл в ваших словах. В этом тексте мысли нарочно переформулированы, а не пересказывают слайд.</w:t>
+        <w:t xml:space="preserve">Не читайте слайды: на них короткие подписи, смысл в ваших словах.</w:t>
       </w:r>
     </w:p>
     <w:p>
       <w:pPr>
         <w:numPr>
           <w:ilvl w:val="0"/>
-          <w:numId w:val="1002"/>
+          <w:numId w:val="1001"/>
         </w:numPr>
         <w:pStyle w:val="Compact"/>
       </w:pPr>
       <w:r>
-        <w:t xml:space="preserve">Вопросы-связки (жирные) произносите вслух и делайте паузу.</w:t>
+        <w:t xml:space="preserve">Связки жирным произносите вслух и делайте паузу после них.</w:t>
       </w:r>
     </w:p>
     <w:p>
       <w:pPr>
         <w:numPr>
           <w:ilvl w:val="0"/>
-          <w:numId w:val="1002"/>
+          <w:numId w:val="1001"/>
         </w:numPr>
         <w:pStyle w:val="Compact"/>
       </w:pPr>
@@ -2024,7 +1910,7 @@
       <w:pPr>
         <w:numPr>
           <w:ilvl w:val="0"/>
-          <w:numId w:val="1002"/>
+          <w:numId w:val="1001"/>
         </w:numPr>
         <w:pStyle w:val="Compact"/>
       </w:pPr>
@@ -2036,7 +1922,7 @@
       <w:pPr>
         <w:numPr>
           <w:ilvl w:val="0"/>
-          <w:numId w:val="1002"/>
+          <w:numId w:val="1001"/>
         </w:numPr>
         <w:pStyle w:val="Compact"/>
       </w:pPr>
@@ -2048,7 +1934,7 @@
       <w:pPr>
         <w:numPr>
           <w:ilvl w:val="0"/>
-          <w:numId w:val="1002"/>
+          <w:numId w:val="1001"/>
         </w:numPr>
         <w:pStyle w:val="Compact"/>
       </w:pPr>
@@ -2056,8 +1942,8 @@
         <w:t xml:space="preserve">Если не хватает времени, слайды 9, 10 и 11 рассказывайте за минуту каждый, а образы (мука, лекция, леса) оставляйте: они запоминаются лучше цифр.</w:t>
       </w:r>
     </w:p>
+    <w:bookmarkEnd w:id="39"/>
     <w:bookmarkEnd w:id="40"/>
-    <w:bookmarkEnd w:id="41"/>
     <w:sectPr/>
   </w:body>
 </w:document>
@@ -2244,9 +2130,6 @@
     <w:abstractNumId w:val="990"/>
   </w:num>
   <w:num w:numId="1001">
-    <w:abstractNumId w:val="991"/>
-  </w:num>
-  <w:num w:numId="1002">
     <w:abstractNumId w:val="991"/>
   </w:num>
 </w:numbering>

</xml_diff>

<commit_message>
Replace flour analogy with smartphones/processors
</commit_message>
<xml_diff>
--- a/harness/Doklad-Harness.docx
+++ b/harness/Doklad-Harness.docx
@@ -246,7 +246,7 @@
         <w:pStyle w:val="BodyText"/>
       </w:pPr>
       <w:r>
-        <w:t xml:space="preserve">Сравните с пекарнями в вашем городе. Муку они часто берут у одних и тех же поставщиков, и мука у всех примерно одинаковая. Но в одной пекарне за хлебом стоит очередь, а в соседней он вчерашний. Разница вовсе не в муке, а в том, как организована работа: рецепт, печь, контроль качества.</w:t>
+        <w:t xml:space="preserve">Сравните со смартфонами. Процессоры для них делают несколько компаний, и один и тот же чип могут поставить в телефоны разных брендов. Но вы выбираете телефон не по названию процессора. Вы смотрите на камеру, на то, как долго он держит заряд, на удобство системы и на то, как всё это сделано в целом. Чип один, а телефоны получаются разными.</w:t>
       </w:r>
     </w:p>
     <w:p>
@@ -264,7 +264,7 @@
           <w:bCs/>
           <w:b/>
         </w:rPr>
-        <w:t xml:space="preserve">Если мука у всех одна, откуда берётся разница в хлебе?</w:t>
+        <w:t xml:space="preserve">Если «процессор» у всех один, откуда берётся разница между «телефонами»?</w:t>
       </w:r>
     </w:p>
     <w:p>
@@ -1939,7 +1939,7 @@
         <w:pStyle w:val="Compact"/>
       </w:pPr>
       <w:r>
-        <w:t xml:space="preserve">Если не хватает времени, слайды 9, 10 и 11 рассказывайте за минуту каждый, а образы (мука, лекция, леса) оставляйте: они запоминаются лучше цифр.</w:t>
+        <w:t xml:space="preserve">Если не хватает времени, слайды 9, 10 и 11 рассказывайте за минуту каждый, а образы (смартфоны, лекция, леса) оставляйте: они запоминаются лучше цифр.</w:t>
       </w:r>
     </w:p>
     <w:bookmarkEnd w:id="39"/>

</xml_diff>

<commit_message>
Speech: remove intro block
</commit_message>
<xml_diff>
--- a/harness/Doklad-Harness.docx
+++ b/harness/Doklad-Harness.docx
@@ -17,86 +17,10 @@
       </w:pPr>
       <w:r>
         <w:rPr>
-          <w:bCs/>
-          <w:b/>
-        </w:rPr>
-        <w:t xml:space="preserve">Время:</w:t>
-      </w:r>
-      <w:r>
-        <w:t xml:space="preserve"> </w:t>
-      </w:r>
-      <w:r>
-        <w:t xml:space="preserve">около 18–20 минут, 16 слайдов.</w:t>
-      </w:r>
-      <w:r>
-        <w:t xml:space="preserve"> </w:t>
-      </w:r>
-      <w:r>
-        <w:rPr>
-          <w:bCs/>
-          <w:b/>
-        </w:rPr>
-        <w:t xml:space="preserve">Слушатели:</w:t>
-      </w:r>
-      <w:r>
-        <w:t xml:space="preserve"> </w:t>
-      </w:r>
-      <w:r>
-        <w:t xml:space="preserve">студенты БГУИР и преподаватель по маркетингу программных продуктов.</w:t>
-      </w:r>
-    </w:p>
-    <w:p>
-      <w:pPr>
-        <w:pStyle w:val="BodyText"/>
-      </w:pPr>
-      <w:r>
-        <w:rPr>
-          <w:bCs/>
-          <w:b/>
-        </w:rPr>
-        <w:t xml:space="preserve">Как пользоваться.</w:t>
-      </w:r>
-      <w:r>
-        <w:t xml:space="preserve"> </w:t>
-      </w:r>
-      <w:r>
-        <w:t xml:space="preserve">Это не текст для заучивания, а живая опора: на слайде короткая мысль, здесь она рассказана своими словами. Курсивом в скобках даны пометки «что сделать». Фразы жирным — связки между слайдами, их стоит произносить вслух.</w:t>
-      </w:r>
-    </w:p>
-    <w:p>
-      <w:pPr>
-        <w:pStyle w:val="BodyText"/>
-      </w:pPr>
-      <w:r>
-        <w:rPr>
-          <w:bCs/>
-          <w:b/>
-        </w:rPr>
-        <w:t xml:space="preserve">Главный образ доклада:</w:t>
-      </w:r>
-      <w:r>
-        <w:t xml:space="preserve"> </w:t>
-      </w:r>
-      <w:r>
-        <w:t xml:space="preserve">ИИ — это новый сотрудник. Модель — талантливый выпускник, harness — его рабочее место, агент — выпускник на рабочем месте, то есть полноценный работник.</w:t>
-      </w:r>
-    </w:p>
-    <w:p>
-      <w:pPr>
-        <w:pStyle w:val="BodyText"/>
-      </w:pPr>
-      <w:r>
-        <w:rPr>
-          <w:bCs/>
-          <w:b/>
-        </w:rPr>
-        <w:t xml:space="preserve">Если выступают трое:</w:t>
-      </w:r>
-      <w:r>
-        <w:t xml:space="preserve"> </w:t>
-      </w:r>
-      <w:r>
-        <w:t xml:space="preserve">слайды 1–5 — первый (проблема и определение), 6–11 — второй (как это устроено и где слабые места), 12–16 — третий (рынок, маркетинг, выводы).</w:t>
+          <w:iCs/>
+          <w:i/>
+        </w:rPr>
+        <w:t xml:space="preserve">Курсивом в скобках — пометки «что сделать». Жирные фразы — связки между слайдами, их стоит произносить вслух.</w:t>
       </w:r>
     </w:p>
     <w:p>

</xml_diff>

<commit_message>
Slide 13: replace audience task with 'building an AI agent' advice
</commit_message>
<xml_diff>
--- a/harness/Doklad-Harness.docx
+++ b/harness/Doklad-Harness.docx
@@ -1041,7 +1041,7 @@
           <w:bCs/>
           <w:b/>
         </w:rPr>
-        <w:t xml:space="preserve">А теперь попробуйте сами.</w:t>
+        <w:t xml:space="preserve">Как это применить на практике?</w:t>
       </w:r>
     </w:p>
     <w:p>
@@ -1052,13 +1052,13 @@
       </w:r>
     </w:p>
     <w:bookmarkEnd w:id="31"/>
-    <w:bookmarkStart w:id="32" w:name="слайд-13.-практика-как-это-продавать"/>
+    <w:bookmarkStart w:id="32" w:name="X5f55484e0a4764ecdc4b9371941af360447c05c"/>
     <w:p>
       <w:pPr>
         <w:pStyle w:val="Heading2"/>
       </w:pPr>
       <w:r>
-        <w:t xml:space="preserve">Слайд 13. Практика: как это продавать</w:t>
+        <w:t xml:space="preserve">Слайд 13. Практика: как это продавать и делать</w:t>
       </w:r>
     </w:p>
     <w:p>
@@ -1070,7 +1070,7 @@
           <w:iCs/>
           <w:i/>
         </w:rPr>
-        <w:t xml:space="preserve">(Это задание для зала. Формулировки на слайде наши, не из статьи.)</w:t>
+        <w:t xml:space="preserve">(Формулировки на слайде наши, не из статьи.)</w:t>
       </w:r>
     </w:p>
     <w:p>
@@ -1086,51 +1086,23 @@
         <w:pStyle w:val="BodyText"/>
       </w:pPr>
       <w:r>
-        <w:t xml:space="preserve">Справа вариант, который сработает: «Помнит ваш проект. Проверяет себя. Спросит, прежде чем что-то удалить». За этим стоят три свойства harness: память, проверка и права. И главное, их можно продемонстрировать: показать, как продукт помнит, как проверяет, как спрашивает разрешение.</w:t>
-      </w:r>
-    </w:p>
-    <w:p>
-      <w:pPr>
-        <w:pStyle w:val="BodyText"/>
-      </w:pPr>
-      <w:r>
-        <w:t xml:space="preserve">Теперь ваша очередь.</w:t>
-      </w:r>
-      <w:r>
-        <w:t xml:space="preserve"> </w:t>
-      </w:r>
-      <w:r>
-        <w:rPr>
-          <w:bCs/>
-          <w:b/>
-        </w:rPr>
-        <w:t xml:space="preserve">Задание на одну минуту:</w:t>
-      </w:r>
-      <w:r>
-        <w:t xml:space="preserve"> </w:t>
-      </w:r>
-      <w:r>
-        <w:t xml:space="preserve">придумайте торговое предложение для ИИ-помощника по своему профилю, например для бухгалтерии, службы поддержки или рекламного агентства. Опирайтесь на четыре пункта со слайда 8: память, проверка, права и доведение до конца.</w:t>
-      </w:r>
-    </w:p>
-    <w:p>
-      <w:pPr>
-        <w:pStyle w:val="BodyText"/>
-      </w:pPr>
-      <w:r>
-        <w:rPr>
-          <w:iCs/>
-          <w:i/>
-        </w:rPr>
-        <w:t xml:space="preserve">(Дать минуту. Выслушать двоих-троих. Если зависли, подсказать: «Что он помнит? Что проверяет? Чего не делает без вас?»)</w:t>
-      </w:r>
-    </w:p>
-    <w:p>
-      <w:pPr>
-        <w:pStyle w:val="BodyText"/>
-      </w:pPr>
-      <w:r>
-        <w:t xml:space="preserve">Хорошее предложение говорит не о технологии, а о свойстве, которое клиент может проверить.</w:t>
+        <w:t xml:space="preserve">Справа вариант, который сработает: «Помнит ваш проект. Проверяет себя. Спросит, прежде чем что-то удалить». За этим стоят три свойства harness: память, проверка и права. И главное, их можно продемонстрировать: показать, как продукт помнит, как проверяет и как спрашивает разрешение.</w:t>
+      </w:r>
+    </w:p>
+    <w:p>
+      <w:pPr>
+        <w:pStyle w:val="BodyText"/>
+      </w:pPr>
+      <w:r>
+        <w:t xml:space="preserve">А теперь представьте, что вы не продаёте, а сами создаёте ИИ-агента. С чего начать? Не с вопроса «какую модель взять», а с четырёх других. Что он будет помнить между сессиями? Как он будет проверять себя до сдачи работы? Что ему можно делать самому, а что только с вашего согласия? И что должно происходить, чтобы он не бросил задачу на полпути? Ответы на эти четыре вопроса и есть ваш будущий harness, а значит, и будущее описание вашего продукта.</w:t>
+      </w:r>
+    </w:p>
+    <w:p>
+      <w:pPr>
+        <w:pStyle w:val="BodyText"/>
+      </w:pPr>
+      <w:r>
+        <w:t xml:space="preserve">Хорошее предложение клиенту говорит не о технологии, а о свойстве, которое можно проверить. И такие свойства нужно закладывать с самого начала, а не дописывать в рекламе.</w:t>
       </w:r>
       <w:r>
         <w:t xml:space="preserve"> </w:t>
@@ -1839,7 +1811,7 @@
         <w:pStyle w:val="Compact"/>
       </w:pPr>
       <w:r>
-        <w:t xml:space="preserve">Слайд 13 — задание для зала. Дайте людям минуту: так доклад запомнится.</w:t>
+        <w:t xml:space="preserve">На слайде 13 не торопитесь: это переход от «как продавать» к «как делать», подводка к слайду 14.</w:t>
       </w:r>
     </w:p>
     <w:p>

</xml_diff>